<commit_message>
Adicionando Figuras 1 e 2
</commit_message>
<xml_diff>
--- a/docs/Rascunho TCC.docx
+++ b/docs/Rascunho TCC.docx
@@ -1,6 +1,6 @@
 
 <file path=word/document.xml><?xml version="1.0" encoding="utf-8"?>
-<w:document xmlns:wpc="http://schemas.microsoft.com/office/word/2010/wordprocessingCanvas" xmlns:cx="http://schemas.microsoft.com/office/drawing/2014/chartex" xmlns:cx1="http://schemas.microsoft.com/office/drawing/2015/9/8/chartex" xmlns:cx2="http://schemas.microsoft.com/office/drawing/2015/10/21/chartex" xmlns:cx3="http://schemas.microsoft.com/office/drawing/2016/5/9/chartex" xmlns:cx4="http://schemas.microsoft.com/office/drawing/2016/5/10/chartex" xmlns:cx5="http://schemas.microsoft.com/office/drawing/2016/5/11/chartex" xmlns:cx6="http://schemas.microsoft.com/office/drawing/2016/5/12/chartex" xmlns:cx7="http://schemas.microsoft.com/office/drawing/2016/5/13/chartex" xmlns:cx8="http://schemas.microsoft.com/office/drawing/2016/5/14/chartex" xmlns:mc="http://schemas.openxmlformats.org/markup-compatibility/2006" xmlns:aink="http://schemas.microsoft.com/office/drawing/2016/ink" xmlns:am3d="http://schemas.microsoft.com/office/drawing/2017/model3d" xmlns:o="urn:schemas-microsoft-com:office:office" xmlns:oel="http://schemas.microsoft.com/office/2019/extlst" xmlns:r="http://schemas.openxmlformats.org/officeDocument/2006/relationships" xmlns:m="http://schemas.openxmlformats.org/officeDocument/2006/math" xmlns:v="urn:schemas-microsoft-com:vml" xmlns:wp14="http://schemas.microsoft.com/office/word/2010/wordprocessingDrawing" xmlns:wp="http://schemas.openxmlformats.org/drawingml/2006/wordprocessingDrawing" xmlns:w10="urn:schemas-microsoft-com:office:word" xmlns:w="http://schemas.openxmlformats.org/wordprocessingml/2006/main" xmlns:w14="http://schemas.microsoft.com/office/word/2010/wordml" xmlns:w15="http://schemas.microsoft.com/office/word/2012/wordml" xmlns:w16cex="http://schemas.microsoft.com/office/word/2018/wordml/cex" xmlns:w16cid="http://schemas.microsoft.com/office/word/2016/wordml/cid" xmlns:w16="http://schemas.microsoft.com/office/word/2018/wordml" xmlns:w16sdtdh="http://schemas.microsoft.com/office/word/2020/wordml/sdtdatahash" xmlns:w16se="http://schemas.microsoft.com/office/word/2015/wordml/symex" xmlns:wpg="http://schemas.microsoft.com/office/word/2010/wordprocessingGroup" xmlns:wpi="http://schemas.microsoft.com/office/word/2010/wordprocessingInk" xmlns:wne="http://schemas.microsoft.com/office/word/2006/wordml" xmlns:wps="http://schemas.microsoft.com/office/word/2010/wordprocessingShape" mc:Ignorable="w14 w15 w16se w16cid w16 w16cex w16sdtdh wp14">
+<w:document xmlns:wpc="http://schemas.microsoft.com/office/word/2010/wordprocessingCanvas" xmlns:cx="http://schemas.microsoft.com/office/drawing/2014/chartex" xmlns:cx1="http://schemas.microsoft.com/office/drawing/2015/9/8/chartex" xmlns:cx2="http://schemas.microsoft.com/office/drawing/2015/10/21/chartex" xmlns:cx3="http://schemas.microsoft.com/office/drawing/2016/5/9/chartex" xmlns:cx4="http://schemas.microsoft.com/office/drawing/2016/5/10/chartex" xmlns:cx5="http://schemas.microsoft.com/office/drawing/2016/5/11/chartex" xmlns:cx6="http://schemas.microsoft.com/office/drawing/2016/5/12/chartex" xmlns:cx7="http://schemas.microsoft.com/office/drawing/2016/5/13/chartex" xmlns:cx8="http://schemas.microsoft.com/office/drawing/2016/5/14/chartex" xmlns:mc="http://schemas.openxmlformats.org/markup-compatibility/2006" xmlns:aink="http://schemas.microsoft.com/office/drawing/2016/ink" xmlns:am3d="http://schemas.microsoft.com/office/drawing/2017/model3d" xmlns:o="urn:schemas-microsoft-com:office:office" xmlns:oel="http://schemas.microsoft.com/office/2019/extlst" xmlns:r="http://schemas.openxmlformats.org/officeDocument/2006/relationships" xmlns:m="http://schemas.openxmlformats.org/officeDocument/2006/math" xmlns:v="urn:schemas-microsoft-com:vml" xmlns:wp14="http://schemas.microsoft.com/office/word/2010/wordprocessingDrawing" xmlns:wp="http://schemas.openxmlformats.org/drawingml/2006/wordprocessingDrawing" xmlns:w10="urn:schemas-microsoft-com:office:word" xmlns:w="http://schemas.openxmlformats.org/wordprocessingml/2006/main" xmlns:w14="http://schemas.microsoft.com/office/word/2010/wordml" xmlns:w15="http://schemas.microsoft.com/office/word/2012/wordml" xmlns:w16cex="http://schemas.microsoft.com/office/word/2018/wordml/cex" xmlns:w16cid="http://schemas.microsoft.com/office/word/2016/wordml/cid" xmlns:w16="http://schemas.microsoft.com/office/word/2018/wordml" xmlns:w16du="http://schemas.microsoft.com/office/word/2023/wordml/word16du" xmlns:w16sdtdh="http://schemas.microsoft.com/office/word/2020/wordml/sdtdatahash" xmlns:w16sdtfl="http://schemas.microsoft.com/office/word/2024/wordml/sdtformatlock" xmlns:w16se="http://schemas.microsoft.com/office/word/2015/wordml/symex" xmlns:wpg="http://schemas.microsoft.com/office/word/2010/wordprocessingGroup" xmlns:wpi="http://schemas.microsoft.com/office/word/2010/wordprocessingInk" xmlns:wne="http://schemas.microsoft.com/office/word/2006/wordml" xmlns:wps="http://schemas.microsoft.com/office/word/2010/wordprocessingShape" mc:Ignorable="w14 w15 w16se w16cid w16 w16cex w16sdtdh w16sdtfl w16du wp14">
   <w:body>
     <w:p>
       <w:pPr>
@@ -213,6 +213,9 @@
         <w:sectPr>
           <w:headerReference w:type="even" r:id="rId9"/>
           <w:headerReference w:type="default" r:id="rId10"/>
+          <w:footerReference w:type="default" r:id="rId11"/>
+          <w:headerReference w:type="first" r:id="rId12"/>
+          <w:footerReference w:type="first" r:id="rId13"/>
           <w:type w:val="continuous"/>
           <w:pgSz w:w="11906" w:h="16838"/>
           <w:pgMar w:top="1701" w:right="1134" w:bottom="1531" w:left="1701" w:header="720" w:footer="720" w:gutter="0"/>
@@ -244,7 +247,6 @@
         <w:pStyle w:val="CP-CapaCabecalho"/>
       </w:pPr>
       <w:r>
-        <w:lastRenderedPageBreak/>
         <w:t>AATEC - Área de Agrárias, Engenharias e Tecnologias</w:t>
       </w:r>
     </w:p>
@@ -404,7 +406,6 @@
         <w:t>, &lt;</w:t>
       </w:r>
       <w:proofErr w:type="spellStart"/>
-      <w:proofErr w:type="gramStart"/>
       <w:r>
         <w:rPr>
           <w:highlight w:val="yellow"/>
@@ -416,14 +417,7 @@
         <w:rPr>
           <w:highlight w:val="yellow"/>
         </w:rPr>
-        <w:t>.,Me.</w:t>
-      </w:r>
-      <w:proofErr w:type="gramEnd"/>
-      <w:r>
-        <w:rPr>
-          <w:highlight w:val="yellow"/>
-        </w:rPr>
-        <w:t>, Dr.&gt;</w:t>
+        <w:t>.,Me., Dr.&gt;</w:t>
       </w:r>
     </w:p>
     <w:p>
@@ -482,6 +476,9 @@
       <w:pPr>
         <w:pStyle w:val="CP-CapaLocaleData"/>
         <w:sectPr>
+          <w:footerReference w:type="default" r:id="rId14"/>
+          <w:headerReference w:type="first" r:id="rId15"/>
+          <w:footerReference w:type="first" r:id="rId16"/>
           <w:pgSz w:w="11906" w:h="16838"/>
           <w:pgMar w:top="1701" w:right="1134" w:bottom="1531" w:left="1701" w:header="720" w:footer="720" w:gutter="0"/>
           <w:pgNumType w:fmt="lowerRoman"/>
@@ -504,7 +501,6 @@
       <w:bookmarkStart w:id="4" w:name="_Toc159362151"/>
       <w:bookmarkStart w:id="5" w:name="_Toc225859264"/>
       <w:r>
-        <w:lastRenderedPageBreak/>
         <w:t>Lista de</w:t>
       </w:r>
       <w:bookmarkEnd w:id="0"/>
@@ -524,53 +520,49 @@
       <w:r>
         <w:rPr>
           <w:b/>
-          <w:caps/>
-          <w:noProof/>
-        </w:rPr>
-        <w:fldChar w:fldCharType="begin"/>
-      </w:r>
-      <w:r>
-        <w:rPr>
-          <w:b/>
-          <w:caps/>
-          <w:noProof/>
-        </w:rPr>
-        <w:instrText xml:space="preserve"> TOC \t "TE-LegendaFigura;9" </w:instrText>
-      </w:r>
-      <w:r>
-        <w:rPr>
-          <w:b/>
-          <w:caps/>
-          <w:noProof/>
-        </w:rPr>
-        <w:fldChar w:fldCharType="separate"/>
-      </w:r>
-      <w:r>
-        <w:rPr>
           <w:bCs/>
           <w:caps/>
           <w:noProof/>
         </w:rPr>
-        <w:t>Nenhuma entrada de sumário foi encontrada.</w:t>
+        <w:fldChar w:fldCharType="begin"/>
       </w:r>
       <w:r>
         <w:rPr>
           <w:b/>
+          <w:bCs/>
           <w:caps/>
           <w:noProof/>
-          <w:snapToGrid/>
-          <w:szCs w:val="26"/>
+        </w:rPr>
+        <w:instrText xml:space="preserve"> TOC \t "TE-LegendaFigura;9" </w:instrText>
+      </w:r>
+      <w:r>
+        <w:rPr>
+          <w:b/>
+          <w:bCs/>
+          <w:caps/>
+          <w:noProof/>
+        </w:rPr>
+        <w:fldChar w:fldCharType="separate"/>
+      </w:r>
+      <w:r>
+        <w:rPr>
+          <w:caps/>
+          <w:noProof/>
+        </w:rPr>
+        <w:t>Nenhuma entrada de sumário foi encontrada.</w:t>
+      </w:r>
+      <w:r>
+        <w:rPr>
+          <w:b/>
+          <w:bCs/>
+          <w:caps/>
+          <w:noProof/>
         </w:rPr>
         <w:fldChar w:fldCharType="end"/>
       </w:r>
     </w:p>
     <w:p>
       <w:pPr>
-        <w:pStyle w:val="TE-Normal"/>
-      </w:pPr>
-    </w:p>
-    <w:p>
-      <w:pPr>
         <w:pStyle w:val="LI-ListaItem"/>
       </w:pPr>
     </w:p>
@@ -651,8 +643,10 @@
       <w:pPr>
         <w:pStyle w:val="TE-Normal"/>
         <w:sectPr>
-          <w:headerReference w:type="default" r:id="rId11"/>
-          <w:headerReference w:type="first" r:id="rId12"/>
+          <w:headerReference w:type="default" r:id="rId17"/>
+          <w:footerReference w:type="default" r:id="rId18"/>
+          <w:headerReference w:type="first" r:id="rId19"/>
+          <w:footerReference w:type="first" r:id="rId20"/>
           <w:pgSz w:w="11906" w:h="16838" w:code="9"/>
           <w:pgMar w:top="1701" w:right="1134" w:bottom="1531" w:left="1701" w:header="720" w:footer="720" w:gutter="0"/>
           <w:pgNumType w:fmt="lowerRoman" w:start="3"/>
@@ -669,7 +663,6 @@
       <w:bookmarkStart w:id="6" w:name="_Toc159362152"/>
       <w:bookmarkStart w:id="7" w:name="_Toc225859265"/>
       <w:r>
-        <w:lastRenderedPageBreak/>
         <w:t>Lista de QUADROS</w:t>
       </w:r>
       <w:bookmarkEnd w:id="6"/>
@@ -830,8 +823,10 @@
       <w:pPr>
         <w:pStyle w:val="TE-Normal"/>
         <w:sectPr>
-          <w:headerReference w:type="default" r:id="rId13"/>
-          <w:headerReference w:type="first" r:id="rId14"/>
+          <w:headerReference w:type="default" r:id="rId21"/>
+          <w:footerReference w:type="default" r:id="rId22"/>
+          <w:headerReference w:type="first" r:id="rId23"/>
+          <w:footerReference w:type="first" r:id="rId24"/>
           <w:pgSz w:w="11906" w:h="16838" w:code="9"/>
           <w:pgMar w:top="1701" w:right="1134" w:bottom="1531" w:left="1701" w:header="720" w:footer="720" w:gutter="0"/>
           <w:pgNumType w:fmt="lowerRoman"/>
@@ -848,7 +843,6 @@
       <w:bookmarkStart w:id="8" w:name="_Toc159362153"/>
       <w:bookmarkStart w:id="9" w:name="_Toc225859266"/>
       <w:r>
-        <w:lastRenderedPageBreak/>
         <w:t>Lista de tabelas</w:t>
       </w:r>
       <w:bookmarkEnd w:id="8"/>
@@ -865,7 +859,6 @@
       <w:r>
         <w:rPr>
           <w:noProof/>
-          <w:szCs w:val="26"/>
         </w:rPr>
         <w:fldChar w:fldCharType="begin"/>
       </w:r>
@@ -878,7 +871,6 @@
       <w:r>
         <w:rPr>
           <w:noProof/>
-          <w:szCs w:val="26"/>
         </w:rPr>
         <w:fldChar w:fldCharType="separate"/>
       </w:r>
@@ -887,25 +879,23 @@
           <w:b/>
           <w:bCs/>
           <w:noProof/>
-          <w:szCs w:val="26"/>
         </w:rPr>
         <w:t>Nenhuma entrada de sumário foi encontrada.</w:t>
       </w:r>
       <w:r>
+        <w:rPr>
+          <w:noProof/>
+        </w:rPr>
+        <w:fldChar w:fldCharType="end"/>
+      </w:r>
+    </w:p>
+    <w:p>
+      <w:pPr>
+        <w:pStyle w:val="TE-Normal"/>
         <w:rPr>
           <w:noProof/>
           <w:snapToGrid/>
         </w:rPr>
-        <w:fldChar w:fldCharType="end"/>
-      </w:r>
-    </w:p>
-    <w:p>
-      <w:pPr>
-        <w:pStyle w:val="TE-Normal"/>
-        <w:rPr>
-          <w:noProof/>
-          <w:snapToGrid/>
-        </w:rPr>
       </w:pPr>
     </w:p>
     <w:p>
@@ -1034,8 +1024,10 @@
         <w:pStyle w:val="TE-Normal"/>
         <w:ind w:firstLine="0"/>
         <w:sectPr>
-          <w:headerReference w:type="default" r:id="rId15"/>
-          <w:headerReference w:type="first" r:id="rId16"/>
+          <w:headerReference w:type="default" r:id="rId25"/>
+          <w:footerReference w:type="default" r:id="rId26"/>
+          <w:headerReference w:type="first" r:id="rId27"/>
+          <w:footerReference w:type="first" r:id="rId28"/>
           <w:pgSz w:w="11906" w:h="16838" w:code="9"/>
           <w:pgMar w:top="1701" w:right="1134" w:bottom="1531" w:left="1701" w:header="720" w:footer="720" w:gutter="0"/>
           <w:pgNumType w:fmt="lowerRoman"/>
@@ -1052,7 +1044,6 @@
       <w:bookmarkStart w:id="10" w:name="_Toc159362154"/>
       <w:bookmarkStart w:id="11" w:name="_Toc225859267"/>
       <w:r>
-        <w:lastRenderedPageBreak/>
         <w:t>Lista de Siglas</w:t>
       </w:r>
       <w:bookmarkEnd w:id="10"/>
@@ -1084,7 +1075,9 @@
         <w:pStyle w:val="TE-Normal"/>
         <w:ind w:firstLine="0"/>
         <w:sectPr>
-          <w:headerReference w:type="first" r:id="rId17"/>
+          <w:footerReference w:type="default" r:id="rId29"/>
+          <w:headerReference w:type="first" r:id="rId30"/>
+          <w:footerReference w:type="first" r:id="rId31"/>
           <w:pgSz w:w="11906" w:h="16838" w:code="9"/>
           <w:pgMar w:top="1701" w:right="1134" w:bottom="1531" w:left="1701" w:header="720" w:footer="720" w:gutter="0"/>
           <w:pgNumType w:fmt="lowerRoman"/>
@@ -1099,7 +1092,6 @@
         <w:pStyle w:val="TC-TituloSumario"/>
       </w:pPr>
       <w:r>
-        <w:lastRenderedPageBreak/>
         <w:t>Sumário</w:t>
       </w:r>
     </w:p>
@@ -2194,7 +2186,6 @@
         </w:rPr>
       </w:pPr>
       <w:r>
-        <w:lastRenderedPageBreak/>
         <w:t>3.8 Visão geral do sistema proposto</w:t>
       </w:r>
       <w:r>
@@ -2306,8 +2297,10 @@
       <w:pPr>
         <w:pStyle w:val="TE-Normal"/>
         <w:sectPr>
-          <w:headerReference w:type="default" r:id="rId18"/>
-          <w:headerReference w:type="first" r:id="rId19"/>
+          <w:headerReference w:type="default" r:id="rId32"/>
+          <w:footerReference w:type="default" r:id="rId33"/>
+          <w:headerReference w:type="first" r:id="rId34"/>
+          <w:footerReference w:type="first" r:id="rId35"/>
           <w:pgSz w:w="11906" w:h="16838" w:code="9"/>
           <w:pgMar w:top="1701" w:right="1134" w:bottom="1531" w:left="1701" w:header="720" w:footer="720" w:gutter="0"/>
           <w:pgNumType w:fmt="lowerRoman"/>
@@ -2327,7 +2320,6 @@
       <w:bookmarkStart w:id="15" w:name="_Toc527795385"/>
       <w:bookmarkStart w:id="16" w:name="_Toc527798495"/>
       <w:r>
-        <w:lastRenderedPageBreak/>
         <w:t>Introdução</w:t>
       </w:r>
       <w:bookmarkEnd w:id="12"/>
@@ -2391,11 +2383,7 @@
         <w:t>(MÜLLER, 2015)</w:t>
       </w:r>
       <w:r>
-        <w:t xml:space="preserve">. Nesse contexto, destaca-se a área de Music Information Retrieval (MIR), que investiga </w:t>
-      </w:r>
-      <w:r>
-        <w:lastRenderedPageBreak/>
-        <w:t>métodos para extração e análise de informações musicais a partir de dados digitais</w:t>
+        <w:t>. Nesse contexto, destaca-se a área de Music Information Retrieval (MIR), que investiga métodos para extração e análise de informações musicais a partir de dados digitais</w:t>
       </w:r>
       <w:r>
         <w:t xml:space="preserve"> </w:t>
@@ -2478,7 +2466,6 @@
       </w:pPr>
       <w:bookmarkStart w:id="18" w:name="_Toc225859270"/>
       <w:r>
-        <w:lastRenderedPageBreak/>
         <w:t>De</w:t>
       </w:r>
       <w:r>
@@ -2558,7 +2545,6 @@
         <w:pStyle w:val="TE-Normal"/>
       </w:pPr>
       <w:r>
-        <w:lastRenderedPageBreak/>
         <w:t>Desenvolver um</w:t>
       </w:r>
       <w:r>
@@ -2584,7 +2570,7 @@
         <w:pStyle w:val="TE-Alnea"/>
         <w:numPr>
           <w:ilvl w:val="0"/>
-          <w:numId w:val="4"/>
+          <w:numId w:val="5"/>
         </w:numPr>
         <w:tabs>
           <w:tab w:val="clear" w:pos="360"/>
@@ -2604,7 +2590,7 @@
         <w:pStyle w:val="TE-Alnea"/>
         <w:numPr>
           <w:ilvl w:val="0"/>
-          <w:numId w:val="4"/>
+          <w:numId w:val="5"/>
         </w:numPr>
         <w:tabs>
           <w:tab w:val="clear" w:pos="360"/>
@@ -2624,7 +2610,7 @@
         <w:pStyle w:val="TE-Alnea"/>
         <w:numPr>
           <w:ilvl w:val="0"/>
-          <w:numId w:val="4"/>
+          <w:numId w:val="5"/>
         </w:numPr>
         <w:tabs>
           <w:tab w:val="clear" w:pos="360"/>
@@ -2644,7 +2630,7 @@
         <w:pStyle w:val="TE-Alnea"/>
         <w:numPr>
           <w:ilvl w:val="0"/>
-          <w:numId w:val="4"/>
+          <w:numId w:val="5"/>
         </w:numPr>
         <w:tabs>
           <w:tab w:val="clear" w:pos="360"/>
@@ -2664,7 +2650,7 @@
         <w:pStyle w:val="TE-Alnea"/>
         <w:numPr>
           <w:ilvl w:val="0"/>
-          <w:numId w:val="4"/>
+          <w:numId w:val="5"/>
         </w:numPr>
         <w:tabs>
           <w:tab w:val="clear" w:pos="360"/>
@@ -2710,11 +2696,7 @@
         <w:pStyle w:val="TE-Normal"/>
       </w:pPr>
       <w:r>
-        <w:t xml:space="preserve">Entretanto, muitas das abordagens existentes na literatura utilizam métodos complexos, frequentemente baseados em técnicas avançadas de mineração de dados ou aprendizado de máquina (MEREDITH, 2016), o que pode dificultar sua aplicação em </w:t>
-      </w:r>
-      <w:r>
-        <w:lastRenderedPageBreak/>
-        <w:t>contextos acadêmicos introdutórios ou em estudos exploratórios.</w:t>
+        <w:t>Entretanto, muitas das abordagens existentes na literatura utilizam métodos complexos, frequentemente baseados em técnicas avançadas de mineração de dados ou aprendizado de máquina (MEREDITH, 2016), o que pode dificultar sua aplicação em contextos acadêmicos introdutórios ou em estudos exploratórios.</w:t>
       </w:r>
     </w:p>
     <w:p>
@@ -2795,7 +2777,6 @@
       </w:pPr>
       <w:bookmarkStart w:id="24" w:name="_Toc225859276"/>
       <w:r>
-        <w:lastRenderedPageBreak/>
         <w:t xml:space="preserve">Procedimentos </w:t>
       </w:r>
       <w:r>
@@ -2866,7 +2847,6 @@
       <w:bookmarkEnd w:id="15"/>
       <w:bookmarkEnd w:id="16"/>
       <w:r>
-        <w:lastRenderedPageBreak/>
         <w:t>Fundamentação teórica</w:t>
       </w:r>
       <w:bookmarkEnd w:id="26"/>
@@ -2931,6 +2911,155 @@
     </w:p>
     <w:p>
       <w:pPr>
+        <w:pStyle w:val="TE-Normal"/>
+      </w:pPr>
+    </w:p>
+    <w:p>
+      <w:pPr>
+        <w:widowControl w:val="0"/>
+        <w:spacing w:line="360" w:lineRule="auto"/>
+        <w:ind w:firstLine="1009"/>
+        <w:jc w:val="both"/>
+        <w:rPr>
+          <w:color w:val="000000" w:themeColor="text1"/>
+          <w:sz w:val="26"/>
+          <w:szCs w:val="26"/>
+        </w:rPr>
+      </w:pPr>
+    </w:p>
+    <w:p>
+      <w:pPr>
+        <w:pStyle w:val="TE-LegendaFigura"/>
+        <w:rPr>
+          <w:color w:val="000000" w:themeColor="text1"/>
+        </w:rPr>
+      </w:pPr>
+      <w:r>
+        <w:rPr>
+          <w:color w:val="000000" w:themeColor="text1"/>
+        </w:rPr>
+        <w:t>Exemplo de representação de uma partitura no formato MusicXML</w:t>
+      </w:r>
+      <w:r>
+        <w:rPr>
+          <w:color w:val="000000" w:themeColor="text1"/>
+        </w:rPr>
+        <w:t xml:space="preserve"> (Item 1.1)</w:t>
+      </w:r>
+    </w:p>
+    <w:p>
+      <w:pPr>
+        <w:widowControl w:val="0"/>
+        <w:spacing w:line="360" w:lineRule="auto"/>
+        <w:ind w:firstLine="1009"/>
+        <w:jc w:val="both"/>
+      </w:pPr>
+    </w:p>
+    <w:p>
+      <w:pPr>
+        <w:widowControl w:val="0"/>
+        <w:spacing w:line="360" w:lineRule="auto"/>
+        <w:ind w:firstLine="1009"/>
+        <w:jc w:val="both"/>
+      </w:pPr>
+      <w:r>
+        <w:rPr>
+          <w:noProof/>
+        </w:rPr>
+        <w:drawing>
+          <wp:anchor distT="0" distB="0" distL="114300" distR="114300" simplePos="0" relativeHeight="251657216" behindDoc="0" locked="0" layoutInCell="1" allowOverlap="1" wp14:anchorId="0CC63A32" wp14:editId="00B593DE">
+            <wp:simplePos x="0" y="0"/>
+            <wp:positionH relativeFrom="column">
+              <wp:align>left</wp:align>
+            </wp:positionH>
+            <wp:positionV relativeFrom="paragraph">
+              <wp:posOffset>0</wp:posOffset>
+            </wp:positionV>
+            <wp:extent cx="5762625" cy="2200275"/>
+            <wp:effectExtent l="0" t="0" r="0" b="0"/>
+            <wp:wrapSquare wrapText="bothSides"/>
+            <wp:docPr id="1147246515" name="drawing"/>
+            <wp:cNvGraphicFramePr>
+              <a:graphicFrameLocks xmlns:a="http://schemas.openxmlformats.org/drawingml/2006/main" noChangeAspect="1"/>
+            </wp:cNvGraphicFramePr>
+            <a:graphic xmlns:a="http://schemas.openxmlformats.org/drawingml/2006/main">
+              <a:graphicData uri="http://schemas.openxmlformats.org/drawingml/2006/picture">
+                <pic:pic xmlns:pic="http://schemas.openxmlformats.org/drawingml/2006/picture">
+                  <pic:nvPicPr>
+                    <pic:cNvPr id="1790840218" name="Picture 1790840218"/>
+                    <pic:cNvPicPr/>
+                  </pic:nvPicPr>
+                  <pic:blipFill>
+                    <a:blip r:embed="rId36">
+                      <a:extLst>
+                        <a:ext uri="{28A0092B-C50C-407E-A947-70E740481C1C}">
+                          <a14:useLocalDpi xmlns:a14="http://schemas.microsoft.com/office/drawing/2010/main"/>
+                        </a:ext>
+                      </a:extLst>
+                    </a:blip>
+                    <a:stretch>
+                      <a:fillRect/>
+                    </a:stretch>
+                  </pic:blipFill>
+                  <pic:spPr>
+                    <a:xfrm>
+                      <a:off x="0" y="0"/>
+                      <a:ext cx="5762625" cy="2200275"/>
+                    </a:xfrm>
+                    <a:prstGeom prst="rect">
+                      <a:avLst/>
+                    </a:prstGeom>
+                  </pic:spPr>
+                </pic:pic>
+              </a:graphicData>
+            </a:graphic>
+            <wp14:sizeRelH relativeFrom="page">
+              <wp14:pctWidth>0</wp14:pctWidth>
+            </wp14:sizeRelH>
+            <wp14:sizeRelV relativeFrom="page">
+              <wp14:pctHeight>0</wp14:pctHeight>
+            </wp14:sizeRelV>
+          </wp:anchor>
+        </w:drawing>
+      </w:r>
+    </w:p>
+    <w:p>
+      <w:pPr>
+        <w:pStyle w:val="TE-Normal"/>
+        <w:jc w:val="center"/>
+        <w:rPr>
+          <w:color w:val="000000" w:themeColor="text1"/>
+          <w:sz w:val="22"/>
+          <w:szCs w:val="22"/>
+        </w:rPr>
+      </w:pPr>
+      <w:r>
+        <w:rPr>
+          <w:color w:val="000000" w:themeColor="text1"/>
+          <w:sz w:val="22"/>
+          <w:szCs w:val="22"/>
+        </w:rPr>
+        <w:t>Fonte: Elaborada pelo autor (</w:t>
+      </w:r>
+      <w:r>
+        <w:rPr>
+          <w:color w:val="000000" w:themeColor="text1"/>
+          <w:sz w:val="22"/>
+          <w:szCs w:val="22"/>
+        </w:rPr>
+        <w:t>2026</w:t>
+      </w:r>
+      <w:r>
+        <w:rPr>
+          <w:color w:val="000000" w:themeColor="text1"/>
+          <w:sz w:val="22"/>
+          <w:szCs w:val="22"/>
+        </w:rPr>
+        <w:t>).</w:t>
+      </w:r>
+    </w:p>
+    <w:p>
+      <w:pPr>
         <w:pStyle w:val="T2-TituloSecundario"/>
       </w:pPr>
       <w:bookmarkStart w:id="29" w:name="_Toc225859281"/>
@@ -2944,7 +3073,6 @@
         <w:pStyle w:val="TE-Normal"/>
       </w:pPr>
       <w:r>
-        <w:lastRenderedPageBreak/>
         <w:t>A identificação de padrões melódicos é uma prática recorrente na análise musical, sendo utilizada para compreender a organização interna de obras e a recorrência de motivos musicais. Esses padrões podem ser definidos como sequências de notas ou relações intervalares que se repetem ao longo de uma composição, contribuindo para sua coesão e identidade estilística (HURON, 2006).</w:t>
       </w:r>
     </w:p>
@@ -2981,6 +3109,135 @@
       <w:r>
         <w:t>Nesse sentido, torna-se relevante utilizar representações que capturem a estrutura interna da melodia, permitindo a identificação de padrões independentemente de sua tonalidade ou posição na escala. Essa abordagem é especialmente útil em sistemas automatizados de análise musical.</w:t>
       </w:r>
+      <w:r>
+        <w:t xml:space="preserve"> </w:t>
+      </w:r>
+      <w:r>
+        <w:rPr>
+          <w:highlight w:val="yellow"/>
+        </w:rPr>
+        <w:t>A Figura X apresenta um exemplo de padrão melódico recorrente, no qual um mesmo motivo é repetido em diferentes trechos da partitura.</w:t>
+      </w:r>
+    </w:p>
+    <w:p>
+      <w:pPr>
+        <w:pStyle w:val="TE-LegendaFigura"/>
+        <w:numPr>
+          <w:ilvl w:val="0"/>
+          <w:numId w:val="0"/>
+        </w:numPr>
+        <w:spacing w:line="360" w:lineRule="auto"/>
+        <w:ind w:left="709"/>
+        <w:jc w:val="both"/>
+      </w:pPr>
+    </w:p>
+    <w:p>
+      <w:pPr>
+        <w:pStyle w:val="TE-LegendaFigura"/>
+        <w:rPr>
+          <w:color w:val="000000" w:themeColor="text1"/>
+        </w:rPr>
+      </w:pPr>
+      <w:r>
+        <w:t>Exemplo de padrão melódico recorrente em partitura, evidenciando a repetição de motivos musicais.</w:t>
+      </w:r>
+      <w:r>
+        <w:rPr>
+          <w:color w:val="000000" w:themeColor="text1"/>
+        </w:rPr>
+        <w:t xml:space="preserve"> (Item 1.1)</w:t>
+      </w:r>
+    </w:p>
+    <w:p>
+      <w:pPr>
+        <w:pStyle w:val="TE-Normal"/>
+      </w:pPr>
+    </w:p>
+    <w:p>
+      <w:pPr>
+        <w:widowControl w:val="0"/>
+        <w:spacing w:line="360" w:lineRule="auto"/>
+        <w:ind w:firstLine="709"/>
+        <w:jc w:val="center"/>
+        <w:rPr>
+          <w:color w:val="000000" w:themeColor="text1"/>
+          <w:sz w:val="22"/>
+          <w:szCs w:val="22"/>
+        </w:rPr>
+      </w:pPr>
+      <w:r>
+        <w:rPr>
+          <w:noProof/>
+        </w:rPr>
+        <w:drawing>
+          <wp:anchor distT="0" distB="0" distL="114300" distR="114300" simplePos="0" relativeHeight="251658240" behindDoc="0" locked="0" layoutInCell="1" allowOverlap="1" wp14:anchorId="1D6DD93D" wp14:editId="573511DE">
+            <wp:simplePos x="0" y="0"/>
+            <wp:positionH relativeFrom="column">
+              <wp:align>right</wp:align>
+            </wp:positionH>
+            <wp:positionV relativeFrom="paragraph">
+              <wp:posOffset>0</wp:posOffset>
+            </wp:positionV>
+            <wp:extent cx="5762625" cy="2590800"/>
+            <wp:effectExtent l="0" t="0" r="0" b="0"/>
+            <wp:wrapSquare wrapText="bothSides"/>
+            <wp:docPr id="1290150002" name="drawing"/>
+            <wp:cNvGraphicFramePr>
+              <a:graphicFrameLocks xmlns:a="http://schemas.openxmlformats.org/drawingml/2006/main" noChangeAspect="1"/>
+            </wp:cNvGraphicFramePr>
+            <a:graphic xmlns:a="http://schemas.openxmlformats.org/drawingml/2006/main">
+              <a:graphicData uri="http://schemas.openxmlformats.org/drawingml/2006/picture">
+                <pic:pic xmlns:pic="http://schemas.openxmlformats.org/drawingml/2006/picture">
+                  <pic:nvPicPr>
+                    <pic:cNvPr id="931493097" name="Picture 931493097"/>
+                    <pic:cNvPicPr/>
+                  </pic:nvPicPr>
+                  <pic:blipFill>
+                    <a:blip r:embed="rId37">
+                      <a:extLst>
+                        <a:ext uri="{28A0092B-C50C-407E-A947-70E740481C1C}">
+                          <a14:useLocalDpi xmlns:a14="http://schemas.microsoft.com/office/drawing/2010/main"/>
+                        </a:ext>
+                      </a:extLst>
+                    </a:blip>
+                    <a:stretch>
+                      <a:fillRect/>
+                    </a:stretch>
+                  </pic:blipFill>
+                  <pic:spPr>
+                    <a:xfrm>
+                      <a:off x="0" y="0"/>
+                      <a:ext cx="5762625" cy="2590800"/>
+                    </a:xfrm>
+                    <a:prstGeom prst="rect">
+                      <a:avLst/>
+                    </a:prstGeom>
+                  </pic:spPr>
+                </pic:pic>
+              </a:graphicData>
+            </a:graphic>
+            <wp14:sizeRelH relativeFrom="page">
+              <wp14:pctWidth>0</wp14:pctWidth>
+            </wp14:sizeRelH>
+            <wp14:sizeRelV relativeFrom="page">
+              <wp14:pctHeight>0</wp14:pctHeight>
+            </wp14:sizeRelV>
+          </wp:anchor>
+        </w:drawing>
+      </w:r>
+      <w:r>
+        <w:rPr>
+          <w:color w:val="000000" w:themeColor="text1"/>
+          <w:sz w:val="22"/>
+          <w:szCs w:val="22"/>
+        </w:rPr>
+        <w:t>Fonte: Elaborada pelo autor (2026).</w:t>
+      </w:r>
+    </w:p>
+    <w:p>
+      <w:pPr>
+        <w:pStyle w:val="TE-Normal"/>
+      </w:pPr>
     </w:p>
     <w:p>
       <w:pPr>
@@ -3005,11 +3262,7 @@
         <w:pStyle w:val="TE-Normal"/>
       </w:pPr>
       <w:r>
-        <w:t xml:space="preserve">Por exemplo, uma sequência de notas pode ser convertida em uma sequência de intervalos, representando as distâncias entre cada par de notas consecutivas. Dessa </w:t>
-      </w:r>
-      <w:r>
-        <w:lastRenderedPageBreak/>
-        <w:t>forma, diferentes melodias que compartilham a mesma estrutura intervalar podem ser reconhecidas como equivalentes.</w:t>
+        <w:t>Por exemplo, uma sequência de notas pode ser convertida em uma sequência de intervalos, representando as distâncias entre cada par de notas consecutivas. Dessa forma, diferentes melodias que compartilham a mesma estrutura intervalar podem ser reconhecidas como equivalentes.</w:t>
       </w:r>
     </w:p>
     <w:p>
@@ -3096,7 +3349,6 @@
       </w:pPr>
       <w:bookmarkStart w:id="35" w:name="_Toc225859287"/>
       <w:r>
-        <w:lastRenderedPageBreak/>
         <w:t>Trabalhos Relacionados</w:t>
       </w:r>
       <w:bookmarkEnd w:id="35"/>
@@ -3142,7 +3394,6 @@
       </w:pPr>
       <w:bookmarkStart w:id="36" w:name="_Toc225859288"/>
       <w:r>
-        <w:lastRenderedPageBreak/>
         <w:t>PROCEDIMENTOS METODOLÓGICOS</w:t>
       </w:r>
       <w:bookmarkEnd w:id="36"/>
@@ -3213,7 +3464,6 @@
       </w:pPr>
       <w:bookmarkStart w:id="40" w:name="_Toc225859292"/>
       <w:r>
-        <w:lastRenderedPageBreak/>
         <w:t>Representação por intervalos</w:t>
       </w:r>
       <w:bookmarkEnd w:id="40"/>
@@ -3294,7 +3544,6 @@
       </w:pPr>
       <w:bookmarkStart w:id="44" w:name="_Toc225859296"/>
       <w:r>
-        <w:lastRenderedPageBreak/>
         <w:t>Visão geral do sistema proposto</w:t>
       </w:r>
       <w:bookmarkEnd w:id="44"/>
@@ -3321,7 +3570,6 @@
       </w:pPr>
       <w:bookmarkStart w:id="45" w:name="_Toc225859297"/>
       <w:r>
-        <w:lastRenderedPageBreak/>
         <w:t>CRONOGRAMA</w:t>
       </w:r>
       <w:bookmarkEnd w:id="45"/>
@@ -3384,7 +3632,7 @@
                     <pic:cNvPicPr/>
                   </pic:nvPicPr>
                   <pic:blipFill>
-                    <a:blip r:embed="rId20"/>
+                    <a:blip r:embed="rId38"/>
                     <a:stretch>
                       <a:fillRect/>
                     </a:stretch>
@@ -3437,7 +3685,9 @@
       <w:pPr>
         <w:pStyle w:val="TE-Normal"/>
         <w:sectPr>
-          <w:headerReference w:type="default" r:id="rId21"/>
+          <w:headerReference w:type="default" r:id="rId39"/>
+          <w:footerReference w:type="default" r:id="rId40"/>
+          <w:footerReference w:type="first" r:id="rId41"/>
           <w:pgSz w:w="11906" w:h="16838" w:code="9"/>
           <w:pgMar w:top="1701" w:right="1134" w:bottom="1531" w:left="1701" w:header="720" w:footer="720" w:gutter="0"/>
           <w:cols w:space="720"/>
@@ -3456,7 +3706,6 @@
       <w:bookmarkStart w:id="49" w:name="_Toc527798510"/>
       <w:bookmarkStart w:id="50" w:name="_Toc225859298"/>
       <w:r>
-        <w:lastRenderedPageBreak/>
         <w:t>Referências</w:t>
       </w:r>
       <w:bookmarkEnd w:id="46"/>
@@ -3550,6 +3799,8 @@
       </w:r>
     </w:p>
     <w:sectPr>
+      <w:footerReference w:type="default" r:id="rId42"/>
+      <w:footerReference w:type="first" r:id="rId43"/>
       <w:pgSz w:w="11906" w:h="16838" w:code="9"/>
       <w:pgMar w:top="1701" w:right="1134" w:bottom="1531" w:left="1701" w:header="720" w:footer="720" w:gutter="0"/>
       <w:cols w:space="720"/>
@@ -3561,7 +3812,7 @@
 </file>
 
 <file path=word/endnotes.xml><?xml version="1.0" encoding="utf-8"?>
-<w:endnotes xmlns:wpc="http://schemas.microsoft.com/office/word/2010/wordprocessingCanvas" xmlns:cx="http://schemas.microsoft.com/office/drawing/2014/chartex" xmlns:cx1="http://schemas.microsoft.com/office/drawing/2015/9/8/chartex" xmlns:cx2="http://schemas.microsoft.com/office/drawing/2015/10/21/chartex" xmlns:cx3="http://schemas.microsoft.com/office/drawing/2016/5/9/chartex" xmlns:cx4="http://schemas.microsoft.com/office/drawing/2016/5/10/chartex" xmlns:cx5="http://schemas.microsoft.com/office/drawing/2016/5/11/chartex" xmlns:cx6="http://schemas.microsoft.com/office/drawing/2016/5/12/chartex" xmlns:cx7="http://schemas.microsoft.com/office/drawing/2016/5/13/chartex" xmlns:cx8="http://schemas.microsoft.com/office/drawing/2016/5/14/chartex" xmlns:mc="http://schemas.openxmlformats.org/markup-compatibility/2006" xmlns:aink="http://schemas.microsoft.com/office/drawing/2016/ink" xmlns:am3d="http://schemas.microsoft.com/office/drawing/2017/model3d" xmlns:o="urn:schemas-microsoft-com:office:office" xmlns:oel="http://schemas.microsoft.com/office/2019/extlst" xmlns:r="http://schemas.openxmlformats.org/officeDocument/2006/relationships" xmlns:m="http://schemas.openxmlformats.org/officeDocument/2006/math" xmlns:v="urn:schemas-microsoft-com:vml" xmlns:wp14="http://schemas.microsoft.com/office/word/2010/wordprocessingDrawing" xmlns:wp="http://schemas.openxmlformats.org/drawingml/2006/wordprocessingDrawing" xmlns:w10="urn:schemas-microsoft-com:office:word" xmlns:w="http://schemas.openxmlformats.org/wordprocessingml/2006/main" xmlns:w14="http://schemas.microsoft.com/office/word/2010/wordml" xmlns:w15="http://schemas.microsoft.com/office/word/2012/wordml" xmlns:w16cex="http://schemas.microsoft.com/office/word/2018/wordml/cex" xmlns:w16cid="http://schemas.microsoft.com/office/word/2016/wordml/cid" xmlns:w16="http://schemas.microsoft.com/office/word/2018/wordml" xmlns:w16sdtdh="http://schemas.microsoft.com/office/word/2020/wordml/sdtdatahash" xmlns:w16se="http://schemas.microsoft.com/office/word/2015/wordml/symex" xmlns:wpg="http://schemas.microsoft.com/office/word/2010/wordprocessingGroup" xmlns:wpi="http://schemas.microsoft.com/office/word/2010/wordprocessingInk" xmlns:wne="http://schemas.microsoft.com/office/word/2006/wordml" xmlns:wps="http://schemas.microsoft.com/office/word/2010/wordprocessingShape" mc:Ignorable="w14 w15 w16se w16cid w16 w16cex w16sdtdh wp14">
+<w:endnotes xmlns:wpc="http://schemas.microsoft.com/office/word/2010/wordprocessingCanvas" xmlns:cx="http://schemas.microsoft.com/office/drawing/2014/chartex" xmlns:cx1="http://schemas.microsoft.com/office/drawing/2015/9/8/chartex" xmlns:cx2="http://schemas.microsoft.com/office/drawing/2015/10/21/chartex" xmlns:cx3="http://schemas.microsoft.com/office/drawing/2016/5/9/chartex" xmlns:cx4="http://schemas.microsoft.com/office/drawing/2016/5/10/chartex" xmlns:cx5="http://schemas.microsoft.com/office/drawing/2016/5/11/chartex" xmlns:cx6="http://schemas.microsoft.com/office/drawing/2016/5/12/chartex" xmlns:cx7="http://schemas.microsoft.com/office/drawing/2016/5/13/chartex" xmlns:cx8="http://schemas.microsoft.com/office/drawing/2016/5/14/chartex" xmlns:mc="http://schemas.openxmlformats.org/markup-compatibility/2006" xmlns:aink="http://schemas.microsoft.com/office/drawing/2016/ink" xmlns:am3d="http://schemas.microsoft.com/office/drawing/2017/model3d" xmlns:o="urn:schemas-microsoft-com:office:office" xmlns:oel="http://schemas.microsoft.com/office/2019/extlst" xmlns:r="http://schemas.openxmlformats.org/officeDocument/2006/relationships" xmlns:m="http://schemas.openxmlformats.org/officeDocument/2006/math" xmlns:v="urn:schemas-microsoft-com:vml" xmlns:wp14="http://schemas.microsoft.com/office/word/2010/wordprocessingDrawing" xmlns:wp="http://schemas.openxmlformats.org/drawingml/2006/wordprocessingDrawing" xmlns:w10="urn:schemas-microsoft-com:office:word" xmlns:w="http://schemas.openxmlformats.org/wordprocessingml/2006/main" xmlns:w14="http://schemas.microsoft.com/office/word/2010/wordml" xmlns:w15="http://schemas.microsoft.com/office/word/2012/wordml" xmlns:w16cex="http://schemas.microsoft.com/office/word/2018/wordml/cex" xmlns:w16cid="http://schemas.microsoft.com/office/word/2016/wordml/cid" xmlns:w16="http://schemas.microsoft.com/office/word/2018/wordml" xmlns:w16du="http://schemas.microsoft.com/office/word/2023/wordml/word16du" xmlns:w16sdtdh="http://schemas.microsoft.com/office/word/2020/wordml/sdtdatahash" xmlns:w16sdtfl="http://schemas.microsoft.com/office/word/2024/wordml/sdtformatlock" xmlns:w16se="http://schemas.microsoft.com/office/word/2015/wordml/symex" xmlns:wpg="http://schemas.microsoft.com/office/word/2010/wordprocessingGroup" xmlns:wpi="http://schemas.microsoft.com/office/word/2010/wordprocessingInk" xmlns:wne="http://schemas.microsoft.com/office/word/2006/wordml" xmlns:wps="http://schemas.microsoft.com/office/word/2010/wordprocessingShape" mc:Ignorable="w14 w15 w16se w16cid w16 w16cex w16sdtdh w16sdtfl w16du wp14">
   <w:endnote w:type="separator" w:id="-1">
     <w:p>
       <w:r>
@@ -3579,8 +3830,1088 @@
 </w:endnotes>
 </file>
 
+<file path=word/footer1.xml><?xml version="1.0" encoding="utf-8"?>
+<w:ftr xmlns:wpc="http://schemas.microsoft.com/office/word/2010/wordprocessingCanvas" xmlns:cx="http://schemas.microsoft.com/office/drawing/2014/chartex" xmlns:cx1="http://schemas.microsoft.com/office/drawing/2015/9/8/chartex" xmlns:cx2="http://schemas.microsoft.com/office/drawing/2015/10/21/chartex" xmlns:cx3="http://schemas.microsoft.com/office/drawing/2016/5/9/chartex" xmlns:cx4="http://schemas.microsoft.com/office/drawing/2016/5/10/chartex" xmlns:cx5="http://schemas.microsoft.com/office/drawing/2016/5/11/chartex" xmlns:cx6="http://schemas.microsoft.com/office/drawing/2016/5/12/chartex" xmlns:cx7="http://schemas.microsoft.com/office/drawing/2016/5/13/chartex" xmlns:cx8="http://schemas.microsoft.com/office/drawing/2016/5/14/chartex" xmlns:mc="http://schemas.openxmlformats.org/markup-compatibility/2006" xmlns:aink="http://schemas.microsoft.com/office/drawing/2016/ink" xmlns:am3d="http://schemas.microsoft.com/office/drawing/2017/model3d" xmlns:o="urn:schemas-microsoft-com:office:office" xmlns:oel="http://schemas.microsoft.com/office/2019/extlst" xmlns:r="http://schemas.openxmlformats.org/officeDocument/2006/relationships" xmlns:m="http://schemas.openxmlformats.org/officeDocument/2006/math" xmlns:v="urn:schemas-microsoft-com:vml" xmlns:wp14="http://schemas.microsoft.com/office/word/2010/wordprocessingDrawing" xmlns:wp="http://schemas.openxmlformats.org/drawingml/2006/wordprocessingDrawing" xmlns:w10="urn:schemas-microsoft-com:office:word" xmlns:w="http://schemas.openxmlformats.org/wordprocessingml/2006/main" xmlns:w14="http://schemas.microsoft.com/office/word/2010/wordml" xmlns:w15="http://schemas.microsoft.com/office/word/2012/wordml" xmlns:w16cex="http://schemas.microsoft.com/office/word/2018/wordml/cex" xmlns:w16cid="http://schemas.microsoft.com/office/word/2016/wordml/cid" xmlns:w16="http://schemas.microsoft.com/office/word/2018/wordml" xmlns:w16du="http://schemas.microsoft.com/office/word/2023/wordml/word16du" xmlns:w16sdtdh="http://schemas.microsoft.com/office/word/2020/wordml/sdtdatahash" xmlns:w16sdtfl="http://schemas.microsoft.com/office/word/2024/wordml/sdtformatlock" xmlns:w16se="http://schemas.microsoft.com/office/word/2015/wordml/symex" xmlns:wpg="http://schemas.microsoft.com/office/word/2010/wordprocessingGroup" xmlns:wpi="http://schemas.microsoft.com/office/word/2010/wordprocessingInk" xmlns:wne="http://schemas.microsoft.com/office/word/2006/wordml" xmlns:wps="http://schemas.microsoft.com/office/word/2010/wordprocessingShape" mc:Ignorable="w14 w15 w16se w16cid w16 w16cex w16sdtdh w16sdtfl w16du wp14">
+  <w:tbl>
+    <w:tblPr>
+      <w:tblW w:w="0" w:type="auto"/>
+      <w:tblLook w:val="06A0" w:firstRow="1" w:lastRow="0" w:firstColumn="1" w:lastColumn="0" w:noHBand="1" w:noVBand="1"/>
+    </w:tblPr>
+    <w:tblGrid>
+      <w:gridCol w:w="3020"/>
+      <w:gridCol w:w="3020"/>
+      <w:gridCol w:w="3020"/>
+    </w:tblGrid>
+    <w:tr>
+      <w:trPr>
+        <w:trHeight w:val="300"/>
+      </w:trPr>
+      <w:tc>
+        <w:tcPr>
+          <w:tcW w:w="3020" w:type="dxa"/>
+        </w:tcPr>
+        <w:p>
+          <w:pPr>
+            <w:pStyle w:val="Cabealho"/>
+            <w:ind w:left="-115"/>
+            <w:jc w:val="left"/>
+          </w:pPr>
+        </w:p>
+      </w:tc>
+      <w:tc>
+        <w:tcPr>
+          <w:tcW w:w="3020" w:type="dxa"/>
+        </w:tcPr>
+        <w:p>
+          <w:pPr>
+            <w:pStyle w:val="Cabealho"/>
+            <w:jc w:val="center"/>
+          </w:pPr>
+        </w:p>
+      </w:tc>
+      <w:tc>
+        <w:tcPr>
+          <w:tcW w:w="3020" w:type="dxa"/>
+        </w:tcPr>
+        <w:p>
+          <w:pPr>
+            <w:pStyle w:val="Cabealho"/>
+            <w:ind w:right="-115"/>
+          </w:pPr>
+        </w:p>
+      </w:tc>
+    </w:tr>
+  </w:tbl>
+  <w:p>
+    <w:pPr>
+      <w:pStyle w:val="Rodap"/>
+    </w:pPr>
+  </w:p>
+</w:ftr>
+</file>
+
+<file path=word/footer10.xml><?xml version="1.0" encoding="utf-8"?>
+<w:ftr xmlns:wpc="http://schemas.microsoft.com/office/word/2010/wordprocessingCanvas" xmlns:cx="http://schemas.microsoft.com/office/drawing/2014/chartex" xmlns:cx1="http://schemas.microsoft.com/office/drawing/2015/9/8/chartex" xmlns:cx2="http://schemas.microsoft.com/office/drawing/2015/10/21/chartex" xmlns:cx3="http://schemas.microsoft.com/office/drawing/2016/5/9/chartex" xmlns:cx4="http://schemas.microsoft.com/office/drawing/2016/5/10/chartex" xmlns:cx5="http://schemas.microsoft.com/office/drawing/2016/5/11/chartex" xmlns:cx6="http://schemas.microsoft.com/office/drawing/2016/5/12/chartex" xmlns:cx7="http://schemas.microsoft.com/office/drawing/2016/5/13/chartex" xmlns:cx8="http://schemas.microsoft.com/office/drawing/2016/5/14/chartex" xmlns:mc="http://schemas.openxmlformats.org/markup-compatibility/2006" xmlns:aink="http://schemas.microsoft.com/office/drawing/2016/ink" xmlns:am3d="http://schemas.microsoft.com/office/drawing/2017/model3d" xmlns:o="urn:schemas-microsoft-com:office:office" xmlns:oel="http://schemas.microsoft.com/office/2019/extlst" xmlns:r="http://schemas.openxmlformats.org/officeDocument/2006/relationships" xmlns:m="http://schemas.openxmlformats.org/officeDocument/2006/math" xmlns:v="urn:schemas-microsoft-com:vml" xmlns:wp14="http://schemas.microsoft.com/office/word/2010/wordprocessingDrawing" xmlns:wp="http://schemas.openxmlformats.org/drawingml/2006/wordprocessingDrawing" xmlns:w10="urn:schemas-microsoft-com:office:word" xmlns:w="http://schemas.openxmlformats.org/wordprocessingml/2006/main" xmlns:w14="http://schemas.microsoft.com/office/word/2010/wordml" xmlns:w15="http://schemas.microsoft.com/office/word/2012/wordml" xmlns:w16cex="http://schemas.microsoft.com/office/word/2018/wordml/cex" xmlns:w16cid="http://schemas.microsoft.com/office/word/2016/wordml/cid" xmlns:w16="http://schemas.microsoft.com/office/word/2018/wordml" xmlns:w16du="http://schemas.microsoft.com/office/word/2023/wordml/word16du" xmlns:w16sdtdh="http://schemas.microsoft.com/office/word/2020/wordml/sdtdatahash" xmlns:w16sdtfl="http://schemas.microsoft.com/office/word/2024/wordml/sdtformatlock" xmlns:w16se="http://schemas.microsoft.com/office/word/2015/wordml/symex" xmlns:wpg="http://schemas.microsoft.com/office/word/2010/wordprocessingGroup" xmlns:wpi="http://schemas.microsoft.com/office/word/2010/wordprocessingInk" xmlns:wne="http://schemas.microsoft.com/office/word/2006/wordml" xmlns:wps="http://schemas.microsoft.com/office/word/2010/wordprocessingShape" mc:Ignorable="w14 w15 w16se w16cid w16 w16cex w16sdtdh w16sdtfl w16du wp14">
+  <w:tbl>
+    <w:tblPr>
+      <w:tblW w:w="0" w:type="auto"/>
+      <w:tblLook w:val="06A0" w:firstRow="1" w:lastRow="0" w:firstColumn="1" w:lastColumn="0" w:noHBand="1" w:noVBand="1"/>
+    </w:tblPr>
+    <w:tblGrid>
+      <w:gridCol w:w="3020"/>
+      <w:gridCol w:w="3020"/>
+      <w:gridCol w:w="3020"/>
+    </w:tblGrid>
+    <w:tr>
+      <w:trPr>
+        <w:trHeight w:val="300"/>
+      </w:trPr>
+      <w:tc>
+        <w:tcPr>
+          <w:tcW w:w="3020" w:type="dxa"/>
+        </w:tcPr>
+        <w:p>
+          <w:pPr>
+            <w:pStyle w:val="Cabealho"/>
+            <w:ind w:left="-115"/>
+            <w:jc w:val="left"/>
+          </w:pPr>
+        </w:p>
+      </w:tc>
+      <w:tc>
+        <w:tcPr>
+          <w:tcW w:w="3020" w:type="dxa"/>
+        </w:tcPr>
+        <w:p>
+          <w:pPr>
+            <w:pStyle w:val="Cabealho"/>
+            <w:jc w:val="center"/>
+          </w:pPr>
+        </w:p>
+      </w:tc>
+      <w:tc>
+        <w:tcPr>
+          <w:tcW w:w="3020" w:type="dxa"/>
+        </w:tcPr>
+        <w:p>
+          <w:pPr>
+            <w:pStyle w:val="Cabealho"/>
+            <w:ind w:right="-115"/>
+          </w:pPr>
+        </w:p>
+      </w:tc>
+    </w:tr>
+  </w:tbl>
+  <w:p>
+    <w:pPr>
+      <w:pStyle w:val="Rodap"/>
+    </w:pPr>
+  </w:p>
+</w:ftr>
+</file>
+
+<file path=word/footer11.xml><?xml version="1.0" encoding="utf-8"?>
+<w:ftr xmlns:wpc="http://schemas.microsoft.com/office/word/2010/wordprocessingCanvas" xmlns:cx="http://schemas.microsoft.com/office/drawing/2014/chartex" xmlns:cx1="http://schemas.microsoft.com/office/drawing/2015/9/8/chartex" xmlns:cx2="http://schemas.microsoft.com/office/drawing/2015/10/21/chartex" xmlns:cx3="http://schemas.microsoft.com/office/drawing/2016/5/9/chartex" xmlns:cx4="http://schemas.microsoft.com/office/drawing/2016/5/10/chartex" xmlns:cx5="http://schemas.microsoft.com/office/drawing/2016/5/11/chartex" xmlns:cx6="http://schemas.microsoft.com/office/drawing/2016/5/12/chartex" xmlns:cx7="http://schemas.microsoft.com/office/drawing/2016/5/13/chartex" xmlns:cx8="http://schemas.microsoft.com/office/drawing/2016/5/14/chartex" xmlns:mc="http://schemas.openxmlformats.org/markup-compatibility/2006" xmlns:aink="http://schemas.microsoft.com/office/drawing/2016/ink" xmlns:am3d="http://schemas.microsoft.com/office/drawing/2017/model3d" xmlns:o="urn:schemas-microsoft-com:office:office" xmlns:oel="http://schemas.microsoft.com/office/2019/extlst" xmlns:r="http://schemas.openxmlformats.org/officeDocument/2006/relationships" xmlns:m="http://schemas.openxmlformats.org/officeDocument/2006/math" xmlns:v="urn:schemas-microsoft-com:vml" xmlns:wp14="http://schemas.microsoft.com/office/word/2010/wordprocessingDrawing" xmlns:wp="http://schemas.openxmlformats.org/drawingml/2006/wordprocessingDrawing" xmlns:w10="urn:schemas-microsoft-com:office:word" xmlns:w="http://schemas.openxmlformats.org/wordprocessingml/2006/main" xmlns:w14="http://schemas.microsoft.com/office/word/2010/wordml" xmlns:w15="http://schemas.microsoft.com/office/word/2012/wordml" xmlns:w16cex="http://schemas.microsoft.com/office/word/2018/wordml/cex" xmlns:w16cid="http://schemas.microsoft.com/office/word/2016/wordml/cid" xmlns:w16="http://schemas.microsoft.com/office/word/2018/wordml" xmlns:w16du="http://schemas.microsoft.com/office/word/2023/wordml/word16du" xmlns:w16sdtdh="http://schemas.microsoft.com/office/word/2020/wordml/sdtdatahash" xmlns:w16sdtfl="http://schemas.microsoft.com/office/word/2024/wordml/sdtformatlock" xmlns:w16se="http://schemas.microsoft.com/office/word/2015/wordml/symex" xmlns:wpg="http://schemas.microsoft.com/office/word/2010/wordprocessingGroup" xmlns:wpi="http://schemas.microsoft.com/office/word/2010/wordprocessingInk" xmlns:wne="http://schemas.microsoft.com/office/word/2006/wordml" xmlns:wps="http://schemas.microsoft.com/office/word/2010/wordprocessingShape" mc:Ignorable="w14 w15 w16se w16cid w16 w16cex w16sdtdh w16sdtfl w16du wp14">
+  <w:tbl>
+    <w:tblPr>
+      <w:tblW w:w="0" w:type="auto"/>
+      <w:tblLook w:val="06A0" w:firstRow="1" w:lastRow="0" w:firstColumn="1" w:lastColumn="0" w:noHBand="1" w:noVBand="1"/>
+    </w:tblPr>
+    <w:tblGrid>
+      <w:gridCol w:w="3020"/>
+      <w:gridCol w:w="3020"/>
+      <w:gridCol w:w="3020"/>
+    </w:tblGrid>
+    <w:tr>
+      <w:trPr>
+        <w:trHeight w:val="300"/>
+      </w:trPr>
+      <w:tc>
+        <w:tcPr>
+          <w:tcW w:w="3020" w:type="dxa"/>
+        </w:tcPr>
+        <w:p>
+          <w:pPr>
+            <w:pStyle w:val="Cabealho"/>
+            <w:ind w:left="-115"/>
+            <w:jc w:val="left"/>
+          </w:pPr>
+        </w:p>
+      </w:tc>
+      <w:tc>
+        <w:tcPr>
+          <w:tcW w:w="3020" w:type="dxa"/>
+        </w:tcPr>
+        <w:p>
+          <w:pPr>
+            <w:pStyle w:val="Cabealho"/>
+            <w:jc w:val="center"/>
+          </w:pPr>
+        </w:p>
+      </w:tc>
+      <w:tc>
+        <w:tcPr>
+          <w:tcW w:w="3020" w:type="dxa"/>
+        </w:tcPr>
+        <w:p>
+          <w:pPr>
+            <w:pStyle w:val="Cabealho"/>
+            <w:ind w:right="-115"/>
+          </w:pPr>
+        </w:p>
+      </w:tc>
+    </w:tr>
+  </w:tbl>
+  <w:p>
+    <w:pPr>
+      <w:pStyle w:val="Rodap"/>
+    </w:pPr>
+  </w:p>
+</w:ftr>
+</file>
+
+<file path=word/footer12.xml><?xml version="1.0" encoding="utf-8"?>
+<w:ftr xmlns:wpc="http://schemas.microsoft.com/office/word/2010/wordprocessingCanvas" xmlns:cx="http://schemas.microsoft.com/office/drawing/2014/chartex" xmlns:cx1="http://schemas.microsoft.com/office/drawing/2015/9/8/chartex" xmlns:cx2="http://schemas.microsoft.com/office/drawing/2015/10/21/chartex" xmlns:cx3="http://schemas.microsoft.com/office/drawing/2016/5/9/chartex" xmlns:cx4="http://schemas.microsoft.com/office/drawing/2016/5/10/chartex" xmlns:cx5="http://schemas.microsoft.com/office/drawing/2016/5/11/chartex" xmlns:cx6="http://schemas.microsoft.com/office/drawing/2016/5/12/chartex" xmlns:cx7="http://schemas.microsoft.com/office/drawing/2016/5/13/chartex" xmlns:cx8="http://schemas.microsoft.com/office/drawing/2016/5/14/chartex" xmlns:mc="http://schemas.openxmlformats.org/markup-compatibility/2006" xmlns:aink="http://schemas.microsoft.com/office/drawing/2016/ink" xmlns:am3d="http://schemas.microsoft.com/office/drawing/2017/model3d" xmlns:o="urn:schemas-microsoft-com:office:office" xmlns:oel="http://schemas.microsoft.com/office/2019/extlst" xmlns:r="http://schemas.openxmlformats.org/officeDocument/2006/relationships" xmlns:m="http://schemas.openxmlformats.org/officeDocument/2006/math" xmlns:v="urn:schemas-microsoft-com:vml" xmlns:wp14="http://schemas.microsoft.com/office/word/2010/wordprocessingDrawing" xmlns:wp="http://schemas.openxmlformats.org/drawingml/2006/wordprocessingDrawing" xmlns:w10="urn:schemas-microsoft-com:office:word" xmlns:w="http://schemas.openxmlformats.org/wordprocessingml/2006/main" xmlns:w14="http://schemas.microsoft.com/office/word/2010/wordml" xmlns:w15="http://schemas.microsoft.com/office/word/2012/wordml" xmlns:w16cex="http://schemas.microsoft.com/office/word/2018/wordml/cex" xmlns:w16cid="http://schemas.microsoft.com/office/word/2016/wordml/cid" xmlns:w16="http://schemas.microsoft.com/office/word/2018/wordml" xmlns:w16du="http://schemas.microsoft.com/office/word/2023/wordml/word16du" xmlns:w16sdtdh="http://schemas.microsoft.com/office/word/2020/wordml/sdtdatahash" xmlns:w16sdtfl="http://schemas.microsoft.com/office/word/2024/wordml/sdtformatlock" xmlns:w16se="http://schemas.microsoft.com/office/word/2015/wordml/symex" xmlns:wpg="http://schemas.microsoft.com/office/word/2010/wordprocessingGroup" xmlns:wpi="http://schemas.microsoft.com/office/word/2010/wordprocessingInk" xmlns:wne="http://schemas.microsoft.com/office/word/2006/wordml" xmlns:wps="http://schemas.microsoft.com/office/word/2010/wordprocessingShape" mc:Ignorable="w14 w15 w16se w16cid w16 w16cex w16sdtdh w16sdtfl w16du wp14">
+  <w:tbl>
+    <w:tblPr>
+      <w:tblW w:w="0" w:type="auto"/>
+      <w:tblLook w:val="06A0" w:firstRow="1" w:lastRow="0" w:firstColumn="1" w:lastColumn="0" w:noHBand="1" w:noVBand="1"/>
+    </w:tblPr>
+    <w:tblGrid>
+      <w:gridCol w:w="3020"/>
+      <w:gridCol w:w="3020"/>
+      <w:gridCol w:w="3020"/>
+    </w:tblGrid>
+    <w:tr>
+      <w:trPr>
+        <w:trHeight w:val="300"/>
+      </w:trPr>
+      <w:tc>
+        <w:tcPr>
+          <w:tcW w:w="3020" w:type="dxa"/>
+        </w:tcPr>
+        <w:p>
+          <w:pPr>
+            <w:pStyle w:val="Cabealho"/>
+            <w:ind w:left="-115"/>
+            <w:jc w:val="left"/>
+          </w:pPr>
+        </w:p>
+      </w:tc>
+      <w:tc>
+        <w:tcPr>
+          <w:tcW w:w="3020" w:type="dxa"/>
+        </w:tcPr>
+        <w:p>
+          <w:pPr>
+            <w:pStyle w:val="Cabealho"/>
+            <w:jc w:val="center"/>
+          </w:pPr>
+        </w:p>
+      </w:tc>
+      <w:tc>
+        <w:tcPr>
+          <w:tcW w:w="3020" w:type="dxa"/>
+        </w:tcPr>
+        <w:p>
+          <w:pPr>
+            <w:pStyle w:val="Cabealho"/>
+            <w:ind w:right="-115"/>
+          </w:pPr>
+        </w:p>
+      </w:tc>
+    </w:tr>
+  </w:tbl>
+  <w:p>
+    <w:pPr>
+      <w:pStyle w:val="Rodap"/>
+    </w:pPr>
+  </w:p>
+</w:ftr>
+</file>
+
+<file path=word/footer13.xml><?xml version="1.0" encoding="utf-8"?>
+<w:ftr xmlns:wpc="http://schemas.microsoft.com/office/word/2010/wordprocessingCanvas" xmlns:cx="http://schemas.microsoft.com/office/drawing/2014/chartex" xmlns:cx1="http://schemas.microsoft.com/office/drawing/2015/9/8/chartex" xmlns:cx2="http://schemas.microsoft.com/office/drawing/2015/10/21/chartex" xmlns:cx3="http://schemas.microsoft.com/office/drawing/2016/5/9/chartex" xmlns:cx4="http://schemas.microsoft.com/office/drawing/2016/5/10/chartex" xmlns:cx5="http://schemas.microsoft.com/office/drawing/2016/5/11/chartex" xmlns:cx6="http://schemas.microsoft.com/office/drawing/2016/5/12/chartex" xmlns:cx7="http://schemas.microsoft.com/office/drawing/2016/5/13/chartex" xmlns:cx8="http://schemas.microsoft.com/office/drawing/2016/5/14/chartex" xmlns:mc="http://schemas.openxmlformats.org/markup-compatibility/2006" xmlns:aink="http://schemas.microsoft.com/office/drawing/2016/ink" xmlns:am3d="http://schemas.microsoft.com/office/drawing/2017/model3d" xmlns:o="urn:schemas-microsoft-com:office:office" xmlns:oel="http://schemas.microsoft.com/office/2019/extlst" xmlns:r="http://schemas.openxmlformats.org/officeDocument/2006/relationships" xmlns:m="http://schemas.openxmlformats.org/officeDocument/2006/math" xmlns:v="urn:schemas-microsoft-com:vml" xmlns:wp14="http://schemas.microsoft.com/office/word/2010/wordprocessingDrawing" xmlns:wp="http://schemas.openxmlformats.org/drawingml/2006/wordprocessingDrawing" xmlns:w10="urn:schemas-microsoft-com:office:word" xmlns:w="http://schemas.openxmlformats.org/wordprocessingml/2006/main" xmlns:w14="http://schemas.microsoft.com/office/word/2010/wordml" xmlns:w15="http://schemas.microsoft.com/office/word/2012/wordml" xmlns:w16cex="http://schemas.microsoft.com/office/word/2018/wordml/cex" xmlns:w16cid="http://schemas.microsoft.com/office/word/2016/wordml/cid" xmlns:w16="http://schemas.microsoft.com/office/word/2018/wordml" xmlns:w16du="http://schemas.microsoft.com/office/word/2023/wordml/word16du" xmlns:w16sdtdh="http://schemas.microsoft.com/office/word/2020/wordml/sdtdatahash" xmlns:w16sdtfl="http://schemas.microsoft.com/office/word/2024/wordml/sdtformatlock" xmlns:w16se="http://schemas.microsoft.com/office/word/2015/wordml/symex" xmlns:wpg="http://schemas.microsoft.com/office/word/2010/wordprocessingGroup" xmlns:wpi="http://schemas.microsoft.com/office/word/2010/wordprocessingInk" xmlns:wne="http://schemas.microsoft.com/office/word/2006/wordml" xmlns:wps="http://schemas.microsoft.com/office/word/2010/wordprocessingShape" mc:Ignorable="w14 w15 w16se w16cid w16 w16cex w16sdtdh w16sdtfl w16du wp14">
+  <w:tbl>
+    <w:tblPr>
+      <w:tblW w:w="0" w:type="auto"/>
+      <w:tblLook w:val="06A0" w:firstRow="1" w:lastRow="0" w:firstColumn="1" w:lastColumn="0" w:noHBand="1" w:noVBand="1"/>
+    </w:tblPr>
+    <w:tblGrid>
+      <w:gridCol w:w="3020"/>
+      <w:gridCol w:w="3020"/>
+      <w:gridCol w:w="3020"/>
+    </w:tblGrid>
+    <w:tr>
+      <w:trPr>
+        <w:trHeight w:val="300"/>
+      </w:trPr>
+      <w:tc>
+        <w:tcPr>
+          <w:tcW w:w="3020" w:type="dxa"/>
+        </w:tcPr>
+        <w:p>
+          <w:pPr>
+            <w:pStyle w:val="Cabealho"/>
+            <w:ind w:left="-115"/>
+            <w:jc w:val="left"/>
+          </w:pPr>
+        </w:p>
+      </w:tc>
+      <w:tc>
+        <w:tcPr>
+          <w:tcW w:w="3020" w:type="dxa"/>
+        </w:tcPr>
+        <w:p>
+          <w:pPr>
+            <w:pStyle w:val="Cabealho"/>
+            <w:jc w:val="center"/>
+          </w:pPr>
+        </w:p>
+      </w:tc>
+      <w:tc>
+        <w:tcPr>
+          <w:tcW w:w="3020" w:type="dxa"/>
+        </w:tcPr>
+        <w:p>
+          <w:pPr>
+            <w:pStyle w:val="Cabealho"/>
+            <w:ind w:right="-115"/>
+          </w:pPr>
+        </w:p>
+      </w:tc>
+    </w:tr>
+  </w:tbl>
+  <w:p>
+    <w:pPr>
+      <w:pStyle w:val="Rodap"/>
+    </w:pPr>
+  </w:p>
+</w:ftr>
+</file>
+
+<file path=word/footer14.xml><?xml version="1.0" encoding="utf-8"?>
+<w:ftr xmlns:wpc="http://schemas.microsoft.com/office/word/2010/wordprocessingCanvas" xmlns:cx="http://schemas.microsoft.com/office/drawing/2014/chartex" xmlns:cx1="http://schemas.microsoft.com/office/drawing/2015/9/8/chartex" xmlns:cx2="http://schemas.microsoft.com/office/drawing/2015/10/21/chartex" xmlns:cx3="http://schemas.microsoft.com/office/drawing/2016/5/9/chartex" xmlns:cx4="http://schemas.microsoft.com/office/drawing/2016/5/10/chartex" xmlns:cx5="http://schemas.microsoft.com/office/drawing/2016/5/11/chartex" xmlns:cx6="http://schemas.microsoft.com/office/drawing/2016/5/12/chartex" xmlns:cx7="http://schemas.microsoft.com/office/drawing/2016/5/13/chartex" xmlns:cx8="http://schemas.microsoft.com/office/drawing/2016/5/14/chartex" xmlns:mc="http://schemas.openxmlformats.org/markup-compatibility/2006" xmlns:aink="http://schemas.microsoft.com/office/drawing/2016/ink" xmlns:am3d="http://schemas.microsoft.com/office/drawing/2017/model3d" xmlns:o="urn:schemas-microsoft-com:office:office" xmlns:oel="http://schemas.microsoft.com/office/2019/extlst" xmlns:r="http://schemas.openxmlformats.org/officeDocument/2006/relationships" xmlns:m="http://schemas.openxmlformats.org/officeDocument/2006/math" xmlns:v="urn:schemas-microsoft-com:vml" xmlns:wp14="http://schemas.microsoft.com/office/word/2010/wordprocessingDrawing" xmlns:wp="http://schemas.openxmlformats.org/drawingml/2006/wordprocessingDrawing" xmlns:w10="urn:schemas-microsoft-com:office:word" xmlns:w="http://schemas.openxmlformats.org/wordprocessingml/2006/main" xmlns:w14="http://schemas.microsoft.com/office/word/2010/wordml" xmlns:w15="http://schemas.microsoft.com/office/word/2012/wordml" xmlns:w16cex="http://schemas.microsoft.com/office/word/2018/wordml/cex" xmlns:w16cid="http://schemas.microsoft.com/office/word/2016/wordml/cid" xmlns:w16="http://schemas.microsoft.com/office/word/2018/wordml" xmlns:w16du="http://schemas.microsoft.com/office/word/2023/wordml/word16du" xmlns:w16sdtdh="http://schemas.microsoft.com/office/word/2020/wordml/sdtdatahash" xmlns:w16sdtfl="http://schemas.microsoft.com/office/word/2024/wordml/sdtformatlock" xmlns:w16se="http://schemas.microsoft.com/office/word/2015/wordml/symex" xmlns:wpg="http://schemas.microsoft.com/office/word/2010/wordprocessingGroup" xmlns:wpi="http://schemas.microsoft.com/office/word/2010/wordprocessingInk" xmlns:wne="http://schemas.microsoft.com/office/word/2006/wordml" xmlns:wps="http://schemas.microsoft.com/office/word/2010/wordprocessingShape" mc:Ignorable="w14 w15 w16se w16cid w16 w16cex w16sdtdh w16sdtfl w16du wp14">
+  <w:tbl>
+    <w:tblPr>
+      <w:tblW w:w="0" w:type="auto"/>
+      <w:tblLook w:val="06A0" w:firstRow="1" w:lastRow="0" w:firstColumn="1" w:lastColumn="0" w:noHBand="1" w:noVBand="1"/>
+    </w:tblPr>
+    <w:tblGrid>
+      <w:gridCol w:w="3020"/>
+      <w:gridCol w:w="3020"/>
+      <w:gridCol w:w="3020"/>
+    </w:tblGrid>
+    <w:tr>
+      <w:trPr>
+        <w:trHeight w:val="300"/>
+      </w:trPr>
+      <w:tc>
+        <w:tcPr>
+          <w:tcW w:w="3020" w:type="dxa"/>
+        </w:tcPr>
+        <w:p>
+          <w:pPr>
+            <w:pStyle w:val="Cabealho"/>
+            <w:ind w:left="-115"/>
+            <w:jc w:val="left"/>
+          </w:pPr>
+        </w:p>
+      </w:tc>
+      <w:tc>
+        <w:tcPr>
+          <w:tcW w:w="3020" w:type="dxa"/>
+        </w:tcPr>
+        <w:p>
+          <w:pPr>
+            <w:pStyle w:val="Cabealho"/>
+            <w:jc w:val="center"/>
+          </w:pPr>
+        </w:p>
+      </w:tc>
+      <w:tc>
+        <w:tcPr>
+          <w:tcW w:w="3020" w:type="dxa"/>
+        </w:tcPr>
+        <w:p>
+          <w:pPr>
+            <w:pStyle w:val="Cabealho"/>
+            <w:ind w:right="-115"/>
+          </w:pPr>
+        </w:p>
+      </w:tc>
+    </w:tr>
+  </w:tbl>
+  <w:p>
+    <w:pPr>
+      <w:pStyle w:val="Rodap"/>
+    </w:pPr>
+  </w:p>
+</w:ftr>
+</file>
+
+<file path=word/footer15.xml><?xml version="1.0" encoding="utf-8"?>
+<w:ftr xmlns:wpc="http://schemas.microsoft.com/office/word/2010/wordprocessingCanvas" xmlns:cx="http://schemas.microsoft.com/office/drawing/2014/chartex" xmlns:cx1="http://schemas.microsoft.com/office/drawing/2015/9/8/chartex" xmlns:cx2="http://schemas.microsoft.com/office/drawing/2015/10/21/chartex" xmlns:cx3="http://schemas.microsoft.com/office/drawing/2016/5/9/chartex" xmlns:cx4="http://schemas.microsoft.com/office/drawing/2016/5/10/chartex" xmlns:cx5="http://schemas.microsoft.com/office/drawing/2016/5/11/chartex" xmlns:cx6="http://schemas.microsoft.com/office/drawing/2016/5/12/chartex" xmlns:cx7="http://schemas.microsoft.com/office/drawing/2016/5/13/chartex" xmlns:cx8="http://schemas.microsoft.com/office/drawing/2016/5/14/chartex" xmlns:mc="http://schemas.openxmlformats.org/markup-compatibility/2006" xmlns:aink="http://schemas.microsoft.com/office/drawing/2016/ink" xmlns:am3d="http://schemas.microsoft.com/office/drawing/2017/model3d" xmlns:o="urn:schemas-microsoft-com:office:office" xmlns:oel="http://schemas.microsoft.com/office/2019/extlst" xmlns:r="http://schemas.openxmlformats.org/officeDocument/2006/relationships" xmlns:m="http://schemas.openxmlformats.org/officeDocument/2006/math" xmlns:v="urn:schemas-microsoft-com:vml" xmlns:wp14="http://schemas.microsoft.com/office/word/2010/wordprocessingDrawing" xmlns:wp="http://schemas.openxmlformats.org/drawingml/2006/wordprocessingDrawing" xmlns:w10="urn:schemas-microsoft-com:office:word" xmlns:w="http://schemas.openxmlformats.org/wordprocessingml/2006/main" xmlns:w14="http://schemas.microsoft.com/office/word/2010/wordml" xmlns:w15="http://schemas.microsoft.com/office/word/2012/wordml" xmlns:w16cex="http://schemas.microsoft.com/office/word/2018/wordml/cex" xmlns:w16cid="http://schemas.microsoft.com/office/word/2016/wordml/cid" xmlns:w16="http://schemas.microsoft.com/office/word/2018/wordml" xmlns:w16du="http://schemas.microsoft.com/office/word/2023/wordml/word16du" xmlns:w16sdtdh="http://schemas.microsoft.com/office/word/2020/wordml/sdtdatahash" xmlns:w16sdtfl="http://schemas.microsoft.com/office/word/2024/wordml/sdtformatlock" xmlns:w16se="http://schemas.microsoft.com/office/word/2015/wordml/symex" xmlns:wpg="http://schemas.microsoft.com/office/word/2010/wordprocessingGroup" xmlns:wpi="http://schemas.microsoft.com/office/word/2010/wordprocessingInk" xmlns:wne="http://schemas.microsoft.com/office/word/2006/wordml" xmlns:wps="http://schemas.microsoft.com/office/word/2010/wordprocessingShape" mc:Ignorable="w14 w15 w16se w16cid w16 w16cex w16sdtdh w16sdtfl w16du wp14">
+  <w:tbl>
+    <w:tblPr>
+      <w:tblW w:w="0" w:type="auto"/>
+      <w:tblLook w:val="06A0" w:firstRow="1" w:lastRow="0" w:firstColumn="1" w:lastColumn="0" w:noHBand="1" w:noVBand="1"/>
+    </w:tblPr>
+    <w:tblGrid>
+      <w:gridCol w:w="3020"/>
+      <w:gridCol w:w="3020"/>
+      <w:gridCol w:w="3020"/>
+    </w:tblGrid>
+    <w:tr>
+      <w:trPr>
+        <w:trHeight w:val="300"/>
+      </w:trPr>
+      <w:tc>
+        <w:tcPr>
+          <w:tcW w:w="3020" w:type="dxa"/>
+        </w:tcPr>
+        <w:p>
+          <w:pPr>
+            <w:pStyle w:val="Cabealho"/>
+            <w:ind w:left="-115"/>
+            <w:jc w:val="left"/>
+          </w:pPr>
+        </w:p>
+      </w:tc>
+      <w:tc>
+        <w:tcPr>
+          <w:tcW w:w="3020" w:type="dxa"/>
+        </w:tcPr>
+        <w:p>
+          <w:pPr>
+            <w:pStyle w:val="Cabealho"/>
+            <w:jc w:val="center"/>
+          </w:pPr>
+        </w:p>
+      </w:tc>
+      <w:tc>
+        <w:tcPr>
+          <w:tcW w:w="3020" w:type="dxa"/>
+        </w:tcPr>
+        <w:p>
+          <w:pPr>
+            <w:pStyle w:val="Cabealho"/>
+            <w:ind w:right="-115"/>
+          </w:pPr>
+        </w:p>
+      </w:tc>
+    </w:tr>
+  </w:tbl>
+  <w:p>
+    <w:pPr>
+      <w:pStyle w:val="Rodap"/>
+    </w:pPr>
+  </w:p>
+</w:ftr>
+</file>
+
+<file path=word/footer16.xml><?xml version="1.0" encoding="utf-8"?>
+<w:ftr xmlns:wpc="http://schemas.microsoft.com/office/word/2010/wordprocessingCanvas" xmlns:cx="http://schemas.microsoft.com/office/drawing/2014/chartex" xmlns:cx1="http://schemas.microsoft.com/office/drawing/2015/9/8/chartex" xmlns:cx2="http://schemas.microsoft.com/office/drawing/2015/10/21/chartex" xmlns:cx3="http://schemas.microsoft.com/office/drawing/2016/5/9/chartex" xmlns:cx4="http://schemas.microsoft.com/office/drawing/2016/5/10/chartex" xmlns:cx5="http://schemas.microsoft.com/office/drawing/2016/5/11/chartex" xmlns:cx6="http://schemas.microsoft.com/office/drawing/2016/5/12/chartex" xmlns:cx7="http://schemas.microsoft.com/office/drawing/2016/5/13/chartex" xmlns:cx8="http://schemas.microsoft.com/office/drawing/2016/5/14/chartex" xmlns:mc="http://schemas.openxmlformats.org/markup-compatibility/2006" xmlns:aink="http://schemas.microsoft.com/office/drawing/2016/ink" xmlns:am3d="http://schemas.microsoft.com/office/drawing/2017/model3d" xmlns:o="urn:schemas-microsoft-com:office:office" xmlns:oel="http://schemas.microsoft.com/office/2019/extlst" xmlns:r="http://schemas.openxmlformats.org/officeDocument/2006/relationships" xmlns:m="http://schemas.openxmlformats.org/officeDocument/2006/math" xmlns:v="urn:schemas-microsoft-com:vml" xmlns:wp14="http://schemas.microsoft.com/office/word/2010/wordprocessingDrawing" xmlns:wp="http://schemas.openxmlformats.org/drawingml/2006/wordprocessingDrawing" xmlns:w10="urn:schemas-microsoft-com:office:word" xmlns:w="http://schemas.openxmlformats.org/wordprocessingml/2006/main" xmlns:w14="http://schemas.microsoft.com/office/word/2010/wordml" xmlns:w15="http://schemas.microsoft.com/office/word/2012/wordml" xmlns:w16cex="http://schemas.microsoft.com/office/word/2018/wordml/cex" xmlns:w16cid="http://schemas.microsoft.com/office/word/2016/wordml/cid" xmlns:w16="http://schemas.microsoft.com/office/word/2018/wordml" xmlns:w16du="http://schemas.microsoft.com/office/word/2023/wordml/word16du" xmlns:w16sdtdh="http://schemas.microsoft.com/office/word/2020/wordml/sdtdatahash" xmlns:w16sdtfl="http://schemas.microsoft.com/office/word/2024/wordml/sdtformatlock" xmlns:w16se="http://schemas.microsoft.com/office/word/2015/wordml/symex" xmlns:wpg="http://schemas.microsoft.com/office/word/2010/wordprocessingGroup" xmlns:wpi="http://schemas.microsoft.com/office/word/2010/wordprocessingInk" xmlns:wne="http://schemas.microsoft.com/office/word/2006/wordml" xmlns:wps="http://schemas.microsoft.com/office/word/2010/wordprocessingShape" mc:Ignorable="w14 w15 w16se w16cid w16 w16cex w16sdtdh w16sdtfl w16du wp14">
+  <w:tbl>
+    <w:tblPr>
+      <w:tblW w:w="0" w:type="auto"/>
+      <w:tblLook w:val="06A0" w:firstRow="1" w:lastRow="0" w:firstColumn="1" w:lastColumn="0" w:noHBand="1" w:noVBand="1"/>
+    </w:tblPr>
+    <w:tblGrid>
+      <w:gridCol w:w="3020"/>
+      <w:gridCol w:w="3020"/>
+      <w:gridCol w:w="3020"/>
+    </w:tblGrid>
+    <w:tr>
+      <w:trPr>
+        <w:trHeight w:val="300"/>
+      </w:trPr>
+      <w:tc>
+        <w:tcPr>
+          <w:tcW w:w="3020" w:type="dxa"/>
+        </w:tcPr>
+        <w:p>
+          <w:pPr>
+            <w:pStyle w:val="Cabealho"/>
+            <w:ind w:left="-115"/>
+            <w:jc w:val="left"/>
+          </w:pPr>
+        </w:p>
+      </w:tc>
+      <w:tc>
+        <w:tcPr>
+          <w:tcW w:w="3020" w:type="dxa"/>
+        </w:tcPr>
+        <w:p>
+          <w:pPr>
+            <w:pStyle w:val="Cabealho"/>
+            <w:jc w:val="center"/>
+          </w:pPr>
+        </w:p>
+      </w:tc>
+      <w:tc>
+        <w:tcPr>
+          <w:tcW w:w="3020" w:type="dxa"/>
+        </w:tcPr>
+        <w:p>
+          <w:pPr>
+            <w:pStyle w:val="Cabealho"/>
+            <w:ind w:right="-115"/>
+          </w:pPr>
+        </w:p>
+      </w:tc>
+    </w:tr>
+  </w:tbl>
+  <w:p>
+    <w:pPr>
+      <w:pStyle w:val="Rodap"/>
+    </w:pPr>
+  </w:p>
+</w:ftr>
+</file>
+
+<file path=word/footer17.xml><?xml version="1.0" encoding="utf-8"?>
+<w:ftr xmlns:wpc="http://schemas.microsoft.com/office/word/2010/wordprocessingCanvas" xmlns:cx="http://schemas.microsoft.com/office/drawing/2014/chartex" xmlns:cx1="http://schemas.microsoft.com/office/drawing/2015/9/8/chartex" xmlns:cx2="http://schemas.microsoft.com/office/drawing/2015/10/21/chartex" xmlns:cx3="http://schemas.microsoft.com/office/drawing/2016/5/9/chartex" xmlns:cx4="http://schemas.microsoft.com/office/drawing/2016/5/10/chartex" xmlns:cx5="http://schemas.microsoft.com/office/drawing/2016/5/11/chartex" xmlns:cx6="http://schemas.microsoft.com/office/drawing/2016/5/12/chartex" xmlns:cx7="http://schemas.microsoft.com/office/drawing/2016/5/13/chartex" xmlns:cx8="http://schemas.microsoft.com/office/drawing/2016/5/14/chartex" xmlns:mc="http://schemas.openxmlformats.org/markup-compatibility/2006" xmlns:aink="http://schemas.microsoft.com/office/drawing/2016/ink" xmlns:am3d="http://schemas.microsoft.com/office/drawing/2017/model3d" xmlns:o="urn:schemas-microsoft-com:office:office" xmlns:oel="http://schemas.microsoft.com/office/2019/extlst" xmlns:r="http://schemas.openxmlformats.org/officeDocument/2006/relationships" xmlns:m="http://schemas.openxmlformats.org/officeDocument/2006/math" xmlns:v="urn:schemas-microsoft-com:vml" xmlns:wp14="http://schemas.microsoft.com/office/word/2010/wordprocessingDrawing" xmlns:wp="http://schemas.openxmlformats.org/drawingml/2006/wordprocessingDrawing" xmlns:w10="urn:schemas-microsoft-com:office:word" xmlns:w="http://schemas.openxmlformats.org/wordprocessingml/2006/main" xmlns:w14="http://schemas.microsoft.com/office/word/2010/wordml" xmlns:w15="http://schemas.microsoft.com/office/word/2012/wordml" xmlns:w16cex="http://schemas.microsoft.com/office/word/2018/wordml/cex" xmlns:w16cid="http://schemas.microsoft.com/office/word/2016/wordml/cid" xmlns:w16="http://schemas.microsoft.com/office/word/2018/wordml" xmlns:w16du="http://schemas.microsoft.com/office/word/2023/wordml/word16du" xmlns:w16sdtdh="http://schemas.microsoft.com/office/word/2020/wordml/sdtdatahash" xmlns:w16sdtfl="http://schemas.microsoft.com/office/word/2024/wordml/sdtformatlock" xmlns:w16se="http://schemas.microsoft.com/office/word/2015/wordml/symex" xmlns:wpg="http://schemas.microsoft.com/office/word/2010/wordprocessingGroup" xmlns:wpi="http://schemas.microsoft.com/office/word/2010/wordprocessingInk" xmlns:wne="http://schemas.microsoft.com/office/word/2006/wordml" xmlns:wps="http://schemas.microsoft.com/office/word/2010/wordprocessingShape" mc:Ignorable="w14 w15 w16se w16cid w16 w16cex w16sdtdh w16sdtfl w16du wp14">
+  <w:tbl>
+    <w:tblPr>
+      <w:tblW w:w="0" w:type="auto"/>
+      <w:tblLook w:val="06A0" w:firstRow="1" w:lastRow="0" w:firstColumn="1" w:lastColumn="0" w:noHBand="1" w:noVBand="1"/>
+    </w:tblPr>
+    <w:tblGrid>
+      <w:gridCol w:w="3020"/>
+      <w:gridCol w:w="3020"/>
+      <w:gridCol w:w="3020"/>
+    </w:tblGrid>
+    <w:tr>
+      <w:trPr>
+        <w:trHeight w:val="300"/>
+      </w:trPr>
+      <w:tc>
+        <w:tcPr>
+          <w:tcW w:w="3020" w:type="dxa"/>
+        </w:tcPr>
+        <w:p>
+          <w:pPr>
+            <w:pStyle w:val="Cabealho"/>
+            <w:ind w:left="-115"/>
+            <w:jc w:val="left"/>
+          </w:pPr>
+        </w:p>
+      </w:tc>
+      <w:tc>
+        <w:tcPr>
+          <w:tcW w:w="3020" w:type="dxa"/>
+        </w:tcPr>
+        <w:p>
+          <w:pPr>
+            <w:pStyle w:val="Cabealho"/>
+            <w:jc w:val="center"/>
+          </w:pPr>
+        </w:p>
+      </w:tc>
+      <w:tc>
+        <w:tcPr>
+          <w:tcW w:w="3020" w:type="dxa"/>
+        </w:tcPr>
+        <w:p>
+          <w:pPr>
+            <w:pStyle w:val="Cabealho"/>
+            <w:ind w:right="-115"/>
+          </w:pPr>
+        </w:p>
+      </w:tc>
+    </w:tr>
+  </w:tbl>
+  <w:p>
+    <w:pPr>
+      <w:pStyle w:val="Rodap"/>
+    </w:pPr>
+  </w:p>
+</w:ftr>
+</file>
+
+<file path=word/footer18.xml><?xml version="1.0" encoding="utf-8"?>
+<w:ftr xmlns:wpc="http://schemas.microsoft.com/office/word/2010/wordprocessingCanvas" xmlns:cx="http://schemas.microsoft.com/office/drawing/2014/chartex" xmlns:cx1="http://schemas.microsoft.com/office/drawing/2015/9/8/chartex" xmlns:cx2="http://schemas.microsoft.com/office/drawing/2015/10/21/chartex" xmlns:cx3="http://schemas.microsoft.com/office/drawing/2016/5/9/chartex" xmlns:cx4="http://schemas.microsoft.com/office/drawing/2016/5/10/chartex" xmlns:cx5="http://schemas.microsoft.com/office/drawing/2016/5/11/chartex" xmlns:cx6="http://schemas.microsoft.com/office/drawing/2016/5/12/chartex" xmlns:cx7="http://schemas.microsoft.com/office/drawing/2016/5/13/chartex" xmlns:cx8="http://schemas.microsoft.com/office/drawing/2016/5/14/chartex" xmlns:mc="http://schemas.openxmlformats.org/markup-compatibility/2006" xmlns:aink="http://schemas.microsoft.com/office/drawing/2016/ink" xmlns:am3d="http://schemas.microsoft.com/office/drawing/2017/model3d" xmlns:o="urn:schemas-microsoft-com:office:office" xmlns:oel="http://schemas.microsoft.com/office/2019/extlst" xmlns:r="http://schemas.openxmlformats.org/officeDocument/2006/relationships" xmlns:m="http://schemas.openxmlformats.org/officeDocument/2006/math" xmlns:v="urn:schemas-microsoft-com:vml" xmlns:wp14="http://schemas.microsoft.com/office/word/2010/wordprocessingDrawing" xmlns:wp="http://schemas.openxmlformats.org/drawingml/2006/wordprocessingDrawing" xmlns:w10="urn:schemas-microsoft-com:office:word" xmlns:w="http://schemas.openxmlformats.org/wordprocessingml/2006/main" xmlns:w14="http://schemas.microsoft.com/office/word/2010/wordml" xmlns:w15="http://schemas.microsoft.com/office/word/2012/wordml" xmlns:w16cex="http://schemas.microsoft.com/office/word/2018/wordml/cex" xmlns:w16cid="http://schemas.microsoft.com/office/word/2016/wordml/cid" xmlns:w16="http://schemas.microsoft.com/office/word/2018/wordml" xmlns:w16du="http://schemas.microsoft.com/office/word/2023/wordml/word16du" xmlns:w16sdtdh="http://schemas.microsoft.com/office/word/2020/wordml/sdtdatahash" xmlns:w16sdtfl="http://schemas.microsoft.com/office/word/2024/wordml/sdtformatlock" xmlns:w16se="http://schemas.microsoft.com/office/word/2015/wordml/symex" xmlns:wpg="http://schemas.microsoft.com/office/word/2010/wordprocessingGroup" xmlns:wpi="http://schemas.microsoft.com/office/word/2010/wordprocessingInk" xmlns:wne="http://schemas.microsoft.com/office/word/2006/wordml" xmlns:wps="http://schemas.microsoft.com/office/word/2010/wordprocessingShape" mc:Ignorable="w14 w15 w16se w16cid w16 w16cex w16sdtdh w16sdtfl w16du wp14">
+  <w:tbl>
+    <w:tblPr>
+      <w:tblW w:w="0" w:type="auto"/>
+      <w:tblLook w:val="06A0" w:firstRow="1" w:lastRow="0" w:firstColumn="1" w:lastColumn="0" w:noHBand="1" w:noVBand="1"/>
+    </w:tblPr>
+    <w:tblGrid>
+      <w:gridCol w:w="3020"/>
+      <w:gridCol w:w="3020"/>
+      <w:gridCol w:w="3020"/>
+    </w:tblGrid>
+    <w:tr>
+      <w:trPr>
+        <w:trHeight w:val="300"/>
+      </w:trPr>
+      <w:tc>
+        <w:tcPr>
+          <w:tcW w:w="3020" w:type="dxa"/>
+        </w:tcPr>
+        <w:p>
+          <w:pPr>
+            <w:pStyle w:val="Cabealho"/>
+            <w:ind w:left="-115"/>
+            <w:jc w:val="left"/>
+          </w:pPr>
+        </w:p>
+      </w:tc>
+      <w:tc>
+        <w:tcPr>
+          <w:tcW w:w="3020" w:type="dxa"/>
+        </w:tcPr>
+        <w:p>
+          <w:pPr>
+            <w:pStyle w:val="Cabealho"/>
+            <w:jc w:val="center"/>
+          </w:pPr>
+        </w:p>
+      </w:tc>
+      <w:tc>
+        <w:tcPr>
+          <w:tcW w:w="3020" w:type="dxa"/>
+        </w:tcPr>
+        <w:p>
+          <w:pPr>
+            <w:pStyle w:val="Cabealho"/>
+            <w:ind w:right="-115"/>
+          </w:pPr>
+        </w:p>
+      </w:tc>
+    </w:tr>
+  </w:tbl>
+  <w:p>
+    <w:pPr>
+      <w:pStyle w:val="Rodap"/>
+    </w:pPr>
+  </w:p>
+</w:ftr>
+</file>
+
+<file path=word/footer2.xml><?xml version="1.0" encoding="utf-8"?>
+<w:ftr xmlns:wpc="http://schemas.microsoft.com/office/word/2010/wordprocessingCanvas" xmlns:cx="http://schemas.microsoft.com/office/drawing/2014/chartex" xmlns:cx1="http://schemas.microsoft.com/office/drawing/2015/9/8/chartex" xmlns:cx2="http://schemas.microsoft.com/office/drawing/2015/10/21/chartex" xmlns:cx3="http://schemas.microsoft.com/office/drawing/2016/5/9/chartex" xmlns:cx4="http://schemas.microsoft.com/office/drawing/2016/5/10/chartex" xmlns:cx5="http://schemas.microsoft.com/office/drawing/2016/5/11/chartex" xmlns:cx6="http://schemas.microsoft.com/office/drawing/2016/5/12/chartex" xmlns:cx7="http://schemas.microsoft.com/office/drawing/2016/5/13/chartex" xmlns:cx8="http://schemas.microsoft.com/office/drawing/2016/5/14/chartex" xmlns:mc="http://schemas.openxmlformats.org/markup-compatibility/2006" xmlns:aink="http://schemas.microsoft.com/office/drawing/2016/ink" xmlns:am3d="http://schemas.microsoft.com/office/drawing/2017/model3d" xmlns:o="urn:schemas-microsoft-com:office:office" xmlns:oel="http://schemas.microsoft.com/office/2019/extlst" xmlns:r="http://schemas.openxmlformats.org/officeDocument/2006/relationships" xmlns:m="http://schemas.openxmlformats.org/officeDocument/2006/math" xmlns:v="urn:schemas-microsoft-com:vml" xmlns:wp14="http://schemas.microsoft.com/office/word/2010/wordprocessingDrawing" xmlns:wp="http://schemas.openxmlformats.org/drawingml/2006/wordprocessingDrawing" xmlns:w10="urn:schemas-microsoft-com:office:word" xmlns:w="http://schemas.openxmlformats.org/wordprocessingml/2006/main" xmlns:w14="http://schemas.microsoft.com/office/word/2010/wordml" xmlns:w15="http://schemas.microsoft.com/office/word/2012/wordml" xmlns:w16cex="http://schemas.microsoft.com/office/word/2018/wordml/cex" xmlns:w16cid="http://schemas.microsoft.com/office/word/2016/wordml/cid" xmlns:w16="http://schemas.microsoft.com/office/word/2018/wordml" xmlns:w16du="http://schemas.microsoft.com/office/word/2023/wordml/word16du" xmlns:w16sdtdh="http://schemas.microsoft.com/office/word/2020/wordml/sdtdatahash" xmlns:w16sdtfl="http://schemas.microsoft.com/office/word/2024/wordml/sdtformatlock" xmlns:w16se="http://schemas.microsoft.com/office/word/2015/wordml/symex" xmlns:wpg="http://schemas.microsoft.com/office/word/2010/wordprocessingGroup" xmlns:wpi="http://schemas.microsoft.com/office/word/2010/wordprocessingInk" xmlns:wne="http://schemas.microsoft.com/office/word/2006/wordml" xmlns:wps="http://schemas.microsoft.com/office/word/2010/wordprocessingShape" mc:Ignorable="w14 w15 w16se w16cid w16 w16cex w16sdtdh w16sdtfl w16du wp14">
+  <w:tbl>
+    <w:tblPr>
+      <w:tblW w:w="0" w:type="auto"/>
+      <w:tblLook w:val="06A0" w:firstRow="1" w:lastRow="0" w:firstColumn="1" w:lastColumn="0" w:noHBand="1" w:noVBand="1"/>
+    </w:tblPr>
+    <w:tblGrid>
+      <w:gridCol w:w="3020"/>
+      <w:gridCol w:w="3020"/>
+      <w:gridCol w:w="3020"/>
+    </w:tblGrid>
+    <w:tr>
+      <w:trPr>
+        <w:trHeight w:val="300"/>
+      </w:trPr>
+      <w:tc>
+        <w:tcPr>
+          <w:tcW w:w="3020" w:type="dxa"/>
+        </w:tcPr>
+        <w:p>
+          <w:pPr>
+            <w:pStyle w:val="Cabealho"/>
+            <w:ind w:left="-115"/>
+            <w:jc w:val="left"/>
+          </w:pPr>
+        </w:p>
+      </w:tc>
+      <w:tc>
+        <w:tcPr>
+          <w:tcW w:w="3020" w:type="dxa"/>
+        </w:tcPr>
+        <w:p>
+          <w:pPr>
+            <w:pStyle w:val="Cabealho"/>
+            <w:jc w:val="center"/>
+          </w:pPr>
+        </w:p>
+      </w:tc>
+      <w:tc>
+        <w:tcPr>
+          <w:tcW w:w="3020" w:type="dxa"/>
+        </w:tcPr>
+        <w:p>
+          <w:pPr>
+            <w:pStyle w:val="Cabealho"/>
+            <w:ind w:right="-115"/>
+          </w:pPr>
+        </w:p>
+      </w:tc>
+    </w:tr>
+  </w:tbl>
+  <w:p>
+    <w:pPr>
+      <w:pStyle w:val="Rodap"/>
+    </w:pPr>
+  </w:p>
+</w:ftr>
+</file>
+
+<file path=word/footer3.xml><?xml version="1.0" encoding="utf-8"?>
+<w:ftr xmlns:wpc="http://schemas.microsoft.com/office/word/2010/wordprocessingCanvas" xmlns:cx="http://schemas.microsoft.com/office/drawing/2014/chartex" xmlns:cx1="http://schemas.microsoft.com/office/drawing/2015/9/8/chartex" xmlns:cx2="http://schemas.microsoft.com/office/drawing/2015/10/21/chartex" xmlns:cx3="http://schemas.microsoft.com/office/drawing/2016/5/9/chartex" xmlns:cx4="http://schemas.microsoft.com/office/drawing/2016/5/10/chartex" xmlns:cx5="http://schemas.microsoft.com/office/drawing/2016/5/11/chartex" xmlns:cx6="http://schemas.microsoft.com/office/drawing/2016/5/12/chartex" xmlns:cx7="http://schemas.microsoft.com/office/drawing/2016/5/13/chartex" xmlns:cx8="http://schemas.microsoft.com/office/drawing/2016/5/14/chartex" xmlns:mc="http://schemas.openxmlformats.org/markup-compatibility/2006" xmlns:aink="http://schemas.microsoft.com/office/drawing/2016/ink" xmlns:am3d="http://schemas.microsoft.com/office/drawing/2017/model3d" xmlns:o="urn:schemas-microsoft-com:office:office" xmlns:oel="http://schemas.microsoft.com/office/2019/extlst" xmlns:r="http://schemas.openxmlformats.org/officeDocument/2006/relationships" xmlns:m="http://schemas.openxmlformats.org/officeDocument/2006/math" xmlns:v="urn:schemas-microsoft-com:vml" xmlns:wp14="http://schemas.microsoft.com/office/word/2010/wordprocessingDrawing" xmlns:wp="http://schemas.openxmlformats.org/drawingml/2006/wordprocessingDrawing" xmlns:w10="urn:schemas-microsoft-com:office:word" xmlns:w="http://schemas.openxmlformats.org/wordprocessingml/2006/main" xmlns:w14="http://schemas.microsoft.com/office/word/2010/wordml" xmlns:w15="http://schemas.microsoft.com/office/word/2012/wordml" xmlns:w16cex="http://schemas.microsoft.com/office/word/2018/wordml/cex" xmlns:w16cid="http://schemas.microsoft.com/office/word/2016/wordml/cid" xmlns:w16="http://schemas.microsoft.com/office/word/2018/wordml" xmlns:w16du="http://schemas.microsoft.com/office/word/2023/wordml/word16du" xmlns:w16sdtdh="http://schemas.microsoft.com/office/word/2020/wordml/sdtdatahash" xmlns:w16sdtfl="http://schemas.microsoft.com/office/word/2024/wordml/sdtformatlock" xmlns:w16se="http://schemas.microsoft.com/office/word/2015/wordml/symex" xmlns:wpg="http://schemas.microsoft.com/office/word/2010/wordprocessingGroup" xmlns:wpi="http://schemas.microsoft.com/office/word/2010/wordprocessingInk" xmlns:wne="http://schemas.microsoft.com/office/word/2006/wordml" xmlns:wps="http://schemas.microsoft.com/office/word/2010/wordprocessingShape" mc:Ignorable="w14 w15 w16se w16cid w16 w16cex w16sdtdh w16sdtfl w16du wp14">
+  <w:tbl>
+    <w:tblPr>
+      <w:tblW w:w="0" w:type="auto"/>
+      <w:tblLook w:val="06A0" w:firstRow="1" w:lastRow="0" w:firstColumn="1" w:lastColumn="0" w:noHBand="1" w:noVBand="1"/>
+    </w:tblPr>
+    <w:tblGrid>
+      <w:gridCol w:w="3020"/>
+      <w:gridCol w:w="3020"/>
+      <w:gridCol w:w="3020"/>
+    </w:tblGrid>
+    <w:tr>
+      <w:trPr>
+        <w:trHeight w:val="300"/>
+      </w:trPr>
+      <w:tc>
+        <w:tcPr>
+          <w:tcW w:w="3020" w:type="dxa"/>
+        </w:tcPr>
+        <w:p>
+          <w:pPr>
+            <w:pStyle w:val="Cabealho"/>
+            <w:ind w:left="-115"/>
+            <w:jc w:val="left"/>
+          </w:pPr>
+        </w:p>
+      </w:tc>
+      <w:tc>
+        <w:tcPr>
+          <w:tcW w:w="3020" w:type="dxa"/>
+        </w:tcPr>
+        <w:p>
+          <w:pPr>
+            <w:pStyle w:val="Cabealho"/>
+            <w:jc w:val="center"/>
+          </w:pPr>
+        </w:p>
+      </w:tc>
+      <w:tc>
+        <w:tcPr>
+          <w:tcW w:w="3020" w:type="dxa"/>
+        </w:tcPr>
+        <w:p>
+          <w:pPr>
+            <w:pStyle w:val="Cabealho"/>
+            <w:ind w:right="-115"/>
+          </w:pPr>
+        </w:p>
+      </w:tc>
+    </w:tr>
+  </w:tbl>
+  <w:p>
+    <w:pPr>
+      <w:pStyle w:val="Rodap"/>
+    </w:pPr>
+  </w:p>
+</w:ftr>
+</file>
+
+<file path=word/footer4.xml><?xml version="1.0" encoding="utf-8"?>
+<w:ftr xmlns:wpc="http://schemas.microsoft.com/office/word/2010/wordprocessingCanvas" xmlns:cx="http://schemas.microsoft.com/office/drawing/2014/chartex" xmlns:cx1="http://schemas.microsoft.com/office/drawing/2015/9/8/chartex" xmlns:cx2="http://schemas.microsoft.com/office/drawing/2015/10/21/chartex" xmlns:cx3="http://schemas.microsoft.com/office/drawing/2016/5/9/chartex" xmlns:cx4="http://schemas.microsoft.com/office/drawing/2016/5/10/chartex" xmlns:cx5="http://schemas.microsoft.com/office/drawing/2016/5/11/chartex" xmlns:cx6="http://schemas.microsoft.com/office/drawing/2016/5/12/chartex" xmlns:cx7="http://schemas.microsoft.com/office/drawing/2016/5/13/chartex" xmlns:cx8="http://schemas.microsoft.com/office/drawing/2016/5/14/chartex" xmlns:mc="http://schemas.openxmlformats.org/markup-compatibility/2006" xmlns:aink="http://schemas.microsoft.com/office/drawing/2016/ink" xmlns:am3d="http://schemas.microsoft.com/office/drawing/2017/model3d" xmlns:o="urn:schemas-microsoft-com:office:office" xmlns:oel="http://schemas.microsoft.com/office/2019/extlst" xmlns:r="http://schemas.openxmlformats.org/officeDocument/2006/relationships" xmlns:m="http://schemas.openxmlformats.org/officeDocument/2006/math" xmlns:v="urn:schemas-microsoft-com:vml" xmlns:wp14="http://schemas.microsoft.com/office/word/2010/wordprocessingDrawing" xmlns:wp="http://schemas.openxmlformats.org/drawingml/2006/wordprocessingDrawing" xmlns:w10="urn:schemas-microsoft-com:office:word" xmlns:w="http://schemas.openxmlformats.org/wordprocessingml/2006/main" xmlns:w14="http://schemas.microsoft.com/office/word/2010/wordml" xmlns:w15="http://schemas.microsoft.com/office/word/2012/wordml" xmlns:w16cex="http://schemas.microsoft.com/office/word/2018/wordml/cex" xmlns:w16cid="http://schemas.microsoft.com/office/word/2016/wordml/cid" xmlns:w16="http://schemas.microsoft.com/office/word/2018/wordml" xmlns:w16du="http://schemas.microsoft.com/office/word/2023/wordml/word16du" xmlns:w16sdtdh="http://schemas.microsoft.com/office/word/2020/wordml/sdtdatahash" xmlns:w16sdtfl="http://schemas.microsoft.com/office/word/2024/wordml/sdtformatlock" xmlns:w16se="http://schemas.microsoft.com/office/word/2015/wordml/symex" xmlns:wpg="http://schemas.microsoft.com/office/word/2010/wordprocessingGroup" xmlns:wpi="http://schemas.microsoft.com/office/word/2010/wordprocessingInk" xmlns:wne="http://schemas.microsoft.com/office/word/2006/wordml" xmlns:wps="http://schemas.microsoft.com/office/word/2010/wordprocessingShape" mc:Ignorable="w14 w15 w16se w16cid w16 w16cex w16sdtdh w16sdtfl w16du wp14">
+  <w:tbl>
+    <w:tblPr>
+      <w:tblW w:w="0" w:type="auto"/>
+      <w:tblLook w:val="06A0" w:firstRow="1" w:lastRow="0" w:firstColumn="1" w:lastColumn="0" w:noHBand="1" w:noVBand="1"/>
+    </w:tblPr>
+    <w:tblGrid>
+      <w:gridCol w:w="3020"/>
+      <w:gridCol w:w="3020"/>
+      <w:gridCol w:w="3020"/>
+    </w:tblGrid>
+    <w:tr>
+      <w:trPr>
+        <w:trHeight w:val="300"/>
+      </w:trPr>
+      <w:tc>
+        <w:tcPr>
+          <w:tcW w:w="3020" w:type="dxa"/>
+        </w:tcPr>
+        <w:p>
+          <w:pPr>
+            <w:pStyle w:val="Cabealho"/>
+            <w:ind w:left="-115"/>
+            <w:jc w:val="left"/>
+          </w:pPr>
+        </w:p>
+      </w:tc>
+      <w:tc>
+        <w:tcPr>
+          <w:tcW w:w="3020" w:type="dxa"/>
+        </w:tcPr>
+        <w:p>
+          <w:pPr>
+            <w:pStyle w:val="Cabealho"/>
+            <w:jc w:val="center"/>
+          </w:pPr>
+        </w:p>
+      </w:tc>
+      <w:tc>
+        <w:tcPr>
+          <w:tcW w:w="3020" w:type="dxa"/>
+        </w:tcPr>
+        <w:p>
+          <w:pPr>
+            <w:pStyle w:val="Cabealho"/>
+            <w:ind w:right="-115"/>
+          </w:pPr>
+        </w:p>
+      </w:tc>
+    </w:tr>
+  </w:tbl>
+  <w:p>
+    <w:pPr>
+      <w:pStyle w:val="Rodap"/>
+    </w:pPr>
+  </w:p>
+</w:ftr>
+</file>
+
+<file path=word/footer5.xml><?xml version="1.0" encoding="utf-8"?>
+<w:ftr xmlns:wpc="http://schemas.microsoft.com/office/word/2010/wordprocessingCanvas" xmlns:cx="http://schemas.microsoft.com/office/drawing/2014/chartex" xmlns:cx1="http://schemas.microsoft.com/office/drawing/2015/9/8/chartex" xmlns:cx2="http://schemas.microsoft.com/office/drawing/2015/10/21/chartex" xmlns:cx3="http://schemas.microsoft.com/office/drawing/2016/5/9/chartex" xmlns:cx4="http://schemas.microsoft.com/office/drawing/2016/5/10/chartex" xmlns:cx5="http://schemas.microsoft.com/office/drawing/2016/5/11/chartex" xmlns:cx6="http://schemas.microsoft.com/office/drawing/2016/5/12/chartex" xmlns:cx7="http://schemas.microsoft.com/office/drawing/2016/5/13/chartex" xmlns:cx8="http://schemas.microsoft.com/office/drawing/2016/5/14/chartex" xmlns:mc="http://schemas.openxmlformats.org/markup-compatibility/2006" xmlns:aink="http://schemas.microsoft.com/office/drawing/2016/ink" xmlns:am3d="http://schemas.microsoft.com/office/drawing/2017/model3d" xmlns:o="urn:schemas-microsoft-com:office:office" xmlns:oel="http://schemas.microsoft.com/office/2019/extlst" xmlns:r="http://schemas.openxmlformats.org/officeDocument/2006/relationships" xmlns:m="http://schemas.openxmlformats.org/officeDocument/2006/math" xmlns:v="urn:schemas-microsoft-com:vml" xmlns:wp14="http://schemas.microsoft.com/office/word/2010/wordprocessingDrawing" xmlns:wp="http://schemas.openxmlformats.org/drawingml/2006/wordprocessingDrawing" xmlns:w10="urn:schemas-microsoft-com:office:word" xmlns:w="http://schemas.openxmlformats.org/wordprocessingml/2006/main" xmlns:w14="http://schemas.microsoft.com/office/word/2010/wordml" xmlns:w15="http://schemas.microsoft.com/office/word/2012/wordml" xmlns:w16cex="http://schemas.microsoft.com/office/word/2018/wordml/cex" xmlns:w16cid="http://schemas.microsoft.com/office/word/2016/wordml/cid" xmlns:w16="http://schemas.microsoft.com/office/word/2018/wordml" xmlns:w16du="http://schemas.microsoft.com/office/word/2023/wordml/word16du" xmlns:w16sdtdh="http://schemas.microsoft.com/office/word/2020/wordml/sdtdatahash" xmlns:w16sdtfl="http://schemas.microsoft.com/office/word/2024/wordml/sdtformatlock" xmlns:w16se="http://schemas.microsoft.com/office/word/2015/wordml/symex" xmlns:wpg="http://schemas.microsoft.com/office/word/2010/wordprocessingGroup" xmlns:wpi="http://schemas.microsoft.com/office/word/2010/wordprocessingInk" xmlns:wne="http://schemas.microsoft.com/office/word/2006/wordml" xmlns:wps="http://schemas.microsoft.com/office/word/2010/wordprocessingShape" mc:Ignorable="w14 w15 w16se w16cid w16 w16cex w16sdtdh w16sdtfl w16du wp14">
+  <w:tbl>
+    <w:tblPr>
+      <w:tblW w:w="0" w:type="auto"/>
+      <w:tblLook w:val="06A0" w:firstRow="1" w:lastRow="0" w:firstColumn="1" w:lastColumn="0" w:noHBand="1" w:noVBand="1"/>
+    </w:tblPr>
+    <w:tblGrid>
+      <w:gridCol w:w="3020"/>
+      <w:gridCol w:w="3020"/>
+      <w:gridCol w:w="3020"/>
+    </w:tblGrid>
+    <w:tr>
+      <w:trPr>
+        <w:trHeight w:val="300"/>
+      </w:trPr>
+      <w:tc>
+        <w:tcPr>
+          <w:tcW w:w="3020" w:type="dxa"/>
+        </w:tcPr>
+        <w:p>
+          <w:pPr>
+            <w:pStyle w:val="Cabealho"/>
+            <w:ind w:left="-115"/>
+            <w:jc w:val="left"/>
+          </w:pPr>
+        </w:p>
+      </w:tc>
+      <w:tc>
+        <w:tcPr>
+          <w:tcW w:w="3020" w:type="dxa"/>
+        </w:tcPr>
+        <w:p>
+          <w:pPr>
+            <w:pStyle w:val="Cabealho"/>
+            <w:jc w:val="center"/>
+          </w:pPr>
+        </w:p>
+      </w:tc>
+      <w:tc>
+        <w:tcPr>
+          <w:tcW w:w="3020" w:type="dxa"/>
+        </w:tcPr>
+        <w:p>
+          <w:pPr>
+            <w:pStyle w:val="Cabealho"/>
+            <w:ind w:right="-115"/>
+          </w:pPr>
+        </w:p>
+      </w:tc>
+    </w:tr>
+  </w:tbl>
+  <w:p>
+    <w:pPr>
+      <w:pStyle w:val="Rodap"/>
+    </w:pPr>
+  </w:p>
+</w:ftr>
+</file>
+
+<file path=word/footer6.xml><?xml version="1.0" encoding="utf-8"?>
+<w:ftr xmlns:wpc="http://schemas.microsoft.com/office/word/2010/wordprocessingCanvas" xmlns:cx="http://schemas.microsoft.com/office/drawing/2014/chartex" xmlns:cx1="http://schemas.microsoft.com/office/drawing/2015/9/8/chartex" xmlns:cx2="http://schemas.microsoft.com/office/drawing/2015/10/21/chartex" xmlns:cx3="http://schemas.microsoft.com/office/drawing/2016/5/9/chartex" xmlns:cx4="http://schemas.microsoft.com/office/drawing/2016/5/10/chartex" xmlns:cx5="http://schemas.microsoft.com/office/drawing/2016/5/11/chartex" xmlns:cx6="http://schemas.microsoft.com/office/drawing/2016/5/12/chartex" xmlns:cx7="http://schemas.microsoft.com/office/drawing/2016/5/13/chartex" xmlns:cx8="http://schemas.microsoft.com/office/drawing/2016/5/14/chartex" xmlns:mc="http://schemas.openxmlformats.org/markup-compatibility/2006" xmlns:aink="http://schemas.microsoft.com/office/drawing/2016/ink" xmlns:am3d="http://schemas.microsoft.com/office/drawing/2017/model3d" xmlns:o="urn:schemas-microsoft-com:office:office" xmlns:oel="http://schemas.microsoft.com/office/2019/extlst" xmlns:r="http://schemas.openxmlformats.org/officeDocument/2006/relationships" xmlns:m="http://schemas.openxmlformats.org/officeDocument/2006/math" xmlns:v="urn:schemas-microsoft-com:vml" xmlns:wp14="http://schemas.microsoft.com/office/word/2010/wordprocessingDrawing" xmlns:wp="http://schemas.openxmlformats.org/drawingml/2006/wordprocessingDrawing" xmlns:w10="urn:schemas-microsoft-com:office:word" xmlns:w="http://schemas.openxmlformats.org/wordprocessingml/2006/main" xmlns:w14="http://schemas.microsoft.com/office/word/2010/wordml" xmlns:w15="http://schemas.microsoft.com/office/word/2012/wordml" xmlns:w16cex="http://schemas.microsoft.com/office/word/2018/wordml/cex" xmlns:w16cid="http://schemas.microsoft.com/office/word/2016/wordml/cid" xmlns:w16="http://schemas.microsoft.com/office/word/2018/wordml" xmlns:w16du="http://schemas.microsoft.com/office/word/2023/wordml/word16du" xmlns:w16sdtdh="http://schemas.microsoft.com/office/word/2020/wordml/sdtdatahash" xmlns:w16sdtfl="http://schemas.microsoft.com/office/word/2024/wordml/sdtformatlock" xmlns:w16se="http://schemas.microsoft.com/office/word/2015/wordml/symex" xmlns:wpg="http://schemas.microsoft.com/office/word/2010/wordprocessingGroup" xmlns:wpi="http://schemas.microsoft.com/office/word/2010/wordprocessingInk" xmlns:wne="http://schemas.microsoft.com/office/word/2006/wordml" xmlns:wps="http://schemas.microsoft.com/office/word/2010/wordprocessingShape" mc:Ignorable="w14 w15 w16se w16cid w16 w16cex w16sdtdh w16sdtfl w16du wp14">
+  <w:tbl>
+    <w:tblPr>
+      <w:tblW w:w="0" w:type="auto"/>
+      <w:tblLook w:val="06A0" w:firstRow="1" w:lastRow="0" w:firstColumn="1" w:lastColumn="0" w:noHBand="1" w:noVBand="1"/>
+    </w:tblPr>
+    <w:tblGrid>
+      <w:gridCol w:w="3020"/>
+      <w:gridCol w:w="3020"/>
+      <w:gridCol w:w="3020"/>
+    </w:tblGrid>
+    <w:tr>
+      <w:trPr>
+        <w:trHeight w:val="300"/>
+      </w:trPr>
+      <w:tc>
+        <w:tcPr>
+          <w:tcW w:w="3020" w:type="dxa"/>
+        </w:tcPr>
+        <w:p>
+          <w:pPr>
+            <w:pStyle w:val="Cabealho"/>
+            <w:ind w:left="-115"/>
+            <w:jc w:val="left"/>
+          </w:pPr>
+        </w:p>
+      </w:tc>
+      <w:tc>
+        <w:tcPr>
+          <w:tcW w:w="3020" w:type="dxa"/>
+        </w:tcPr>
+        <w:p>
+          <w:pPr>
+            <w:pStyle w:val="Cabealho"/>
+            <w:jc w:val="center"/>
+          </w:pPr>
+        </w:p>
+      </w:tc>
+      <w:tc>
+        <w:tcPr>
+          <w:tcW w:w="3020" w:type="dxa"/>
+        </w:tcPr>
+        <w:p>
+          <w:pPr>
+            <w:pStyle w:val="Cabealho"/>
+            <w:ind w:right="-115"/>
+          </w:pPr>
+        </w:p>
+      </w:tc>
+    </w:tr>
+  </w:tbl>
+  <w:p>
+    <w:pPr>
+      <w:pStyle w:val="Rodap"/>
+    </w:pPr>
+  </w:p>
+</w:ftr>
+</file>
+
+<file path=word/footer7.xml><?xml version="1.0" encoding="utf-8"?>
+<w:ftr xmlns:wpc="http://schemas.microsoft.com/office/word/2010/wordprocessingCanvas" xmlns:cx="http://schemas.microsoft.com/office/drawing/2014/chartex" xmlns:cx1="http://schemas.microsoft.com/office/drawing/2015/9/8/chartex" xmlns:cx2="http://schemas.microsoft.com/office/drawing/2015/10/21/chartex" xmlns:cx3="http://schemas.microsoft.com/office/drawing/2016/5/9/chartex" xmlns:cx4="http://schemas.microsoft.com/office/drawing/2016/5/10/chartex" xmlns:cx5="http://schemas.microsoft.com/office/drawing/2016/5/11/chartex" xmlns:cx6="http://schemas.microsoft.com/office/drawing/2016/5/12/chartex" xmlns:cx7="http://schemas.microsoft.com/office/drawing/2016/5/13/chartex" xmlns:cx8="http://schemas.microsoft.com/office/drawing/2016/5/14/chartex" xmlns:mc="http://schemas.openxmlformats.org/markup-compatibility/2006" xmlns:aink="http://schemas.microsoft.com/office/drawing/2016/ink" xmlns:am3d="http://schemas.microsoft.com/office/drawing/2017/model3d" xmlns:o="urn:schemas-microsoft-com:office:office" xmlns:oel="http://schemas.microsoft.com/office/2019/extlst" xmlns:r="http://schemas.openxmlformats.org/officeDocument/2006/relationships" xmlns:m="http://schemas.openxmlformats.org/officeDocument/2006/math" xmlns:v="urn:schemas-microsoft-com:vml" xmlns:wp14="http://schemas.microsoft.com/office/word/2010/wordprocessingDrawing" xmlns:wp="http://schemas.openxmlformats.org/drawingml/2006/wordprocessingDrawing" xmlns:w10="urn:schemas-microsoft-com:office:word" xmlns:w="http://schemas.openxmlformats.org/wordprocessingml/2006/main" xmlns:w14="http://schemas.microsoft.com/office/word/2010/wordml" xmlns:w15="http://schemas.microsoft.com/office/word/2012/wordml" xmlns:w16cex="http://schemas.microsoft.com/office/word/2018/wordml/cex" xmlns:w16cid="http://schemas.microsoft.com/office/word/2016/wordml/cid" xmlns:w16="http://schemas.microsoft.com/office/word/2018/wordml" xmlns:w16du="http://schemas.microsoft.com/office/word/2023/wordml/word16du" xmlns:w16sdtdh="http://schemas.microsoft.com/office/word/2020/wordml/sdtdatahash" xmlns:w16sdtfl="http://schemas.microsoft.com/office/word/2024/wordml/sdtformatlock" xmlns:w16se="http://schemas.microsoft.com/office/word/2015/wordml/symex" xmlns:wpg="http://schemas.microsoft.com/office/word/2010/wordprocessingGroup" xmlns:wpi="http://schemas.microsoft.com/office/word/2010/wordprocessingInk" xmlns:wne="http://schemas.microsoft.com/office/word/2006/wordml" xmlns:wps="http://schemas.microsoft.com/office/word/2010/wordprocessingShape" mc:Ignorable="w14 w15 w16se w16cid w16 w16cex w16sdtdh w16sdtfl w16du wp14">
+  <w:tbl>
+    <w:tblPr>
+      <w:tblW w:w="0" w:type="auto"/>
+      <w:tblLook w:val="06A0" w:firstRow="1" w:lastRow="0" w:firstColumn="1" w:lastColumn="0" w:noHBand="1" w:noVBand="1"/>
+    </w:tblPr>
+    <w:tblGrid>
+      <w:gridCol w:w="3020"/>
+      <w:gridCol w:w="3020"/>
+      <w:gridCol w:w="3020"/>
+    </w:tblGrid>
+    <w:tr>
+      <w:trPr>
+        <w:trHeight w:val="300"/>
+      </w:trPr>
+      <w:tc>
+        <w:tcPr>
+          <w:tcW w:w="3020" w:type="dxa"/>
+        </w:tcPr>
+        <w:p>
+          <w:pPr>
+            <w:pStyle w:val="Cabealho"/>
+            <w:ind w:left="-115"/>
+            <w:jc w:val="left"/>
+          </w:pPr>
+        </w:p>
+      </w:tc>
+      <w:tc>
+        <w:tcPr>
+          <w:tcW w:w="3020" w:type="dxa"/>
+        </w:tcPr>
+        <w:p>
+          <w:pPr>
+            <w:pStyle w:val="Cabealho"/>
+            <w:jc w:val="center"/>
+          </w:pPr>
+        </w:p>
+      </w:tc>
+      <w:tc>
+        <w:tcPr>
+          <w:tcW w:w="3020" w:type="dxa"/>
+        </w:tcPr>
+        <w:p>
+          <w:pPr>
+            <w:pStyle w:val="Cabealho"/>
+            <w:ind w:right="-115"/>
+          </w:pPr>
+        </w:p>
+      </w:tc>
+    </w:tr>
+  </w:tbl>
+  <w:p>
+    <w:pPr>
+      <w:pStyle w:val="Rodap"/>
+    </w:pPr>
+  </w:p>
+</w:ftr>
+</file>
+
+<file path=word/footer8.xml><?xml version="1.0" encoding="utf-8"?>
+<w:ftr xmlns:wpc="http://schemas.microsoft.com/office/word/2010/wordprocessingCanvas" xmlns:cx="http://schemas.microsoft.com/office/drawing/2014/chartex" xmlns:cx1="http://schemas.microsoft.com/office/drawing/2015/9/8/chartex" xmlns:cx2="http://schemas.microsoft.com/office/drawing/2015/10/21/chartex" xmlns:cx3="http://schemas.microsoft.com/office/drawing/2016/5/9/chartex" xmlns:cx4="http://schemas.microsoft.com/office/drawing/2016/5/10/chartex" xmlns:cx5="http://schemas.microsoft.com/office/drawing/2016/5/11/chartex" xmlns:cx6="http://schemas.microsoft.com/office/drawing/2016/5/12/chartex" xmlns:cx7="http://schemas.microsoft.com/office/drawing/2016/5/13/chartex" xmlns:cx8="http://schemas.microsoft.com/office/drawing/2016/5/14/chartex" xmlns:mc="http://schemas.openxmlformats.org/markup-compatibility/2006" xmlns:aink="http://schemas.microsoft.com/office/drawing/2016/ink" xmlns:am3d="http://schemas.microsoft.com/office/drawing/2017/model3d" xmlns:o="urn:schemas-microsoft-com:office:office" xmlns:oel="http://schemas.microsoft.com/office/2019/extlst" xmlns:r="http://schemas.openxmlformats.org/officeDocument/2006/relationships" xmlns:m="http://schemas.openxmlformats.org/officeDocument/2006/math" xmlns:v="urn:schemas-microsoft-com:vml" xmlns:wp14="http://schemas.microsoft.com/office/word/2010/wordprocessingDrawing" xmlns:wp="http://schemas.openxmlformats.org/drawingml/2006/wordprocessingDrawing" xmlns:w10="urn:schemas-microsoft-com:office:word" xmlns:w="http://schemas.openxmlformats.org/wordprocessingml/2006/main" xmlns:w14="http://schemas.microsoft.com/office/word/2010/wordml" xmlns:w15="http://schemas.microsoft.com/office/word/2012/wordml" xmlns:w16cex="http://schemas.microsoft.com/office/word/2018/wordml/cex" xmlns:w16cid="http://schemas.microsoft.com/office/word/2016/wordml/cid" xmlns:w16="http://schemas.microsoft.com/office/word/2018/wordml" xmlns:w16du="http://schemas.microsoft.com/office/word/2023/wordml/word16du" xmlns:w16sdtdh="http://schemas.microsoft.com/office/word/2020/wordml/sdtdatahash" xmlns:w16sdtfl="http://schemas.microsoft.com/office/word/2024/wordml/sdtformatlock" xmlns:w16se="http://schemas.microsoft.com/office/word/2015/wordml/symex" xmlns:wpg="http://schemas.microsoft.com/office/word/2010/wordprocessingGroup" xmlns:wpi="http://schemas.microsoft.com/office/word/2010/wordprocessingInk" xmlns:wne="http://schemas.microsoft.com/office/word/2006/wordml" xmlns:wps="http://schemas.microsoft.com/office/word/2010/wordprocessingShape" mc:Ignorable="w14 w15 w16se w16cid w16 w16cex w16sdtdh w16sdtfl w16du wp14">
+  <w:tbl>
+    <w:tblPr>
+      <w:tblW w:w="0" w:type="auto"/>
+      <w:tblLook w:val="06A0" w:firstRow="1" w:lastRow="0" w:firstColumn="1" w:lastColumn="0" w:noHBand="1" w:noVBand="1"/>
+    </w:tblPr>
+    <w:tblGrid>
+      <w:gridCol w:w="3020"/>
+      <w:gridCol w:w="3020"/>
+      <w:gridCol w:w="3020"/>
+    </w:tblGrid>
+    <w:tr>
+      <w:trPr>
+        <w:trHeight w:val="300"/>
+      </w:trPr>
+      <w:tc>
+        <w:tcPr>
+          <w:tcW w:w="3020" w:type="dxa"/>
+        </w:tcPr>
+        <w:p>
+          <w:pPr>
+            <w:pStyle w:val="Cabealho"/>
+            <w:ind w:left="-115"/>
+            <w:jc w:val="left"/>
+          </w:pPr>
+        </w:p>
+      </w:tc>
+      <w:tc>
+        <w:tcPr>
+          <w:tcW w:w="3020" w:type="dxa"/>
+        </w:tcPr>
+        <w:p>
+          <w:pPr>
+            <w:pStyle w:val="Cabealho"/>
+            <w:jc w:val="center"/>
+          </w:pPr>
+        </w:p>
+      </w:tc>
+      <w:tc>
+        <w:tcPr>
+          <w:tcW w:w="3020" w:type="dxa"/>
+        </w:tcPr>
+        <w:p>
+          <w:pPr>
+            <w:pStyle w:val="Cabealho"/>
+            <w:ind w:right="-115"/>
+          </w:pPr>
+        </w:p>
+      </w:tc>
+    </w:tr>
+  </w:tbl>
+  <w:p>
+    <w:pPr>
+      <w:pStyle w:val="Rodap"/>
+    </w:pPr>
+  </w:p>
+</w:ftr>
+</file>
+
+<file path=word/footer9.xml><?xml version="1.0" encoding="utf-8"?>
+<w:ftr xmlns:wpc="http://schemas.microsoft.com/office/word/2010/wordprocessingCanvas" xmlns:cx="http://schemas.microsoft.com/office/drawing/2014/chartex" xmlns:cx1="http://schemas.microsoft.com/office/drawing/2015/9/8/chartex" xmlns:cx2="http://schemas.microsoft.com/office/drawing/2015/10/21/chartex" xmlns:cx3="http://schemas.microsoft.com/office/drawing/2016/5/9/chartex" xmlns:cx4="http://schemas.microsoft.com/office/drawing/2016/5/10/chartex" xmlns:cx5="http://schemas.microsoft.com/office/drawing/2016/5/11/chartex" xmlns:cx6="http://schemas.microsoft.com/office/drawing/2016/5/12/chartex" xmlns:cx7="http://schemas.microsoft.com/office/drawing/2016/5/13/chartex" xmlns:cx8="http://schemas.microsoft.com/office/drawing/2016/5/14/chartex" xmlns:mc="http://schemas.openxmlformats.org/markup-compatibility/2006" xmlns:aink="http://schemas.microsoft.com/office/drawing/2016/ink" xmlns:am3d="http://schemas.microsoft.com/office/drawing/2017/model3d" xmlns:o="urn:schemas-microsoft-com:office:office" xmlns:oel="http://schemas.microsoft.com/office/2019/extlst" xmlns:r="http://schemas.openxmlformats.org/officeDocument/2006/relationships" xmlns:m="http://schemas.openxmlformats.org/officeDocument/2006/math" xmlns:v="urn:schemas-microsoft-com:vml" xmlns:wp14="http://schemas.microsoft.com/office/word/2010/wordprocessingDrawing" xmlns:wp="http://schemas.openxmlformats.org/drawingml/2006/wordprocessingDrawing" xmlns:w10="urn:schemas-microsoft-com:office:word" xmlns:w="http://schemas.openxmlformats.org/wordprocessingml/2006/main" xmlns:w14="http://schemas.microsoft.com/office/word/2010/wordml" xmlns:w15="http://schemas.microsoft.com/office/word/2012/wordml" xmlns:w16cex="http://schemas.microsoft.com/office/word/2018/wordml/cex" xmlns:w16cid="http://schemas.microsoft.com/office/word/2016/wordml/cid" xmlns:w16="http://schemas.microsoft.com/office/word/2018/wordml" xmlns:w16du="http://schemas.microsoft.com/office/word/2023/wordml/word16du" xmlns:w16sdtdh="http://schemas.microsoft.com/office/word/2020/wordml/sdtdatahash" xmlns:w16sdtfl="http://schemas.microsoft.com/office/word/2024/wordml/sdtformatlock" xmlns:w16se="http://schemas.microsoft.com/office/word/2015/wordml/symex" xmlns:wpg="http://schemas.microsoft.com/office/word/2010/wordprocessingGroup" xmlns:wpi="http://schemas.microsoft.com/office/word/2010/wordprocessingInk" xmlns:wne="http://schemas.microsoft.com/office/word/2006/wordml" xmlns:wps="http://schemas.microsoft.com/office/word/2010/wordprocessingShape" mc:Ignorable="w14 w15 w16se w16cid w16 w16cex w16sdtdh w16sdtfl w16du wp14">
+  <w:tbl>
+    <w:tblPr>
+      <w:tblW w:w="0" w:type="auto"/>
+      <w:tblLook w:val="06A0" w:firstRow="1" w:lastRow="0" w:firstColumn="1" w:lastColumn="0" w:noHBand="1" w:noVBand="1"/>
+    </w:tblPr>
+    <w:tblGrid>
+      <w:gridCol w:w="3020"/>
+      <w:gridCol w:w="3020"/>
+      <w:gridCol w:w="3020"/>
+    </w:tblGrid>
+    <w:tr>
+      <w:trPr>
+        <w:trHeight w:val="300"/>
+      </w:trPr>
+      <w:tc>
+        <w:tcPr>
+          <w:tcW w:w="3020" w:type="dxa"/>
+        </w:tcPr>
+        <w:p>
+          <w:pPr>
+            <w:pStyle w:val="Cabealho"/>
+            <w:ind w:left="-115"/>
+            <w:jc w:val="left"/>
+          </w:pPr>
+        </w:p>
+      </w:tc>
+      <w:tc>
+        <w:tcPr>
+          <w:tcW w:w="3020" w:type="dxa"/>
+        </w:tcPr>
+        <w:p>
+          <w:pPr>
+            <w:pStyle w:val="Cabealho"/>
+            <w:jc w:val="center"/>
+          </w:pPr>
+        </w:p>
+      </w:tc>
+      <w:tc>
+        <w:tcPr>
+          <w:tcW w:w="3020" w:type="dxa"/>
+        </w:tcPr>
+        <w:p>
+          <w:pPr>
+            <w:pStyle w:val="Cabealho"/>
+            <w:ind w:right="-115"/>
+          </w:pPr>
+        </w:p>
+      </w:tc>
+    </w:tr>
+  </w:tbl>
+  <w:p>
+    <w:pPr>
+      <w:pStyle w:val="Rodap"/>
+    </w:pPr>
+  </w:p>
+</w:ftr>
+</file>
+
 <file path=word/footnotes.xml><?xml version="1.0" encoding="utf-8"?>
-<w:footnotes xmlns:wpc="http://schemas.microsoft.com/office/word/2010/wordprocessingCanvas" xmlns:cx="http://schemas.microsoft.com/office/drawing/2014/chartex" xmlns:cx1="http://schemas.microsoft.com/office/drawing/2015/9/8/chartex" xmlns:cx2="http://schemas.microsoft.com/office/drawing/2015/10/21/chartex" xmlns:cx3="http://schemas.microsoft.com/office/drawing/2016/5/9/chartex" xmlns:cx4="http://schemas.microsoft.com/office/drawing/2016/5/10/chartex" xmlns:cx5="http://schemas.microsoft.com/office/drawing/2016/5/11/chartex" xmlns:cx6="http://schemas.microsoft.com/office/drawing/2016/5/12/chartex" xmlns:cx7="http://schemas.microsoft.com/office/drawing/2016/5/13/chartex" xmlns:cx8="http://schemas.microsoft.com/office/drawing/2016/5/14/chartex" xmlns:mc="http://schemas.openxmlformats.org/markup-compatibility/2006" xmlns:aink="http://schemas.microsoft.com/office/drawing/2016/ink" xmlns:am3d="http://schemas.microsoft.com/office/drawing/2017/model3d" xmlns:o="urn:schemas-microsoft-com:office:office" xmlns:oel="http://schemas.microsoft.com/office/2019/extlst" xmlns:r="http://schemas.openxmlformats.org/officeDocument/2006/relationships" xmlns:m="http://schemas.openxmlformats.org/officeDocument/2006/math" xmlns:v="urn:schemas-microsoft-com:vml" xmlns:wp14="http://schemas.microsoft.com/office/word/2010/wordprocessingDrawing" xmlns:wp="http://schemas.openxmlformats.org/drawingml/2006/wordprocessingDrawing" xmlns:w10="urn:schemas-microsoft-com:office:word" xmlns:w="http://schemas.openxmlformats.org/wordprocessingml/2006/main" xmlns:w14="http://schemas.microsoft.com/office/word/2010/wordml" xmlns:w15="http://schemas.microsoft.com/office/word/2012/wordml" xmlns:w16cex="http://schemas.microsoft.com/office/word/2018/wordml/cex" xmlns:w16cid="http://schemas.microsoft.com/office/word/2016/wordml/cid" xmlns:w16="http://schemas.microsoft.com/office/word/2018/wordml" xmlns:w16sdtdh="http://schemas.microsoft.com/office/word/2020/wordml/sdtdatahash" xmlns:w16se="http://schemas.microsoft.com/office/word/2015/wordml/symex" xmlns:wpg="http://schemas.microsoft.com/office/word/2010/wordprocessingGroup" xmlns:wpi="http://schemas.microsoft.com/office/word/2010/wordprocessingInk" xmlns:wne="http://schemas.microsoft.com/office/word/2006/wordml" xmlns:wps="http://schemas.microsoft.com/office/word/2010/wordprocessingShape" mc:Ignorable="w14 w15 w16se w16cid w16 w16cex w16sdtdh wp14">
+<w:footnotes xmlns:wpc="http://schemas.microsoft.com/office/word/2010/wordprocessingCanvas" xmlns:cx="http://schemas.microsoft.com/office/drawing/2014/chartex" xmlns:cx1="http://schemas.microsoft.com/office/drawing/2015/9/8/chartex" xmlns:cx2="http://schemas.microsoft.com/office/drawing/2015/10/21/chartex" xmlns:cx3="http://schemas.microsoft.com/office/drawing/2016/5/9/chartex" xmlns:cx4="http://schemas.microsoft.com/office/drawing/2016/5/10/chartex" xmlns:cx5="http://schemas.microsoft.com/office/drawing/2016/5/11/chartex" xmlns:cx6="http://schemas.microsoft.com/office/drawing/2016/5/12/chartex" xmlns:cx7="http://schemas.microsoft.com/office/drawing/2016/5/13/chartex" xmlns:cx8="http://schemas.microsoft.com/office/drawing/2016/5/14/chartex" xmlns:mc="http://schemas.openxmlformats.org/markup-compatibility/2006" xmlns:aink="http://schemas.microsoft.com/office/drawing/2016/ink" xmlns:am3d="http://schemas.microsoft.com/office/drawing/2017/model3d" xmlns:o="urn:schemas-microsoft-com:office:office" xmlns:oel="http://schemas.microsoft.com/office/2019/extlst" xmlns:r="http://schemas.openxmlformats.org/officeDocument/2006/relationships" xmlns:m="http://schemas.openxmlformats.org/officeDocument/2006/math" xmlns:v="urn:schemas-microsoft-com:vml" xmlns:wp14="http://schemas.microsoft.com/office/word/2010/wordprocessingDrawing" xmlns:wp="http://schemas.openxmlformats.org/drawingml/2006/wordprocessingDrawing" xmlns:w10="urn:schemas-microsoft-com:office:word" xmlns:w="http://schemas.openxmlformats.org/wordprocessingml/2006/main" xmlns:w14="http://schemas.microsoft.com/office/word/2010/wordml" xmlns:w15="http://schemas.microsoft.com/office/word/2012/wordml" xmlns:w16cex="http://schemas.microsoft.com/office/word/2018/wordml/cex" xmlns:w16cid="http://schemas.microsoft.com/office/word/2016/wordml/cid" xmlns:w16="http://schemas.microsoft.com/office/word/2018/wordml" xmlns:w16du="http://schemas.microsoft.com/office/word/2023/wordml/word16du" xmlns:w16sdtdh="http://schemas.microsoft.com/office/word/2020/wordml/sdtdatahash" xmlns:w16sdtfl="http://schemas.microsoft.com/office/word/2024/wordml/sdtformatlock" xmlns:w16se="http://schemas.microsoft.com/office/word/2015/wordml/symex" xmlns:wpg="http://schemas.microsoft.com/office/word/2010/wordprocessingGroup" xmlns:wpi="http://schemas.microsoft.com/office/word/2010/wordprocessingInk" xmlns:wne="http://schemas.microsoft.com/office/word/2006/wordml" xmlns:wps="http://schemas.microsoft.com/office/word/2010/wordprocessingShape" mc:Ignorable="w14 w15 w16se w16cid w16 w16cex w16sdtdh w16sdtfl w16du wp14">
   <w:footnote w:type="separator" w:id="-1">
     <w:p>
       <w:r>
@@ -3599,7 +4930,7 @@
 </file>
 
 <file path=word/header1.xml><?xml version="1.0" encoding="utf-8"?>
-<w:hdr xmlns:wpc="http://schemas.microsoft.com/office/word/2010/wordprocessingCanvas" xmlns:cx="http://schemas.microsoft.com/office/drawing/2014/chartex" xmlns:cx1="http://schemas.microsoft.com/office/drawing/2015/9/8/chartex" xmlns:cx2="http://schemas.microsoft.com/office/drawing/2015/10/21/chartex" xmlns:cx3="http://schemas.microsoft.com/office/drawing/2016/5/9/chartex" xmlns:cx4="http://schemas.microsoft.com/office/drawing/2016/5/10/chartex" xmlns:cx5="http://schemas.microsoft.com/office/drawing/2016/5/11/chartex" xmlns:cx6="http://schemas.microsoft.com/office/drawing/2016/5/12/chartex" xmlns:cx7="http://schemas.microsoft.com/office/drawing/2016/5/13/chartex" xmlns:cx8="http://schemas.microsoft.com/office/drawing/2016/5/14/chartex" xmlns:mc="http://schemas.openxmlformats.org/markup-compatibility/2006" xmlns:aink="http://schemas.microsoft.com/office/drawing/2016/ink" xmlns:am3d="http://schemas.microsoft.com/office/drawing/2017/model3d" xmlns:o="urn:schemas-microsoft-com:office:office" xmlns:oel="http://schemas.microsoft.com/office/2019/extlst" xmlns:r="http://schemas.openxmlformats.org/officeDocument/2006/relationships" xmlns:m="http://schemas.openxmlformats.org/officeDocument/2006/math" xmlns:v="urn:schemas-microsoft-com:vml" xmlns:wp14="http://schemas.microsoft.com/office/word/2010/wordprocessingDrawing" xmlns:wp="http://schemas.openxmlformats.org/drawingml/2006/wordprocessingDrawing" xmlns:w10="urn:schemas-microsoft-com:office:word" xmlns:w="http://schemas.openxmlformats.org/wordprocessingml/2006/main" xmlns:w14="http://schemas.microsoft.com/office/word/2010/wordml" xmlns:w15="http://schemas.microsoft.com/office/word/2012/wordml" xmlns:w16cex="http://schemas.microsoft.com/office/word/2018/wordml/cex" xmlns:w16cid="http://schemas.microsoft.com/office/word/2016/wordml/cid" xmlns:w16="http://schemas.microsoft.com/office/word/2018/wordml" xmlns:w16sdtdh="http://schemas.microsoft.com/office/word/2020/wordml/sdtdatahash" xmlns:w16se="http://schemas.microsoft.com/office/word/2015/wordml/symex" xmlns:wpg="http://schemas.microsoft.com/office/word/2010/wordprocessingGroup" xmlns:wpi="http://schemas.microsoft.com/office/word/2010/wordprocessingInk" xmlns:wne="http://schemas.microsoft.com/office/word/2006/wordml" xmlns:wps="http://schemas.microsoft.com/office/word/2010/wordprocessingShape" mc:Ignorable="w14 w15 w16se w16cid w16 w16cex w16sdtdh wp14">
+<w:hdr xmlns:wpc="http://schemas.microsoft.com/office/word/2010/wordprocessingCanvas" xmlns:cx="http://schemas.microsoft.com/office/drawing/2014/chartex" xmlns:cx1="http://schemas.microsoft.com/office/drawing/2015/9/8/chartex" xmlns:cx2="http://schemas.microsoft.com/office/drawing/2015/10/21/chartex" xmlns:cx3="http://schemas.microsoft.com/office/drawing/2016/5/9/chartex" xmlns:cx4="http://schemas.microsoft.com/office/drawing/2016/5/10/chartex" xmlns:cx5="http://schemas.microsoft.com/office/drawing/2016/5/11/chartex" xmlns:cx6="http://schemas.microsoft.com/office/drawing/2016/5/12/chartex" xmlns:cx7="http://schemas.microsoft.com/office/drawing/2016/5/13/chartex" xmlns:cx8="http://schemas.microsoft.com/office/drawing/2016/5/14/chartex" xmlns:mc="http://schemas.openxmlformats.org/markup-compatibility/2006" xmlns:aink="http://schemas.microsoft.com/office/drawing/2016/ink" xmlns:am3d="http://schemas.microsoft.com/office/drawing/2017/model3d" xmlns:o="urn:schemas-microsoft-com:office:office" xmlns:oel="http://schemas.microsoft.com/office/2019/extlst" xmlns:r="http://schemas.openxmlformats.org/officeDocument/2006/relationships" xmlns:m="http://schemas.openxmlformats.org/officeDocument/2006/math" xmlns:v="urn:schemas-microsoft-com:vml" xmlns:wp14="http://schemas.microsoft.com/office/word/2010/wordprocessingDrawing" xmlns:wp="http://schemas.openxmlformats.org/drawingml/2006/wordprocessingDrawing" xmlns:w10="urn:schemas-microsoft-com:office:word" xmlns:w="http://schemas.openxmlformats.org/wordprocessingml/2006/main" xmlns:w14="http://schemas.microsoft.com/office/word/2010/wordml" xmlns:w15="http://schemas.microsoft.com/office/word/2012/wordml" xmlns:w16cex="http://schemas.microsoft.com/office/word/2018/wordml/cex" xmlns:w16cid="http://schemas.microsoft.com/office/word/2016/wordml/cid" xmlns:w16="http://schemas.microsoft.com/office/word/2018/wordml" xmlns:w16du="http://schemas.microsoft.com/office/word/2023/wordml/word16du" xmlns:w16sdtdh="http://schemas.microsoft.com/office/word/2020/wordml/sdtdatahash" xmlns:w16sdtfl="http://schemas.microsoft.com/office/word/2024/wordml/sdtformatlock" xmlns:w16se="http://schemas.microsoft.com/office/word/2015/wordml/symex" xmlns:wpg="http://schemas.microsoft.com/office/word/2010/wordprocessingGroup" xmlns:wpi="http://schemas.microsoft.com/office/word/2010/wordprocessingInk" xmlns:wne="http://schemas.microsoft.com/office/word/2006/wordml" xmlns:wps="http://schemas.microsoft.com/office/word/2010/wordprocessingShape" mc:Ignorable="w14 w15 w16se w16cid w16 w16cex w16sdtdh w16sdtfl w16du wp14">
   <w:p>
     <w:pPr>
       <w:pStyle w:val="Cabealho"/>
@@ -3650,7 +4981,33 @@
 </file>
 
 <file path=word/header10.xml><?xml version="1.0" encoding="utf-8"?>
-<w:hdr xmlns:wpc="http://schemas.microsoft.com/office/word/2010/wordprocessingCanvas" xmlns:cx="http://schemas.microsoft.com/office/drawing/2014/chartex" xmlns:cx1="http://schemas.microsoft.com/office/drawing/2015/9/8/chartex" xmlns:cx2="http://schemas.microsoft.com/office/drawing/2015/10/21/chartex" xmlns:cx3="http://schemas.microsoft.com/office/drawing/2016/5/9/chartex" xmlns:cx4="http://schemas.microsoft.com/office/drawing/2016/5/10/chartex" xmlns:cx5="http://schemas.microsoft.com/office/drawing/2016/5/11/chartex" xmlns:cx6="http://schemas.microsoft.com/office/drawing/2016/5/12/chartex" xmlns:cx7="http://schemas.microsoft.com/office/drawing/2016/5/13/chartex" xmlns:cx8="http://schemas.microsoft.com/office/drawing/2016/5/14/chartex" xmlns:mc="http://schemas.openxmlformats.org/markup-compatibility/2006" xmlns:aink="http://schemas.microsoft.com/office/drawing/2016/ink" xmlns:am3d="http://schemas.microsoft.com/office/drawing/2017/model3d" xmlns:o="urn:schemas-microsoft-com:office:office" xmlns:oel="http://schemas.microsoft.com/office/2019/extlst" xmlns:r="http://schemas.openxmlformats.org/officeDocument/2006/relationships" xmlns:m="http://schemas.openxmlformats.org/officeDocument/2006/math" xmlns:v="urn:schemas-microsoft-com:vml" xmlns:wp14="http://schemas.microsoft.com/office/word/2010/wordprocessingDrawing" xmlns:wp="http://schemas.openxmlformats.org/drawingml/2006/wordprocessingDrawing" xmlns:w10="urn:schemas-microsoft-com:office:word" xmlns:w="http://schemas.openxmlformats.org/wordprocessingml/2006/main" xmlns:w14="http://schemas.microsoft.com/office/word/2010/wordml" xmlns:w15="http://schemas.microsoft.com/office/word/2012/wordml" xmlns:w16cex="http://schemas.microsoft.com/office/word/2018/wordml/cex" xmlns:w16cid="http://schemas.microsoft.com/office/word/2016/wordml/cid" xmlns:w16="http://schemas.microsoft.com/office/word/2018/wordml" xmlns:w16sdtdh="http://schemas.microsoft.com/office/word/2020/wordml/sdtdatahash" xmlns:w16se="http://schemas.microsoft.com/office/word/2015/wordml/symex" xmlns:wpg="http://schemas.microsoft.com/office/word/2010/wordprocessingGroup" xmlns:wpi="http://schemas.microsoft.com/office/word/2010/wordprocessingInk" xmlns:wne="http://schemas.microsoft.com/office/word/2006/wordml" xmlns:wps="http://schemas.microsoft.com/office/word/2010/wordprocessingShape" mc:Ignorable="w14 w15 w16se w16cid w16 w16cex w16sdtdh wp14">
+<w:hdr xmlns:wpc="http://schemas.microsoft.com/office/word/2010/wordprocessingCanvas" xmlns:cx="http://schemas.microsoft.com/office/drawing/2014/chartex" xmlns:cx1="http://schemas.microsoft.com/office/drawing/2015/9/8/chartex" xmlns:cx2="http://schemas.microsoft.com/office/drawing/2015/10/21/chartex" xmlns:cx3="http://schemas.microsoft.com/office/drawing/2016/5/9/chartex" xmlns:cx4="http://schemas.microsoft.com/office/drawing/2016/5/10/chartex" xmlns:cx5="http://schemas.microsoft.com/office/drawing/2016/5/11/chartex" xmlns:cx6="http://schemas.microsoft.com/office/drawing/2016/5/12/chartex" xmlns:cx7="http://schemas.microsoft.com/office/drawing/2016/5/13/chartex" xmlns:cx8="http://schemas.microsoft.com/office/drawing/2016/5/14/chartex" xmlns:mc="http://schemas.openxmlformats.org/markup-compatibility/2006" xmlns:aink="http://schemas.microsoft.com/office/drawing/2016/ink" xmlns:am3d="http://schemas.microsoft.com/office/drawing/2017/model3d" xmlns:o="urn:schemas-microsoft-com:office:office" xmlns:oel="http://schemas.microsoft.com/office/2019/extlst" xmlns:r="http://schemas.openxmlformats.org/officeDocument/2006/relationships" xmlns:m="http://schemas.openxmlformats.org/officeDocument/2006/math" xmlns:v="urn:schemas-microsoft-com:vml" xmlns:wp14="http://schemas.microsoft.com/office/word/2010/wordprocessingDrawing" xmlns:wp="http://schemas.openxmlformats.org/drawingml/2006/wordprocessingDrawing" xmlns:w10="urn:schemas-microsoft-com:office:word" xmlns:w="http://schemas.openxmlformats.org/wordprocessingml/2006/main" xmlns:w14="http://schemas.microsoft.com/office/word/2010/wordml" xmlns:w15="http://schemas.microsoft.com/office/word/2012/wordml" xmlns:w16cex="http://schemas.microsoft.com/office/word/2018/wordml/cex" xmlns:w16cid="http://schemas.microsoft.com/office/word/2016/wordml/cid" xmlns:w16="http://schemas.microsoft.com/office/word/2018/wordml" xmlns:w16du="http://schemas.microsoft.com/office/word/2023/wordml/word16du" xmlns:w16sdtdh="http://schemas.microsoft.com/office/word/2020/wordml/sdtdatahash" xmlns:w16sdtfl="http://schemas.microsoft.com/office/word/2024/wordml/sdtformatlock" xmlns:w16se="http://schemas.microsoft.com/office/word/2015/wordml/symex" xmlns:wpg="http://schemas.microsoft.com/office/word/2010/wordprocessingGroup" xmlns:wpi="http://schemas.microsoft.com/office/word/2010/wordprocessingInk" xmlns:wne="http://schemas.microsoft.com/office/word/2006/wordml" xmlns:wps="http://schemas.microsoft.com/office/word/2010/wordprocessingShape" mc:Ignorable="w14 w15 w16se w16cid w16 w16cex w16sdtdh w16sdtfl w16du wp14">
+  <w:p>
+    <w:pPr>
+      <w:pStyle w:val="Cabealho"/>
+    </w:pPr>
+    <w:r>
+      <w:t>v</w:t>
+    </w:r>
+  </w:p>
+</w:hdr>
+</file>
+
+<file path=word/header11.xml><?xml version="1.0" encoding="utf-8"?>
+<w:hdr xmlns:wpc="http://schemas.microsoft.com/office/word/2010/wordprocessingCanvas" xmlns:cx="http://schemas.microsoft.com/office/drawing/2014/chartex" xmlns:cx1="http://schemas.microsoft.com/office/drawing/2015/9/8/chartex" xmlns:cx2="http://schemas.microsoft.com/office/drawing/2015/10/21/chartex" xmlns:cx3="http://schemas.microsoft.com/office/drawing/2016/5/9/chartex" xmlns:cx4="http://schemas.microsoft.com/office/drawing/2016/5/10/chartex" xmlns:cx5="http://schemas.microsoft.com/office/drawing/2016/5/11/chartex" xmlns:cx6="http://schemas.microsoft.com/office/drawing/2016/5/12/chartex" xmlns:cx7="http://schemas.microsoft.com/office/drawing/2016/5/13/chartex" xmlns:cx8="http://schemas.microsoft.com/office/drawing/2016/5/14/chartex" xmlns:mc="http://schemas.openxmlformats.org/markup-compatibility/2006" xmlns:aink="http://schemas.microsoft.com/office/drawing/2016/ink" xmlns:am3d="http://schemas.microsoft.com/office/drawing/2017/model3d" xmlns:o="urn:schemas-microsoft-com:office:office" xmlns:oel="http://schemas.microsoft.com/office/2019/extlst" xmlns:r="http://schemas.openxmlformats.org/officeDocument/2006/relationships" xmlns:m="http://schemas.openxmlformats.org/officeDocument/2006/math" xmlns:v="urn:schemas-microsoft-com:vml" xmlns:wp14="http://schemas.microsoft.com/office/word/2010/wordprocessingDrawing" xmlns:wp="http://schemas.openxmlformats.org/drawingml/2006/wordprocessingDrawing" xmlns:w10="urn:schemas-microsoft-com:office:word" xmlns:w="http://schemas.openxmlformats.org/wordprocessingml/2006/main" xmlns:w14="http://schemas.microsoft.com/office/word/2010/wordml" xmlns:w15="http://schemas.microsoft.com/office/word/2012/wordml" xmlns:w16cex="http://schemas.microsoft.com/office/word/2018/wordml/cex" xmlns:w16cid="http://schemas.microsoft.com/office/word/2016/wordml/cid" xmlns:w16="http://schemas.microsoft.com/office/word/2018/wordml" xmlns:w16du="http://schemas.microsoft.com/office/word/2023/wordml/word16du" xmlns:w16sdtdh="http://schemas.microsoft.com/office/word/2020/wordml/sdtdatahash" xmlns:w16sdtfl="http://schemas.microsoft.com/office/word/2024/wordml/sdtformatlock" xmlns:w16se="http://schemas.microsoft.com/office/word/2015/wordml/symex" xmlns:wpg="http://schemas.microsoft.com/office/word/2010/wordprocessingGroup" xmlns:wpi="http://schemas.microsoft.com/office/word/2010/wordprocessingInk" xmlns:wne="http://schemas.microsoft.com/office/word/2006/wordml" xmlns:wps="http://schemas.microsoft.com/office/word/2010/wordprocessingShape" mc:Ignorable="w14 w15 w16se w16cid w16 w16cex w16sdtdh w16sdtfl w16du wp14">
+  <w:p>
+    <w:pPr>
+      <w:pStyle w:val="Cabealho"/>
+    </w:pPr>
+    <w:r>
+      <w:t>vi</w:t>
+    </w:r>
+  </w:p>
+</w:hdr>
+</file>
+
+<file path=word/header12.xml><?xml version="1.0" encoding="utf-8"?>
+<w:hdr xmlns:wpc="http://schemas.microsoft.com/office/word/2010/wordprocessingCanvas" xmlns:cx="http://schemas.microsoft.com/office/drawing/2014/chartex" xmlns:cx1="http://schemas.microsoft.com/office/drawing/2015/9/8/chartex" xmlns:cx2="http://schemas.microsoft.com/office/drawing/2015/10/21/chartex" xmlns:cx3="http://schemas.microsoft.com/office/drawing/2016/5/9/chartex" xmlns:cx4="http://schemas.microsoft.com/office/drawing/2016/5/10/chartex" xmlns:cx5="http://schemas.microsoft.com/office/drawing/2016/5/11/chartex" xmlns:cx6="http://schemas.microsoft.com/office/drawing/2016/5/12/chartex" xmlns:cx7="http://schemas.microsoft.com/office/drawing/2016/5/13/chartex" xmlns:cx8="http://schemas.microsoft.com/office/drawing/2016/5/14/chartex" xmlns:mc="http://schemas.openxmlformats.org/markup-compatibility/2006" xmlns:aink="http://schemas.microsoft.com/office/drawing/2016/ink" xmlns:am3d="http://schemas.microsoft.com/office/drawing/2017/model3d" xmlns:o="urn:schemas-microsoft-com:office:office" xmlns:oel="http://schemas.microsoft.com/office/2019/extlst" xmlns:r="http://schemas.openxmlformats.org/officeDocument/2006/relationships" xmlns:m="http://schemas.openxmlformats.org/officeDocument/2006/math" xmlns:v="urn:schemas-microsoft-com:vml" xmlns:wp14="http://schemas.microsoft.com/office/word/2010/wordprocessingDrawing" xmlns:wp="http://schemas.openxmlformats.org/drawingml/2006/wordprocessingDrawing" xmlns:w10="urn:schemas-microsoft-com:office:word" xmlns:w="http://schemas.openxmlformats.org/wordprocessingml/2006/main" xmlns:w14="http://schemas.microsoft.com/office/word/2010/wordml" xmlns:w15="http://schemas.microsoft.com/office/word/2012/wordml" xmlns:w16cex="http://schemas.microsoft.com/office/word/2018/wordml/cex" xmlns:w16cid="http://schemas.microsoft.com/office/word/2016/wordml/cid" xmlns:w16="http://schemas.microsoft.com/office/word/2018/wordml" xmlns:w16du="http://schemas.microsoft.com/office/word/2023/wordml/word16du" xmlns:w16sdtdh="http://schemas.microsoft.com/office/word/2020/wordml/sdtdatahash" xmlns:w16sdtfl="http://schemas.microsoft.com/office/word/2024/wordml/sdtformatlock" xmlns:w16se="http://schemas.microsoft.com/office/word/2015/wordml/symex" xmlns:wpg="http://schemas.microsoft.com/office/word/2010/wordprocessingGroup" xmlns:wpi="http://schemas.microsoft.com/office/word/2010/wordprocessingInk" xmlns:wne="http://schemas.microsoft.com/office/word/2006/wordml" xmlns:wps="http://schemas.microsoft.com/office/word/2010/wordprocessingShape" mc:Ignorable="w14 w15 w16se w16cid w16 w16cex w16sdtdh w16sdtfl w16du wp14">
   <w:p>
     <w:pPr>
       <w:pStyle w:val="Cabealho"/>
@@ -3659,14 +5016,12 @@
         <w:rStyle w:val="Nmerodepgina"/>
       </w:rPr>
     </w:pPr>
-    <w:proofErr w:type="spellStart"/>
     <w:r>
       <w:rPr>
         <w:rStyle w:val="Nmerodepgina"/>
       </w:rPr>
       <w:t>viii</w:t>
     </w:r>
-    <w:proofErr w:type="spellEnd"/>
   </w:p>
   <w:p>
     <w:pPr>
@@ -3692,23 +5047,21 @@
 </w:hdr>
 </file>
 
-<file path=word/header11.xml><?xml version="1.0" encoding="utf-8"?>
-<w:hdr xmlns:wpc="http://schemas.microsoft.com/office/word/2010/wordprocessingCanvas" xmlns:cx="http://schemas.microsoft.com/office/drawing/2014/chartex" xmlns:cx1="http://schemas.microsoft.com/office/drawing/2015/9/8/chartex" xmlns:cx2="http://schemas.microsoft.com/office/drawing/2015/10/21/chartex" xmlns:cx3="http://schemas.microsoft.com/office/drawing/2016/5/9/chartex" xmlns:cx4="http://schemas.microsoft.com/office/drawing/2016/5/10/chartex" xmlns:cx5="http://schemas.microsoft.com/office/drawing/2016/5/11/chartex" xmlns:cx6="http://schemas.microsoft.com/office/drawing/2016/5/12/chartex" xmlns:cx7="http://schemas.microsoft.com/office/drawing/2016/5/13/chartex" xmlns:cx8="http://schemas.microsoft.com/office/drawing/2016/5/14/chartex" xmlns:mc="http://schemas.openxmlformats.org/markup-compatibility/2006" xmlns:aink="http://schemas.microsoft.com/office/drawing/2016/ink" xmlns:am3d="http://schemas.microsoft.com/office/drawing/2017/model3d" xmlns:o="urn:schemas-microsoft-com:office:office" xmlns:oel="http://schemas.microsoft.com/office/2019/extlst" xmlns:r="http://schemas.openxmlformats.org/officeDocument/2006/relationships" xmlns:m="http://schemas.openxmlformats.org/officeDocument/2006/math" xmlns:v="urn:schemas-microsoft-com:vml" xmlns:wp14="http://schemas.microsoft.com/office/word/2010/wordprocessingDrawing" xmlns:wp="http://schemas.openxmlformats.org/drawingml/2006/wordprocessingDrawing" xmlns:w10="urn:schemas-microsoft-com:office:word" xmlns:w="http://schemas.openxmlformats.org/wordprocessingml/2006/main" xmlns:w14="http://schemas.microsoft.com/office/word/2010/wordml" xmlns:w15="http://schemas.microsoft.com/office/word/2012/wordml" xmlns:w16cex="http://schemas.microsoft.com/office/word/2018/wordml/cex" xmlns:w16cid="http://schemas.microsoft.com/office/word/2016/wordml/cid" xmlns:w16="http://schemas.microsoft.com/office/word/2018/wordml" xmlns:w16sdtdh="http://schemas.microsoft.com/office/word/2020/wordml/sdtdatahash" xmlns:w16se="http://schemas.microsoft.com/office/word/2015/wordml/symex" xmlns:wpg="http://schemas.microsoft.com/office/word/2010/wordprocessingGroup" xmlns:wpi="http://schemas.microsoft.com/office/word/2010/wordprocessingInk" xmlns:wne="http://schemas.microsoft.com/office/word/2006/wordml" xmlns:wps="http://schemas.microsoft.com/office/word/2010/wordprocessingShape" mc:Ignorable="w14 w15 w16se w16cid w16 w16cex w16sdtdh wp14">
+<file path=word/header13.xml><?xml version="1.0" encoding="utf-8"?>
+<w:hdr xmlns:wpc="http://schemas.microsoft.com/office/word/2010/wordprocessingCanvas" xmlns:cx="http://schemas.microsoft.com/office/drawing/2014/chartex" xmlns:cx1="http://schemas.microsoft.com/office/drawing/2015/9/8/chartex" xmlns:cx2="http://schemas.microsoft.com/office/drawing/2015/10/21/chartex" xmlns:cx3="http://schemas.microsoft.com/office/drawing/2016/5/9/chartex" xmlns:cx4="http://schemas.microsoft.com/office/drawing/2016/5/10/chartex" xmlns:cx5="http://schemas.microsoft.com/office/drawing/2016/5/11/chartex" xmlns:cx6="http://schemas.microsoft.com/office/drawing/2016/5/12/chartex" xmlns:cx7="http://schemas.microsoft.com/office/drawing/2016/5/13/chartex" xmlns:cx8="http://schemas.microsoft.com/office/drawing/2016/5/14/chartex" xmlns:mc="http://schemas.openxmlformats.org/markup-compatibility/2006" xmlns:aink="http://schemas.microsoft.com/office/drawing/2016/ink" xmlns:am3d="http://schemas.microsoft.com/office/drawing/2017/model3d" xmlns:o="urn:schemas-microsoft-com:office:office" xmlns:oel="http://schemas.microsoft.com/office/2019/extlst" xmlns:r="http://schemas.openxmlformats.org/officeDocument/2006/relationships" xmlns:m="http://schemas.openxmlformats.org/officeDocument/2006/math" xmlns:v="urn:schemas-microsoft-com:vml" xmlns:wp14="http://schemas.microsoft.com/office/word/2010/wordprocessingDrawing" xmlns:wp="http://schemas.openxmlformats.org/drawingml/2006/wordprocessingDrawing" xmlns:w10="urn:schemas-microsoft-com:office:word" xmlns:w="http://schemas.openxmlformats.org/wordprocessingml/2006/main" xmlns:w14="http://schemas.microsoft.com/office/word/2010/wordml" xmlns:w15="http://schemas.microsoft.com/office/word/2012/wordml" xmlns:w16cex="http://schemas.microsoft.com/office/word/2018/wordml/cex" xmlns:w16cid="http://schemas.microsoft.com/office/word/2016/wordml/cid" xmlns:w16="http://schemas.microsoft.com/office/word/2018/wordml" xmlns:w16du="http://schemas.microsoft.com/office/word/2023/wordml/word16du" xmlns:w16sdtdh="http://schemas.microsoft.com/office/word/2020/wordml/sdtdatahash" xmlns:w16sdtfl="http://schemas.microsoft.com/office/word/2024/wordml/sdtformatlock" xmlns:w16se="http://schemas.microsoft.com/office/word/2015/wordml/symex" xmlns:wpg="http://schemas.microsoft.com/office/word/2010/wordprocessingGroup" xmlns:wpi="http://schemas.microsoft.com/office/word/2010/wordprocessingInk" xmlns:wne="http://schemas.microsoft.com/office/word/2006/wordml" xmlns:wps="http://schemas.microsoft.com/office/word/2010/wordprocessingShape" mc:Ignorable="w14 w15 w16se w16cid w16 w16cex w16sdtdh w16sdtfl w16du wp14">
   <w:p>
     <w:pPr>
       <w:pStyle w:val="Cabealho"/>
     </w:pPr>
-    <w:proofErr w:type="spellStart"/>
     <w:r>
       <w:t>vii</w:t>
     </w:r>
-    <w:proofErr w:type="spellEnd"/>
   </w:p>
 </w:hdr>
 </file>
 
-<file path=word/header12.xml><?xml version="1.0" encoding="utf-8"?>
-<w:hdr xmlns:wpc="http://schemas.microsoft.com/office/word/2010/wordprocessingCanvas" xmlns:cx="http://schemas.microsoft.com/office/drawing/2014/chartex" xmlns:cx1="http://schemas.microsoft.com/office/drawing/2015/9/8/chartex" xmlns:cx2="http://schemas.microsoft.com/office/drawing/2015/10/21/chartex" xmlns:cx3="http://schemas.microsoft.com/office/drawing/2016/5/9/chartex" xmlns:cx4="http://schemas.microsoft.com/office/drawing/2016/5/10/chartex" xmlns:cx5="http://schemas.microsoft.com/office/drawing/2016/5/11/chartex" xmlns:cx6="http://schemas.microsoft.com/office/drawing/2016/5/12/chartex" xmlns:cx7="http://schemas.microsoft.com/office/drawing/2016/5/13/chartex" xmlns:cx8="http://schemas.microsoft.com/office/drawing/2016/5/14/chartex" xmlns:mc="http://schemas.openxmlformats.org/markup-compatibility/2006" xmlns:aink="http://schemas.microsoft.com/office/drawing/2016/ink" xmlns:am3d="http://schemas.microsoft.com/office/drawing/2017/model3d" xmlns:o="urn:schemas-microsoft-com:office:office" xmlns:oel="http://schemas.microsoft.com/office/2019/extlst" xmlns:r="http://schemas.openxmlformats.org/officeDocument/2006/relationships" xmlns:m="http://schemas.openxmlformats.org/officeDocument/2006/math" xmlns:v="urn:schemas-microsoft-com:vml" xmlns:wp14="http://schemas.microsoft.com/office/word/2010/wordprocessingDrawing" xmlns:wp="http://schemas.openxmlformats.org/drawingml/2006/wordprocessingDrawing" xmlns:w10="urn:schemas-microsoft-com:office:word" xmlns:w="http://schemas.openxmlformats.org/wordprocessingml/2006/main" xmlns:w14="http://schemas.microsoft.com/office/word/2010/wordml" xmlns:w15="http://schemas.microsoft.com/office/word/2012/wordml" xmlns:w16cex="http://schemas.microsoft.com/office/word/2018/wordml/cex" xmlns:w16cid="http://schemas.microsoft.com/office/word/2016/wordml/cid" xmlns:w16="http://schemas.microsoft.com/office/word/2018/wordml" xmlns:w16sdtdh="http://schemas.microsoft.com/office/word/2020/wordml/sdtdatahash" xmlns:w16se="http://schemas.microsoft.com/office/word/2015/wordml/symex" xmlns:wpg="http://schemas.microsoft.com/office/word/2010/wordprocessingGroup" xmlns:wpi="http://schemas.microsoft.com/office/word/2010/wordprocessingInk" xmlns:wne="http://schemas.microsoft.com/office/word/2006/wordml" xmlns:wps="http://schemas.microsoft.com/office/word/2010/wordprocessingShape" mc:Ignorable="w14 w15 w16se w16cid w16 w16cex w16sdtdh wp14">
+<file path=word/header14.xml><?xml version="1.0" encoding="utf-8"?>
+<w:hdr xmlns:wpc="http://schemas.microsoft.com/office/word/2010/wordprocessingCanvas" xmlns:cx="http://schemas.microsoft.com/office/drawing/2014/chartex" xmlns:cx1="http://schemas.microsoft.com/office/drawing/2015/9/8/chartex" xmlns:cx2="http://schemas.microsoft.com/office/drawing/2015/10/21/chartex" xmlns:cx3="http://schemas.microsoft.com/office/drawing/2016/5/9/chartex" xmlns:cx4="http://schemas.microsoft.com/office/drawing/2016/5/10/chartex" xmlns:cx5="http://schemas.microsoft.com/office/drawing/2016/5/11/chartex" xmlns:cx6="http://schemas.microsoft.com/office/drawing/2016/5/12/chartex" xmlns:cx7="http://schemas.microsoft.com/office/drawing/2016/5/13/chartex" xmlns:cx8="http://schemas.microsoft.com/office/drawing/2016/5/14/chartex" xmlns:mc="http://schemas.openxmlformats.org/markup-compatibility/2006" xmlns:aink="http://schemas.microsoft.com/office/drawing/2016/ink" xmlns:am3d="http://schemas.microsoft.com/office/drawing/2017/model3d" xmlns:o="urn:schemas-microsoft-com:office:office" xmlns:oel="http://schemas.microsoft.com/office/2019/extlst" xmlns:r="http://schemas.openxmlformats.org/officeDocument/2006/relationships" xmlns:m="http://schemas.openxmlformats.org/officeDocument/2006/math" xmlns:v="urn:schemas-microsoft-com:vml" xmlns:wp14="http://schemas.microsoft.com/office/word/2010/wordprocessingDrawing" xmlns:wp="http://schemas.openxmlformats.org/drawingml/2006/wordprocessingDrawing" xmlns:w10="urn:schemas-microsoft-com:office:word" xmlns:w="http://schemas.openxmlformats.org/wordprocessingml/2006/main" xmlns:w14="http://schemas.microsoft.com/office/word/2010/wordml" xmlns:w15="http://schemas.microsoft.com/office/word/2012/wordml" xmlns:w16cex="http://schemas.microsoft.com/office/word/2018/wordml/cex" xmlns:w16cid="http://schemas.microsoft.com/office/word/2016/wordml/cid" xmlns:w16="http://schemas.microsoft.com/office/word/2018/wordml" xmlns:w16du="http://schemas.microsoft.com/office/word/2023/wordml/word16du" xmlns:w16sdtdh="http://schemas.microsoft.com/office/word/2020/wordml/sdtdatahash" xmlns:w16sdtfl="http://schemas.microsoft.com/office/word/2024/wordml/sdtformatlock" xmlns:w16se="http://schemas.microsoft.com/office/word/2015/wordml/symex" xmlns:wpg="http://schemas.microsoft.com/office/word/2010/wordprocessingGroup" xmlns:wpi="http://schemas.microsoft.com/office/word/2010/wordprocessingInk" xmlns:wne="http://schemas.microsoft.com/office/word/2006/wordml" xmlns:wps="http://schemas.microsoft.com/office/word/2010/wordprocessingShape" mc:Ignorable="w14 w15 w16se w16cid w16 w16cex w16sdtdh w16sdtfl w16du wp14">
   <w:p>
     <w:pPr>
       <w:pStyle w:val="Cabealho"/>
@@ -3774,7 +5127,7 @@
 </file>
 
 <file path=word/header2.xml><?xml version="1.0" encoding="utf-8"?>
-<w:hdr xmlns:wpc="http://schemas.microsoft.com/office/word/2010/wordprocessingCanvas" xmlns:cx="http://schemas.microsoft.com/office/drawing/2014/chartex" xmlns:cx1="http://schemas.microsoft.com/office/drawing/2015/9/8/chartex" xmlns:cx2="http://schemas.microsoft.com/office/drawing/2015/10/21/chartex" xmlns:cx3="http://schemas.microsoft.com/office/drawing/2016/5/9/chartex" xmlns:cx4="http://schemas.microsoft.com/office/drawing/2016/5/10/chartex" xmlns:cx5="http://schemas.microsoft.com/office/drawing/2016/5/11/chartex" xmlns:cx6="http://schemas.microsoft.com/office/drawing/2016/5/12/chartex" xmlns:cx7="http://schemas.microsoft.com/office/drawing/2016/5/13/chartex" xmlns:cx8="http://schemas.microsoft.com/office/drawing/2016/5/14/chartex" xmlns:mc="http://schemas.openxmlformats.org/markup-compatibility/2006" xmlns:aink="http://schemas.microsoft.com/office/drawing/2016/ink" xmlns:am3d="http://schemas.microsoft.com/office/drawing/2017/model3d" xmlns:o="urn:schemas-microsoft-com:office:office" xmlns:oel="http://schemas.microsoft.com/office/2019/extlst" xmlns:r="http://schemas.openxmlformats.org/officeDocument/2006/relationships" xmlns:m="http://schemas.openxmlformats.org/officeDocument/2006/math" xmlns:v="urn:schemas-microsoft-com:vml" xmlns:wp14="http://schemas.microsoft.com/office/word/2010/wordprocessingDrawing" xmlns:wp="http://schemas.openxmlformats.org/drawingml/2006/wordprocessingDrawing" xmlns:w10="urn:schemas-microsoft-com:office:word" xmlns:w="http://schemas.openxmlformats.org/wordprocessingml/2006/main" xmlns:w14="http://schemas.microsoft.com/office/word/2010/wordml" xmlns:w15="http://schemas.microsoft.com/office/word/2012/wordml" xmlns:w16cex="http://schemas.microsoft.com/office/word/2018/wordml/cex" xmlns:w16cid="http://schemas.microsoft.com/office/word/2016/wordml/cid" xmlns:w16="http://schemas.microsoft.com/office/word/2018/wordml" xmlns:w16sdtdh="http://schemas.microsoft.com/office/word/2020/wordml/sdtdatahash" xmlns:w16se="http://schemas.microsoft.com/office/word/2015/wordml/symex" xmlns:wpg="http://schemas.microsoft.com/office/word/2010/wordprocessingGroup" xmlns:wpi="http://schemas.microsoft.com/office/word/2010/wordprocessingInk" xmlns:wne="http://schemas.microsoft.com/office/word/2006/wordml" xmlns:wps="http://schemas.microsoft.com/office/word/2010/wordprocessingShape" mc:Ignorable="w14 w15 w16se w16cid w16 w16cex w16sdtdh wp14">
+<w:hdr xmlns:wpc="http://schemas.microsoft.com/office/word/2010/wordprocessingCanvas" xmlns:cx="http://schemas.microsoft.com/office/drawing/2014/chartex" xmlns:cx1="http://schemas.microsoft.com/office/drawing/2015/9/8/chartex" xmlns:cx2="http://schemas.microsoft.com/office/drawing/2015/10/21/chartex" xmlns:cx3="http://schemas.microsoft.com/office/drawing/2016/5/9/chartex" xmlns:cx4="http://schemas.microsoft.com/office/drawing/2016/5/10/chartex" xmlns:cx5="http://schemas.microsoft.com/office/drawing/2016/5/11/chartex" xmlns:cx6="http://schemas.microsoft.com/office/drawing/2016/5/12/chartex" xmlns:cx7="http://schemas.microsoft.com/office/drawing/2016/5/13/chartex" xmlns:cx8="http://schemas.microsoft.com/office/drawing/2016/5/14/chartex" xmlns:mc="http://schemas.openxmlformats.org/markup-compatibility/2006" xmlns:aink="http://schemas.microsoft.com/office/drawing/2016/ink" xmlns:am3d="http://schemas.microsoft.com/office/drawing/2017/model3d" xmlns:o="urn:schemas-microsoft-com:office:office" xmlns:oel="http://schemas.microsoft.com/office/2019/extlst" xmlns:r="http://schemas.openxmlformats.org/officeDocument/2006/relationships" xmlns:m="http://schemas.openxmlformats.org/officeDocument/2006/math" xmlns:v="urn:schemas-microsoft-com:vml" xmlns:wp14="http://schemas.microsoft.com/office/word/2010/wordprocessingDrawing" xmlns:wp="http://schemas.openxmlformats.org/drawingml/2006/wordprocessingDrawing" xmlns:w10="urn:schemas-microsoft-com:office:word" xmlns:w="http://schemas.openxmlformats.org/wordprocessingml/2006/main" xmlns:w14="http://schemas.microsoft.com/office/word/2010/wordml" xmlns:w15="http://schemas.microsoft.com/office/word/2012/wordml" xmlns:w16cex="http://schemas.microsoft.com/office/word/2018/wordml/cex" xmlns:w16cid="http://schemas.microsoft.com/office/word/2016/wordml/cid" xmlns:w16="http://schemas.microsoft.com/office/word/2018/wordml" xmlns:w16du="http://schemas.microsoft.com/office/word/2023/wordml/word16du" xmlns:w16sdtdh="http://schemas.microsoft.com/office/word/2020/wordml/sdtdatahash" xmlns:w16sdtfl="http://schemas.microsoft.com/office/word/2024/wordml/sdtformatlock" xmlns:w16se="http://schemas.microsoft.com/office/word/2015/wordml/symex" xmlns:wpg="http://schemas.microsoft.com/office/word/2010/wordprocessingGroup" xmlns:wpi="http://schemas.microsoft.com/office/word/2010/wordprocessingInk" xmlns:wne="http://schemas.microsoft.com/office/word/2006/wordml" xmlns:wps="http://schemas.microsoft.com/office/word/2010/wordprocessingShape" mc:Ignorable="w14 w15 w16se w16cid w16 w16cex w16sdtdh w16sdtfl w16du wp14">
   <w:sdt>
     <w:sdtPr>
       <w:id w:val="-927114894"/>
@@ -3783,6 +5136,7 @@
         <w:docPartUnique/>
       </w:docPartObj>
     </w:sdtPr>
+    <w:sdtEndPr/>
     <w:sdtContent>
       <w:p>
         <w:pPr>
@@ -3819,7 +5173,127 @@
 </file>
 
 <file path=word/header3.xml><?xml version="1.0" encoding="utf-8"?>
-<w:hdr xmlns:wpc="http://schemas.microsoft.com/office/word/2010/wordprocessingCanvas" xmlns:cx="http://schemas.microsoft.com/office/drawing/2014/chartex" xmlns:cx1="http://schemas.microsoft.com/office/drawing/2015/9/8/chartex" xmlns:cx2="http://schemas.microsoft.com/office/drawing/2015/10/21/chartex" xmlns:cx3="http://schemas.microsoft.com/office/drawing/2016/5/9/chartex" xmlns:cx4="http://schemas.microsoft.com/office/drawing/2016/5/10/chartex" xmlns:cx5="http://schemas.microsoft.com/office/drawing/2016/5/11/chartex" xmlns:cx6="http://schemas.microsoft.com/office/drawing/2016/5/12/chartex" xmlns:cx7="http://schemas.microsoft.com/office/drawing/2016/5/13/chartex" xmlns:cx8="http://schemas.microsoft.com/office/drawing/2016/5/14/chartex" xmlns:mc="http://schemas.openxmlformats.org/markup-compatibility/2006" xmlns:aink="http://schemas.microsoft.com/office/drawing/2016/ink" xmlns:am3d="http://schemas.microsoft.com/office/drawing/2017/model3d" xmlns:o="urn:schemas-microsoft-com:office:office" xmlns:oel="http://schemas.microsoft.com/office/2019/extlst" xmlns:r="http://schemas.openxmlformats.org/officeDocument/2006/relationships" xmlns:m="http://schemas.openxmlformats.org/officeDocument/2006/math" xmlns:v="urn:schemas-microsoft-com:vml" xmlns:wp14="http://schemas.microsoft.com/office/word/2010/wordprocessingDrawing" xmlns:wp="http://schemas.openxmlformats.org/drawingml/2006/wordprocessingDrawing" xmlns:w10="urn:schemas-microsoft-com:office:word" xmlns:w="http://schemas.openxmlformats.org/wordprocessingml/2006/main" xmlns:w14="http://schemas.microsoft.com/office/word/2010/wordml" xmlns:w15="http://schemas.microsoft.com/office/word/2012/wordml" xmlns:w16cex="http://schemas.microsoft.com/office/word/2018/wordml/cex" xmlns:w16cid="http://schemas.microsoft.com/office/word/2016/wordml/cid" xmlns:w16="http://schemas.microsoft.com/office/word/2018/wordml" xmlns:w16sdtdh="http://schemas.microsoft.com/office/word/2020/wordml/sdtdatahash" xmlns:w16se="http://schemas.microsoft.com/office/word/2015/wordml/symex" xmlns:wpg="http://schemas.microsoft.com/office/word/2010/wordprocessingGroup" xmlns:wpi="http://schemas.microsoft.com/office/word/2010/wordprocessingInk" xmlns:wne="http://schemas.microsoft.com/office/word/2006/wordml" xmlns:wps="http://schemas.microsoft.com/office/word/2010/wordprocessingShape" mc:Ignorable="w14 w15 w16se w16cid w16 w16cex w16sdtdh wp14">
+<w:hdr xmlns:wpc="http://schemas.microsoft.com/office/word/2010/wordprocessingCanvas" xmlns:cx="http://schemas.microsoft.com/office/drawing/2014/chartex" xmlns:cx1="http://schemas.microsoft.com/office/drawing/2015/9/8/chartex" xmlns:cx2="http://schemas.microsoft.com/office/drawing/2015/10/21/chartex" xmlns:cx3="http://schemas.microsoft.com/office/drawing/2016/5/9/chartex" xmlns:cx4="http://schemas.microsoft.com/office/drawing/2016/5/10/chartex" xmlns:cx5="http://schemas.microsoft.com/office/drawing/2016/5/11/chartex" xmlns:cx6="http://schemas.microsoft.com/office/drawing/2016/5/12/chartex" xmlns:cx7="http://schemas.microsoft.com/office/drawing/2016/5/13/chartex" xmlns:cx8="http://schemas.microsoft.com/office/drawing/2016/5/14/chartex" xmlns:mc="http://schemas.openxmlformats.org/markup-compatibility/2006" xmlns:aink="http://schemas.microsoft.com/office/drawing/2016/ink" xmlns:am3d="http://schemas.microsoft.com/office/drawing/2017/model3d" xmlns:o="urn:schemas-microsoft-com:office:office" xmlns:oel="http://schemas.microsoft.com/office/2019/extlst" xmlns:r="http://schemas.openxmlformats.org/officeDocument/2006/relationships" xmlns:m="http://schemas.openxmlformats.org/officeDocument/2006/math" xmlns:v="urn:schemas-microsoft-com:vml" xmlns:wp14="http://schemas.microsoft.com/office/word/2010/wordprocessingDrawing" xmlns:wp="http://schemas.openxmlformats.org/drawingml/2006/wordprocessingDrawing" xmlns:w10="urn:schemas-microsoft-com:office:word" xmlns:w="http://schemas.openxmlformats.org/wordprocessingml/2006/main" xmlns:w14="http://schemas.microsoft.com/office/word/2010/wordml" xmlns:w15="http://schemas.microsoft.com/office/word/2012/wordml" xmlns:w16cex="http://schemas.microsoft.com/office/word/2018/wordml/cex" xmlns:w16cid="http://schemas.microsoft.com/office/word/2016/wordml/cid" xmlns:w16="http://schemas.microsoft.com/office/word/2018/wordml" xmlns:w16du="http://schemas.microsoft.com/office/word/2023/wordml/word16du" xmlns:w16sdtdh="http://schemas.microsoft.com/office/word/2020/wordml/sdtdatahash" xmlns:w16sdtfl="http://schemas.microsoft.com/office/word/2024/wordml/sdtformatlock" xmlns:w16se="http://schemas.microsoft.com/office/word/2015/wordml/symex" xmlns:wpg="http://schemas.microsoft.com/office/word/2010/wordprocessingGroup" xmlns:wpi="http://schemas.microsoft.com/office/word/2010/wordprocessingInk" xmlns:wne="http://schemas.microsoft.com/office/word/2006/wordml" xmlns:wps="http://schemas.microsoft.com/office/word/2010/wordprocessingShape" mc:Ignorable="w14 w15 w16se w16cid w16 w16cex w16sdtdh w16sdtfl w16du wp14">
+  <w:tbl>
+    <w:tblPr>
+      <w:tblW w:w="0" w:type="auto"/>
+      <w:tblLook w:val="06A0" w:firstRow="1" w:lastRow="0" w:firstColumn="1" w:lastColumn="0" w:noHBand="1" w:noVBand="1"/>
+    </w:tblPr>
+    <w:tblGrid>
+      <w:gridCol w:w="3020"/>
+      <w:gridCol w:w="3020"/>
+      <w:gridCol w:w="3020"/>
+    </w:tblGrid>
+    <w:tr>
+      <w:trPr>
+        <w:trHeight w:val="300"/>
+      </w:trPr>
+      <w:tc>
+        <w:tcPr>
+          <w:tcW w:w="3020" w:type="dxa"/>
+        </w:tcPr>
+        <w:p>
+          <w:pPr>
+            <w:pStyle w:val="Cabealho"/>
+            <w:ind w:left="-115"/>
+            <w:jc w:val="left"/>
+          </w:pPr>
+        </w:p>
+      </w:tc>
+      <w:tc>
+        <w:tcPr>
+          <w:tcW w:w="3020" w:type="dxa"/>
+        </w:tcPr>
+        <w:p>
+          <w:pPr>
+            <w:pStyle w:val="Cabealho"/>
+            <w:jc w:val="center"/>
+          </w:pPr>
+        </w:p>
+      </w:tc>
+      <w:tc>
+        <w:tcPr>
+          <w:tcW w:w="3020" w:type="dxa"/>
+        </w:tcPr>
+        <w:p>
+          <w:pPr>
+            <w:pStyle w:val="Cabealho"/>
+            <w:ind w:right="-115"/>
+          </w:pPr>
+        </w:p>
+      </w:tc>
+    </w:tr>
+  </w:tbl>
+  <w:p>
+    <w:pPr>
+      <w:pStyle w:val="Cabealho"/>
+    </w:pPr>
+  </w:p>
+</w:hdr>
+</file>
+
+<file path=word/header4.xml><?xml version="1.0" encoding="utf-8"?>
+<w:hdr xmlns:wpc="http://schemas.microsoft.com/office/word/2010/wordprocessingCanvas" xmlns:cx="http://schemas.microsoft.com/office/drawing/2014/chartex" xmlns:cx1="http://schemas.microsoft.com/office/drawing/2015/9/8/chartex" xmlns:cx2="http://schemas.microsoft.com/office/drawing/2015/10/21/chartex" xmlns:cx3="http://schemas.microsoft.com/office/drawing/2016/5/9/chartex" xmlns:cx4="http://schemas.microsoft.com/office/drawing/2016/5/10/chartex" xmlns:cx5="http://schemas.microsoft.com/office/drawing/2016/5/11/chartex" xmlns:cx6="http://schemas.microsoft.com/office/drawing/2016/5/12/chartex" xmlns:cx7="http://schemas.microsoft.com/office/drawing/2016/5/13/chartex" xmlns:cx8="http://schemas.microsoft.com/office/drawing/2016/5/14/chartex" xmlns:mc="http://schemas.openxmlformats.org/markup-compatibility/2006" xmlns:aink="http://schemas.microsoft.com/office/drawing/2016/ink" xmlns:am3d="http://schemas.microsoft.com/office/drawing/2017/model3d" xmlns:o="urn:schemas-microsoft-com:office:office" xmlns:oel="http://schemas.microsoft.com/office/2019/extlst" xmlns:r="http://schemas.openxmlformats.org/officeDocument/2006/relationships" xmlns:m="http://schemas.openxmlformats.org/officeDocument/2006/math" xmlns:v="urn:schemas-microsoft-com:vml" xmlns:wp14="http://schemas.microsoft.com/office/word/2010/wordprocessingDrawing" xmlns:wp="http://schemas.openxmlformats.org/drawingml/2006/wordprocessingDrawing" xmlns:w10="urn:schemas-microsoft-com:office:word" xmlns:w="http://schemas.openxmlformats.org/wordprocessingml/2006/main" xmlns:w14="http://schemas.microsoft.com/office/word/2010/wordml" xmlns:w15="http://schemas.microsoft.com/office/word/2012/wordml" xmlns:w16cex="http://schemas.microsoft.com/office/word/2018/wordml/cex" xmlns:w16cid="http://schemas.microsoft.com/office/word/2016/wordml/cid" xmlns:w16="http://schemas.microsoft.com/office/word/2018/wordml" xmlns:w16du="http://schemas.microsoft.com/office/word/2023/wordml/word16du" xmlns:w16sdtdh="http://schemas.microsoft.com/office/word/2020/wordml/sdtdatahash" xmlns:w16sdtfl="http://schemas.microsoft.com/office/word/2024/wordml/sdtformatlock" xmlns:w16se="http://schemas.microsoft.com/office/word/2015/wordml/symex" xmlns:wpg="http://schemas.microsoft.com/office/word/2010/wordprocessingGroup" xmlns:wpi="http://schemas.microsoft.com/office/word/2010/wordprocessingInk" xmlns:wne="http://schemas.microsoft.com/office/word/2006/wordml" xmlns:wps="http://schemas.microsoft.com/office/word/2010/wordprocessingShape" mc:Ignorable="w14 w15 w16se w16cid w16 w16cex w16sdtdh w16sdtfl w16du wp14">
+  <w:tbl>
+    <w:tblPr>
+      <w:tblW w:w="0" w:type="auto"/>
+      <w:tblLook w:val="06A0" w:firstRow="1" w:lastRow="0" w:firstColumn="1" w:lastColumn="0" w:noHBand="1" w:noVBand="1"/>
+    </w:tblPr>
+    <w:tblGrid>
+      <w:gridCol w:w="3020"/>
+      <w:gridCol w:w="3020"/>
+      <w:gridCol w:w="3020"/>
+    </w:tblGrid>
+    <w:tr>
+      <w:trPr>
+        <w:trHeight w:val="300"/>
+      </w:trPr>
+      <w:tc>
+        <w:tcPr>
+          <w:tcW w:w="3020" w:type="dxa"/>
+        </w:tcPr>
+        <w:p>
+          <w:pPr>
+            <w:pStyle w:val="Cabealho"/>
+            <w:ind w:left="-115"/>
+            <w:jc w:val="left"/>
+          </w:pPr>
+        </w:p>
+      </w:tc>
+      <w:tc>
+        <w:tcPr>
+          <w:tcW w:w="3020" w:type="dxa"/>
+        </w:tcPr>
+        <w:p>
+          <w:pPr>
+            <w:pStyle w:val="Cabealho"/>
+            <w:jc w:val="center"/>
+          </w:pPr>
+        </w:p>
+      </w:tc>
+      <w:tc>
+        <w:tcPr>
+          <w:tcW w:w="3020" w:type="dxa"/>
+        </w:tcPr>
+        <w:p>
+          <w:pPr>
+            <w:pStyle w:val="Cabealho"/>
+            <w:ind w:right="-115"/>
+          </w:pPr>
+        </w:p>
+      </w:tc>
+    </w:tr>
+  </w:tbl>
+  <w:p>
+    <w:pPr>
+      <w:pStyle w:val="Cabealho"/>
+    </w:pPr>
+  </w:p>
+</w:hdr>
+</file>
+
+<file path=word/header5.xml><?xml version="1.0" encoding="utf-8"?>
+<w:hdr xmlns:wpc="http://schemas.microsoft.com/office/word/2010/wordprocessingCanvas" xmlns:cx="http://schemas.microsoft.com/office/drawing/2014/chartex" xmlns:cx1="http://schemas.microsoft.com/office/drawing/2015/9/8/chartex" xmlns:cx2="http://schemas.microsoft.com/office/drawing/2015/10/21/chartex" xmlns:cx3="http://schemas.microsoft.com/office/drawing/2016/5/9/chartex" xmlns:cx4="http://schemas.microsoft.com/office/drawing/2016/5/10/chartex" xmlns:cx5="http://schemas.microsoft.com/office/drawing/2016/5/11/chartex" xmlns:cx6="http://schemas.microsoft.com/office/drawing/2016/5/12/chartex" xmlns:cx7="http://schemas.microsoft.com/office/drawing/2016/5/13/chartex" xmlns:cx8="http://schemas.microsoft.com/office/drawing/2016/5/14/chartex" xmlns:mc="http://schemas.openxmlformats.org/markup-compatibility/2006" xmlns:aink="http://schemas.microsoft.com/office/drawing/2016/ink" xmlns:am3d="http://schemas.microsoft.com/office/drawing/2017/model3d" xmlns:o="urn:schemas-microsoft-com:office:office" xmlns:oel="http://schemas.microsoft.com/office/2019/extlst" xmlns:r="http://schemas.openxmlformats.org/officeDocument/2006/relationships" xmlns:m="http://schemas.openxmlformats.org/officeDocument/2006/math" xmlns:v="urn:schemas-microsoft-com:vml" xmlns:wp14="http://schemas.microsoft.com/office/word/2010/wordprocessingDrawing" xmlns:wp="http://schemas.openxmlformats.org/drawingml/2006/wordprocessingDrawing" xmlns:w10="urn:schemas-microsoft-com:office:word" xmlns:w="http://schemas.openxmlformats.org/wordprocessingml/2006/main" xmlns:w14="http://schemas.microsoft.com/office/word/2010/wordml" xmlns:w15="http://schemas.microsoft.com/office/word/2012/wordml" xmlns:w16cex="http://schemas.microsoft.com/office/word/2018/wordml/cex" xmlns:w16cid="http://schemas.microsoft.com/office/word/2016/wordml/cid" xmlns:w16="http://schemas.microsoft.com/office/word/2018/wordml" xmlns:w16du="http://schemas.microsoft.com/office/word/2023/wordml/word16du" xmlns:w16sdtdh="http://schemas.microsoft.com/office/word/2020/wordml/sdtdatahash" xmlns:w16sdtfl="http://schemas.microsoft.com/office/word/2024/wordml/sdtformatlock" xmlns:w16se="http://schemas.microsoft.com/office/word/2015/wordml/symex" xmlns:wpg="http://schemas.microsoft.com/office/word/2010/wordprocessingGroup" xmlns:wpi="http://schemas.microsoft.com/office/word/2010/wordprocessingInk" xmlns:wne="http://schemas.microsoft.com/office/word/2006/wordml" xmlns:wps="http://schemas.microsoft.com/office/word/2010/wordprocessingShape" mc:Ignorable="w14 w15 w16se w16cid w16 w16cex w16sdtdh w16sdtfl w16du wp14">
   <w:sdt>
     <w:sdtPr>
       <w:id w:val="-659389568"/>
@@ -3828,6 +5302,7 @@
         <w:docPartUnique/>
       </w:docPartObj>
     </w:sdtPr>
+    <w:sdtEndPr/>
     <w:sdtContent>
       <w:p>
         <w:pPr>
@@ -3863,23 +5338,21 @@
 </w:hdr>
 </file>
 
-<file path=word/header4.xml><?xml version="1.0" encoding="utf-8"?>
-<w:hdr xmlns:wpc="http://schemas.microsoft.com/office/word/2010/wordprocessingCanvas" xmlns:cx="http://schemas.microsoft.com/office/drawing/2014/chartex" xmlns:cx1="http://schemas.microsoft.com/office/drawing/2015/9/8/chartex" xmlns:cx2="http://schemas.microsoft.com/office/drawing/2015/10/21/chartex" xmlns:cx3="http://schemas.microsoft.com/office/drawing/2016/5/9/chartex" xmlns:cx4="http://schemas.microsoft.com/office/drawing/2016/5/10/chartex" xmlns:cx5="http://schemas.microsoft.com/office/drawing/2016/5/11/chartex" xmlns:cx6="http://schemas.microsoft.com/office/drawing/2016/5/12/chartex" xmlns:cx7="http://schemas.microsoft.com/office/drawing/2016/5/13/chartex" xmlns:cx8="http://schemas.microsoft.com/office/drawing/2016/5/14/chartex" xmlns:mc="http://schemas.openxmlformats.org/markup-compatibility/2006" xmlns:aink="http://schemas.microsoft.com/office/drawing/2016/ink" xmlns:am3d="http://schemas.microsoft.com/office/drawing/2017/model3d" xmlns:o="urn:schemas-microsoft-com:office:office" xmlns:oel="http://schemas.microsoft.com/office/2019/extlst" xmlns:r="http://schemas.openxmlformats.org/officeDocument/2006/relationships" xmlns:m="http://schemas.openxmlformats.org/officeDocument/2006/math" xmlns:v="urn:schemas-microsoft-com:vml" xmlns:wp14="http://schemas.microsoft.com/office/word/2010/wordprocessingDrawing" xmlns:wp="http://schemas.openxmlformats.org/drawingml/2006/wordprocessingDrawing" xmlns:w10="urn:schemas-microsoft-com:office:word" xmlns:w="http://schemas.openxmlformats.org/wordprocessingml/2006/main" xmlns:w14="http://schemas.microsoft.com/office/word/2010/wordml" xmlns:w15="http://schemas.microsoft.com/office/word/2012/wordml" xmlns:w16cex="http://schemas.microsoft.com/office/word/2018/wordml/cex" xmlns:w16cid="http://schemas.microsoft.com/office/word/2016/wordml/cid" xmlns:w16="http://schemas.microsoft.com/office/word/2018/wordml" xmlns:w16sdtdh="http://schemas.microsoft.com/office/word/2020/wordml/sdtdatahash" xmlns:w16se="http://schemas.microsoft.com/office/word/2015/wordml/symex" xmlns:wpg="http://schemas.microsoft.com/office/word/2010/wordprocessingGroup" xmlns:wpi="http://schemas.microsoft.com/office/word/2010/wordprocessingInk" xmlns:wne="http://schemas.microsoft.com/office/word/2006/wordml" xmlns:wps="http://schemas.microsoft.com/office/word/2010/wordprocessingShape" mc:Ignorable="w14 w15 w16se w16cid w16 w16cex w16sdtdh wp14">
+<file path=word/header6.xml><?xml version="1.0" encoding="utf-8"?>
+<w:hdr xmlns:wpc="http://schemas.microsoft.com/office/word/2010/wordprocessingCanvas" xmlns:cx="http://schemas.microsoft.com/office/drawing/2014/chartex" xmlns:cx1="http://schemas.microsoft.com/office/drawing/2015/9/8/chartex" xmlns:cx2="http://schemas.microsoft.com/office/drawing/2015/10/21/chartex" xmlns:cx3="http://schemas.microsoft.com/office/drawing/2016/5/9/chartex" xmlns:cx4="http://schemas.microsoft.com/office/drawing/2016/5/10/chartex" xmlns:cx5="http://schemas.microsoft.com/office/drawing/2016/5/11/chartex" xmlns:cx6="http://schemas.microsoft.com/office/drawing/2016/5/12/chartex" xmlns:cx7="http://schemas.microsoft.com/office/drawing/2016/5/13/chartex" xmlns:cx8="http://schemas.microsoft.com/office/drawing/2016/5/14/chartex" xmlns:mc="http://schemas.openxmlformats.org/markup-compatibility/2006" xmlns:aink="http://schemas.microsoft.com/office/drawing/2016/ink" xmlns:am3d="http://schemas.microsoft.com/office/drawing/2017/model3d" xmlns:o="urn:schemas-microsoft-com:office:office" xmlns:oel="http://schemas.microsoft.com/office/2019/extlst" xmlns:r="http://schemas.openxmlformats.org/officeDocument/2006/relationships" xmlns:m="http://schemas.openxmlformats.org/officeDocument/2006/math" xmlns:v="urn:schemas-microsoft-com:vml" xmlns:wp14="http://schemas.microsoft.com/office/word/2010/wordprocessingDrawing" xmlns:wp="http://schemas.openxmlformats.org/drawingml/2006/wordprocessingDrawing" xmlns:w10="urn:schemas-microsoft-com:office:word" xmlns:w="http://schemas.openxmlformats.org/wordprocessingml/2006/main" xmlns:w14="http://schemas.microsoft.com/office/word/2010/wordml" xmlns:w15="http://schemas.microsoft.com/office/word/2012/wordml" xmlns:w16cex="http://schemas.microsoft.com/office/word/2018/wordml/cex" xmlns:w16cid="http://schemas.microsoft.com/office/word/2016/wordml/cid" xmlns:w16="http://schemas.microsoft.com/office/word/2018/wordml" xmlns:w16du="http://schemas.microsoft.com/office/word/2023/wordml/word16du" xmlns:w16sdtdh="http://schemas.microsoft.com/office/word/2020/wordml/sdtdatahash" xmlns:w16sdtfl="http://schemas.microsoft.com/office/word/2024/wordml/sdtformatlock" xmlns:w16se="http://schemas.microsoft.com/office/word/2015/wordml/symex" xmlns:wpg="http://schemas.microsoft.com/office/word/2010/wordprocessingGroup" xmlns:wpi="http://schemas.microsoft.com/office/word/2010/wordprocessingInk" xmlns:wne="http://schemas.microsoft.com/office/word/2006/wordml" xmlns:wps="http://schemas.microsoft.com/office/word/2010/wordprocessingShape" mc:Ignorable="w14 w15 w16se w16cid w16 w16cex w16sdtdh w16sdtfl w16du wp14">
   <w:p>
     <w:pPr>
       <w:pStyle w:val="Cabealho"/>
     </w:pPr>
-    <w:proofErr w:type="spellStart"/>
     <w:r>
       <w:t>iii</w:t>
     </w:r>
-    <w:proofErr w:type="spellEnd"/>
   </w:p>
 </w:hdr>
 </file>
 
-<file path=word/header5.xml><?xml version="1.0" encoding="utf-8"?>
-<w:hdr xmlns:wpc="http://schemas.microsoft.com/office/word/2010/wordprocessingCanvas" xmlns:cx="http://schemas.microsoft.com/office/drawing/2014/chartex" xmlns:cx1="http://schemas.microsoft.com/office/drawing/2015/9/8/chartex" xmlns:cx2="http://schemas.microsoft.com/office/drawing/2015/10/21/chartex" xmlns:cx3="http://schemas.microsoft.com/office/drawing/2016/5/9/chartex" xmlns:cx4="http://schemas.microsoft.com/office/drawing/2016/5/10/chartex" xmlns:cx5="http://schemas.microsoft.com/office/drawing/2016/5/11/chartex" xmlns:cx6="http://schemas.microsoft.com/office/drawing/2016/5/12/chartex" xmlns:cx7="http://schemas.microsoft.com/office/drawing/2016/5/13/chartex" xmlns:cx8="http://schemas.microsoft.com/office/drawing/2016/5/14/chartex" xmlns:mc="http://schemas.openxmlformats.org/markup-compatibility/2006" xmlns:aink="http://schemas.microsoft.com/office/drawing/2016/ink" xmlns:am3d="http://schemas.microsoft.com/office/drawing/2017/model3d" xmlns:o="urn:schemas-microsoft-com:office:office" xmlns:oel="http://schemas.microsoft.com/office/2019/extlst" xmlns:r="http://schemas.openxmlformats.org/officeDocument/2006/relationships" xmlns:m="http://schemas.openxmlformats.org/officeDocument/2006/math" xmlns:v="urn:schemas-microsoft-com:vml" xmlns:wp14="http://schemas.microsoft.com/office/word/2010/wordprocessingDrawing" xmlns:wp="http://schemas.openxmlformats.org/drawingml/2006/wordprocessingDrawing" xmlns:w10="urn:schemas-microsoft-com:office:word" xmlns:w="http://schemas.openxmlformats.org/wordprocessingml/2006/main" xmlns:w14="http://schemas.microsoft.com/office/word/2010/wordml" xmlns:w15="http://schemas.microsoft.com/office/word/2012/wordml" xmlns:w16cex="http://schemas.microsoft.com/office/word/2018/wordml/cex" xmlns:w16cid="http://schemas.microsoft.com/office/word/2016/wordml/cid" xmlns:w16="http://schemas.microsoft.com/office/word/2018/wordml" xmlns:w16sdtdh="http://schemas.microsoft.com/office/word/2020/wordml/sdtdatahash" xmlns:w16se="http://schemas.microsoft.com/office/word/2015/wordml/symex" xmlns:wpg="http://schemas.microsoft.com/office/word/2010/wordprocessingGroup" xmlns:wpi="http://schemas.microsoft.com/office/word/2010/wordprocessingInk" xmlns:wne="http://schemas.microsoft.com/office/word/2006/wordml" xmlns:wps="http://schemas.microsoft.com/office/word/2010/wordprocessingShape" mc:Ignorable="w14 w15 w16se w16cid w16 w16cex w16sdtdh wp14">
+<file path=word/header7.xml><?xml version="1.0" encoding="utf-8"?>
+<w:hdr xmlns:wpc="http://schemas.microsoft.com/office/word/2010/wordprocessingCanvas" xmlns:cx="http://schemas.microsoft.com/office/drawing/2014/chartex" xmlns:cx1="http://schemas.microsoft.com/office/drawing/2015/9/8/chartex" xmlns:cx2="http://schemas.microsoft.com/office/drawing/2015/10/21/chartex" xmlns:cx3="http://schemas.microsoft.com/office/drawing/2016/5/9/chartex" xmlns:cx4="http://schemas.microsoft.com/office/drawing/2016/5/10/chartex" xmlns:cx5="http://schemas.microsoft.com/office/drawing/2016/5/11/chartex" xmlns:cx6="http://schemas.microsoft.com/office/drawing/2016/5/12/chartex" xmlns:cx7="http://schemas.microsoft.com/office/drawing/2016/5/13/chartex" xmlns:cx8="http://schemas.microsoft.com/office/drawing/2016/5/14/chartex" xmlns:mc="http://schemas.openxmlformats.org/markup-compatibility/2006" xmlns:aink="http://schemas.microsoft.com/office/drawing/2016/ink" xmlns:am3d="http://schemas.microsoft.com/office/drawing/2017/model3d" xmlns:o="urn:schemas-microsoft-com:office:office" xmlns:oel="http://schemas.microsoft.com/office/2019/extlst" xmlns:r="http://schemas.openxmlformats.org/officeDocument/2006/relationships" xmlns:m="http://schemas.openxmlformats.org/officeDocument/2006/math" xmlns:v="urn:schemas-microsoft-com:vml" xmlns:wp14="http://schemas.microsoft.com/office/word/2010/wordprocessingDrawing" xmlns:wp="http://schemas.openxmlformats.org/drawingml/2006/wordprocessingDrawing" xmlns:w10="urn:schemas-microsoft-com:office:word" xmlns:w="http://schemas.openxmlformats.org/wordprocessingml/2006/main" xmlns:w14="http://schemas.microsoft.com/office/word/2010/wordml" xmlns:w15="http://schemas.microsoft.com/office/word/2012/wordml" xmlns:w16cex="http://schemas.microsoft.com/office/word/2018/wordml/cex" xmlns:w16cid="http://schemas.microsoft.com/office/word/2016/wordml/cid" xmlns:w16="http://schemas.microsoft.com/office/word/2018/wordml" xmlns:w16du="http://schemas.microsoft.com/office/word/2023/wordml/word16du" xmlns:w16sdtdh="http://schemas.microsoft.com/office/word/2020/wordml/sdtdatahash" xmlns:w16sdtfl="http://schemas.microsoft.com/office/word/2024/wordml/sdtformatlock" xmlns:w16se="http://schemas.microsoft.com/office/word/2015/wordml/symex" xmlns:wpg="http://schemas.microsoft.com/office/word/2010/wordprocessingGroup" xmlns:wpi="http://schemas.microsoft.com/office/word/2010/wordprocessingInk" xmlns:wne="http://schemas.microsoft.com/office/word/2006/wordml" xmlns:wps="http://schemas.microsoft.com/office/word/2010/wordprocessingShape" mc:Ignorable="w14 w15 w16se w16cid w16 w16cex w16sdtdh w16sdtfl w16du wp14">
   <w:p>
     <w:pPr>
       <w:pStyle w:val="Cabealho"/>
@@ -3944,26 +5417,24 @@
 </w:hdr>
 </file>
 
-<file path=word/header6.xml><?xml version="1.0" encoding="utf-8"?>
-<w:hdr xmlns:wpc="http://schemas.microsoft.com/office/word/2010/wordprocessingCanvas" xmlns:cx="http://schemas.microsoft.com/office/drawing/2014/chartex" xmlns:cx1="http://schemas.microsoft.com/office/drawing/2015/9/8/chartex" xmlns:cx2="http://schemas.microsoft.com/office/drawing/2015/10/21/chartex" xmlns:cx3="http://schemas.microsoft.com/office/drawing/2016/5/9/chartex" xmlns:cx4="http://schemas.microsoft.com/office/drawing/2016/5/10/chartex" xmlns:cx5="http://schemas.microsoft.com/office/drawing/2016/5/11/chartex" xmlns:cx6="http://schemas.microsoft.com/office/drawing/2016/5/12/chartex" xmlns:cx7="http://schemas.microsoft.com/office/drawing/2016/5/13/chartex" xmlns:cx8="http://schemas.microsoft.com/office/drawing/2016/5/14/chartex" xmlns:mc="http://schemas.openxmlformats.org/markup-compatibility/2006" xmlns:aink="http://schemas.microsoft.com/office/drawing/2016/ink" xmlns:am3d="http://schemas.microsoft.com/office/drawing/2017/model3d" xmlns:o="urn:schemas-microsoft-com:office:office" xmlns:oel="http://schemas.microsoft.com/office/2019/extlst" xmlns:r="http://schemas.openxmlformats.org/officeDocument/2006/relationships" xmlns:m="http://schemas.openxmlformats.org/officeDocument/2006/math" xmlns:v="urn:schemas-microsoft-com:vml" xmlns:wp14="http://schemas.microsoft.com/office/word/2010/wordprocessingDrawing" xmlns:wp="http://schemas.openxmlformats.org/drawingml/2006/wordprocessingDrawing" xmlns:w10="urn:schemas-microsoft-com:office:word" xmlns:w="http://schemas.openxmlformats.org/wordprocessingml/2006/main" xmlns:w14="http://schemas.microsoft.com/office/word/2010/wordml" xmlns:w15="http://schemas.microsoft.com/office/word/2012/wordml" xmlns:w16cex="http://schemas.microsoft.com/office/word/2018/wordml/cex" xmlns:w16cid="http://schemas.microsoft.com/office/word/2016/wordml/cid" xmlns:w16="http://schemas.microsoft.com/office/word/2018/wordml" xmlns:w16sdtdh="http://schemas.microsoft.com/office/word/2020/wordml/sdtdatahash" xmlns:w16se="http://schemas.microsoft.com/office/word/2015/wordml/symex" xmlns:wpg="http://schemas.microsoft.com/office/word/2010/wordprocessingGroup" xmlns:wpi="http://schemas.microsoft.com/office/word/2010/wordprocessingInk" xmlns:wne="http://schemas.microsoft.com/office/word/2006/wordml" xmlns:wps="http://schemas.microsoft.com/office/word/2010/wordprocessingShape" mc:Ignorable="w14 w15 w16se w16cid w16 w16cex w16sdtdh wp14">
+<file path=word/header8.xml><?xml version="1.0" encoding="utf-8"?>
+<w:hdr xmlns:wpc="http://schemas.microsoft.com/office/word/2010/wordprocessingCanvas" xmlns:cx="http://schemas.microsoft.com/office/drawing/2014/chartex" xmlns:cx1="http://schemas.microsoft.com/office/drawing/2015/9/8/chartex" xmlns:cx2="http://schemas.microsoft.com/office/drawing/2015/10/21/chartex" xmlns:cx3="http://schemas.microsoft.com/office/drawing/2016/5/9/chartex" xmlns:cx4="http://schemas.microsoft.com/office/drawing/2016/5/10/chartex" xmlns:cx5="http://schemas.microsoft.com/office/drawing/2016/5/11/chartex" xmlns:cx6="http://schemas.microsoft.com/office/drawing/2016/5/12/chartex" xmlns:cx7="http://schemas.microsoft.com/office/drawing/2016/5/13/chartex" xmlns:cx8="http://schemas.microsoft.com/office/drawing/2016/5/14/chartex" xmlns:mc="http://schemas.openxmlformats.org/markup-compatibility/2006" xmlns:aink="http://schemas.microsoft.com/office/drawing/2016/ink" xmlns:am3d="http://schemas.microsoft.com/office/drawing/2017/model3d" xmlns:o="urn:schemas-microsoft-com:office:office" xmlns:oel="http://schemas.microsoft.com/office/2019/extlst" xmlns:r="http://schemas.openxmlformats.org/officeDocument/2006/relationships" xmlns:m="http://schemas.openxmlformats.org/officeDocument/2006/math" xmlns:v="urn:schemas-microsoft-com:vml" xmlns:wp14="http://schemas.microsoft.com/office/word/2010/wordprocessingDrawing" xmlns:wp="http://schemas.openxmlformats.org/drawingml/2006/wordprocessingDrawing" xmlns:w10="urn:schemas-microsoft-com:office:word" xmlns:w="http://schemas.openxmlformats.org/wordprocessingml/2006/main" xmlns:w14="http://schemas.microsoft.com/office/word/2010/wordml" xmlns:w15="http://schemas.microsoft.com/office/word/2012/wordml" xmlns:w16cex="http://schemas.microsoft.com/office/word/2018/wordml/cex" xmlns:w16cid="http://schemas.microsoft.com/office/word/2016/wordml/cid" xmlns:w16="http://schemas.microsoft.com/office/word/2018/wordml" xmlns:w16du="http://schemas.microsoft.com/office/word/2023/wordml/word16du" xmlns:w16sdtdh="http://schemas.microsoft.com/office/word/2020/wordml/sdtdatahash" xmlns:w16sdtfl="http://schemas.microsoft.com/office/word/2024/wordml/sdtformatlock" xmlns:w16se="http://schemas.microsoft.com/office/word/2015/wordml/symex" xmlns:wpg="http://schemas.microsoft.com/office/word/2010/wordprocessingGroup" xmlns:wpi="http://schemas.microsoft.com/office/word/2010/wordprocessingInk" xmlns:wne="http://schemas.microsoft.com/office/word/2006/wordml" xmlns:wps="http://schemas.microsoft.com/office/word/2010/wordprocessingShape" mc:Ignorable="w14 w15 w16se w16cid w16 w16cex w16sdtdh w16sdtfl w16du wp14">
   <w:p>
     <w:pPr>
       <w:pStyle w:val="Cabealho"/>
     </w:pPr>
-    <w:proofErr w:type="spellStart"/>
     <w:r>
       <w:t>i</w:t>
     </w:r>
     <w:r>
       <w:t>v</w:t>
     </w:r>
-    <w:proofErr w:type="spellEnd"/>
   </w:p>
 </w:hdr>
 </file>
 
-<file path=word/header7.xml><?xml version="1.0" encoding="utf-8"?>
-<w:hdr xmlns:wpc="http://schemas.microsoft.com/office/word/2010/wordprocessingCanvas" xmlns:cx="http://schemas.microsoft.com/office/drawing/2014/chartex" xmlns:cx1="http://schemas.microsoft.com/office/drawing/2015/9/8/chartex" xmlns:cx2="http://schemas.microsoft.com/office/drawing/2015/10/21/chartex" xmlns:cx3="http://schemas.microsoft.com/office/drawing/2016/5/9/chartex" xmlns:cx4="http://schemas.microsoft.com/office/drawing/2016/5/10/chartex" xmlns:cx5="http://schemas.microsoft.com/office/drawing/2016/5/11/chartex" xmlns:cx6="http://schemas.microsoft.com/office/drawing/2016/5/12/chartex" xmlns:cx7="http://schemas.microsoft.com/office/drawing/2016/5/13/chartex" xmlns:cx8="http://schemas.microsoft.com/office/drawing/2016/5/14/chartex" xmlns:mc="http://schemas.openxmlformats.org/markup-compatibility/2006" xmlns:aink="http://schemas.microsoft.com/office/drawing/2016/ink" xmlns:am3d="http://schemas.microsoft.com/office/drawing/2017/model3d" xmlns:o="urn:schemas-microsoft-com:office:office" xmlns:oel="http://schemas.microsoft.com/office/2019/extlst" xmlns:r="http://schemas.openxmlformats.org/officeDocument/2006/relationships" xmlns:m="http://schemas.openxmlformats.org/officeDocument/2006/math" xmlns:v="urn:schemas-microsoft-com:vml" xmlns:wp14="http://schemas.microsoft.com/office/word/2010/wordprocessingDrawing" xmlns:wp="http://schemas.openxmlformats.org/drawingml/2006/wordprocessingDrawing" xmlns:w10="urn:schemas-microsoft-com:office:word" xmlns:w="http://schemas.openxmlformats.org/wordprocessingml/2006/main" xmlns:w14="http://schemas.microsoft.com/office/word/2010/wordml" xmlns:w15="http://schemas.microsoft.com/office/word/2012/wordml" xmlns:w16cex="http://schemas.microsoft.com/office/word/2018/wordml/cex" xmlns:w16cid="http://schemas.microsoft.com/office/word/2016/wordml/cid" xmlns:w16="http://schemas.microsoft.com/office/word/2018/wordml" xmlns:w16sdtdh="http://schemas.microsoft.com/office/word/2020/wordml/sdtdatahash" xmlns:w16se="http://schemas.microsoft.com/office/word/2015/wordml/symex" xmlns:wpg="http://schemas.microsoft.com/office/word/2010/wordprocessingGroup" xmlns:wpi="http://schemas.microsoft.com/office/word/2010/wordprocessingInk" xmlns:wne="http://schemas.microsoft.com/office/word/2006/wordml" xmlns:wps="http://schemas.microsoft.com/office/word/2010/wordprocessingShape" mc:Ignorable="w14 w15 w16se w16cid w16 w16cex w16sdtdh wp14">
+<file path=word/header9.xml><?xml version="1.0" encoding="utf-8"?>
+<w:hdr xmlns:wpc="http://schemas.microsoft.com/office/word/2010/wordprocessingCanvas" xmlns:cx="http://schemas.microsoft.com/office/drawing/2014/chartex" xmlns:cx1="http://schemas.microsoft.com/office/drawing/2015/9/8/chartex" xmlns:cx2="http://schemas.microsoft.com/office/drawing/2015/10/21/chartex" xmlns:cx3="http://schemas.microsoft.com/office/drawing/2016/5/9/chartex" xmlns:cx4="http://schemas.microsoft.com/office/drawing/2016/5/10/chartex" xmlns:cx5="http://schemas.microsoft.com/office/drawing/2016/5/11/chartex" xmlns:cx6="http://schemas.microsoft.com/office/drawing/2016/5/12/chartex" xmlns:cx7="http://schemas.microsoft.com/office/drawing/2016/5/13/chartex" xmlns:cx8="http://schemas.microsoft.com/office/drawing/2016/5/14/chartex" xmlns:mc="http://schemas.openxmlformats.org/markup-compatibility/2006" xmlns:aink="http://schemas.microsoft.com/office/drawing/2016/ink" xmlns:am3d="http://schemas.microsoft.com/office/drawing/2017/model3d" xmlns:o="urn:schemas-microsoft-com:office:office" xmlns:oel="http://schemas.microsoft.com/office/2019/extlst" xmlns:r="http://schemas.openxmlformats.org/officeDocument/2006/relationships" xmlns:m="http://schemas.openxmlformats.org/officeDocument/2006/math" xmlns:v="urn:schemas-microsoft-com:vml" xmlns:wp14="http://schemas.microsoft.com/office/word/2010/wordprocessingDrawing" xmlns:wp="http://schemas.openxmlformats.org/drawingml/2006/wordprocessingDrawing" xmlns:w10="urn:schemas-microsoft-com:office:word" xmlns:w="http://schemas.openxmlformats.org/wordprocessingml/2006/main" xmlns:w14="http://schemas.microsoft.com/office/word/2010/wordml" xmlns:w15="http://schemas.microsoft.com/office/word/2012/wordml" xmlns:w16cex="http://schemas.microsoft.com/office/word/2018/wordml/cex" xmlns:w16cid="http://schemas.microsoft.com/office/word/2016/wordml/cid" xmlns:w16="http://schemas.microsoft.com/office/word/2018/wordml" xmlns:w16du="http://schemas.microsoft.com/office/word/2023/wordml/word16du" xmlns:w16sdtdh="http://schemas.microsoft.com/office/word/2020/wordml/sdtdatahash" xmlns:w16sdtfl="http://schemas.microsoft.com/office/word/2024/wordml/sdtformatlock" xmlns:w16se="http://schemas.microsoft.com/office/word/2015/wordml/symex" xmlns:wpg="http://schemas.microsoft.com/office/word/2010/wordprocessingGroup" xmlns:wpi="http://schemas.microsoft.com/office/word/2010/wordprocessingInk" xmlns:wne="http://schemas.microsoft.com/office/word/2006/wordml" xmlns:wps="http://schemas.microsoft.com/office/word/2010/wordprocessingShape" mc:Ignorable="w14 w15 w16se w16cid w16 w16cex w16sdtdh w16sdtfl w16du wp14">
   <w:p>
     <w:pPr>
       <w:pStyle w:val="Cabealho"/>
@@ -4028,34 +5499,8 @@
 </w:hdr>
 </file>
 
-<file path=word/header8.xml><?xml version="1.0" encoding="utf-8"?>
-<w:hdr xmlns:wpc="http://schemas.microsoft.com/office/word/2010/wordprocessingCanvas" xmlns:cx="http://schemas.microsoft.com/office/drawing/2014/chartex" xmlns:cx1="http://schemas.microsoft.com/office/drawing/2015/9/8/chartex" xmlns:cx2="http://schemas.microsoft.com/office/drawing/2015/10/21/chartex" xmlns:cx3="http://schemas.microsoft.com/office/drawing/2016/5/9/chartex" xmlns:cx4="http://schemas.microsoft.com/office/drawing/2016/5/10/chartex" xmlns:cx5="http://schemas.microsoft.com/office/drawing/2016/5/11/chartex" xmlns:cx6="http://schemas.microsoft.com/office/drawing/2016/5/12/chartex" xmlns:cx7="http://schemas.microsoft.com/office/drawing/2016/5/13/chartex" xmlns:cx8="http://schemas.microsoft.com/office/drawing/2016/5/14/chartex" xmlns:mc="http://schemas.openxmlformats.org/markup-compatibility/2006" xmlns:aink="http://schemas.microsoft.com/office/drawing/2016/ink" xmlns:am3d="http://schemas.microsoft.com/office/drawing/2017/model3d" xmlns:o="urn:schemas-microsoft-com:office:office" xmlns:oel="http://schemas.microsoft.com/office/2019/extlst" xmlns:r="http://schemas.openxmlformats.org/officeDocument/2006/relationships" xmlns:m="http://schemas.openxmlformats.org/officeDocument/2006/math" xmlns:v="urn:schemas-microsoft-com:vml" xmlns:wp14="http://schemas.microsoft.com/office/word/2010/wordprocessingDrawing" xmlns:wp="http://schemas.openxmlformats.org/drawingml/2006/wordprocessingDrawing" xmlns:w10="urn:schemas-microsoft-com:office:word" xmlns:w="http://schemas.openxmlformats.org/wordprocessingml/2006/main" xmlns:w14="http://schemas.microsoft.com/office/word/2010/wordml" xmlns:w15="http://schemas.microsoft.com/office/word/2012/wordml" xmlns:w16cex="http://schemas.microsoft.com/office/word/2018/wordml/cex" xmlns:w16cid="http://schemas.microsoft.com/office/word/2016/wordml/cid" xmlns:w16="http://schemas.microsoft.com/office/word/2018/wordml" xmlns:w16sdtdh="http://schemas.microsoft.com/office/word/2020/wordml/sdtdatahash" xmlns:w16se="http://schemas.microsoft.com/office/word/2015/wordml/symex" xmlns:wpg="http://schemas.microsoft.com/office/word/2010/wordprocessingGroup" xmlns:wpi="http://schemas.microsoft.com/office/word/2010/wordprocessingInk" xmlns:wne="http://schemas.microsoft.com/office/word/2006/wordml" xmlns:wps="http://schemas.microsoft.com/office/word/2010/wordprocessingShape" mc:Ignorable="w14 w15 w16se w16cid w16 w16cex w16sdtdh wp14">
-  <w:p>
-    <w:pPr>
-      <w:pStyle w:val="Cabealho"/>
-    </w:pPr>
-    <w:r>
-      <w:t>v</w:t>
-    </w:r>
-  </w:p>
-</w:hdr>
-</file>
-
-<file path=word/header9.xml><?xml version="1.0" encoding="utf-8"?>
-<w:hdr xmlns:wpc="http://schemas.microsoft.com/office/word/2010/wordprocessingCanvas" xmlns:cx="http://schemas.microsoft.com/office/drawing/2014/chartex" xmlns:cx1="http://schemas.microsoft.com/office/drawing/2015/9/8/chartex" xmlns:cx2="http://schemas.microsoft.com/office/drawing/2015/10/21/chartex" xmlns:cx3="http://schemas.microsoft.com/office/drawing/2016/5/9/chartex" xmlns:cx4="http://schemas.microsoft.com/office/drawing/2016/5/10/chartex" xmlns:cx5="http://schemas.microsoft.com/office/drawing/2016/5/11/chartex" xmlns:cx6="http://schemas.microsoft.com/office/drawing/2016/5/12/chartex" xmlns:cx7="http://schemas.microsoft.com/office/drawing/2016/5/13/chartex" xmlns:cx8="http://schemas.microsoft.com/office/drawing/2016/5/14/chartex" xmlns:mc="http://schemas.openxmlformats.org/markup-compatibility/2006" xmlns:aink="http://schemas.microsoft.com/office/drawing/2016/ink" xmlns:am3d="http://schemas.microsoft.com/office/drawing/2017/model3d" xmlns:o="urn:schemas-microsoft-com:office:office" xmlns:oel="http://schemas.microsoft.com/office/2019/extlst" xmlns:r="http://schemas.openxmlformats.org/officeDocument/2006/relationships" xmlns:m="http://schemas.openxmlformats.org/officeDocument/2006/math" xmlns:v="urn:schemas-microsoft-com:vml" xmlns:wp14="http://schemas.microsoft.com/office/word/2010/wordprocessingDrawing" xmlns:wp="http://schemas.openxmlformats.org/drawingml/2006/wordprocessingDrawing" xmlns:w10="urn:schemas-microsoft-com:office:word" xmlns:w="http://schemas.openxmlformats.org/wordprocessingml/2006/main" xmlns:w14="http://schemas.microsoft.com/office/word/2010/wordml" xmlns:w15="http://schemas.microsoft.com/office/word/2012/wordml" xmlns:w16cex="http://schemas.microsoft.com/office/word/2018/wordml/cex" xmlns:w16cid="http://schemas.microsoft.com/office/word/2016/wordml/cid" xmlns:w16="http://schemas.microsoft.com/office/word/2018/wordml" xmlns:w16sdtdh="http://schemas.microsoft.com/office/word/2020/wordml/sdtdatahash" xmlns:w16se="http://schemas.microsoft.com/office/word/2015/wordml/symex" xmlns:wpg="http://schemas.microsoft.com/office/word/2010/wordprocessingGroup" xmlns:wpi="http://schemas.microsoft.com/office/word/2010/wordprocessingInk" xmlns:wne="http://schemas.microsoft.com/office/word/2006/wordml" xmlns:wps="http://schemas.microsoft.com/office/word/2010/wordprocessingShape" mc:Ignorable="w14 w15 w16se w16cid w16 w16cex w16sdtdh wp14">
-  <w:p>
-    <w:pPr>
-      <w:pStyle w:val="Cabealho"/>
-    </w:pPr>
-    <w:r>
-      <w:t>vi</w:t>
-    </w:r>
-  </w:p>
-</w:hdr>
-</file>
-
 <file path=word/numbering.xml><?xml version="1.0" encoding="utf-8"?>
-<w:numbering xmlns:wpc="http://schemas.microsoft.com/office/word/2010/wordprocessingCanvas" xmlns:cx="http://schemas.microsoft.com/office/drawing/2014/chartex" xmlns:cx1="http://schemas.microsoft.com/office/drawing/2015/9/8/chartex" xmlns:cx2="http://schemas.microsoft.com/office/drawing/2015/10/21/chartex" xmlns:cx3="http://schemas.microsoft.com/office/drawing/2016/5/9/chartex" xmlns:cx4="http://schemas.microsoft.com/office/drawing/2016/5/10/chartex" xmlns:cx5="http://schemas.microsoft.com/office/drawing/2016/5/11/chartex" xmlns:cx6="http://schemas.microsoft.com/office/drawing/2016/5/12/chartex" xmlns:cx7="http://schemas.microsoft.com/office/drawing/2016/5/13/chartex" xmlns:cx8="http://schemas.microsoft.com/office/drawing/2016/5/14/chartex" xmlns:mc="http://schemas.openxmlformats.org/markup-compatibility/2006" xmlns:aink="http://schemas.microsoft.com/office/drawing/2016/ink" xmlns:am3d="http://schemas.microsoft.com/office/drawing/2017/model3d" xmlns:o="urn:schemas-microsoft-com:office:office" xmlns:oel="http://schemas.microsoft.com/office/2019/extlst" xmlns:r="http://schemas.openxmlformats.org/officeDocument/2006/relationships" xmlns:m="http://schemas.openxmlformats.org/officeDocument/2006/math" xmlns:v="urn:schemas-microsoft-com:vml" xmlns:wp14="http://schemas.microsoft.com/office/word/2010/wordprocessingDrawing" xmlns:wp="http://schemas.openxmlformats.org/drawingml/2006/wordprocessingDrawing" xmlns:w10="urn:schemas-microsoft-com:office:word" xmlns:w="http://schemas.openxmlformats.org/wordprocessingml/2006/main" xmlns:w14="http://schemas.microsoft.com/office/word/2010/wordml" xmlns:w15="http://schemas.microsoft.com/office/word/2012/wordml" xmlns:w16cex="http://schemas.microsoft.com/office/word/2018/wordml/cex" xmlns:w16cid="http://schemas.microsoft.com/office/word/2016/wordml/cid" xmlns:w16="http://schemas.microsoft.com/office/word/2018/wordml" xmlns:w16sdtdh="http://schemas.microsoft.com/office/word/2020/wordml/sdtdatahash" xmlns:w16se="http://schemas.microsoft.com/office/word/2015/wordml/symex" xmlns:wpg="http://schemas.microsoft.com/office/word/2010/wordprocessingGroup" xmlns:wpi="http://schemas.microsoft.com/office/word/2010/wordprocessingInk" xmlns:wne="http://schemas.microsoft.com/office/word/2006/wordml" xmlns:wps="http://schemas.microsoft.com/office/word/2010/wordprocessingShape" mc:Ignorable="w14 w15 w16se w16cid w16 w16cex w16sdtdh wp14">
+<w:numbering xmlns:wpc="http://schemas.microsoft.com/office/word/2010/wordprocessingCanvas" xmlns:cx="http://schemas.microsoft.com/office/drawing/2014/chartex" xmlns:cx1="http://schemas.microsoft.com/office/drawing/2015/9/8/chartex" xmlns:cx2="http://schemas.microsoft.com/office/drawing/2015/10/21/chartex" xmlns:cx3="http://schemas.microsoft.com/office/drawing/2016/5/9/chartex" xmlns:cx4="http://schemas.microsoft.com/office/drawing/2016/5/10/chartex" xmlns:cx5="http://schemas.microsoft.com/office/drawing/2016/5/11/chartex" xmlns:cx6="http://schemas.microsoft.com/office/drawing/2016/5/12/chartex" xmlns:cx7="http://schemas.microsoft.com/office/drawing/2016/5/13/chartex" xmlns:cx8="http://schemas.microsoft.com/office/drawing/2016/5/14/chartex" xmlns:mc="http://schemas.openxmlformats.org/markup-compatibility/2006" xmlns:aink="http://schemas.microsoft.com/office/drawing/2016/ink" xmlns:am3d="http://schemas.microsoft.com/office/drawing/2017/model3d" xmlns:o="urn:schemas-microsoft-com:office:office" xmlns:oel="http://schemas.microsoft.com/office/2019/extlst" xmlns:r="http://schemas.openxmlformats.org/officeDocument/2006/relationships" xmlns:m="http://schemas.openxmlformats.org/officeDocument/2006/math" xmlns:v="urn:schemas-microsoft-com:vml" xmlns:wp14="http://schemas.microsoft.com/office/word/2010/wordprocessingDrawing" xmlns:wp="http://schemas.openxmlformats.org/drawingml/2006/wordprocessingDrawing" xmlns:w10="urn:schemas-microsoft-com:office:word" xmlns:w="http://schemas.openxmlformats.org/wordprocessingml/2006/main" xmlns:w14="http://schemas.microsoft.com/office/word/2010/wordml" xmlns:w15="http://schemas.microsoft.com/office/word/2012/wordml" xmlns:w16cex="http://schemas.microsoft.com/office/word/2018/wordml/cex" xmlns:w16cid="http://schemas.microsoft.com/office/word/2016/wordml/cid" xmlns:w16="http://schemas.microsoft.com/office/word/2018/wordml" xmlns:w16du="http://schemas.microsoft.com/office/word/2023/wordml/word16du" xmlns:w16sdtdh="http://schemas.microsoft.com/office/word/2020/wordml/sdtdatahash" xmlns:w16sdtfl="http://schemas.microsoft.com/office/word/2024/wordml/sdtformatlock" xmlns:w16se="http://schemas.microsoft.com/office/word/2015/wordml/symex" xmlns:wpg="http://schemas.microsoft.com/office/word/2010/wordprocessingGroup" xmlns:wpi="http://schemas.microsoft.com/office/word/2010/wordprocessingInk" xmlns:wne="http://schemas.microsoft.com/office/word/2006/wordml" xmlns:wps="http://schemas.microsoft.com/office/word/2010/wordprocessingShape" mc:Ignorable="w14 w15 w16se w16cid w16 w16cex w16sdtdh w16sdtfl w16du wp14">
   <w:abstractNum w:abstractNumId="0" w15:restartNumberingAfterBreak="0">
     <w:nsid w:val="00000001"/>
     <w:multiLevelType w:val="multilevel"/>
@@ -5048,55 +6493,147 @@
       </w:pPr>
     </w:lvl>
   </w:abstractNum>
-  <w:num w:numId="1" w16cid:durableId="1252815022">
+  <w:abstractNum w:abstractNumId="11" w15:restartNumberingAfterBreak="0">
+    <w:nsid w:val="798E4E6E"/>
+    <w:multiLevelType w:val="hybridMultilevel"/>
+    <w:tmpl w:val="FFFFFFFF"/>
+    <w:lvl w:ilvl="0" w:tplc="2AD46EF0">
+      <w:start w:val="1"/>
+      <w:numFmt w:val="decimal"/>
+      <w:lvlText w:val="FIGURA %1 - "/>
+      <w:lvlJc w:val="left"/>
+      <w:pPr>
+        <w:ind w:left="2722" w:hanging="1304"/>
+      </w:pPr>
+      <w:rPr>
+        <w:rFonts w:ascii="Times New Roman" w:hAnsi="Times New Roman" w:hint="default"/>
+      </w:rPr>
+    </w:lvl>
+    <w:lvl w:ilvl="1" w:tplc="6732787E">
+      <w:start w:val="1"/>
+      <w:numFmt w:val="lowerLetter"/>
+      <w:lvlText w:val="%2."/>
+      <w:lvlJc w:val="left"/>
+      <w:pPr>
+        <w:ind w:left="1440" w:hanging="360"/>
+      </w:pPr>
+    </w:lvl>
+    <w:lvl w:ilvl="2" w:tplc="E026B5F0">
+      <w:start w:val="1"/>
+      <w:numFmt w:val="lowerRoman"/>
+      <w:lvlText w:val="%3."/>
+      <w:lvlJc w:val="right"/>
+      <w:pPr>
+        <w:ind w:left="2160" w:hanging="180"/>
+      </w:pPr>
+    </w:lvl>
+    <w:lvl w:ilvl="3" w:tplc="54E66282">
+      <w:start w:val="1"/>
+      <w:numFmt w:val="decimal"/>
+      <w:lvlText w:val="%4."/>
+      <w:lvlJc w:val="left"/>
+      <w:pPr>
+        <w:ind w:left="2880" w:hanging="360"/>
+      </w:pPr>
+    </w:lvl>
+    <w:lvl w:ilvl="4" w:tplc="9B361306">
+      <w:start w:val="1"/>
+      <w:numFmt w:val="lowerLetter"/>
+      <w:lvlText w:val="%5."/>
+      <w:lvlJc w:val="left"/>
+      <w:pPr>
+        <w:ind w:left="3600" w:hanging="360"/>
+      </w:pPr>
+    </w:lvl>
+    <w:lvl w:ilvl="5" w:tplc="0EBEFD58">
+      <w:start w:val="1"/>
+      <w:numFmt w:val="lowerRoman"/>
+      <w:lvlText w:val="%6."/>
+      <w:lvlJc w:val="right"/>
+      <w:pPr>
+        <w:ind w:left="4320" w:hanging="180"/>
+      </w:pPr>
+    </w:lvl>
+    <w:lvl w:ilvl="6" w:tplc="C6F8C370">
+      <w:start w:val="1"/>
+      <w:numFmt w:val="decimal"/>
+      <w:lvlText w:val="%7."/>
+      <w:lvlJc w:val="left"/>
+      <w:pPr>
+        <w:ind w:left="5040" w:hanging="360"/>
+      </w:pPr>
+    </w:lvl>
+    <w:lvl w:ilvl="7" w:tplc="2C22A358">
+      <w:start w:val="1"/>
+      <w:numFmt w:val="lowerLetter"/>
+      <w:lvlText w:val="%8."/>
+      <w:lvlJc w:val="left"/>
+      <w:pPr>
+        <w:ind w:left="5760" w:hanging="360"/>
+      </w:pPr>
+    </w:lvl>
+    <w:lvl w:ilvl="8" w:tplc="ECB0D43A">
+      <w:start w:val="1"/>
+      <w:numFmt w:val="lowerRoman"/>
+      <w:lvlText w:val="%9."/>
+      <w:lvlJc w:val="right"/>
+      <w:pPr>
+        <w:ind w:left="6480" w:hanging="180"/>
+      </w:pPr>
+    </w:lvl>
+  </w:abstractNum>
+  <w:num w:numId="1" w16cid:durableId="710770037">
+    <w:abstractNumId w:val="11"/>
+  </w:num>
+  <w:num w:numId="2" w16cid:durableId="1252815022">
     <w:abstractNumId w:val="3"/>
   </w:num>
-  <w:num w:numId="2" w16cid:durableId="467747690">
+  <w:num w:numId="3" w16cid:durableId="467747690">
     <w:abstractNumId w:val="8"/>
   </w:num>
-  <w:num w:numId="3" w16cid:durableId="1898085235">
+  <w:num w:numId="4" w16cid:durableId="1898085235">
     <w:abstractNumId w:val="4"/>
   </w:num>
-  <w:num w:numId="4" w16cid:durableId="2006736264">
+  <w:num w:numId="5" w16cid:durableId="2006736264">
     <w:abstractNumId w:val="7"/>
     <w:lvlOverride w:ilvl="0">
       <w:startOverride w:val="1"/>
     </w:lvlOverride>
   </w:num>
-  <w:num w:numId="5" w16cid:durableId="2089840616">
+  <w:num w:numId="6" w16cid:durableId="2089840616">
     <w:abstractNumId w:val="7"/>
     <w:lvlOverride w:ilvl="0">
       <w:startOverride w:val="1"/>
     </w:lvlOverride>
   </w:num>
-  <w:num w:numId="6" w16cid:durableId="1644191920">
+  <w:num w:numId="7" w16cid:durableId="1644191920">
     <w:abstractNumId w:val="7"/>
   </w:num>
-  <w:num w:numId="7" w16cid:durableId="1815365057">
+  <w:num w:numId="8" w16cid:durableId="1815365057">
     <w:abstractNumId w:val="5"/>
   </w:num>
-  <w:num w:numId="8" w16cid:durableId="334577241">
+  <w:num w:numId="9" w16cid:durableId="334577241">
     <w:abstractNumId w:val="7"/>
     <w:lvlOverride w:ilvl="0">
       <w:startOverride w:val="1"/>
     </w:lvlOverride>
   </w:num>
-  <w:num w:numId="9" w16cid:durableId="1649557162">
+  <w:num w:numId="10" w16cid:durableId="1649557162">
     <w:abstractNumId w:val="9"/>
   </w:num>
-  <w:num w:numId="10" w16cid:durableId="1828747703">
+  <w:num w:numId="11" w16cid:durableId="1828747703">
     <w:abstractNumId w:val="10"/>
   </w:num>
-  <w:num w:numId="11" w16cid:durableId="519003112">
+  <w:num w:numId="12" w16cid:durableId="519003112">
     <w:abstractNumId w:val="7"/>
     <w:lvlOverride w:ilvl="0">
       <w:startOverride w:val="1"/>
     </w:lvlOverride>
   </w:num>
-  <w:num w:numId="12" w16cid:durableId="940069361">
+  <w:num w:numId="13" w16cid:durableId="940069361">
     <w:abstractNumId w:val="6"/>
   </w:num>
-  <w:num w:numId="13" w16cid:durableId="482506668">
+  <w:num w:numId="14" w16cid:durableId="482506668">
     <w:abstractNumId w:val="7"/>
     <w:lvlOverride w:ilvl="0">
       <w:startOverride w:val="1"/>
@@ -5107,7 +6644,7 @@
 </file>
 
 <file path=word/styles.xml><?xml version="1.0" encoding="utf-8"?>
-<w:styles xmlns:mc="http://schemas.openxmlformats.org/markup-compatibility/2006" xmlns:r="http://schemas.openxmlformats.org/officeDocument/2006/relationships" xmlns:w="http://schemas.openxmlformats.org/wordprocessingml/2006/main" xmlns:w14="http://schemas.microsoft.com/office/word/2010/wordml" xmlns:w15="http://schemas.microsoft.com/office/word/2012/wordml" xmlns:w16cex="http://schemas.microsoft.com/office/word/2018/wordml/cex" xmlns:w16cid="http://schemas.microsoft.com/office/word/2016/wordml/cid" xmlns:w16="http://schemas.microsoft.com/office/word/2018/wordml" xmlns:w16sdtdh="http://schemas.microsoft.com/office/word/2020/wordml/sdtdatahash" xmlns:w16se="http://schemas.microsoft.com/office/word/2015/wordml/symex" mc:Ignorable="w14 w15 w16se w16cid w16 w16cex w16sdtdh">
+<w:styles xmlns:mc="http://schemas.openxmlformats.org/markup-compatibility/2006" xmlns:r="http://schemas.openxmlformats.org/officeDocument/2006/relationships" xmlns:w="http://schemas.openxmlformats.org/wordprocessingml/2006/main" xmlns:w14="http://schemas.microsoft.com/office/word/2010/wordml" xmlns:w15="http://schemas.microsoft.com/office/word/2012/wordml" xmlns:w16cex="http://schemas.microsoft.com/office/word/2018/wordml/cex" xmlns:w16cid="http://schemas.microsoft.com/office/word/2016/wordml/cid" xmlns:w16="http://schemas.microsoft.com/office/word/2018/wordml" xmlns:w16du="http://schemas.microsoft.com/office/word/2023/wordml/word16du" xmlns:w16sdtdh="http://schemas.microsoft.com/office/word/2020/wordml/sdtdatahash" xmlns:w16sdtfl="http://schemas.microsoft.com/office/word/2024/wordml/sdtformatlock" xmlns:w16se="http://schemas.microsoft.com/office/word/2015/wordml/symex" mc:Ignorable="w14 w15 w16se w16cid w16 w16cex w16sdtdh w16sdtfl w16du">
   <w:docDefaults>
     <w:rPrDefault>
       <w:rPr>
@@ -5920,7 +7457,7 @@
       <w:pageBreakBefore/>
       <w:widowControl w:val="0"/>
       <w:numPr>
-        <w:numId w:val="7"/>
+        <w:numId w:val="8"/>
       </w:numPr>
       <w:spacing w:before="980" w:after="1740" w:line="360" w:lineRule="auto"/>
       <w:ind w:left="283"/>
@@ -5941,7 +7478,7 @@
     <w:pPr>
       <w:widowControl w:val="0"/>
       <w:numPr>
-        <w:numId w:val="6"/>
+        <w:numId w:val="7"/>
       </w:numPr>
       <w:spacing w:line="360" w:lineRule="auto"/>
       <w:jc w:val="both"/>
@@ -5958,7 +7495,7 @@
     <w:pPr>
       <w:widowControl w:val="0"/>
       <w:numPr>
-        <w:numId w:val="1"/>
+        <w:numId w:val="2"/>
       </w:numPr>
       <w:spacing w:line="360" w:lineRule="auto"/>
       <w:ind w:left="1718" w:hanging="357"/>
@@ -5976,7 +7513,7 @@
     <w:pPr>
       <w:widowControl w:val="0"/>
       <w:numPr>
-        <w:numId w:val="2"/>
+        <w:numId w:val="3"/>
       </w:numPr>
       <w:tabs>
         <w:tab w:val="clear" w:pos="360"/>
@@ -5998,7 +7535,7 @@
       <w:widowControl w:val="0"/>
       <w:numPr>
         <w:ilvl w:val="1"/>
-        <w:numId w:val="7"/>
+        <w:numId w:val="8"/>
       </w:numPr>
       <w:spacing w:before="580" w:after="300" w:line="360" w:lineRule="auto"/>
       <w:jc w:val="both"/>
@@ -6018,7 +7555,7 @@
       <w:widowControl w:val="0"/>
       <w:numPr>
         <w:ilvl w:val="2"/>
-        <w:numId w:val="7"/>
+        <w:numId w:val="8"/>
       </w:numPr>
       <w:spacing w:before="300" w:after="300" w:line="360" w:lineRule="auto"/>
       <w:jc w:val="both"/>
@@ -6038,7 +7575,7 @@
       <w:widowControl w:val="0"/>
       <w:numPr>
         <w:ilvl w:val="3"/>
-        <w:numId w:val="7"/>
+        <w:numId w:val="8"/>
       </w:numPr>
       <w:spacing w:before="200" w:after="200" w:line="360" w:lineRule="auto"/>
       <w:jc w:val="both"/>
@@ -6118,7 +7655,7 @@
       <w:widowControl w:val="0"/>
       <w:numPr>
         <w:ilvl w:val="4"/>
-        <w:numId w:val="7"/>
+        <w:numId w:val="8"/>
       </w:numPr>
       <w:spacing w:before="200" w:after="200" w:line="360" w:lineRule="auto"/>
       <w:jc w:val="both"/>
@@ -6315,7 +7852,7 @@
     <w:pPr>
       <w:widowControl w:val="0"/>
       <w:numPr>
-        <w:numId w:val="9"/>
+        <w:numId w:val="10"/>
       </w:numPr>
       <w:tabs>
         <w:tab w:val="clear" w:pos="1418"/>
@@ -6351,7 +7888,7 @@
     <w:pPr>
       <w:widowControl w:val="0"/>
       <w:numPr>
-        <w:numId w:val="12"/>
+        <w:numId w:val="13"/>
       </w:numPr>
       <w:spacing w:before="240"/>
       <w:jc w:val="center"/>
@@ -6431,7 +7968,7 @@
       <w:widowControl w:val="0"/>
       <w:numPr>
         <w:ilvl w:val="4"/>
-        <w:numId w:val="3"/>
+        <w:numId w:val="4"/>
       </w:numPr>
       <w:spacing w:after="1701" w:line="360" w:lineRule="auto"/>
       <w:jc w:val="center"/>
@@ -6717,7 +8254,7 @@
     <w:rsid w:val="0041607B"/>
     <w:pPr>
       <w:numPr>
-        <w:numId w:val="10"/>
+        <w:numId w:val="11"/>
       </w:numPr>
       <w:spacing w:before="240"/>
       <w:jc w:val="center"/>
@@ -6853,6 +8390,34 @@
       <w:ind w:left="720"/>
       <w:contextualSpacing/>
     </w:pPr>
+  </w:style>
+  <w:style w:type="paragraph" w:styleId="Subttulo">
+    <w:name w:val="Subtitle"/>
+    <w:basedOn w:val="Normal"/>
+    <w:next w:val="Normal"/>
+    <w:link w:val="SubttuloChar"/>
+    <w:uiPriority w:val="11"/>
+    <w:qFormat/>
+    <w:rsid w:val="36C0377B"/>
+    <w:rPr>
+      <w:rFonts w:eastAsiaTheme="majorEastAsia" w:cstheme="majorBidi"/>
+      <w:color w:val="595959" w:themeColor="text1" w:themeTint="A6"/>
+      <w:sz w:val="28"/>
+      <w:szCs w:val="28"/>
+    </w:rPr>
+  </w:style>
+  <w:style w:type="character" w:customStyle="1" w:styleId="SubttuloChar">
+    <w:name w:val="Subtítulo Char"/>
+    <w:basedOn w:val="Fontepargpadro"/>
+    <w:link w:val="Subttulo"/>
+    <w:uiPriority w:val="11"/>
+    <w:rsid w:val="36C0377B"/>
+    <w:rPr>
+      <w:rFonts w:eastAsiaTheme="majorEastAsia" w:cstheme="majorBidi"/>
+      <w:color w:val="595959" w:themeColor="text1" w:themeTint="A6"/>
+      <w:sz w:val="28"/>
+      <w:szCs w:val="28"/>
+    </w:rPr>
   </w:style>
 </w:styles>
 </file>

</xml_diff>

<commit_message>
Adicionando tabelas no capítulo 2 e ajustando texto
</commit_message>
<xml_diff>
--- a/docs/Rascunho TCC.docx
+++ b/docs/Rascunho TCC.docx
@@ -247,6 +247,7 @@
         <w:pStyle w:val="CP-CapaCabecalho"/>
       </w:pPr>
       <w:r>
+        <w:lastRenderedPageBreak/>
         <w:t>AATEC - Área de Agrárias, Engenharias e Tecnologias</w:t>
       </w:r>
     </w:p>
@@ -375,49 +376,19 @@
         <w:pStyle w:val="CP-CapaOrientador"/>
       </w:pPr>
       <w:r>
-        <w:t xml:space="preserve">Orientador(a): </w:t>
-      </w:r>
-      <w:proofErr w:type="spellStart"/>
-      <w:r>
-        <w:t>Prof</w:t>
-      </w:r>
-      <w:proofErr w:type="spellEnd"/>
-      <w:r>
-        <w:t>(ª).</w:t>
+        <w:t>Orientador(a): Prof(ª).</w:t>
       </w:r>
       <w:r>
         <w:rPr>
           <w:highlight w:val="yellow"/>
         </w:rPr>
-        <w:t xml:space="preserve"> Lucas Antunes da Rocha </w:t>
-      </w:r>
-      <w:proofErr w:type="spellStart"/>
+        <w:t xml:space="preserve"> Lucas Antunes da Rocha Volfe</w:t>
+      </w:r>
       <w:r>
         <w:rPr>
           <w:highlight w:val="yellow"/>
         </w:rPr>
-        <w:t>Volfe</w:t>
-      </w:r>
-      <w:proofErr w:type="spellEnd"/>
-      <w:r>
-        <w:rPr>
-          <w:highlight w:val="yellow"/>
-        </w:rPr>
-        <w:t>, &lt;</w:t>
-      </w:r>
-      <w:proofErr w:type="spellStart"/>
-      <w:r>
-        <w:rPr>
-          <w:highlight w:val="yellow"/>
-        </w:rPr>
-        <w:t>Esp</w:t>
-      </w:r>
-      <w:proofErr w:type="spellEnd"/>
-      <w:r>
-        <w:rPr>
-          <w:highlight w:val="yellow"/>
-        </w:rPr>
-        <w:t>.,Me., Dr.&gt;</w:t>
+        <w:t>, &lt;Esp.,Me., Dr.&gt;</w:t>
       </w:r>
     </w:p>
     <w:p>
@@ -499,8 +470,9 @@
       <w:bookmarkStart w:id="2" w:name="_Toc527795382"/>
       <w:bookmarkStart w:id="3" w:name="_Toc527798492"/>
       <w:bookmarkStart w:id="4" w:name="_Toc159362151"/>
-      <w:bookmarkStart w:id="5" w:name="_Toc225859264"/>
-      <w:r>
+      <w:bookmarkStart w:id="5" w:name="_Toc228622500"/>
+      <w:r>
+        <w:lastRenderedPageBreak/>
         <w:t>Lista de</w:t>
       </w:r>
       <w:bookmarkEnd w:id="0"/>
@@ -515,7 +487,15 @@
     </w:p>
     <w:p>
       <w:pPr>
-        <w:pStyle w:val="TE-Normal"/>
+        <w:pStyle w:val="Sumrio9"/>
+        <w:rPr>
+          <w:rFonts w:asciiTheme="minorHAnsi" w:eastAsiaTheme="minorEastAsia" w:hAnsiTheme="minorHAnsi" w:cstheme="minorBidi"/>
+          <w:noProof/>
+          <w:kern w:val="2"/>
+          <w:sz w:val="24"/>
+          <w:szCs w:val="24"/>
+          <w14:ligatures w14:val="standardContextual"/>
+        </w:rPr>
       </w:pPr>
       <w:r>
         <w:rPr>
@@ -546,11 +526,162 @@
       </w:r>
       <w:r>
         <w:rPr>
-          <w:caps/>
+          <w:b/>
           <w:noProof/>
-        </w:rPr>
-        <w:t>Nenhuma entrada de sumário foi encontrada.</w:t>
-      </w:r>
+          <w:color w:val="000000" w:themeColor="text1"/>
+        </w:rPr>
+        <w:t>FIGURA 1 -</w:t>
+      </w:r>
+      <w:r>
+        <w:rPr>
+          <w:rFonts w:asciiTheme="minorHAnsi" w:eastAsiaTheme="minorEastAsia" w:hAnsiTheme="minorHAnsi" w:cstheme="minorBidi"/>
+          <w:noProof/>
+          <w:kern w:val="2"/>
+          <w:sz w:val="24"/>
+          <w:szCs w:val="24"/>
+          <w14:ligatures w14:val="standardContextual"/>
+        </w:rPr>
+        <w:tab/>
+      </w:r>
+      <w:r>
+        <w:rPr>
+          <w:noProof/>
+          <w:color w:val="000000" w:themeColor="text1"/>
+        </w:rPr>
+        <w:t>Exemplo de representação de uma partitura no formato MusicXML (Item 1.1)</w:t>
+      </w:r>
+      <w:r>
+        <w:rPr>
+          <w:noProof/>
+        </w:rPr>
+        <w:tab/>
+      </w:r>
+      <w:r>
+        <w:rPr>
+          <w:noProof/>
+        </w:rPr>
+        <w:fldChar w:fldCharType="begin"/>
+      </w:r>
+      <w:r>
+        <w:rPr>
+          <w:noProof/>
+        </w:rPr>
+        <w:instrText xml:space="preserve"> PAGEREF _Toc228620295 \h </w:instrText>
+      </w:r>
+      <w:r>
+        <w:rPr>
+          <w:noProof/>
+        </w:rPr>
+      </w:r>
+      <w:r>
+        <w:rPr>
+          <w:noProof/>
+        </w:rPr>
+        <w:fldChar w:fldCharType="separate"/>
+      </w:r>
+      <w:r>
+        <w:rPr>
+          <w:noProof/>
+        </w:rPr>
+        <w:t>15</w:t>
+      </w:r>
+      <w:r>
+        <w:rPr>
+          <w:noProof/>
+        </w:rPr>
+        <w:fldChar w:fldCharType="end"/>
+      </w:r>
+    </w:p>
+    <w:p>
+      <w:pPr>
+        <w:pStyle w:val="Sumrio9"/>
+        <w:rPr>
+          <w:rFonts w:asciiTheme="minorHAnsi" w:eastAsiaTheme="minorEastAsia" w:hAnsiTheme="minorHAnsi" w:cstheme="minorBidi"/>
+          <w:noProof/>
+          <w:kern w:val="2"/>
+          <w:sz w:val="24"/>
+          <w:szCs w:val="24"/>
+          <w14:ligatures w14:val="standardContextual"/>
+        </w:rPr>
+      </w:pPr>
+      <w:r>
+        <w:rPr>
+          <w:b/>
+          <w:noProof/>
+          <w:color w:val="000000" w:themeColor="text1"/>
+        </w:rPr>
+        <w:t>FIGURA 2 -</w:t>
+      </w:r>
+      <w:r>
+        <w:rPr>
+          <w:rFonts w:asciiTheme="minorHAnsi" w:eastAsiaTheme="minorEastAsia" w:hAnsiTheme="minorHAnsi" w:cstheme="minorBidi"/>
+          <w:noProof/>
+          <w:kern w:val="2"/>
+          <w:sz w:val="24"/>
+          <w:szCs w:val="24"/>
+          <w14:ligatures w14:val="standardContextual"/>
+        </w:rPr>
+        <w:tab/>
+      </w:r>
+      <w:r>
+        <w:rPr>
+          <w:noProof/>
+        </w:rPr>
+        <w:t>Exemplo de padrão melódico recorrente em partitura, evidenciando a repetição de motivos musicais.</w:t>
+      </w:r>
+      <w:r>
+        <w:rPr>
+          <w:noProof/>
+          <w:color w:val="000000" w:themeColor="text1"/>
+        </w:rPr>
+        <w:t xml:space="preserve"> (Item 1.1)</w:t>
+      </w:r>
+      <w:r>
+        <w:rPr>
+          <w:noProof/>
+        </w:rPr>
+        <w:tab/>
+      </w:r>
+      <w:r>
+        <w:rPr>
+          <w:noProof/>
+        </w:rPr>
+        <w:fldChar w:fldCharType="begin"/>
+      </w:r>
+      <w:r>
+        <w:rPr>
+          <w:noProof/>
+        </w:rPr>
+        <w:instrText xml:space="preserve"> PAGEREF _Toc228620296 \h </w:instrText>
+      </w:r>
+      <w:r>
+        <w:rPr>
+          <w:noProof/>
+        </w:rPr>
+      </w:r>
+      <w:r>
+        <w:rPr>
+          <w:noProof/>
+        </w:rPr>
+        <w:fldChar w:fldCharType="separate"/>
+      </w:r>
+      <w:r>
+        <w:rPr>
+          <w:noProof/>
+        </w:rPr>
+        <w:t>17</w:t>
+      </w:r>
+      <w:r>
+        <w:rPr>
+          <w:noProof/>
+        </w:rPr>
+        <w:fldChar w:fldCharType="end"/>
+      </w:r>
+    </w:p>
+    <w:p>
+      <w:pPr>
+        <w:pStyle w:val="TE-Normal"/>
+      </w:pPr>
       <w:r>
         <w:rPr>
           <w:b/>
@@ -661,8 +792,9 @@
         <w:pStyle w:val="TC-TituloCentralizado"/>
       </w:pPr>
       <w:bookmarkStart w:id="6" w:name="_Toc159362152"/>
-      <w:bookmarkStart w:id="7" w:name="_Toc225859265"/>
-      <w:r>
+      <w:bookmarkStart w:id="7" w:name="_Toc228622501"/>
+      <w:r>
+        <w:lastRenderedPageBreak/>
         <w:t>Lista de QUADROS</w:t>
       </w:r>
       <w:bookmarkEnd w:id="6"/>
@@ -676,42 +808,6 @@
           <w:snapToGrid/>
         </w:rPr>
       </w:pPr>
-      <w:r>
-        <w:rPr>
-          <w:noProof/>
-          <w:szCs w:val="26"/>
-        </w:rPr>
-        <w:fldChar w:fldCharType="begin"/>
-      </w:r>
-      <w:r>
-        <w:rPr>
-          <w:noProof/>
-        </w:rPr>
-        <w:instrText xml:space="preserve"> TOC \t "TE-LegendaQuadro;9" </w:instrText>
-      </w:r>
-      <w:r>
-        <w:rPr>
-          <w:noProof/>
-          <w:szCs w:val="26"/>
-        </w:rPr>
-        <w:fldChar w:fldCharType="separate"/>
-      </w:r>
-      <w:r>
-        <w:rPr>
-          <w:b/>
-          <w:bCs/>
-          <w:noProof/>
-          <w:szCs w:val="26"/>
-        </w:rPr>
-        <w:t>Nenhuma entrada de sumário foi encontrada.</w:t>
-      </w:r>
-      <w:r>
-        <w:rPr>
-          <w:noProof/>
-          <w:snapToGrid/>
-        </w:rPr>
-        <w:fldChar w:fldCharType="end"/>
-      </w:r>
     </w:p>
     <w:p>
       <w:pPr>
@@ -840,54 +936,84 @@
       <w:pPr>
         <w:pStyle w:val="TC-TituloCentralizado"/>
       </w:pPr>
-      <w:bookmarkStart w:id="8" w:name="_Toc159362153"/>
-      <w:bookmarkStart w:id="9" w:name="_Toc225859266"/>
-      <w:r>
-        <w:t>Lista de tabelas</w:t>
-      </w:r>
-      <w:bookmarkEnd w:id="8"/>
-      <w:bookmarkEnd w:id="9"/>
-    </w:p>
-    <w:p>
-      <w:pPr>
-        <w:pStyle w:val="TE-Normal"/>
-        <w:rPr>
-          <w:noProof/>
-          <w:snapToGrid/>
-        </w:rPr>
-      </w:pPr>
-      <w:r>
-        <w:rPr>
-          <w:noProof/>
-        </w:rPr>
-        <w:fldChar w:fldCharType="begin"/>
-      </w:r>
-      <w:r>
-        <w:rPr>
-          <w:noProof/>
-        </w:rPr>
-        <w:instrText xml:space="preserve"> TOC \t "TE-LegendaTabela;9" </w:instrText>
-      </w:r>
-      <w:r>
-        <w:rPr>
-          <w:noProof/>
-        </w:rPr>
-        <w:fldChar w:fldCharType="separate"/>
-      </w:r>
-      <w:r>
-        <w:rPr>
-          <w:b/>
-          <w:bCs/>
-          <w:noProof/>
-        </w:rPr>
-        <w:t>Nenhuma entrada de sumário foi encontrada.</w:t>
-      </w:r>
-      <w:r>
-        <w:rPr>
-          <w:noProof/>
-        </w:rPr>
-        <w:fldChar w:fldCharType="end"/>
-      </w:r>
+      <w:r>
+        <w:lastRenderedPageBreak/>
+        <w:t xml:space="preserve">Lista de </w:t>
+      </w:r>
+      <w:r>
+        <w:t>tABELAS</w:t>
+      </w:r>
+    </w:p>
+    <w:sdt>
+      <w:sdtPr>
+        <w:id w:val="-1556333960"/>
+        <w:docPartObj>
+          <w:docPartGallery w:val="Table of Contents"/>
+          <w:docPartUnique/>
+        </w:docPartObj>
+      </w:sdtPr>
+      <w:sdtContent>
+        <w:p>
+          <w:pPr>
+            <w:widowControl w:val="0"/>
+            <w:pBdr>
+              <w:top w:val="nil"/>
+              <w:left w:val="nil"/>
+              <w:bottom w:val="nil"/>
+              <w:right w:val="nil"/>
+              <w:between w:val="nil"/>
+            </w:pBdr>
+            <w:spacing w:line="360" w:lineRule="auto"/>
+            <w:ind w:firstLine="1009"/>
+            <w:jc w:val="both"/>
+            <w:rPr>
+              <w:color w:val="000000"/>
+              <w:sz w:val="26"/>
+              <w:szCs w:val="26"/>
+            </w:rPr>
+          </w:pPr>
+          <w:r>
+            <w:fldChar w:fldCharType="begin"/>
+          </w:r>
+          <w:r>
+            <w:instrText xml:space="preserve"> TOC \h \u \z \t "Heading 1,1,Heading 2,2,Heading 3,3,Heading 4,4,Heading 5,5,Heading 6,6,"</w:instrText>
+          </w:r>
+          <w:r>
+            <w:fldChar w:fldCharType="separate"/>
+          </w:r>
+          <w:r>
+            <w:rPr>
+              <w:b/>
+              <w:bCs/>
+              <w:noProof/>
+            </w:rPr>
+            <w:t>Nenhuma entrada de sumário foi encontrada.</w:t>
+          </w:r>
+          <w:r>
+            <w:fldChar w:fldCharType="end"/>
+          </w:r>
+        </w:p>
+      </w:sdtContent>
+    </w:sdt>
+    <w:p>
+      <w:pPr>
+        <w:widowControl w:val="0"/>
+        <w:pBdr>
+          <w:top w:val="nil"/>
+          <w:left w:val="nil"/>
+          <w:bottom w:val="nil"/>
+          <w:right w:val="nil"/>
+          <w:between w:val="nil"/>
+        </w:pBdr>
+        <w:spacing w:line="360" w:lineRule="auto"/>
+        <w:ind w:firstLine="1009"/>
+        <w:jc w:val="both"/>
+        <w:rPr>
+          <w:color w:val="000000"/>
+          <w:sz w:val="26"/>
+          <w:szCs w:val="26"/>
+        </w:rPr>
+      </w:pPr>
     </w:p>
     <w:p>
       <w:pPr>
@@ -1041,13 +1167,14 @@
       <w:pPr>
         <w:pStyle w:val="TC-TituloCentralizado"/>
       </w:pPr>
-      <w:bookmarkStart w:id="10" w:name="_Toc159362154"/>
-      <w:bookmarkStart w:id="11" w:name="_Toc225859267"/>
-      <w:r>
+      <w:bookmarkStart w:id="8" w:name="_Toc159362154"/>
+      <w:bookmarkStart w:id="9" w:name="_Toc228622503"/>
+      <w:r>
+        <w:lastRenderedPageBreak/>
         <w:t>Lista de Siglas</w:t>
       </w:r>
-      <w:bookmarkEnd w:id="10"/>
-      <w:bookmarkEnd w:id="11"/>
+      <w:bookmarkEnd w:id="8"/>
+      <w:bookmarkEnd w:id="9"/>
     </w:p>
     <w:p>
       <w:pPr>
@@ -1092,6 +1219,7 @@
         <w:pStyle w:val="TC-TituloSumario"/>
       </w:pPr>
       <w:r>
+        <w:lastRenderedPageBreak/>
         <w:t>Sumário</w:t>
       </w:r>
     </w:p>
@@ -1127,7 +1255,7 @@
         <w:fldChar w:fldCharType="begin"/>
       </w:r>
       <w:r>
-        <w:instrText xml:space="preserve"> PAGEREF _Toc225859264 \h </w:instrText>
+        <w:instrText xml:space="preserve"> PAGEREF _Toc228622500 \h </w:instrText>
       </w:r>
       <w:r>
         <w:fldChar w:fldCharType="separate"/>
@@ -1162,7 +1290,7 @@
         <w:fldChar w:fldCharType="begin"/>
       </w:r>
       <w:r>
-        <w:instrText xml:space="preserve"> PAGEREF _Toc225859265 \h </w:instrText>
+        <w:instrText xml:space="preserve"> PAGEREF _Toc228622501 \h </w:instrText>
       </w:r>
       <w:r>
         <w:fldChar w:fldCharType="separate"/>
@@ -1197,7 +1325,7 @@
         <w:fldChar w:fldCharType="begin"/>
       </w:r>
       <w:r>
-        <w:instrText xml:space="preserve"> PAGEREF _Toc225859266 \h </w:instrText>
+        <w:instrText xml:space="preserve"> PAGEREF _Toc228622502 \h </w:instrText>
       </w:r>
       <w:r>
         <w:fldChar w:fldCharType="separate"/>
@@ -1232,7 +1360,7 @@
         <w:fldChar w:fldCharType="begin"/>
       </w:r>
       <w:r>
-        <w:instrText xml:space="preserve"> PAGEREF _Toc225859267 \h </w:instrText>
+        <w:instrText xml:space="preserve"> PAGEREF _Toc228622503 \h </w:instrText>
       </w:r>
       <w:r>
         <w:fldChar w:fldCharType="separate"/>
@@ -1267,13 +1395,13 @@
         <w:fldChar w:fldCharType="begin"/>
       </w:r>
       <w:r>
-        <w:instrText xml:space="preserve"> PAGEREF _Toc225859268 \h </w:instrText>
+        <w:instrText xml:space="preserve"> PAGEREF _Toc228622504 \h </w:instrText>
       </w:r>
       <w:r>
         <w:fldChar w:fldCharType="separate"/>
       </w:r>
       <w:r>
-        <w:t>1</w:t>
+        <w:t>9</w:t>
       </w:r>
       <w:r>
         <w:fldChar w:fldCharType="end"/>
@@ -1300,13 +1428,13 @@
         <w:fldChar w:fldCharType="begin"/>
       </w:r>
       <w:r>
-        <w:instrText xml:space="preserve"> PAGEREF _Toc225859269 \h </w:instrText>
+        <w:instrText xml:space="preserve"> PAGEREF _Toc228622505 \h </w:instrText>
       </w:r>
       <w:r>
         <w:fldChar w:fldCharType="separate"/>
       </w:r>
       <w:r>
-        <w:t>1</w:t>
+        <w:t>10</w:t>
       </w:r>
       <w:r>
         <w:fldChar w:fldCharType="end"/>
@@ -1333,13 +1461,13 @@
         <w:fldChar w:fldCharType="begin"/>
       </w:r>
       <w:r>
-        <w:instrText xml:space="preserve"> PAGEREF _Toc225859270 \h </w:instrText>
+        <w:instrText xml:space="preserve"> PAGEREF _Toc228622506 \h </w:instrText>
       </w:r>
       <w:r>
         <w:fldChar w:fldCharType="separate"/>
       </w:r>
       <w:r>
-        <w:t>2</w:t>
+        <w:t>11</w:t>
       </w:r>
       <w:r>
         <w:fldChar w:fldCharType="end"/>
@@ -1366,13 +1494,13 @@
         <w:fldChar w:fldCharType="begin"/>
       </w:r>
       <w:r>
-        <w:instrText xml:space="preserve"> PAGEREF _Toc225859271 \h </w:instrText>
+        <w:instrText xml:space="preserve"> PAGEREF _Toc228622507 \h </w:instrText>
       </w:r>
       <w:r>
         <w:fldChar w:fldCharType="separate"/>
       </w:r>
       <w:r>
-        <w:t>2</w:t>
+        <w:t>11</w:t>
       </w:r>
       <w:r>
         <w:fldChar w:fldCharType="end"/>
@@ -1399,13 +1527,13 @@
         <w:fldChar w:fldCharType="begin"/>
       </w:r>
       <w:r>
-        <w:instrText xml:space="preserve"> PAGEREF _Toc225859272 \h </w:instrText>
+        <w:instrText xml:space="preserve"> PAGEREF _Toc228622508 \h </w:instrText>
       </w:r>
       <w:r>
         <w:fldChar w:fldCharType="separate"/>
       </w:r>
       <w:r>
-        <w:t>2</w:t>
+        <w:t>11</w:t>
       </w:r>
       <w:r>
         <w:fldChar w:fldCharType="end"/>
@@ -1432,13 +1560,13 @@
         <w:fldChar w:fldCharType="begin"/>
       </w:r>
       <w:r>
-        <w:instrText xml:space="preserve"> PAGEREF _Toc225859273 \h </w:instrText>
+        <w:instrText xml:space="preserve"> PAGEREF _Toc228622509 \h </w:instrText>
       </w:r>
       <w:r>
         <w:fldChar w:fldCharType="separate"/>
       </w:r>
       <w:r>
-        <w:t>2</w:t>
+        <w:t>12</w:t>
       </w:r>
       <w:r>
         <w:fldChar w:fldCharType="end"/>
@@ -1465,13 +1593,13 @@
         <w:fldChar w:fldCharType="begin"/>
       </w:r>
       <w:r>
-        <w:instrText xml:space="preserve"> PAGEREF _Toc225859274 \h </w:instrText>
+        <w:instrText xml:space="preserve"> PAGEREF _Toc228622510 \h </w:instrText>
       </w:r>
       <w:r>
         <w:fldChar w:fldCharType="separate"/>
       </w:r>
       <w:r>
-        <w:t>3</w:t>
+        <w:t>12</w:t>
       </w:r>
       <w:r>
         <w:fldChar w:fldCharType="end"/>
@@ -1498,13 +1626,13 @@
         <w:fldChar w:fldCharType="begin"/>
       </w:r>
       <w:r>
-        <w:instrText xml:space="preserve"> PAGEREF _Toc225859275 \h </w:instrText>
+        <w:instrText xml:space="preserve"> PAGEREF _Toc228622511 \h </w:instrText>
       </w:r>
       <w:r>
         <w:fldChar w:fldCharType="separate"/>
       </w:r>
       <w:r>
-        <w:t>4</w:t>
+        <w:t>13</w:t>
       </w:r>
       <w:r>
         <w:fldChar w:fldCharType="end"/>
@@ -1531,13 +1659,13 @@
         <w:fldChar w:fldCharType="begin"/>
       </w:r>
       <w:r>
-        <w:instrText xml:space="preserve"> PAGEREF _Toc225859276 \h </w:instrText>
+        <w:instrText xml:space="preserve"> PAGEREF _Toc228622512 \h </w:instrText>
       </w:r>
       <w:r>
         <w:fldChar w:fldCharType="separate"/>
       </w:r>
       <w:r>
-        <w:t>5</w:t>
+        <w:t>14</w:t>
       </w:r>
       <w:r>
         <w:fldChar w:fldCharType="end"/>
@@ -1564,13 +1692,13 @@
         <w:fldChar w:fldCharType="begin"/>
       </w:r>
       <w:r>
-        <w:instrText xml:space="preserve"> PAGEREF _Toc225859277 \h </w:instrText>
+        <w:instrText xml:space="preserve"> PAGEREF _Toc228622513 \h </w:instrText>
       </w:r>
       <w:r>
         <w:fldChar w:fldCharType="separate"/>
       </w:r>
       <w:r>
-        <w:t>5</w:t>
+        <w:t>14</w:t>
       </w:r>
       <w:r>
         <w:fldChar w:fldCharType="end"/>
@@ -1599,13 +1727,13 @@
         <w:fldChar w:fldCharType="begin"/>
       </w:r>
       <w:r>
-        <w:instrText xml:space="preserve"> PAGEREF _Toc225859278 \h </w:instrText>
+        <w:instrText xml:space="preserve"> PAGEREF _Toc228622514 \h </w:instrText>
       </w:r>
       <w:r>
         <w:fldChar w:fldCharType="separate"/>
       </w:r>
       <w:r>
-        <w:t>6</w:t>
+        <w:t>15</w:t>
       </w:r>
       <w:r>
         <w:fldChar w:fldCharType="end"/>
@@ -1632,13 +1760,13 @@
         <w:fldChar w:fldCharType="begin"/>
       </w:r>
       <w:r>
-        <w:instrText xml:space="preserve"> PAGEREF _Toc225859279 \h </w:instrText>
+        <w:instrText xml:space="preserve"> PAGEREF _Toc228622515 \h </w:instrText>
       </w:r>
       <w:r>
         <w:fldChar w:fldCharType="separate"/>
       </w:r>
       <w:r>
-        <w:t>6</w:t>
+        <w:t>15</w:t>
       </w:r>
       <w:r>
         <w:fldChar w:fldCharType="end"/>
@@ -1665,13 +1793,13 @@
         <w:fldChar w:fldCharType="begin"/>
       </w:r>
       <w:r>
-        <w:instrText xml:space="preserve"> PAGEREF _Toc225859280 \h </w:instrText>
+        <w:instrText xml:space="preserve"> PAGEREF _Toc228622516 \h </w:instrText>
       </w:r>
       <w:r>
         <w:fldChar w:fldCharType="separate"/>
       </w:r>
       <w:r>
-        <w:t>6</w:t>
+        <w:t>15</w:t>
       </w:r>
       <w:r>
         <w:fldChar w:fldCharType="end"/>
@@ -1698,13 +1826,13 @@
         <w:fldChar w:fldCharType="begin"/>
       </w:r>
       <w:r>
-        <w:instrText xml:space="preserve"> PAGEREF _Toc225859281 \h </w:instrText>
+        <w:instrText xml:space="preserve"> PAGEREF _Toc228622517 \h </w:instrText>
       </w:r>
       <w:r>
         <w:fldChar w:fldCharType="separate"/>
       </w:r>
       <w:r>
-        <w:t>6</w:t>
+        <w:t>16</w:t>
       </w:r>
       <w:r>
         <w:fldChar w:fldCharType="end"/>
@@ -1731,13 +1859,13 @@
         <w:fldChar w:fldCharType="begin"/>
       </w:r>
       <w:r>
-        <w:instrText xml:space="preserve"> PAGEREF _Toc225859282 \h </w:instrText>
+        <w:instrText xml:space="preserve"> PAGEREF _Toc228622518 \h </w:instrText>
       </w:r>
       <w:r>
         <w:fldChar w:fldCharType="separate"/>
       </w:r>
       <w:r>
-        <w:t>7</w:t>
+        <w:t>16</w:t>
       </w:r>
       <w:r>
         <w:fldChar w:fldCharType="end"/>
@@ -1764,13 +1892,13 @@
         <w:fldChar w:fldCharType="begin"/>
       </w:r>
       <w:r>
-        <w:instrText xml:space="preserve"> PAGEREF _Toc225859283 \h </w:instrText>
+        <w:instrText xml:space="preserve"> PAGEREF _Toc228622519 \h </w:instrText>
       </w:r>
       <w:r>
         <w:fldChar w:fldCharType="separate"/>
       </w:r>
       <w:r>
-        <w:t>7</w:t>
+        <w:t>17</w:t>
       </w:r>
       <w:r>
         <w:fldChar w:fldCharType="end"/>
@@ -1797,13 +1925,13 @@
         <w:fldChar w:fldCharType="begin"/>
       </w:r>
       <w:r>
-        <w:instrText xml:space="preserve"> PAGEREF _Toc225859284 \h </w:instrText>
+        <w:instrText xml:space="preserve"> PAGEREF _Toc228622520 \h </w:instrText>
       </w:r>
       <w:r>
         <w:fldChar w:fldCharType="separate"/>
       </w:r>
       <w:r>
-        <w:t>8</w:t>
+        <w:t>18</w:t>
       </w:r>
       <w:r>
         <w:fldChar w:fldCharType="end"/>
@@ -1830,13 +1958,13 @@
         <w:fldChar w:fldCharType="begin"/>
       </w:r>
       <w:r>
-        <w:instrText xml:space="preserve"> PAGEREF _Toc225859285 \h </w:instrText>
+        <w:instrText xml:space="preserve"> PAGEREF _Toc228622521 \h </w:instrText>
       </w:r>
       <w:r>
         <w:fldChar w:fldCharType="separate"/>
       </w:r>
       <w:r>
-        <w:t>8</w:t>
+        <w:t>18</w:t>
       </w:r>
       <w:r>
         <w:fldChar w:fldCharType="end"/>
@@ -1863,13 +1991,13 @@
         <w:fldChar w:fldCharType="begin"/>
       </w:r>
       <w:r>
-        <w:instrText xml:space="preserve"> PAGEREF _Toc225859286 \h </w:instrText>
+        <w:instrText xml:space="preserve"> PAGEREF _Toc228622522 \h </w:instrText>
       </w:r>
       <w:r>
         <w:fldChar w:fldCharType="separate"/>
       </w:r>
       <w:r>
-        <w:t>8</w:t>
+        <w:t>18</w:t>
       </w:r>
       <w:r>
         <w:fldChar w:fldCharType="end"/>
@@ -1896,13 +2024,13 @@
         <w:fldChar w:fldCharType="begin"/>
       </w:r>
       <w:r>
-        <w:instrText xml:space="preserve"> PAGEREF _Toc225859287 \h </w:instrText>
+        <w:instrText xml:space="preserve"> PAGEREF _Toc228622523 \h </w:instrText>
       </w:r>
       <w:r>
         <w:fldChar w:fldCharType="separate"/>
       </w:r>
       <w:r>
-        <w:t>9</w:t>
+        <w:t>19</w:t>
       </w:r>
       <w:r>
         <w:fldChar w:fldCharType="end"/>
@@ -1931,13 +2059,13 @@
         <w:fldChar w:fldCharType="begin"/>
       </w:r>
       <w:r>
-        <w:instrText xml:space="preserve"> PAGEREF _Toc225859288 \h </w:instrText>
+        <w:instrText xml:space="preserve"> PAGEREF _Toc228622524 \h </w:instrText>
       </w:r>
       <w:r>
         <w:fldChar w:fldCharType="separate"/>
       </w:r>
       <w:r>
-        <w:t>10</w:t>
+        <w:t>20</w:t>
       </w:r>
       <w:r>
         <w:fldChar w:fldCharType="end"/>
@@ -1964,13 +2092,13 @@
         <w:fldChar w:fldCharType="begin"/>
       </w:r>
       <w:r>
-        <w:instrText xml:space="preserve"> PAGEREF _Toc225859289 \h </w:instrText>
+        <w:instrText xml:space="preserve"> PAGEREF _Toc228622525 \h </w:instrText>
       </w:r>
       <w:r>
         <w:fldChar w:fldCharType="separate"/>
       </w:r>
       <w:r>
-        <w:t>10</w:t>
+        <w:t>20</w:t>
       </w:r>
       <w:r>
         <w:fldChar w:fldCharType="end"/>
@@ -1997,13 +2125,13 @@
         <w:fldChar w:fldCharType="begin"/>
       </w:r>
       <w:r>
-        <w:instrText xml:space="preserve"> PAGEREF _Toc225859290 \h </w:instrText>
+        <w:instrText xml:space="preserve"> PAGEREF _Toc228622526 \h </w:instrText>
       </w:r>
       <w:r>
         <w:fldChar w:fldCharType="separate"/>
       </w:r>
       <w:r>
-        <w:t>10</w:t>
+        <w:t>20</w:t>
       </w:r>
       <w:r>
         <w:fldChar w:fldCharType="end"/>
@@ -2030,13 +2158,13 @@
         <w:fldChar w:fldCharType="begin"/>
       </w:r>
       <w:r>
-        <w:instrText xml:space="preserve"> PAGEREF _Toc225859291 \h </w:instrText>
+        <w:instrText xml:space="preserve"> PAGEREF _Toc228622527 \h </w:instrText>
       </w:r>
       <w:r>
         <w:fldChar w:fldCharType="separate"/>
       </w:r>
       <w:r>
-        <w:t>10</w:t>
+        <w:t>20</w:t>
       </w:r>
       <w:r>
         <w:fldChar w:fldCharType="end"/>
@@ -2063,13 +2191,13 @@
         <w:fldChar w:fldCharType="begin"/>
       </w:r>
       <w:r>
-        <w:instrText xml:space="preserve"> PAGEREF _Toc225859292 \h </w:instrText>
+        <w:instrText xml:space="preserve"> PAGEREF _Toc228622528 \h </w:instrText>
       </w:r>
       <w:r>
         <w:fldChar w:fldCharType="separate"/>
       </w:r>
       <w:r>
-        <w:t>11</w:t>
+        <w:t>21</w:t>
       </w:r>
       <w:r>
         <w:fldChar w:fldCharType="end"/>
@@ -2096,13 +2224,13 @@
         <w:fldChar w:fldCharType="begin"/>
       </w:r>
       <w:r>
-        <w:instrText xml:space="preserve"> PAGEREF _Toc225859293 \h </w:instrText>
+        <w:instrText xml:space="preserve"> PAGEREF _Toc228622529 \h </w:instrText>
       </w:r>
       <w:r>
         <w:fldChar w:fldCharType="separate"/>
       </w:r>
       <w:r>
-        <w:t>11</w:t>
+        <w:t>21</w:t>
       </w:r>
       <w:r>
         <w:fldChar w:fldCharType="end"/>
@@ -2129,13 +2257,13 @@
         <w:fldChar w:fldCharType="begin"/>
       </w:r>
       <w:r>
-        <w:instrText xml:space="preserve"> PAGEREF _Toc225859294 \h </w:instrText>
+        <w:instrText xml:space="preserve"> PAGEREF _Toc228622530 \h </w:instrText>
       </w:r>
       <w:r>
         <w:fldChar w:fldCharType="separate"/>
       </w:r>
       <w:r>
-        <w:t>11</w:t>
+        <w:t>21</w:t>
       </w:r>
       <w:r>
         <w:fldChar w:fldCharType="end"/>
@@ -2162,13 +2290,13 @@
         <w:fldChar w:fldCharType="begin"/>
       </w:r>
       <w:r>
-        <w:instrText xml:space="preserve"> PAGEREF _Toc225859295 \h </w:instrText>
+        <w:instrText xml:space="preserve"> PAGEREF _Toc228622531 \h </w:instrText>
       </w:r>
       <w:r>
         <w:fldChar w:fldCharType="separate"/>
       </w:r>
       <w:r>
-        <w:t>11</w:t>
+        <w:t>21</w:t>
       </w:r>
       <w:r>
         <w:fldChar w:fldCharType="end"/>
@@ -2186,6 +2314,7 @@
         </w:rPr>
       </w:pPr>
       <w:r>
+        <w:lastRenderedPageBreak/>
         <w:t>3.8 Visão geral do sistema proposto</w:t>
       </w:r>
       <w:r>
@@ -2195,13 +2324,13 @@
         <w:fldChar w:fldCharType="begin"/>
       </w:r>
       <w:r>
-        <w:instrText xml:space="preserve"> PAGEREF _Toc225859296 \h </w:instrText>
+        <w:instrText xml:space="preserve"> PAGEREF _Toc228622532 \h </w:instrText>
       </w:r>
       <w:r>
         <w:fldChar w:fldCharType="separate"/>
       </w:r>
       <w:r>
-        <w:t>12</w:t>
+        <w:t>22</w:t>
       </w:r>
       <w:r>
         <w:fldChar w:fldCharType="end"/>
@@ -2230,13 +2359,13 @@
         <w:fldChar w:fldCharType="begin"/>
       </w:r>
       <w:r>
-        <w:instrText xml:space="preserve"> PAGEREF _Toc225859297 \h </w:instrText>
+        <w:instrText xml:space="preserve"> PAGEREF _Toc228622533 \h </w:instrText>
       </w:r>
       <w:r>
         <w:fldChar w:fldCharType="separate"/>
       </w:r>
       <w:r>
-        <w:t>13</w:t>
+        <w:t>23</w:t>
       </w:r>
       <w:r>
         <w:fldChar w:fldCharType="end"/>
@@ -2265,13 +2394,13 @@
         <w:fldChar w:fldCharType="begin"/>
       </w:r>
       <w:r>
-        <w:instrText xml:space="preserve"> PAGEREF _Toc225859298 \h </w:instrText>
+        <w:instrText xml:space="preserve"> PAGEREF _Toc228622534 \h </w:instrText>
       </w:r>
       <w:r>
         <w:fldChar w:fldCharType="separate"/>
       </w:r>
       <w:r>
-        <w:t>14</w:t>
+        <w:t>24</w:t>
       </w:r>
       <w:r>
         <w:fldChar w:fldCharType="end"/>
@@ -2314,15 +2443,16 @@
       <w:pPr>
         <w:pStyle w:val="T1-TituloPrimario"/>
       </w:pPr>
-      <w:bookmarkStart w:id="12" w:name="_Toc225859268"/>
-      <w:bookmarkStart w:id="13" w:name="_Toc527721613"/>
-      <w:bookmarkStart w:id="14" w:name="_Toc527793652"/>
-      <w:bookmarkStart w:id="15" w:name="_Toc527795385"/>
-      <w:bookmarkStart w:id="16" w:name="_Toc527798495"/>
-      <w:r>
+      <w:bookmarkStart w:id="10" w:name="_Toc527721613"/>
+      <w:bookmarkStart w:id="11" w:name="_Toc527793652"/>
+      <w:bookmarkStart w:id="12" w:name="_Toc527795385"/>
+      <w:bookmarkStart w:id="13" w:name="_Toc527798495"/>
+      <w:bookmarkStart w:id="14" w:name="_Toc228622504"/>
+      <w:r>
+        <w:lastRenderedPageBreak/>
         <w:t>Introdução</w:t>
       </w:r>
-      <w:bookmarkEnd w:id="12"/>
+      <w:bookmarkEnd w:id="14"/>
     </w:p>
     <w:p>
       <w:pPr>
@@ -2383,7 +2513,11 @@
         <w:t>(MÜLLER, 2015)</w:t>
       </w:r>
       <w:r>
-        <w:t>. Nesse contexto, destaca-se a área de Music Information Retrieval (MIR), que investiga métodos para extração e análise de informações musicais a partir de dados digitais</w:t>
+        <w:t xml:space="preserve">. Nesse contexto, destaca-se a área de Music Information Retrieval (MIR), que investiga </w:t>
+      </w:r>
+      <w:r>
+        <w:lastRenderedPageBreak/>
+        <w:t>métodos para extração e análise de informações musicais a partir de dados digitais</w:t>
       </w:r>
       <w:r>
         <w:t xml:space="preserve"> </w:t>
@@ -2430,121 +2564,123 @@
       <w:pPr>
         <w:pStyle w:val="T2-TituloSecundario"/>
       </w:pPr>
-      <w:bookmarkStart w:id="17" w:name="_Toc225859269"/>
+      <w:bookmarkStart w:id="15" w:name="_Toc228622505"/>
       <w:r>
         <w:t>Contextualização</w:t>
       </w:r>
+      <w:bookmarkEnd w:id="15"/>
+    </w:p>
+    <w:p>
+      <w:pPr>
+        <w:pStyle w:val="TE-Normal"/>
+      </w:pPr>
+      <w:r>
+        <w:t>A crescente digitalização de conteúdos musicais tem possibilitado o desenvolvimento de ferramentas computacionais voltadas à análise musical. Nesse contexto, a representação simbólica da música, por meio de formatos como o MusicXML, permite a manipulação estruturada de elementos musicais, como notas, intervalos e frases melódicas.</w:t>
+      </w:r>
+    </w:p>
+    <w:p>
+      <w:pPr>
+        <w:pStyle w:val="TE-Normal"/>
+      </w:pPr>
+      <w:r>
+        <w:t>Paralelamente, a análise musical desempenha um papel importante na compreensão da organização interna das obras, especialmente no que se refere à identificação de padrões recorrentes. No entanto, esse processo é tradicionalmente realizado de forma manual, exigindo tempo e conhecimento especializado.</w:t>
+      </w:r>
+    </w:p>
+    <w:p>
+      <w:pPr>
+        <w:pStyle w:val="TE-Normal"/>
+      </w:pPr>
+      <w:r>
+        <w:t>Diante desse cenário, surge a necessidade de explorar abordagens computacionais que auxiliem na identificação automática de padrões melódicos, contribuindo para a análise musical assistida por computador.</w:t>
+      </w:r>
+    </w:p>
+    <w:p>
+      <w:pPr>
+        <w:pStyle w:val="T2-TituloSecundario"/>
+      </w:pPr>
+      <w:bookmarkStart w:id="16" w:name="_Toc228622506"/>
+      <w:r>
+        <w:lastRenderedPageBreak/>
+        <w:t>De</w:t>
+      </w:r>
+      <w:r>
+        <w:t>limitação</w:t>
+      </w:r>
+      <w:r>
+        <w:t xml:space="preserve"> do problema</w:t>
+      </w:r>
+      <w:bookmarkEnd w:id="16"/>
+    </w:p>
+    <w:p>
+      <w:pPr>
+        <w:pStyle w:val="TE-Normal"/>
+      </w:pPr>
+      <w:r>
+        <w:t>A identificação de padrões melódicos constitui uma prática relevante na análise musical, pois permite compreender a organização interna das obras e a recorrência de estruturas que contribuem para sua coesão e identidade estilística (HURON, 2006). Tradicionalmente, essa tarefa é realizada de forma manual, por meio da leitura e interpretação direta de partituras, o que pode tornar o processo demorado e sujeito a interpretações subjetivas.</w:t>
+      </w:r>
+    </w:p>
+    <w:p>
+      <w:pPr>
+        <w:pStyle w:val="TE-Normal"/>
+      </w:pPr>
+      <w:r>
+        <w:t>Além disso, a análise manual apresenta limitações quando aplicada a contextos que exigem maior sistematização ou comparação entre múltiplas obras. A identificação de padrões recorrentes ao longo de diferentes composições demanda esforço significativo, sendo dificultada pela ausência de mecanismos formais que permitam a comparação estruturada de sequências melódicas. Adicionalmente, a percepção humana pode apresentar limitações na detecção de recorrências mais sutis ou não triviais, especialmente em obras mais extensas ou complexas.</w:t>
+      </w:r>
+    </w:p>
+    <w:p>
+      <w:pPr>
+        <w:pStyle w:val="TE-Normal"/>
+      </w:pPr>
+      <w:r>
+        <w:t>Nesse contexto, observa-se a necessidade de métodos que possibilitem a representação e análise sistemática de sequências musicais, de modo a apoiar a identificação de padrões de forma mais consistente e reprodutível. Com o avanço das pesquisas na área de análise musical assistida por computador e Music Information Retrieval (MIR), surgem oportunidades para o desenvolvimento de abordagens automatizadas voltadas à detecção de padrões melódicos em dados musicais digitais (DOWNIE, 2003).</w:t>
+      </w:r>
+    </w:p>
+    <w:p>
+      <w:pPr>
+        <w:pStyle w:val="TE-Normal"/>
+      </w:pPr>
+      <w:r>
+        <w:t>Diante desse cenário, formula-se a seguinte questão de pesquisa: como identificar automaticamente padrões melódicos recorrentes em partituras digitais por meio de técnicas computacionais baseadas em representações estruturais da melodia?</w:t>
+      </w:r>
+    </w:p>
+    <w:p>
+      <w:pPr>
+        <w:pStyle w:val="TE-Normal"/>
+      </w:pPr>
+      <w:r>
+        <w:t>Com base na questão de pesquisa apresentada, definem-se os seguintes objetivos, que orientam o desenvolvimento deste trabalho.</w:t>
+      </w:r>
+    </w:p>
+    <w:p>
+      <w:pPr>
+        <w:pStyle w:val="T2-TituloSecundario"/>
+      </w:pPr>
+      <w:bookmarkStart w:id="17" w:name="_Toc228622507"/>
+      <w:r>
+        <w:t>Objetivo</w:t>
+      </w:r>
+      <w:r>
+        <w:t>s</w:t>
+      </w:r>
       <w:bookmarkEnd w:id="17"/>
-    </w:p>
-    <w:p>
-      <w:pPr>
-        <w:pStyle w:val="TE-Normal"/>
-      </w:pPr>
-      <w:r>
-        <w:t>A crescente digitalização de conteúdos musicais tem possibilitado o desenvolvimento de ferramentas computacionais voltadas à análise musical. Nesse contexto, a representação simbólica da música, por meio de formatos como o MusicXML, permite a manipulação estruturada de elementos musicais, como notas, intervalos e frases melódicas.</w:t>
-      </w:r>
-    </w:p>
-    <w:p>
-      <w:pPr>
-        <w:pStyle w:val="TE-Normal"/>
-      </w:pPr>
-      <w:r>
-        <w:t>Paralelamente, a análise musical desempenha um papel importante na compreensão da organização interna das obras, especialmente no que se refere à identificação de padrões recorrentes. No entanto, esse processo é tradicionalmente realizado de forma manual, exigindo tempo e conhecimento especializado.</w:t>
-      </w:r>
-    </w:p>
-    <w:p>
-      <w:pPr>
-        <w:pStyle w:val="TE-Normal"/>
-      </w:pPr>
-      <w:r>
-        <w:t>Diante desse cenário, surge a necessidade de explorar abordagens computacionais que auxiliem na identificação automática de padrões melódicos, contribuindo para a análise musical assistida por computador.</w:t>
-      </w:r>
-    </w:p>
-    <w:p>
-      <w:pPr>
-        <w:pStyle w:val="T2-TituloSecundario"/>
-      </w:pPr>
-      <w:bookmarkStart w:id="18" w:name="_Toc225859270"/>
-      <w:r>
-        <w:t>De</w:t>
-      </w:r>
-      <w:r>
-        <w:t>limitação</w:t>
-      </w:r>
-      <w:r>
-        <w:t xml:space="preserve"> do problema</w:t>
-      </w:r>
-      <w:bookmarkEnd w:id="18"/>
-    </w:p>
-    <w:p>
-      <w:pPr>
-        <w:pStyle w:val="TE-Normal"/>
-      </w:pPr>
-      <w:r>
-        <w:t>A identificação de padrões melódicos constitui uma prática relevante na análise musical, pois permite compreender a organização interna das obras e a recorrência de estruturas que contribuem para sua coesão e identidade estilística (HURON, 2006). Tradicionalmente, essa tarefa é realizada de forma manual, por meio da leitura e interpretação direta de partituras, o que pode tornar o processo demorado e sujeito a interpretações subjetivas.</w:t>
-      </w:r>
-    </w:p>
-    <w:p>
-      <w:pPr>
-        <w:pStyle w:val="TE-Normal"/>
-      </w:pPr>
-      <w:r>
-        <w:t>Além disso, a análise manual apresenta limitações quando aplicada a contextos que exigem maior sistematização ou comparação entre múltiplas obras. A identificação de padrões recorrentes ao longo de diferentes composições demanda esforço significativo, sendo dificultada pela ausência de mecanismos formais que permitam a comparação estruturada de sequências melódicas. Adicionalmente, a percepção humana pode apresentar limitações na detecção de recorrências mais sutis ou não triviais, especialmente em obras mais extensas ou complexas.</w:t>
-      </w:r>
-    </w:p>
-    <w:p>
-      <w:pPr>
-        <w:pStyle w:val="TE-Normal"/>
-      </w:pPr>
-      <w:r>
-        <w:t>Nesse contexto, observa-se a necessidade de métodos que possibilitem a representação e análise sistemática de sequências musicais, de modo a apoiar a identificação de padrões de forma mais consistente e reprodutível. Com o avanço das pesquisas na área de análise musical assistida por computador e Music Information Retrieval (MIR), surgem oportunidades para o desenvolvimento de abordagens automatizadas voltadas à detecção de padrões melódicos em dados musicais digitais (DOWNIE, 2003).</w:t>
-      </w:r>
-    </w:p>
-    <w:p>
-      <w:pPr>
-        <w:pStyle w:val="TE-Normal"/>
-      </w:pPr>
-      <w:r>
-        <w:t>Diante desse cenário, formula-se a seguinte questão de pesquisa: como identificar automaticamente padrões melódicos recorrentes em partituras digitais por meio de técnicas computacionais baseadas em representações estruturais da melodia?</w:t>
-      </w:r>
-    </w:p>
-    <w:p>
-      <w:pPr>
-        <w:pStyle w:val="TE-Normal"/>
-      </w:pPr>
-      <w:r>
-        <w:t>Com base na questão de pesquisa apresentada, definem-se os seguintes objetivos, que orientam o desenvolvimento deste trabalho.</w:t>
-      </w:r>
-    </w:p>
-    <w:p>
-      <w:pPr>
-        <w:pStyle w:val="T2-TituloSecundario"/>
-      </w:pPr>
-      <w:bookmarkStart w:id="19" w:name="_Toc225859271"/>
-      <w:r>
-        <w:t>Objetivo</w:t>
-      </w:r>
-      <w:r>
-        <w:t>s</w:t>
-      </w:r>
-      <w:bookmarkEnd w:id="19"/>
     </w:p>
     <w:p>
       <w:pPr>
         <w:pStyle w:val="T3-TituloTerciario"/>
         <w:ind w:left="0"/>
       </w:pPr>
-      <w:bookmarkStart w:id="20" w:name="_Toc225859272"/>
+      <w:bookmarkStart w:id="18" w:name="_Toc228622508"/>
       <w:r>
         <w:t>Objetivo geral</w:t>
       </w:r>
-      <w:bookmarkEnd w:id="20"/>
-    </w:p>
-    <w:p>
-      <w:pPr>
-        <w:pStyle w:val="TE-Normal"/>
-      </w:pPr>
-      <w:r>
+      <w:bookmarkEnd w:id="18"/>
+    </w:p>
+    <w:p>
+      <w:pPr>
+        <w:pStyle w:val="TE-Normal"/>
+      </w:pPr>
+      <w:r>
+        <w:lastRenderedPageBreak/>
         <w:t>Desenvolver um</w:t>
       </w:r>
       <w:r>
@@ -2559,11 +2695,11 @@
         <w:pStyle w:val="T3-TituloTerciario"/>
         <w:ind w:left="0"/>
       </w:pPr>
-      <w:bookmarkStart w:id="21" w:name="_Toc225859273"/>
+      <w:bookmarkStart w:id="19" w:name="_Toc228622509"/>
       <w:r>
         <w:t>Objetivos específicos</w:t>
       </w:r>
-      <w:bookmarkEnd w:id="21"/>
+      <w:bookmarkEnd w:id="19"/>
     </w:p>
     <w:p>
       <w:pPr>
@@ -2669,10 +2805,127 @@
       <w:pPr>
         <w:pStyle w:val="T2-TituloSecundario"/>
       </w:pPr>
-      <w:bookmarkStart w:id="22" w:name="_Toc225859274"/>
+      <w:bookmarkStart w:id="20" w:name="_Toc228622510"/>
       <w:r>
         <w:t>Justificativa</w:t>
       </w:r>
+      <w:bookmarkEnd w:id="20"/>
+    </w:p>
+    <w:p>
+      <w:pPr>
+        <w:pStyle w:val="TE-Normal"/>
+      </w:pPr>
+      <w:r>
+        <w:t>A identificação de padrões melódicos é uma prática fundamental na análise musical, pois contribui para a compreensão da organização interna das obras, da recorrência de motivos e das características estilísticas de um compositor (HURON, 2006). Tradicionalmente, esse processo é realizado de forma manual, o que pode demandar tempo significativo, além de depender de conhecimento especializado e estar sujeito a interpretações subjetivas.</w:t>
+      </w:r>
+    </w:p>
+    <w:p>
+      <w:pPr>
+        <w:pStyle w:val="TE-Normal"/>
+      </w:pPr>
+      <w:r>
+        <w:t>Com o avanço da análise musical computacional, tornou-se possível empregar técnicas de processamento simbólico para auxiliar na identificação de estruturas musicais em dados digitais. Nesse contexto, destaca-se a área de Music Information Retrieval (MIR), que investiga métodos para extração e análise de informações musicais a partir de diferentes formas de representação (DOWNIE, 2003).</w:t>
+      </w:r>
+    </w:p>
+    <w:p>
+      <w:pPr>
+        <w:pStyle w:val="TE-Normal"/>
+      </w:pPr>
+      <w:r>
+        <w:t xml:space="preserve">Entretanto, muitas das abordagens existentes na literatura utilizam métodos complexos, frequentemente baseados em técnicas avançadas de mineração de dados ou aprendizado de máquina (MEREDITH, 2016), o que pode dificultar sua aplicação em </w:t>
+      </w:r>
+      <w:r>
+        <w:lastRenderedPageBreak/>
+        <w:t>contextos acadêmicos introdutórios ou em estudos exploratórios.</w:t>
+      </w:r>
+    </w:p>
+    <w:p>
+      <w:pPr>
+        <w:pStyle w:val="TE-Normal"/>
+      </w:pPr>
+      <w:r>
+        <w:t>Diante disso, justifica-se o desenvolvimento de um protótipo computacional que utilize representações estruturais mais simples, como intervalos melódicos e contorno melódico, amplamente utilizados na análise musical (MEREDITH, 2016). Essa abordagem permite investigar, de forma prática e controlada, a viabilidade da identificação automática de padrões melódicos, sem a necessidade de métodos computacionais altamente complexos.</w:t>
+      </w:r>
+    </w:p>
+    <w:p>
+      <w:pPr>
+        <w:pStyle w:val="TE-Normal"/>
+      </w:pPr>
+      <w:r>
+        <w:t>Além disso, o presente trabalho contribui para a área de análise musical assistida por computador ao propor uma solução acessível e reprodutível, podendo servir como base para estudos futuros e para a evolução de abordagens mais sofisticadas na análise musical computacional.</w:t>
+      </w:r>
+    </w:p>
+    <w:p>
+      <w:pPr>
+        <w:pStyle w:val="T2-TituloSecundario"/>
+      </w:pPr>
+      <w:bookmarkStart w:id="21" w:name="_Toc228622511"/>
+      <w:r>
+        <w:t>Delimitação do Escopo</w:t>
+      </w:r>
+      <w:bookmarkEnd w:id="21"/>
+    </w:p>
+    <w:p>
+      <w:pPr>
+        <w:pStyle w:val="TE-Normal"/>
+      </w:pPr>
+      <w:r>
+        <w:t>Este trabalho se limita à identificação de padrões melódicos recorrentes em partituras digitais, não contemplando análise harmônica, rítmica ou estrutural completa das obras.</w:t>
+      </w:r>
+    </w:p>
+    <w:p>
+      <w:pPr>
+        <w:pStyle w:val="TE-Normal"/>
+      </w:pPr>
+      <w:r>
+        <w:t>A análise será realizada exclusivamente sobre a linha melódica principal de cada partitura, utilizando versões simplificadas dos arquivos contendo apenas a melodia, a fim de evitar interferência de elementos polifônicos ou acompanhamentos.</w:t>
+      </w:r>
+    </w:p>
+    <w:p>
+      <w:pPr>
+        <w:pStyle w:val="TE-Normal"/>
+      </w:pPr>
+      <w:r>
+        <w:t>O corpus utilizado será composto por cinco partituras autorais em formato MusicXML, escolhidas para permitir a validação do algoritmo proposto.</w:t>
+      </w:r>
+    </w:p>
+    <w:p>
+      <w:pPr>
+        <w:pStyle w:val="TE-Normal"/>
+      </w:pPr>
+      <w:r>
+        <w:t>A detecção de padrões será baseada na comparação de subsequências melódicas representadas por intervalos relativos entre notas consecutivas e por contorno melódico, considerando janelas de tamanho fixo</w:t>
+      </w:r>
+      <w:r>
+        <w:t>, a serem definidas conforme a experimentação</w:t>
+      </w:r>
+      <w:r>
+        <w:t>.</w:t>
+      </w:r>
+    </w:p>
+    <w:p>
+      <w:pPr>
+        <w:pStyle w:val="TE-Normal"/>
+      </w:pPr>
+      <w:r>
+        <w:t>O objetivo do trabalho não é realizar uma análise musicológica abrangente, mas demonstrar a viabilidade de uma abordagem computacional simples para identificação automática de padrões melódicos.</w:t>
+      </w:r>
+    </w:p>
+    <w:p>
+      <w:pPr>
+        <w:pStyle w:val="T2-TituloSecundario"/>
+      </w:pPr>
+      <w:bookmarkStart w:id="22" w:name="_Toc228622512"/>
+      <w:r>
+        <w:lastRenderedPageBreak/>
+        <w:t xml:space="preserve">Procedimentos </w:t>
+      </w:r>
+      <w:r>
+        <w:t>M</w:t>
+      </w:r>
+      <w:r>
+        <w:t>etodológicos</w:t>
+      </w:r>
       <w:bookmarkEnd w:id="22"/>
     </w:p>
     <w:p>
@@ -2680,48 +2933,40 @@
         <w:pStyle w:val="TE-Normal"/>
       </w:pPr>
       <w:r>
-        <w:t>A identificação de padrões melódicos é uma prática fundamental na análise musical, pois contribui para a compreensão da organização interna das obras, da recorrência de motivos e das características estilísticas de um compositor (HURON, 2006). Tradicionalmente, esse processo é realizado de forma manual, o que pode demandar tempo significativo, além de depender de conhecimento especializado e estar sujeito a interpretações subjetivas.</w:t>
-      </w:r>
-    </w:p>
-    <w:p>
-      <w:pPr>
-        <w:pStyle w:val="TE-Normal"/>
-      </w:pPr>
-      <w:r>
-        <w:t>Com o avanço da análise musical computacional, tornou-se possível empregar técnicas de processamento simbólico para auxiliar na identificação de estruturas musicais em dados digitais. Nesse contexto, destaca-se a área de Music Information Retrieval (MIR), que investiga métodos para extração e análise de informações musicais a partir de diferentes formas de representação (DOWNIE, 2003).</w:t>
-      </w:r>
-    </w:p>
-    <w:p>
-      <w:pPr>
-        <w:pStyle w:val="TE-Normal"/>
-      </w:pPr>
-      <w:r>
-        <w:t>Entretanto, muitas das abordagens existentes na literatura utilizam métodos complexos, frequentemente baseados em técnicas avançadas de mineração de dados ou aprendizado de máquina (MEREDITH, 2016), o que pode dificultar sua aplicação em contextos acadêmicos introdutórios ou em estudos exploratórios.</w:t>
-      </w:r>
-    </w:p>
-    <w:p>
-      <w:pPr>
-        <w:pStyle w:val="TE-Normal"/>
-      </w:pPr>
-      <w:r>
-        <w:t>Diante disso, justifica-se o desenvolvimento de um protótipo computacional que utilize representações estruturais mais simples, como intervalos melódicos e contorno melódico, amplamente utilizados na análise musical (MEREDITH, 2016). Essa abordagem permite investigar, de forma prática e controlada, a viabilidade da identificação automática de padrões melódicos, sem a necessidade de métodos computacionais altamente complexos.</w:t>
-      </w:r>
-    </w:p>
-    <w:p>
-      <w:pPr>
-        <w:pStyle w:val="TE-Normal"/>
-      </w:pPr>
-      <w:r>
-        <w:t>Além disso, o presente trabalho contribui para a área de análise musical assistida por computador ao propor uma solução acessível e reprodutível, podendo servir como base para estudos futuros e para a evolução de abordagens mais sofisticadas na análise musical computacional.</w:t>
+        <w:t>O presente trabalho caracteriza-se como uma pesquisa de natureza aplicada, uma vez que visa o desenvolvimento de um protótipo computacional para a identificação de padrões melódicos em partituras digitais. Quanto aos objetivos, classifica-se como exploratória, por investigar a viabilidade de uma abordagem baseada em representações estruturais da melodia. Em relação aos procedimentos, trata-se de uma pesquisa experimental.</w:t>
+      </w:r>
+    </w:p>
+    <w:p>
+      <w:pPr>
+        <w:pStyle w:val="TE-Normal"/>
+      </w:pPr>
+      <w:r>
+        <w:t>De forma geral, o desenvolvimento do trabalho será realizado por meio da seleção de um conjunto de partituras em formato MusicXML, seguido da extração da linha melódica principal. As sequências obtidas serão convertidas em representações estruturais baseadas em intervalos melódicos e contorno melódico.</w:t>
+      </w:r>
+    </w:p>
+    <w:p>
+      <w:pPr>
+        <w:pStyle w:val="TE-Normal"/>
+      </w:pPr>
+      <w:r>
+        <w:t>A partir dessas representações, será aplicado um método de detecção de padrões baseado na análise de subsequências, com o objetivo de identificar recorrências estruturais nas melodias. Por fim, os resultados obtidos serão analisados de forma qualitativa, por meio da comparação entre os padrões identificados automaticamente e a análise manual das partituras.</w:t>
+      </w:r>
+    </w:p>
+    <w:p>
+      <w:pPr>
+        <w:pStyle w:val="TE-Normal"/>
+      </w:pPr>
+      <w:r>
+        <w:t>O protótipo será desenvolvido utilizando a linguagem Python, com apoio de bibliotecas voltadas à manipulação de dados musicais simbólicos, como a biblioteca music21. Os experimentos serão conduzidos em ambiente de desenvolvimento controlado, visando garantir a reprodutibilidade dos resultados.</w:t>
       </w:r>
     </w:p>
     <w:p>
       <w:pPr>
         <w:pStyle w:val="T2-TituloSecundario"/>
       </w:pPr>
-      <w:bookmarkStart w:id="23" w:name="_Toc225859275"/>
-      <w:r>
-        <w:t>Delimitação do Escopo</w:t>
+      <w:bookmarkStart w:id="23" w:name="_Toc228622513"/>
+      <w:r>
+        <w:t>Estrutura do Trabalho</w:t>
       </w:r>
       <w:bookmarkEnd w:id="23"/>
     </w:p>
@@ -2730,189 +2975,115 @@
         <w:pStyle w:val="TE-Normal"/>
       </w:pPr>
       <w:r>
-        <w:t>Este trabalho se limita à identificação de padrões melódicos recorrentes em partituras digitais, não contemplando análise harmônica, rítmica ou estrutural completa das obras.</w:t>
-      </w:r>
-    </w:p>
-    <w:p>
-      <w:pPr>
-        <w:pStyle w:val="TE-Normal"/>
-      </w:pPr>
-      <w:r>
-        <w:t>A análise será realizada exclusivamente sobre a linha melódica principal de cada partitura, utilizando versões simplificadas dos arquivos contendo apenas a melodia, a fim de evitar interferência de elementos polifônicos ou acompanhamentos.</w:t>
-      </w:r>
-    </w:p>
-    <w:p>
-      <w:pPr>
-        <w:pStyle w:val="TE-Normal"/>
-      </w:pPr>
-      <w:r>
-        <w:t>O corpus utilizado será composto por cinco partituras autorais em formato MusicXML, escolhidas para permitir a validação do algoritmo proposto.</w:t>
-      </w:r>
-    </w:p>
-    <w:p>
-      <w:pPr>
-        <w:pStyle w:val="TE-Normal"/>
-      </w:pPr>
-      <w:r>
-        <w:t>A detecção de padrões será baseada na comparação de subsequências melódicas representadas por intervalos relativos entre notas consecutivas e por contorno melódico, considerando janelas de tamanho fixo</w:t>
-      </w:r>
-      <w:r>
-        <w:t>, a serem definidas conforme a experimentação</w:t>
-      </w:r>
-      <w:r>
+        <w:t>Este trabalho está estruturado da seguinte forma: o Capítulo 1 apresenta a introdução, abordando a contextualização, o problema de pesquisa, os objetivos, a justificativa, o escopo e os procedimentos metodológicos. O Capítulo 2 apresenta a revisão bibliográfica, contemplando os principais conceitos relacionados à representação musical digital, padrões melódicos, intervalos e contorno melódico. O Capítulo 3 descreve os procedimentos metodológicos adotados no desenvolvimento do trabalho. Por fim, são apresentados o cronograma e as referências utilizadas.</w:t>
+      </w:r>
+    </w:p>
+    <w:p>
+      <w:pPr>
+        <w:pStyle w:val="T1-TituloPrimario"/>
+      </w:pPr>
+      <w:bookmarkStart w:id="24" w:name="_Toc228622514"/>
+      <w:bookmarkEnd w:id="10"/>
+      <w:bookmarkEnd w:id="11"/>
+      <w:bookmarkEnd w:id="12"/>
+      <w:bookmarkEnd w:id="13"/>
+      <w:r>
+        <w:lastRenderedPageBreak/>
+        <w:t>Fundamentação teórica</w:t>
+      </w:r>
+      <w:bookmarkEnd w:id="24"/>
+    </w:p>
+    <w:p>
+      <w:pPr>
+        <w:pStyle w:val="T2-TituloSecundario"/>
+      </w:pPr>
+      <w:bookmarkStart w:id="25" w:name="_Toc228622515"/>
+      <w:r>
+        <w:t>Representação Musical Digital</w:t>
+      </w:r>
+      <w:bookmarkEnd w:id="25"/>
+    </w:p>
+    <w:p>
+      <w:pPr>
+        <w:pStyle w:val="TE-Normal"/>
+      </w:pPr>
+      <w:r>
+        <w:t>A representação digital da música é um elemento fundamental para o desenvolvimento de sistemas computacionais voltados à análise musical. Diferentemente do áudio, que consiste em um sinal contínuo, a representação simbólica permite descrever a música em termos de notas, durações, alturas e estruturas formais, facilitando a manipulação e interpretação por algoritmos (MÜLLER, 2015).</w:t>
+      </w:r>
+    </w:p>
+    <w:p>
+      <w:pPr>
+        <w:pStyle w:val="TE-Normal"/>
+      </w:pPr>
+      <w:r>
+        <w:t>Nesse contexto, formatos simbólicos tornam-se especialmente relevantes, pois permitem a análise direta de estruturas musicais sem a necessidade de etapas complexas de processamento de sinal. Essa abordagem é amplamente utilizada em estudos na área de</w:t>
+      </w:r>
+      <w:r>
+        <w:t xml:space="preserve"> MIR</w:t>
+      </w:r>
+      <w:r>
+        <w:t>, que busca extrair e analisar informações musicais a partir de dados digitais.</w:t>
+      </w:r>
+    </w:p>
+    <w:p>
+      <w:pPr>
+        <w:pStyle w:val="T3-TituloTerciario"/>
+      </w:pPr>
+      <w:bookmarkStart w:id="26" w:name="_Toc228622516"/>
+      <w:r>
+        <w:t>Formato MusicXML</w:t>
+      </w:r>
+      <w:bookmarkEnd w:id="26"/>
+    </w:p>
+    <w:p>
+      <w:pPr>
+        <w:pStyle w:val="TE-Normal"/>
+      </w:pPr>
+      <w:r>
+        <w:t>O formato MusicXML é um dos padrões mais utilizados para representação simbólica de partituras digitais, sendo amplamente adotado por softwares de notação musical. Ele permite armazenar informações detalhadas sobre notas, compassos, articulações e outros elementos musicais de forma estruturada e legível por máquinas.</w:t>
+      </w:r>
+    </w:p>
+    <w:p>
+      <w:pPr>
+        <w:pStyle w:val="TE-Normal"/>
+      </w:pPr>
+      <w:r>
+        <w:t>Uma das principais vantagens do MusicXML é sua capacidade de preservar a estrutura musical de forma fiel à notação tradicional, possibilitando a extração de dados relevantes para análise computacional, como sequências melódicas e relações intervalares. Dessa forma, o uso desse formato torna-se adequado para aplicações que envolvem análise estrutural da música.</w:t>
+      </w:r>
+      <w:r>
+        <w:t xml:space="preserve"> </w:t>
+      </w:r>
+      <w:r>
+        <w:t>A Figura 1 apresenta um exemplo de relação entre a representação visual de uma partitura e sua estrutura em formato MusicXML.</w:t>
+      </w:r>
+    </w:p>
+    <w:p>
+      <w:pPr>
+        <w:pStyle w:val="TE-Normal"/>
+      </w:pPr>
+    </w:p>
+    <w:p>
+      <w:pPr>
+        <w:pStyle w:val="TE-LegendaFigura"/>
+        <w:jc w:val="both"/>
+        <w:rPr>
+          <w:color w:val="000000" w:themeColor="text1"/>
+        </w:rPr>
+      </w:pPr>
+      <w:bookmarkStart w:id="27" w:name="_Toc228620295"/>
+      <w:r>
+        <w:rPr>
+          <w:color w:val="000000" w:themeColor="text1"/>
+        </w:rPr>
+        <w:t>Exemplo de representação de uma partitura no formato MusicXML</w:t>
+      </w:r>
+      <w:bookmarkEnd w:id="27"/>
+      <w:r>
+        <w:rPr>
+          <w:color w:val="000000" w:themeColor="text1"/>
+        </w:rPr>
         <w:t>.</w:t>
       </w:r>
-    </w:p>
-    <w:p>
-      <w:pPr>
-        <w:pStyle w:val="TE-Normal"/>
-      </w:pPr>
-      <w:r>
-        <w:t>O objetivo do trabalho não é realizar uma análise musicológica abrangente, mas demonstrar a viabilidade de uma abordagem computacional simples para identificação automática de padrões melódicos.</w:t>
-      </w:r>
-    </w:p>
-    <w:p>
-      <w:pPr>
-        <w:pStyle w:val="T2-TituloSecundario"/>
-      </w:pPr>
-      <w:bookmarkStart w:id="24" w:name="_Toc225859276"/>
-      <w:r>
-        <w:t xml:space="preserve">Procedimentos </w:t>
-      </w:r>
-      <w:r>
-        <w:t>M</w:t>
-      </w:r>
-      <w:r>
-        <w:t>etodológicos</w:t>
-      </w:r>
-      <w:bookmarkEnd w:id="24"/>
-    </w:p>
-    <w:p>
-      <w:pPr>
-        <w:pStyle w:val="TE-Normal"/>
-      </w:pPr>
-      <w:r>
-        <w:t>O presente trabalho caracteriza-se como uma pesquisa de natureza aplicada, uma vez que visa o desenvolvimento de um protótipo computacional para a identificação de padrões melódicos em partituras digitais. Quanto aos objetivos, classifica-se como exploratória, por investigar a viabilidade de uma abordagem baseada em representações estruturais da melodia. Em relação aos procedimentos, trata-se de uma pesquisa experimental.</w:t>
-      </w:r>
-    </w:p>
-    <w:p>
-      <w:pPr>
-        <w:pStyle w:val="TE-Normal"/>
-      </w:pPr>
-      <w:r>
-        <w:t>De forma geral, o desenvolvimento do trabalho será realizado por meio da seleção de um conjunto de partituras em formato MusicXML, seguido da extração da linha melódica principal. As sequências obtidas serão convertidas em representações estruturais baseadas em intervalos melódicos e contorno melódico.</w:t>
-      </w:r>
-    </w:p>
-    <w:p>
-      <w:pPr>
-        <w:pStyle w:val="TE-Normal"/>
-      </w:pPr>
-      <w:r>
-        <w:t>A partir dessas representações, será aplicado um método de detecção de padrões baseado na análise de subsequências, com o objetivo de identificar recorrências estruturais nas melodias. Por fim, os resultados obtidos serão analisados de forma qualitativa, por meio da comparação entre os padrões identificados automaticamente e a análise manual das partituras.</w:t>
-      </w:r>
-    </w:p>
-    <w:p>
-      <w:pPr>
-        <w:pStyle w:val="TE-Normal"/>
-      </w:pPr>
-      <w:r>
-        <w:t>O protótipo será desenvolvido utilizando a linguagem Python, com apoio de bibliotecas voltadas à manipulação de dados musicais simbólicos, como a biblioteca music21. Os experimentos serão conduzidos em ambiente de desenvolvimento controlado, visando garantir a reprodutibilidade dos resultados.</w:t>
-      </w:r>
-    </w:p>
-    <w:p>
-      <w:pPr>
-        <w:pStyle w:val="T2-TituloSecundario"/>
-      </w:pPr>
-      <w:bookmarkStart w:id="25" w:name="_Toc225859277"/>
-      <w:r>
-        <w:t>Estrutura do Trabalho</w:t>
-      </w:r>
-      <w:bookmarkEnd w:id="25"/>
-    </w:p>
-    <w:p>
-      <w:pPr>
-        <w:pStyle w:val="TE-Normal"/>
-      </w:pPr>
-      <w:r>
-        <w:t>Este trabalho está estruturado da seguinte forma: o Capítulo 1 apresenta a introdução, abordando a contextualização, o problema de pesquisa, os objetivos, a justificativa, o escopo e os procedimentos metodológicos. O Capítulo 2 apresenta a revisão bibliográfica, contemplando os principais conceitos relacionados à representação musical digital, padrões melódicos, intervalos e contorno melódico. O Capítulo 3 descreve os procedimentos metodológicos adotados no desenvolvimento do trabalho. Por fim, são apresentados o cronograma e as referências utilizadas.</w:t>
-      </w:r>
-    </w:p>
-    <w:p>
-      <w:pPr>
-        <w:pStyle w:val="T1-TituloPrimario"/>
-      </w:pPr>
-      <w:bookmarkStart w:id="26" w:name="_Toc225859278"/>
-      <w:bookmarkEnd w:id="13"/>
-      <w:bookmarkEnd w:id="14"/>
-      <w:bookmarkEnd w:id="15"/>
-      <w:bookmarkEnd w:id="16"/>
-      <w:r>
-        <w:t>Fundamentação teórica</w:t>
-      </w:r>
-      <w:bookmarkEnd w:id="26"/>
-    </w:p>
-    <w:p>
-      <w:pPr>
-        <w:pStyle w:val="T2-TituloSecundario"/>
-      </w:pPr>
-      <w:bookmarkStart w:id="27" w:name="_Toc225859279"/>
-      <w:r>
-        <w:t>Representação Musical Digital</w:t>
-      </w:r>
-      <w:bookmarkEnd w:id="27"/>
-    </w:p>
-    <w:p>
-      <w:pPr>
-        <w:pStyle w:val="TE-Normal"/>
-      </w:pPr>
-      <w:r>
-        <w:t>A representação digital da música é um elemento fundamental para o desenvolvimento de sistemas computacionais voltados à análise musical. Diferentemente do áudio, que consiste em um sinal contínuo, a representação simbólica permite descrever a música em termos de notas, durações, alturas e estruturas formais, facilitando a manipulação e interpretação por algoritmos (MÜLLER, 2015).</w:t>
-      </w:r>
-    </w:p>
-    <w:p>
-      <w:pPr>
-        <w:pStyle w:val="TE-Normal"/>
-      </w:pPr>
-      <w:r>
-        <w:t>Nesse contexto, formatos simbólicos tornam-se especialmente relevantes, pois permitem a análise direta de estruturas musicais sem a necessidade de etapas complexas de processamento de sinal. Essa abordagem é amplamente utilizada em estudos na área de</w:t>
-      </w:r>
-      <w:r>
-        <w:t xml:space="preserve"> MIR</w:t>
-      </w:r>
-      <w:r>
-        <w:t>, que busca extrair e analisar informações musicais a partir de dados digitais.</w:t>
-      </w:r>
-    </w:p>
-    <w:p>
-      <w:pPr>
-        <w:pStyle w:val="T3-TituloTerciario"/>
-      </w:pPr>
-      <w:bookmarkStart w:id="28" w:name="_Toc225859280"/>
-      <w:r>
-        <w:t>Formato MusicXML</w:t>
-      </w:r>
-      <w:bookmarkEnd w:id="28"/>
-    </w:p>
-    <w:p>
-      <w:pPr>
-        <w:pStyle w:val="TE-Normal"/>
-      </w:pPr>
-      <w:r>
-        <w:t>O formato MusicXML é um dos padrões mais utilizados para representação simbólica de partituras digitais, sendo amplamente adotado por softwares de notação musical. Ele permite armazenar informações detalhadas sobre notas, compassos, articulações e outros elementos musicais de forma estruturada e legível por máquinas.</w:t>
-      </w:r>
-    </w:p>
-    <w:p>
-      <w:pPr>
-        <w:pStyle w:val="TE-Normal"/>
-      </w:pPr>
-      <w:r>
-        <w:t>Uma das principais vantagens do MusicXML é sua capacidade de preservar a estrutura musical de forma fiel à notação tradicional, possibilitando a extração de dados relevantes para análise computacional, como sequências melódicas e relações intervalares. Dessa forma, o uso desse formato torna-se adequado para aplicações que envolvem análise estrutural da música.</w:t>
-      </w:r>
-    </w:p>
-    <w:p>
-      <w:pPr>
-        <w:pStyle w:val="TE-Normal"/>
-      </w:pPr>
     </w:p>
     <w:p>
       <w:pPr>
@@ -2920,52 +3091,12 @@
         <w:spacing w:line="360" w:lineRule="auto"/>
         <w:ind w:firstLine="1009"/>
         <w:jc w:val="both"/>
-        <w:rPr>
-          <w:color w:val="000000" w:themeColor="text1"/>
-          <w:sz w:val="26"/>
-          <w:szCs w:val="26"/>
-        </w:rPr>
-      </w:pPr>
-    </w:p>
-    <w:p>
-      <w:pPr>
-        <w:pStyle w:val="TE-LegendaFigura"/>
-        <w:rPr>
-          <w:color w:val="000000" w:themeColor="text1"/>
-        </w:rPr>
-      </w:pPr>
-      <w:r>
-        <w:rPr>
-          <w:color w:val="000000" w:themeColor="text1"/>
-        </w:rPr>
-        <w:t>Exemplo de representação de uma partitura no formato MusicXML</w:t>
-      </w:r>
-      <w:r>
-        <w:rPr>
-          <w:color w:val="000000" w:themeColor="text1"/>
-        </w:rPr>
-        <w:t xml:space="preserve"> (Item 1.1)</w:t>
-      </w:r>
-    </w:p>
-    <w:p>
-      <w:pPr>
-        <w:widowControl w:val="0"/>
-        <w:spacing w:line="360" w:lineRule="auto"/>
-        <w:ind w:firstLine="1009"/>
-        <w:jc w:val="both"/>
-      </w:pPr>
-    </w:p>
-    <w:p>
-      <w:pPr>
-        <w:widowControl w:val="0"/>
-        <w:spacing w:line="360" w:lineRule="auto"/>
-        <w:ind w:firstLine="1009"/>
-        <w:jc w:val="both"/>
       </w:pPr>
       <w:r>
         <w:rPr>
           <w:noProof/>
         </w:rPr>
+        <w:lastRenderedPageBreak/>
         <w:drawing>
           <wp:anchor distT="0" distB="0" distL="114300" distR="114300" simplePos="0" relativeHeight="251657216" behindDoc="0" locked="0" layoutInCell="1" allowOverlap="1" wp14:anchorId="0CC63A32" wp14:editId="00B593DE">
             <wp:simplePos x="0" y="0"/>
@@ -3062,10 +3193,36 @@
       <w:pPr>
         <w:pStyle w:val="T2-TituloSecundario"/>
       </w:pPr>
-      <w:bookmarkStart w:id="29" w:name="_Toc225859281"/>
+      <w:bookmarkStart w:id="28" w:name="_Toc228622517"/>
       <w:r>
         <w:t>Padrões Melódicos</w:t>
       </w:r>
+      <w:bookmarkEnd w:id="28"/>
+    </w:p>
+    <w:p>
+      <w:pPr>
+        <w:pStyle w:val="TE-Normal"/>
+      </w:pPr>
+      <w:r>
+        <w:t>A identificação de padrões melódicos é uma prática recorrente na análise musical, sendo utilizada para compreender a organização interna de obras e a recorrência de motivos musicais. Esses padrões podem ser definidos como sequências de notas ou relações intervalares que se repetem ao longo de uma composição, contribuindo para sua coesão e identidade estilística (HURON, 2006).</w:t>
+      </w:r>
+    </w:p>
+    <w:p>
+      <w:pPr>
+        <w:pStyle w:val="TE-Normal"/>
+      </w:pPr>
+      <w:r>
+        <w:t>Do ponto de vista computacional, a detecção de padrões melódicos envolve a comparação de sequências musicais, buscando identificar repetições exatas ou variações estruturais equivalentes. Essa tarefa pode ser realizada por meio de diferentes abordagens, incluindo técnicas de mineração de dados e análise de subsequências (MEREDITH, 2016).</w:t>
+      </w:r>
+    </w:p>
+    <w:p>
+      <w:pPr>
+        <w:pStyle w:val="T3-TituloTerciario"/>
+      </w:pPr>
+      <w:bookmarkStart w:id="29" w:name="_Toc228622518"/>
+      <w:r>
+        <w:t>Definição de padrões musicais</w:t>
+      </w:r>
       <w:bookmarkEnd w:id="29"/>
     </w:p>
     <w:p>
@@ -3073,32 +3230,6 @@
         <w:pStyle w:val="TE-Normal"/>
       </w:pPr>
       <w:r>
-        <w:t>A identificação de padrões melódicos é uma prática recorrente na análise musical, sendo utilizada para compreender a organização interna de obras e a recorrência de motivos musicais. Esses padrões podem ser definidos como sequências de notas ou relações intervalares que se repetem ao longo de uma composição, contribuindo para sua coesão e identidade estilística (HURON, 2006).</w:t>
-      </w:r>
-    </w:p>
-    <w:p>
-      <w:pPr>
-        <w:pStyle w:val="TE-Normal"/>
-      </w:pPr>
-      <w:r>
-        <w:t>Do ponto de vista computacional, a detecção de padrões melódicos envolve a comparação de sequências musicais, buscando identificar repetições exatas ou variações estruturais equivalentes. Essa tarefa pode ser realizada por meio de diferentes abordagens, incluindo técnicas de mineração de dados e análise de subsequências (MEREDITH, 2016).</w:t>
-      </w:r>
-    </w:p>
-    <w:p>
-      <w:pPr>
-        <w:pStyle w:val="T3-TituloTerciario"/>
-      </w:pPr>
-      <w:bookmarkStart w:id="30" w:name="_Toc225859282"/>
-      <w:r>
-        <w:t>Definição de padrões musicais</w:t>
-      </w:r>
-      <w:bookmarkEnd w:id="30"/>
-    </w:p>
-    <w:p>
-      <w:pPr>
-        <w:pStyle w:val="TE-Normal"/>
-      </w:pPr>
-      <w:r>
         <w:t>Padrões musicais podem ser caracterizados tanto por sua forma exata quanto por sua estrutura abstrata. Em muitos casos, duas sequências melódicas podem ser consideradas equivalentes mesmo apresentando diferenças superficiais, como transposição para outra tonalidade.</w:t>
       </w:r>
     </w:p>
@@ -3107,7 +3238,11 @@
         <w:pStyle w:val="TE-Normal"/>
       </w:pPr>
       <w:r>
-        <w:t>Nesse sentido, torna-se relevante utilizar representações que capturem a estrutura interna da melodia, permitindo a identificação de padrões independentemente de sua tonalidade ou posição na escala. Essa abordagem é especialmente útil em sistemas automatizados de análise musical.</w:t>
+        <w:t xml:space="preserve">Nesse sentido, torna-se relevante utilizar representações que capturem a estrutura interna da melodia, permitindo a identificação de padrões independentemente </w:t>
+      </w:r>
+      <w:r>
+        <w:lastRenderedPageBreak/>
+        <w:t>de sua tonalidade ou posição na escala. Essa abordagem é especialmente útil em sistemas automatizados de análise musical.</w:t>
       </w:r>
       <w:r>
         <w:t xml:space="preserve"> </w:t>
@@ -3116,7 +3251,19 @@
         <w:rPr>
           <w:highlight w:val="yellow"/>
         </w:rPr>
-        <w:t>A Figura X apresenta um exemplo de padrão melódico recorrente, no qual um mesmo motivo é repetido em diferentes trechos da partitura.</w:t>
+        <w:t xml:space="preserve">A Figura </w:t>
+      </w:r>
+      <w:r>
+        <w:rPr>
+          <w:highlight w:val="yellow"/>
+        </w:rPr>
+        <w:t>2</w:t>
+      </w:r>
+      <w:r>
+        <w:rPr>
+          <w:highlight w:val="yellow"/>
+        </w:rPr>
+        <w:t xml:space="preserve"> apresenta um exemplo de padrão melódico recorrente, no qual um mesmo motivo é repetido em diferentes trechos da partitura.</w:t>
       </w:r>
     </w:p>
     <w:p>
@@ -3134,19 +3281,22 @@
     <w:p>
       <w:pPr>
         <w:pStyle w:val="TE-LegendaFigura"/>
+        <w:jc w:val="both"/>
         <w:rPr>
           <w:color w:val="000000" w:themeColor="text1"/>
         </w:rPr>
       </w:pPr>
-      <w:r>
-        <w:t>Exemplo de padrão melódico recorrente em partitura, evidenciando a repetição de motivos musicais.</w:t>
-      </w:r>
-      <w:r>
-        <w:rPr>
-          <w:color w:val="000000" w:themeColor="text1"/>
-        </w:rPr>
-        <w:t xml:space="preserve"> (Item 1.1)</w:t>
-      </w:r>
+      <w:bookmarkStart w:id="30" w:name="_Toc228620296"/>
+      <w:r>
+        <w:t>Exemplo de padrão melódico recorrente em partitura, evidenciando a repetição</w:t>
+      </w:r>
+      <w:r>
+        <w:t xml:space="preserve"> </w:t>
+      </w:r>
+      <w:r>
+        <w:t>de motivos musicais.</w:t>
+      </w:r>
+      <w:bookmarkEnd w:id="30"/>
     </w:p>
     <w:p>
       <w:pPr>
@@ -3236,14 +3386,9 @@
     </w:p>
     <w:p>
       <w:pPr>
-        <w:pStyle w:val="TE-Normal"/>
-      </w:pPr>
-    </w:p>
-    <w:p>
-      <w:pPr>
         <w:pStyle w:val="T2-TituloSecundario"/>
       </w:pPr>
-      <w:bookmarkStart w:id="31" w:name="_Toc225859283"/>
+      <w:bookmarkStart w:id="31" w:name="_Toc228622519"/>
       <w:r>
         <w:t>Representação Intervalar</w:t>
       </w:r>
@@ -3264,12 +3409,548 @@
       <w:r>
         <w:t>Por exemplo, uma sequência de notas pode ser convertida em uma sequência de intervalos, representando as distâncias entre cada par de notas consecutivas. Dessa forma, diferentes melodias que compartilham a mesma estrutura intervalar podem ser reconhecidas como equivalentes.</w:t>
       </w:r>
+      <w:r>
+        <w:t xml:space="preserve"> </w:t>
+      </w:r>
+      <w:r>
+        <w:t xml:space="preserve">A Tabela 1 apresenta a conversão de uma sequência melódica simples em duas representações estruturais: intervalos relativos entre notas </w:t>
+      </w:r>
+      <w:r>
+        <w:lastRenderedPageBreak/>
+        <w:t>consecutivas e contorno melódico.</w:t>
+      </w:r>
+    </w:p>
+    <w:p>
+      <w:pPr>
+        <w:pStyle w:val="PargrafodaLista"/>
+        <w:numPr>
+          <w:ilvl w:val="0"/>
+          <w:numId w:val="18"/>
+        </w:numPr>
+        <w:pBdr>
+          <w:top w:val="nil"/>
+          <w:left w:val="nil"/>
+          <w:bottom w:val="nil"/>
+          <w:right w:val="nil"/>
+          <w:between w:val="nil"/>
+        </w:pBdr>
+        <w:spacing w:before="240"/>
+      </w:pPr>
+      <w:r>
+        <w:rPr>
+          <w:color w:val="000000"/>
+          <w:sz w:val="22"/>
+          <w:szCs w:val="22"/>
+        </w:rPr>
+        <w:t>Representação intervalar e de contorno de uma sequência melódica.</w:t>
+      </w:r>
+    </w:p>
+    <w:tbl>
+      <w:tblPr>
+        <w:tblW w:w="6947" w:type="dxa"/>
+        <w:jc w:val="center"/>
+        <w:tblBorders>
+          <w:top w:val="single" w:sz="4" w:space="0" w:color="000000"/>
+          <w:left w:val="nil"/>
+          <w:bottom w:val="single" w:sz="4" w:space="0" w:color="000000"/>
+          <w:right w:val="nil"/>
+          <w:insideH w:val="single" w:sz="4" w:space="0" w:color="000000"/>
+          <w:insideV w:val="single" w:sz="4" w:space="0" w:color="000000"/>
+        </w:tblBorders>
+        <w:tblLayout w:type="fixed"/>
+        <w:tblLook w:val="0000" w:firstRow="0" w:lastRow="0" w:firstColumn="0" w:lastColumn="0" w:noHBand="0" w:noVBand="0"/>
+      </w:tblPr>
+      <w:tblGrid>
+        <w:gridCol w:w="1843"/>
+        <w:gridCol w:w="1276"/>
+        <w:gridCol w:w="1276"/>
+        <w:gridCol w:w="1276"/>
+        <w:gridCol w:w="1276"/>
+      </w:tblGrid>
+      <w:tr>
+        <w:trPr>
+          <w:jc w:val="center"/>
+        </w:trPr>
+        <w:tc>
+          <w:tcPr>
+            <w:tcW w:w="1843" w:type="dxa"/>
+          </w:tcPr>
+          <w:p>
+            <w:pPr>
+              <w:widowControl w:val="0"/>
+              <w:pBdr>
+                <w:top w:val="nil"/>
+                <w:left w:val="nil"/>
+                <w:bottom w:val="nil"/>
+                <w:right w:val="nil"/>
+                <w:between w:val="nil"/>
+              </w:pBdr>
+              <w:jc w:val="center"/>
+              <w:rPr>
+                <w:b/>
+                <w:bCs/>
+                <w:color w:val="000000"/>
+              </w:rPr>
+            </w:pPr>
+            <w:r>
+              <w:rPr>
+                <w:b/>
+                <w:bCs/>
+                <w:color w:val="000000"/>
+              </w:rPr>
+              <w:t>Notas</w:t>
+            </w:r>
+          </w:p>
+        </w:tc>
+        <w:tc>
+          <w:tcPr>
+            <w:tcW w:w="1276" w:type="dxa"/>
+          </w:tcPr>
+          <w:p>
+            <w:pPr>
+              <w:widowControl w:val="0"/>
+              <w:pBdr>
+                <w:top w:val="nil"/>
+                <w:left w:val="nil"/>
+                <w:bottom w:val="nil"/>
+                <w:right w:val="nil"/>
+                <w:between w:val="nil"/>
+              </w:pBdr>
+              <w:jc w:val="center"/>
+              <w:rPr>
+                <w:b/>
+                <w:bCs/>
+                <w:color w:val="000000"/>
+              </w:rPr>
+            </w:pPr>
+            <w:r>
+              <w:rPr>
+                <w:b/>
+                <w:bCs/>
+                <w:color w:val="000000"/>
+              </w:rPr>
+              <w:t>C</w:t>
+            </w:r>
+          </w:p>
+        </w:tc>
+        <w:tc>
+          <w:tcPr>
+            <w:tcW w:w="1276" w:type="dxa"/>
+          </w:tcPr>
+          <w:p>
+            <w:pPr>
+              <w:widowControl w:val="0"/>
+              <w:pBdr>
+                <w:top w:val="nil"/>
+                <w:left w:val="nil"/>
+                <w:bottom w:val="nil"/>
+                <w:right w:val="nil"/>
+                <w:between w:val="nil"/>
+              </w:pBdr>
+              <w:jc w:val="center"/>
+              <w:rPr>
+                <w:b/>
+                <w:bCs/>
+                <w:color w:val="000000"/>
+              </w:rPr>
+            </w:pPr>
+            <w:r>
+              <w:rPr>
+                <w:b/>
+                <w:bCs/>
+                <w:color w:val="000000"/>
+              </w:rPr>
+              <w:t>D</w:t>
+            </w:r>
+          </w:p>
+        </w:tc>
+        <w:tc>
+          <w:tcPr>
+            <w:tcW w:w="1276" w:type="dxa"/>
+          </w:tcPr>
+          <w:p>
+            <w:pPr>
+              <w:widowControl w:val="0"/>
+              <w:pBdr>
+                <w:top w:val="nil"/>
+                <w:left w:val="nil"/>
+                <w:bottom w:val="nil"/>
+                <w:right w:val="nil"/>
+                <w:between w:val="nil"/>
+              </w:pBdr>
+              <w:jc w:val="center"/>
+              <w:rPr>
+                <w:b/>
+                <w:bCs/>
+                <w:color w:val="000000"/>
+              </w:rPr>
+            </w:pPr>
+            <w:r>
+              <w:rPr>
+                <w:b/>
+                <w:bCs/>
+                <w:color w:val="000000"/>
+              </w:rPr>
+              <w:t>F</w:t>
+            </w:r>
+          </w:p>
+        </w:tc>
+        <w:tc>
+          <w:tcPr>
+            <w:tcW w:w="1276" w:type="dxa"/>
+          </w:tcPr>
+          <w:p>
+            <w:pPr>
+              <w:widowControl w:val="0"/>
+              <w:pBdr>
+                <w:top w:val="nil"/>
+                <w:left w:val="nil"/>
+                <w:bottom w:val="nil"/>
+                <w:right w:val="nil"/>
+                <w:between w:val="nil"/>
+              </w:pBdr>
+              <w:jc w:val="center"/>
+              <w:rPr>
+                <w:b/>
+                <w:bCs/>
+                <w:color w:val="000000"/>
+              </w:rPr>
+            </w:pPr>
+            <w:r>
+              <w:rPr>
+                <w:b/>
+                <w:bCs/>
+                <w:color w:val="000000"/>
+              </w:rPr>
+              <w:t>E</w:t>
+            </w:r>
+          </w:p>
+        </w:tc>
+      </w:tr>
+      <w:tr>
+        <w:trPr>
+          <w:jc w:val="center"/>
+        </w:trPr>
+        <w:tc>
+          <w:tcPr>
+            <w:tcW w:w="1843" w:type="dxa"/>
+          </w:tcPr>
+          <w:p>
+            <w:pPr>
+              <w:widowControl w:val="0"/>
+              <w:pBdr>
+                <w:top w:val="nil"/>
+                <w:left w:val="nil"/>
+                <w:bottom w:val="nil"/>
+                <w:right w:val="nil"/>
+                <w:between w:val="nil"/>
+              </w:pBdr>
+              <w:jc w:val="center"/>
+              <w:rPr>
+                <w:color w:val="000000"/>
+              </w:rPr>
+            </w:pPr>
+            <w:r>
+              <w:rPr>
+                <w:color w:val="000000"/>
+              </w:rPr>
+              <w:t>Intervalos</w:t>
+            </w:r>
+          </w:p>
+        </w:tc>
+        <w:tc>
+          <w:tcPr>
+            <w:tcW w:w="1276" w:type="dxa"/>
+          </w:tcPr>
+          <w:p>
+            <w:pPr>
+              <w:widowControl w:val="0"/>
+              <w:pBdr>
+                <w:top w:val="nil"/>
+                <w:left w:val="nil"/>
+                <w:bottom w:val="nil"/>
+                <w:right w:val="nil"/>
+                <w:between w:val="nil"/>
+              </w:pBdr>
+              <w:jc w:val="center"/>
+              <w:rPr>
+                <w:color w:val="000000"/>
+              </w:rPr>
+            </w:pPr>
+            <w:r>
+              <w:rPr>
+                <w:color w:val="000000"/>
+              </w:rPr>
+              <w:t>—</w:t>
+            </w:r>
+          </w:p>
+        </w:tc>
+        <w:tc>
+          <w:tcPr>
+            <w:tcW w:w="1276" w:type="dxa"/>
+            <w:vAlign w:val="center"/>
+          </w:tcPr>
+          <w:p>
+            <w:pPr>
+              <w:widowControl w:val="0"/>
+              <w:pBdr>
+                <w:top w:val="nil"/>
+                <w:left w:val="nil"/>
+                <w:bottom w:val="nil"/>
+                <w:right w:val="nil"/>
+                <w:between w:val="nil"/>
+              </w:pBdr>
+              <w:jc w:val="center"/>
+              <w:rPr>
+                <w:color w:val="000000"/>
+              </w:rPr>
+            </w:pPr>
+            <w:r>
+              <w:rPr>
+                <w:snapToGrid w:val="0"/>
+              </w:rPr>
+              <w:t>+2</w:t>
+            </w:r>
+          </w:p>
+        </w:tc>
+        <w:tc>
+          <w:tcPr>
+            <w:tcW w:w="1276" w:type="dxa"/>
+            <w:vAlign w:val="center"/>
+          </w:tcPr>
+          <w:p>
+            <w:pPr>
+              <w:widowControl w:val="0"/>
+              <w:pBdr>
+                <w:top w:val="nil"/>
+                <w:left w:val="nil"/>
+                <w:bottom w:val="nil"/>
+                <w:right w:val="nil"/>
+                <w:between w:val="nil"/>
+              </w:pBdr>
+              <w:jc w:val="center"/>
+              <w:rPr>
+                <w:color w:val="000000"/>
+              </w:rPr>
+            </w:pPr>
+            <w:r>
+              <w:rPr>
+                <w:snapToGrid w:val="0"/>
+              </w:rPr>
+              <w:t>+3</w:t>
+            </w:r>
+          </w:p>
+        </w:tc>
+        <w:tc>
+          <w:tcPr>
+            <w:tcW w:w="1276" w:type="dxa"/>
+            <w:vAlign w:val="center"/>
+          </w:tcPr>
+          <w:p>
+            <w:pPr>
+              <w:widowControl w:val="0"/>
+              <w:pBdr>
+                <w:top w:val="nil"/>
+                <w:left w:val="nil"/>
+                <w:bottom w:val="nil"/>
+                <w:right w:val="nil"/>
+                <w:between w:val="nil"/>
+              </w:pBdr>
+              <w:jc w:val="center"/>
+              <w:rPr>
+                <w:color w:val="000000"/>
+              </w:rPr>
+            </w:pPr>
+            <w:r>
+              <w:rPr>
+                <w:snapToGrid w:val="0"/>
+              </w:rPr>
+              <w:t>-1</w:t>
+            </w:r>
+          </w:p>
+        </w:tc>
+      </w:tr>
+      <w:tr>
+        <w:trPr>
+          <w:jc w:val="center"/>
+        </w:trPr>
+        <w:tc>
+          <w:tcPr>
+            <w:tcW w:w="1843" w:type="dxa"/>
+          </w:tcPr>
+          <w:p>
+            <w:pPr>
+              <w:widowControl w:val="0"/>
+              <w:pBdr>
+                <w:top w:val="nil"/>
+                <w:left w:val="nil"/>
+                <w:bottom w:val="nil"/>
+                <w:right w:val="nil"/>
+                <w:between w:val="nil"/>
+              </w:pBdr>
+              <w:jc w:val="center"/>
+              <w:rPr>
+                <w:color w:val="000000"/>
+              </w:rPr>
+            </w:pPr>
+            <w:r>
+              <w:rPr>
+                <w:color w:val="000000"/>
+              </w:rPr>
+              <w:t>Contorno</w:t>
+            </w:r>
+          </w:p>
+        </w:tc>
+        <w:tc>
+          <w:tcPr>
+            <w:tcW w:w="1276" w:type="dxa"/>
+          </w:tcPr>
+          <w:p>
+            <w:pPr>
+              <w:widowControl w:val="0"/>
+              <w:pBdr>
+                <w:top w:val="nil"/>
+                <w:left w:val="nil"/>
+                <w:bottom w:val="nil"/>
+                <w:right w:val="nil"/>
+                <w:between w:val="nil"/>
+              </w:pBdr>
+              <w:jc w:val="center"/>
+              <w:rPr>
+                <w:color w:val="000000"/>
+              </w:rPr>
+            </w:pPr>
+            <w:r>
+              <w:rPr>
+                <w:color w:val="000000"/>
+              </w:rPr>
+              <w:t>—</w:t>
+            </w:r>
+          </w:p>
+        </w:tc>
+        <w:tc>
+          <w:tcPr>
+            <w:tcW w:w="1276" w:type="dxa"/>
+            <w:vAlign w:val="center"/>
+          </w:tcPr>
+          <w:p>
+            <w:pPr>
+              <w:widowControl w:val="0"/>
+              <w:pBdr>
+                <w:top w:val="nil"/>
+                <w:left w:val="nil"/>
+                <w:bottom w:val="nil"/>
+                <w:right w:val="nil"/>
+                <w:between w:val="nil"/>
+              </w:pBdr>
+              <w:jc w:val="center"/>
+              <w:rPr>
+                <w:color w:val="000000"/>
+              </w:rPr>
+            </w:pPr>
+            <w:r>
+              <w:rPr>
+                <w:snapToGrid w:val="0"/>
+              </w:rPr>
+              <w:t>↑</w:t>
+            </w:r>
+          </w:p>
+        </w:tc>
+        <w:tc>
+          <w:tcPr>
+            <w:tcW w:w="1276" w:type="dxa"/>
+            <w:vAlign w:val="center"/>
+          </w:tcPr>
+          <w:p>
+            <w:pPr>
+              <w:widowControl w:val="0"/>
+              <w:pBdr>
+                <w:top w:val="nil"/>
+                <w:left w:val="nil"/>
+                <w:bottom w:val="nil"/>
+                <w:right w:val="nil"/>
+                <w:between w:val="nil"/>
+              </w:pBdr>
+              <w:jc w:val="center"/>
+              <w:rPr>
+                <w:color w:val="000000"/>
+              </w:rPr>
+            </w:pPr>
+            <w:r>
+              <w:rPr>
+                <w:snapToGrid w:val="0"/>
+              </w:rPr>
+              <w:t>↑</w:t>
+            </w:r>
+          </w:p>
+        </w:tc>
+        <w:tc>
+          <w:tcPr>
+            <w:tcW w:w="1276" w:type="dxa"/>
+            <w:vAlign w:val="center"/>
+          </w:tcPr>
+          <w:p>
+            <w:pPr>
+              <w:widowControl w:val="0"/>
+              <w:pBdr>
+                <w:top w:val="nil"/>
+                <w:left w:val="nil"/>
+                <w:bottom w:val="nil"/>
+                <w:right w:val="nil"/>
+                <w:between w:val="nil"/>
+              </w:pBdr>
+              <w:jc w:val="center"/>
+              <w:rPr>
+                <w:color w:val="000000"/>
+              </w:rPr>
+            </w:pPr>
+            <w:r>
+              <w:rPr>
+                <w:snapToGrid w:val="0"/>
+              </w:rPr>
+              <w:t>↓</w:t>
+            </w:r>
+          </w:p>
+        </w:tc>
+      </w:tr>
+    </w:tbl>
+    <w:p>
+      <w:pPr>
+        <w:widowControl w:val="0"/>
+        <w:pBdr>
+          <w:top w:val="nil"/>
+          <w:left w:val="nil"/>
+          <w:bottom w:val="nil"/>
+          <w:right w:val="nil"/>
+          <w:between w:val="nil"/>
+        </w:pBdr>
+        <w:spacing w:line="360" w:lineRule="auto"/>
+        <w:jc w:val="center"/>
+        <w:rPr>
+          <w:color w:val="000000"/>
+          <w:sz w:val="22"/>
+          <w:szCs w:val="22"/>
+        </w:rPr>
+      </w:pPr>
+      <w:r>
+        <w:rPr>
+          <w:color w:val="000000"/>
+          <w:sz w:val="22"/>
+          <w:szCs w:val="22"/>
+        </w:rPr>
+        <w:t>Fonte: Elaborada pelo autor.</w:t>
+      </w:r>
+    </w:p>
+    <w:p>
+      <w:pPr>
+        <w:pStyle w:val="TE-Normal"/>
+      </w:pPr>
     </w:p>
     <w:p>
       <w:pPr>
         <w:pStyle w:val="T3-TituloTerciario"/>
       </w:pPr>
-      <w:bookmarkStart w:id="32" w:name="_Toc225859284"/>
+      <w:bookmarkStart w:id="32" w:name="_Toc228622520"/>
       <w:r>
         <w:t>Intervalos melódicos</w:t>
       </w:r>
@@ -3295,7 +3976,7 @@
       <w:pPr>
         <w:pStyle w:val="T2-TituloSecundario"/>
       </w:pPr>
-      <w:bookmarkStart w:id="33" w:name="_Toc225859285"/>
+      <w:bookmarkStart w:id="33" w:name="_Toc228622521"/>
       <w:r>
         <w:t>Contorno Melódico</w:t>
       </w:r>
@@ -3312,6 +3993,11 @@
     <w:p>
       <w:pPr>
         <w:pStyle w:val="TE-Normal"/>
+        <w:rPr>
+          <w:color w:val="000000"/>
+          <w:sz w:val="22"/>
+          <w:szCs w:val="22"/>
+        </w:rPr>
       </w:pPr>
       <w:r>
         <w:t>A análise de contorno é frequentemente utilizada em estudos de cognição musical e reconhecimento de padrões, pois reflete a forma como o ser humano percebe relações estruturais na música.</w:t>
@@ -3321,7 +4007,7 @@
       <w:pPr>
         <w:pStyle w:val="T3-TituloTerciario"/>
       </w:pPr>
-      <w:bookmarkStart w:id="34" w:name="_Toc225859286"/>
+      <w:bookmarkStart w:id="34" w:name="_Toc228622522"/>
       <w:r>
         <w:t>Representação direcional</w:t>
       </w:r>
@@ -3340,6 +4026,7 @@
         <w:pStyle w:val="TE-Normal"/>
       </w:pPr>
       <w:r>
+        <w:lastRenderedPageBreak/>
         <w:t>Essa simplificação permite identificar padrões estruturais mesmo quando os intervalos exatos diferem, tornando a abordagem complementar à representação intervalar. Em sistemas computacionais, a combinação dessas duas representações pode aumentar a robustez na detecção de padrões melódicos.</w:t>
       </w:r>
     </w:p>
@@ -3347,7 +4034,7 @@
       <w:pPr>
         <w:pStyle w:val="T2-TituloSecundario"/>
       </w:pPr>
-      <w:bookmarkStart w:id="35" w:name="_Toc225859287"/>
+      <w:bookmarkStart w:id="35" w:name="_Toc228622523"/>
       <w:r>
         <w:t>Trabalhos Relacionados</w:t>
       </w:r>
@@ -3392,8 +4079,9 @@
       <w:pPr>
         <w:pStyle w:val="T1-TituloPrimario"/>
       </w:pPr>
-      <w:bookmarkStart w:id="36" w:name="_Toc225859288"/>
-      <w:r>
+      <w:bookmarkStart w:id="36" w:name="_Toc228622524"/>
+      <w:r>
+        <w:lastRenderedPageBreak/>
         <w:t>PROCEDIMENTOS METODOLÓGICOS</w:t>
       </w:r>
       <w:bookmarkEnd w:id="36"/>
@@ -3408,7 +4096,7 @@
       <w:pPr>
         <w:pStyle w:val="T2-TituloSecundario"/>
       </w:pPr>
-      <w:bookmarkStart w:id="37" w:name="_Toc225859289"/>
+      <w:bookmarkStart w:id="37" w:name="_Toc228622525"/>
       <w:r>
         <w:t>Caracterização da pesquisa</w:t>
       </w:r>
@@ -3426,7 +4114,7 @@
       <w:pPr>
         <w:pStyle w:val="T2-TituloSecundario"/>
       </w:pPr>
-      <w:bookmarkStart w:id="38" w:name="_Toc225859290"/>
+      <w:bookmarkStart w:id="38" w:name="_Toc228622526"/>
       <w:r>
         <w:t>Corpus de análise</w:t>
       </w:r>
@@ -3444,7 +4132,7 @@
       <w:pPr>
         <w:pStyle w:val="T2-TituloSecundario"/>
       </w:pPr>
-      <w:bookmarkStart w:id="39" w:name="_Toc225859291"/>
+      <w:bookmarkStart w:id="39" w:name="_Toc228622527"/>
       <w:r>
         <w:t>Extração da melodia</w:t>
       </w:r>
@@ -3462,8 +4150,9 @@
       <w:pPr>
         <w:pStyle w:val="T2-TituloSecundario"/>
       </w:pPr>
-      <w:bookmarkStart w:id="40" w:name="_Toc225859292"/>
-      <w:r>
+      <w:bookmarkStart w:id="40" w:name="_Toc228622528"/>
+      <w:r>
+        <w:lastRenderedPageBreak/>
         <w:t>Representação por intervalos</w:t>
       </w:r>
       <w:bookmarkEnd w:id="40"/>
@@ -3480,7 +4169,7 @@
       <w:pPr>
         <w:pStyle w:val="T2-TituloSecundario"/>
       </w:pPr>
-      <w:bookmarkStart w:id="41" w:name="_Toc225859293"/>
+      <w:bookmarkStart w:id="41" w:name="_Toc228622529"/>
       <w:r>
         <w:t>Representação por contorno</w:t>
       </w:r>
@@ -3498,7 +4187,7 @@
       <w:pPr>
         <w:pStyle w:val="T2-TituloSecundario"/>
       </w:pPr>
-      <w:bookmarkStart w:id="42" w:name="_Toc225859294"/>
+      <w:bookmarkStart w:id="42" w:name="_Toc228622530"/>
       <w:r>
         <w:t>Detecção de padrões</w:t>
       </w:r>
@@ -3524,7 +4213,7 @@
       <w:pPr>
         <w:pStyle w:val="T2-TituloSecundario"/>
       </w:pPr>
-      <w:bookmarkStart w:id="43" w:name="_Toc225859295"/>
+      <w:bookmarkStart w:id="43" w:name="_Toc228622531"/>
       <w:r>
         <w:t>Análise dos resultados</w:t>
       </w:r>
@@ -3542,8 +4231,9 @@
       <w:pPr>
         <w:pStyle w:val="T2-TituloSecundario"/>
       </w:pPr>
-      <w:bookmarkStart w:id="44" w:name="_Toc225859296"/>
-      <w:r>
+      <w:bookmarkStart w:id="44" w:name="_Toc228622532"/>
+      <w:r>
+        <w:lastRenderedPageBreak/>
         <w:t>Visão geral do sistema proposto</w:t>
       </w:r>
       <w:bookmarkEnd w:id="44"/>
@@ -3568,8 +4258,9 @@
       <w:pPr>
         <w:pStyle w:val="T1-TituloPrimario"/>
       </w:pPr>
-      <w:bookmarkStart w:id="45" w:name="_Toc225859297"/>
-      <w:r>
+      <w:bookmarkStart w:id="45" w:name="_Toc228622533"/>
+      <w:r>
+        <w:lastRenderedPageBreak/>
         <w:t>CRONOGRAMA</w:t>
       </w:r>
       <w:bookmarkEnd w:id="45"/>
@@ -3704,8 +4395,9 @@
       <w:bookmarkStart w:id="47" w:name="_Toc527793681"/>
       <w:bookmarkStart w:id="48" w:name="_Toc527795414"/>
       <w:bookmarkStart w:id="49" w:name="_Toc527798510"/>
-      <w:bookmarkStart w:id="50" w:name="_Toc225859298"/>
-      <w:r>
+      <w:bookmarkStart w:id="50" w:name="_Toc228622534"/>
+      <w:r>
+        <w:lastRenderedPageBreak/>
         <w:t>Referências</w:t>
       </w:r>
       <w:bookmarkEnd w:id="46"/>
@@ -3773,29 +4465,10 @@
         <w:rPr>
           <w:lang w:val="en-US"/>
         </w:rPr>
-        <w:t xml:space="preserve">MÜLLER, </w:t>
-      </w:r>
-      <w:proofErr w:type="spellStart"/>
-      <w:r>
-        <w:rPr>
-          <w:lang w:val="en-US"/>
-        </w:rPr>
-        <w:t>Meinard</w:t>
-      </w:r>
-      <w:proofErr w:type="spellEnd"/>
-      <w:r>
-        <w:rPr>
-          <w:lang w:val="en-US"/>
-        </w:rPr>
-        <w:t xml:space="preserve">. Fundamentals of Music Processing: Audio, Analysis, Algorithms, Applications. </w:t>
-      </w:r>
-      <w:proofErr w:type="spellStart"/>
-      <w:r>
-        <w:t>Cham</w:t>
-      </w:r>
-      <w:proofErr w:type="spellEnd"/>
-      <w:r>
-        <w:t>: Springer, 2015.</w:t>
+        <w:t xml:space="preserve">MÜLLER, Meinard. Fundamentals of Music Processing: Audio, Analysis, Algorithms, Applications. </w:t>
+      </w:r>
+      <w:r>
+        <w:t>Cham: Springer, 2015.</w:t>
       </w:r>
     </w:p>
     <w:sectPr>
@@ -5136,7 +5809,6 @@
         <w:docPartUnique/>
       </w:docPartObj>
     </w:sdtPr>
-    <w:sdtEndPr/>
     <w:sdtContent>
       <w:p>
         <w:pPr>
@@ -5302,7 +5974,6 @@
         <w:docPartUnique/>
       </w:docPartObj>
     </w:sdtPr>
-    <w:sdtEndPr/>
     <w:sdtContent>
       <w:p>
         <w:pPr>
@@ -6213,6 +6884,192 @@
     </w:lvl>
   </w:abstractNum>
   <w:abstractNum w:abstractNumId="7" w15:restartNumberingAfterBreak="0">
+    <w:nsid w:val="1A402D8A"/>
+    <w:multiLevelType w:val="multilevel"/>
+    <w:tmpl w:val="0A8E4DB2"/>
+    <w:lvl w:ilvl="0">
+      <w:start w:val="1"/>
+      <w:numFmt w:val="decimal"/>
+      <w:lvlText w:val="TABELA %1."/>
+      <w:lvlJc w:val="right"/>
+      <w:pPr>
+        <w:ind w:left="1531" w:hanging="1531"/>
+      </w:pPr>
+      <w:rPr>
+        <w:rFonts w:hint="default"/>
+        <w:b/>
+        <w:bCs/>
+        <w:i w:val="0"/>
+        <w:iCs w:val="0"/>
+        <w:sz w:val="22"/>
+        <w:szCs w:val="22"/>
+      </w:rPr>
+    </w:lvl>
+    <w:lvl w:ilvl="1">
+      <w:start w:val="1"/>
+      <w:numFmt w:val="lowerLetter"/>
+      <w:lvlText w:val="%2."/>
+      <w:lvlJc w:val="left"/>
+      <w:pPr>
+        <w:ind w:left="1440" w:hanging="360"/>
+      </w:pPr>
+    </w:lvl>
+    <w:lvl w:ilvl="2">
+      <w:start w:val="1"/>
+      <w:numFmt w:val="lowerRoman"/>
+      <w:lvlText w:val="%3."/>
+      <w:lvlJc w:val="right"/>
+      <w:pPr>
+        <w:ind w:left="2160" w:hanging="180"/>
+      </w:pPr>
+    </w:lvl>
+    <w:lvl w:ilvl="3">
+      <w:start w:val="1"/>
+      <w:numFmt w:val="decimal"/>
+      <w:lvlText w:val="%4."/>
+      <w:lvlJc w:val="left"/>
+      <w:pPr>
+        <w:ind w:left="2880" w:hanging="360"/>
+      </w:pPr>
+    </w:lvl>
+    <w:lvl w:ilvl="4">
+      <w:start w:val="1"/>
+      <w:numFmt w:val="lowerLetter"/>
+      <w:lvlText w:val="%5."/>
+      <w:lvlJc w:val="left"/>
+      <w:pPr>
+        <w:ind w:left="3600" w:hanging="360"/>
+      </w:pPr>
+    </w:lvl>
+    <w:lvl w:ilvl="5">
+      <w:start w:val="1"/>
+      <w:numFmt w:val="lowerRoman"/>
+      <w:lvlText w:val="%6."/>
+      <w:lvlJc w:val="right"/>
+      <w:pPr>
+        <w:ind w:left="4320" w:hanging="180"/>
+      </w:pPr>
+    </w:lvl>
+    <w:lvl w:ilvl="6">
+      <w:start w:val="1"/>
+      <w:numFmt w:val="decimal"/>
+      <w:lvlText w:val="%7."/>
+      <w:lvlJc w:val="left"/>
+      <w:pPr>
+        <w:ind w:left="5040" w:hanging="360"/>
+      </w:pPr>
+    </w:lvl>
+    <w:lvl w:ilvl="7">
+      <w:start w:val="1"/>
+      <w:numFmt w:val="lowerLetter"/>
+      <w:lvlText w:val="%8."/>
+      <w:lvlJc w:val="left"/>
+      <w:pPr>
+        <w:ind w:left="5760" w:hanging="360"/>
+      </w:pPr>
+    </w:lvl>
+    <w:lvl w:ilvl="8">
+      <w:start w:val="1"/>
+      <w:numFmt w:val="lowerRoman"/>
+      <w:lvlText w:val="%9."/>
+      <w:lvlJc w:val="right"/>
+      <w:pPr>
+        <w:ind w:left="6480" w:hanging="180"/>
+      </w:pPr>
+    </w:lvl>
+  </w:abstractNum>
+  <w:abstractNum w:abstractNumId="8" w15:restartNumberingAfterBreak="0">
+    <w:nsid w:val="37201775"/>
+    <w:multiLevelType w:val="hybridMultilevel"/>
+    <w:tmpl w:val="5DF047FE"/>
+    <w:lvl w:ilvl="0" w:tplc="C94E71C2">
+      <w:start w:val="1"/>
+      <w:numFmt w:val="decimal"/>
+      <w:lvlText w:val="TABELA %1."/>
+      <w:lvlJc w:val="center"/>
+      <w:pPr>
+        <w:ind w:left="720" w:hanging="360"/>
+      </w:pPr>
+      <w:rPr>
+        <w:rFonts w:hint="default"/>
+        <w:b/>
+        <w:i w:val="0"/>
+      </w:rPr>
+    </w:lvl>
+    <w:lvl w:ilvl="1" w:tplc="04160019" w:tentative="1">
+      <w:start w:val="1"/>
+      <w:numFmt w:val="lowerLetter"/>
+      <w:lvlText w:val="%2."/>
+      <w:lvlJc w:val="left"/>
+      <w:pPr>
+        <w:ind w:left="1440" w:hanging="360"/>
+      </w:pPr>
+    </w:lvl>
+    <w:lvl w:ilvl="2" w:tplc="0416001B" w:tentative="1">
+      <w:start w:val="1"/>
+      <w:numFmt w:val="lowerRoman"/>
+      <w:lvlText w:val="%3."/>
+      <w:lvlJc w:val="right"/>
+      <w:pPr>
+        <w:ind w:left="2160" w:hanging="180"/>
+      </w:pPr>
+    </w:lvl>
+    <w:lvl w:ilvl="3" w:tplc="0416000F" w:tentative="1">
+      <w:start w:val="1"/>
+      <w:numFmt w:val="decimal"/>
+      <w:lvlText w:val="%4."/>
+      <w:lvlJc w:val="left"/>
+      <w:pPr>
+        <w:ind w:left="2880" w:hanging="360"/>
+      </w:pPr>
+    </w:lvl>
+    <w:lvl w:ilvl="4" w:tplc="04160019" w:tentative="1">
+      <w:start w:val="1"/>
+      <w:numFmt w:val="lowerLetter"/>
+      <w:lvlText w:val="%5."/>
+      <w:lvlJc w:val="left"/>
+      <w:pPr>
+        <w:ind w:left="3600" w:hanging="360"/>
+      </w:pPr>
+    </w:lvl>
+    <w:lvl w:ilvl="5" w:tplc="0416001B" w:tentative="1">
+      <w:start w:val="1"/>
+      <w:numFmt w:val="lowerRoman"/>
+      <w:lvlText w:val="%6."/>
+      <w:lvlJc w:val="right"/>
+      <w:pPr>
+        <w:ind w:left="4320" w:hanging="180"/>
+      </w:pPr>
+    </w:lvl>
+    <w:lvl w:ilvl="6" w:tplc="0416000F" w:tentative="1">
+      <w:start w:val="1"/>
+      <w:numFmt w:val="decimal"/>
+      <w:lvlText w:val="%7."/>
+      <w:lvlJc w:val="left"/>
+      <w:pPr>
+        <w:ind w:left="5040" w:hanging="360"/>
+      </w:pPr>
+    </w:lvl>
+    <w:lvl w:ilvl="7" w:tplc="04160019" w:tentative="1">
+      <w:start w:val="1"/>
+      <w:numFmt w:val="lowerLetter"/>
+      <w:lvlText w:val="%8."/>
+      <w:lvlJc w:val="left"/>
+      <w:pPr>
+        <w:ind w:left="5760" w:hanging="360"/>
+      </w:pPr>
+    </w:lvl>
+    <w:lvl w:ilvl="8" w:tplc="0416001B" w:tentative="1">
+      <w:start w:val="1"/>
+      <w:numFmt w:val="lowerRoman"/>
+      <w:lvlText w:val="%9."/>
+      <w:lvlJc w:val="right"/>
+      <w:pPr>
+        <w:ind w:left="6480" w:hanging="180"/>
+      </w:pPr>
+    </w:lvl>
+  </w:abstractNum>
+  <w:abstractNum w:abstractNumId="9" w15:restartNumberingAfterBreak="0">
     <w:nsid w:val="476E078F"/>
     <w:multiLevelType w:val="singleLevel"/>
     <w:tmpl w:val="D39CC90C"/>
@@ -6230,7 +7087,7 @@
       </w:pPr>
     </w:lvl>
   </w:abstractNum>
-  <w:abstractNum w:abstractNumId="8" w15:restartNumberingAfterBreak="0">
+  <w:abstractNum w:abstractNumId="10" w15:restartNumberingAfterBreak="0">
     <w:nsid w:val="5236381B"/>
     <w:multiLevelType w:val="singleLevel"/>
     <w:tmpl w:val="A6BE4F10"/>
@@ -6251,7 +7108,96 @@
       </w:rPr>
     </w:lvl>
   </w:abstractNum>
-  <w:abstractNum w:abstractNumId="9" w15:restartNumberingAfterBreak="0">
+  <w:abstractNum w:abstractNumId="11" w15:restartNumberingAfterBreak="0">
+    <w:nsid w:val="5A1C243E"/>
+    <w:multiLevelType w:val="hybridMultilevel"/>
+    <w:tmpl w:val="30521E3C"/>
+    <w:lvl w:ilvl="0" w:tplc="20CEEE38">
+      <w:start w:val="1"/>
+      <w:numFmt w:val="decimal"/>
+      <w:lvlText w:val="TABELA %1."/>
+      <w:lvlJc w:val="right"/>
+      <w:pPr>
+        <w:ind w:left="2251" w:hanging="360"/>
+      </w:pPr>
+      <w:rPr>
+        <w:rFonts w:hint="default"/>
+      </w:rPr>
+    </w:lvl>
+    <w:lvl w:ilvl="1" w:tplc="04160019" w:tentative="1">
+      <w:start w:val="1"/>
+      <w:numFmt w:val="lowerLetter"/>
+      <w:lvlText w:val="%2."/>
+      <w:lvlJc w:val="left"/>
+      <w:pPr>
+        <w:ind w:left="2971" w:hanging="360"/>
+      </w:pPr>
+    </w:lvl>
+    <w:lvl w:ilvl="2" w:tplc="0416001B" w:tentative="1">
+      <w:start w:val="1"/>
+      <w:numFmt w:val="lowerRoman"/>
+      <w:lvlText w:val="%3."/>
+      <w:lvlJc w:val="right"/>
+      <w:pPr>
+        <w:ind w:left="3691" w:hanging="180"/>
+      </w:pPr>
+    </w:lvl>
+    <w:lvl w:ilvl="3" w:tplc="0416000F" w:tentative="1">
+      <w:start w:val="1"/>
+      <w:numFmt w:val="decimal"/>
+      <w:lvlText w:val="%4."/>
+      <w:lvlJc w:val="left"/>
+      <w:pPr>
+        <w:ind w:left="4411" w:hanging="360"/>
+      </w:pPr>
+    </w:lvl>
+    <w:lvl w:ilvl="4" w:tplc="04160019" w:tentative="1">
+      <w:start w:val="1"/>
+      <w:numFmt w:val="lowerLetter"/>
+      <w:lvlText w:val="%5."/>
+      <w:lvlJc w:val="left"/>
+      <w:pPr>
+        <w:ind w:left="5131" w:hanging="360"/>
+      </w:pPr>
+    </w:lvl>
+    <w:lvl w:ilvl="5" w:tplc="0416001B" w:tentative="1">
+      <w:start w:val="1"/>
+      <w:numFmt w:val="lowerRoman"/>
+      <w:lvlText w:val="%6."/>
+      <w:lvlJc w:val="right"/>
+      <w:pPr>
+        <w:ind w:left="5851" w:hanging="180"/>
+      </w:pPr>
+    </w:lvl>
+    <w:lvl w:ilvl="6" w:tplc="0416000F" w:tentative="1">
+      <w:start w:val="1"/>
+      <w:numFmt w:val="decimal"/>
+      <w:lvlText w:val="%7."/>
+      <w:lvlJc w:val="left"/>
+      <w:pPr>
+        <w:ind w:left="6571" w:hanging="360"/>
+      </w:pPr>
+    </w:lvl>
+    <w:lvl w:ilvl="7" w:tplc="04160019" w:tentative="1">
+      <w:start w:val="1"/>
+      <w:numFmt w:val="lowerLetter"/>
+      <w:lvlText w:val="%8."/>
+      <w:lvlJc w:val="left"/>
+      <w:pPr>
+        <w:ind w:left="7291" w:hanging="360"/>
+      </w:pPr>
+    </w:lvl>
+    <w:lvl w:ilvl="8" w:tplc="0416001B" w:tentative="1">
+      <w:start w:val="1"/>
+      <w:numFmt w:val="lowerRoman"/>
+      <w:lvlText w:val="%9."/>
+      <w:lvlJc w:val="right"/>
+      <w:pPr>
+        <w:ind w:left="8011" w:hanging="180"/>
+      </w:pPr>
+    </w:lvl>
+  </w:abstractNum>
+  <w:abstractNum w:abstractNumId="12" w15:restartNumberingAfterBreak="0">
     <w:nsid w:val="614861D1"/>
     <w:multiLevelType w:val="hybridMultilevel"/>
     <w:tmpl w:val="FA60F4C4"/>
@@ -6263,9 +7209,9 @@
       <w:lvlJc w:val="left"/>
       <w:pPr>
         <w:tabs>
-          <w:tab w:val="num" w:pos="1418"/>
+          <w:tab w:val="num" w:pos="-709"/>
         </w:tabs>
-        <w:ind w:left="2722" w:hanging="1304"/>
+        <w:ind w:left="595" w:hanging="1304"/>
       </w:pPr>
       <w:rPr>
         <w:rFonts w:ascii="Times New Roman" w:hAnsi="Times New Roman" w:hint="default"/>
@@ -6282,9 +7228,9 @@
       <w:lvlJc w:val="left"/>
       <w:pPr>
         <w:tabs>
-          <w:tab w:val="num" w:pos="2149"/>
+          <w:tab w:val="num" w:pos="22"/>
         </w:tabs>
-        <w:ind w:left="2149" w:hanging="360"/>
+        <w:ind w:left="22" w:hanging="360"/>
       </w:pPr>
     </w:lvl>
     <w:lvl w:ilvl="2" w:tplc="0416001B" w:tentative="1">
@@ -6294,9 +7240,9 @@
       <w:lvlJc w:val="right"/>
       <w:pPr>
         <w:tabs>
-          <w:tab w:val="num" w:pos="2869"/>
+          <w:tab w:val="num" w:pos="742"/>
         </w:tabs>
-        <w:ind w:left="2869" w:hanging="180"/>
+        <w:ind w:left="742" w:hanging="180"/>
       </w:pPr>
     </w:lvl>
     <w:lvl w:ilvl="3" w:tplc="0416000F" w:tentative="1">
@@ -6306,9 +7252,9 @@
       <w:lvlJc w:val="left"/>
       <w:pPr>
         <w:tabs>
-          <w:tab w:val="num" w:pos="3589"/>
+          <w:tab w:val="num" w:pos="1462"/>
         </w:tabs>
-        <w:ind w:left="3589" w:hanging="360"/>
+        <w:ind w:left="1462" w:hanging="360"/>
       </w:pPr>
     </w:lvl>
     <w:lvl w:ilvl="4" w:tplc="04160019" w:tentative="1">
@@ -6318,9 +7264,9 @@
       <w:lvlJc w:val="left"/>
       <w:pPr>
         <w:tabs>
-          <w:tab w:val="num" w:pos="4309"/>
+          <w:tab w:val="num" w:pos="2182"/>
         </w:tabs>
-        <w:ind w:left="4309" w:hanging="360"/>
+        <w:ind w:left="2182" w:hanging="360"/>
       </w:pPr>
     </w:lvl>
     <w:lvl w:ilvl="5" w:tplc="0416001B" w:tentative="1">
@@ -6330,9 +7276,9 @@
       <w:lvlJc w:val="right"/>
       <w:pPr>
         <w:tabs>
-          <w:tab w:val="num" w:pos="5029"/>
+          <w:tab w:val="num" w:pos="2902"/>
         </w:tabs>
-        <w:ind w:left="5029" w:hanging="180"/>
+        <w:ind w:left="2902" w:hanging="180"/>
       </w:pPr>
     </w:lvl>
     <w:lvl w:ilvl="6" w:tplc="0416000F" w:tentative="1">
@@ -6342,9 +7288,9 @@
       <w:lvlJc w:val="left"/>
       <w:pPr>
         <w:tabs>
-          <w:tab w:val="num" w:pos="5749"/>
+          <w:tab w:val="num" w:pos="3622"/>
         </w:tabs>
-        <w:ind w:left="5749" w:hanging="360"/>
+        <w:ind w:left="3622" w:hanging="360"/>
       </w:pPr>
     </w:lvl>
     <w:lvl w:ilvl="7" w:tplc="04160019" w:tentative="1">
@@ -6354,9 +7300,9 @@
       <w:lvlJc w:val="left"/>
       <w:pPr>
         <w:tabs>
-          <w:tab w:val="num" w:pos="6469"/>
+          <w:tab w:val="num" w:pos="4342"/>
         </w:tabs>
-        <w:ind w:left="6469" w:hanging="360"/>
+        <w:ind w:left="4342" w:hanging="360"/>
       </w:pPr>
     </w:lvl>
     <w:lvl w:ilvl="8" w:tplc="0416001B" w:tentative="1">
@@ -6366,13 +7312,13 @@
       <w:lvlJc w:val="right"/>
       <w:pPr>
         <w:tabs>
-          <w:tab w:val="num" w:pos="7189"/>
+          <w:tab w:val="num" w:pos="5062"/>
         </w:tabs>
-        <w:ind w:left="7189" w:hanging="180"/>
+        <w:ind w:left="5062" w:hanging="180"/>
       </w:pPr>
     </w:lvl>
   </w:abstractNum>
-  <w:abstractNum w:abstractNumId="10" w15:restartNumberingAfterBreak="0">
+  <w:abstractNum w:abstractNumId="13" w15:restartNumberingAfterBreak="0">
     <w:nsid w:val="61AA12EF"/>
     <w:multiLevelType w:val="hybridMultilevel"/>
     <w:tmpl w:val="44222DD4"/>
@@ -6493,7 +7439,98 @@
       </w:pPr>
     </w:lvl>
   </w:abstractNum>
-  <w:abstractNum w:abstractNumId="11" w15:restartNumberingAfterBreak="0">
+  <w:abstractNum w:abstractNumId="14" w15:restartNumberingAfterBreak="0">
+    <w:nsid w:val="65816367"/>
+    <w:multiLevelType w:val="hybridMultilevel"/>
+    <w:tmpl w:val="8A848F70"/>
+    <w:lvl w:ilvl="0" w:tplc="31AE3FE0">
+      <w:start w:val="1"/>
+      <w:numFmt w:val="decimal"/>
+      <w:lvlText w:val="TABELA %1 -"/>
+      <w:lvlJc w:val="center"/>
+      <w:pPr>
+        <w:ind w:left="371" w:firstLine="637"/>
+      </w:pPr>
+      <w:rPr>
+        <w:rFonts w:hint="default"/>
+        <w:b/>
+        <w:i w:val="0"/>
+      </w:rPr>
+    </w:lvl>
+    <w:lvl w:ilvl="1" w:tplc="04160019" w:tentative="1">
+      <w:start w:val="1"/>
+      <w:numFmt w:val="lowerLetter"/>
+      <w:lvlText w:val="%2."/>
+      <w:lvlJc w:val="left"/>
+      <w:pPr>
+        <w:ind w:left="2160" w:hanging="360"/>
+      </w:pPr>
+    </w:lvl>
+    <w:lvl w:ilvl="2" w:tplc="0416001B" w:tentative="1">
+      <w:start w:val="1"/>
+      <w:numFmt w:val="lowerRoman"/>
+      <w:lvlText w:val="%3."/>
+      <w:lvlJc w:val="right"/>
+      <w:pPr>
+        <w:ind w:left="2880" w:hanging="180"/>
+      </w:pPr>
+    </w:lvl>
+    <w:lvl w:ilvl="3" w:tplc="0416000F" w:tentative="1">
+      <w:start w:val="1"/>
+      <w:numFmt w:val="decimal"/>
+      <w:lvlText w:val="%4."/>
+      <w:lvlJc w:val="left"/>
+      <w:pPr>
+        <w:ind w:left="3600" w:hanging="360"/>
+      </w:pPr>
+    </w:lvl>
+    <w:lvl w:ilvl="4" w:tplc="04160019" w:tentative="1">
+      <w:start w:val="1"/>
+      <w:numFmt w:val="lowerLetter"/>
+      <w:lvlText w:val="%5."/>
+      <w:lvlJc w:val="left"/>
+      <w:pPr>
+        <w:ind w:left="4320" w:hanging="360"/>
+      </w:pPr>
+    </w:lvl>
+    <w:lvl w:ilvl="5" w:tplc="0416001B" w:tentative="1">
+      <w:start w:val="1"/>
+      <w:numFmt w:val="lowerRoman"/>
+      <w:lvlText w:val="%6."/>
+      <w:lvlJc w:val="right"/>
+      <w:pPr>
+        <w:ind w:left="5040" w:hanging="180"/>
+      </w:pPr>
+    </w:lvl>
+    <w:lvl w:ilvl="6" w:tplc="0416000F" w:tentative="1">
+      <w:start w:val="1"/>
+      <w:numFmt w:val="decimal"/>
+      <w:lvlText w:val="%7."/>
+      <w:lvlJc w:val="left"/>
+      <w:pPr>
+        <w:ind w:left="5760" w:hanging="360"/>
+      </w:pPr>
+    </w:lvl>
+    <w:lvl w:ilvl="7" w:tplc="04160019" w:tentative="1">
+      <w:start w:val="1"/>
+      <w:numFmt w:val="lowerLetter"/>
+      <w:lvlText w:val="%8."/>
+      <w:lvlJc w:val="left"/>
+      <w:pPr>
+        <w:ind w:left="6480" w:hanging="360"/>
+      </w:pPr>
+    </w:lvl>
+    <w:lvl w:ilvl="8" w:tplc="0416001B" w:tentative="1">
+      <w:start w:val="1"/>
+      <w:numFmt w:val="lowerRoman"/>
+      <w:lvlText w:val="%9."/>
+      <w:lvlJc w:val="right"/>
+      <w:pPr>
+        <w:ind w:left="7200" w:hanging="180"/>
+      </w:pPr>
+    </w:lvl>
+  </w:abstractNum>
+  <w:abstractNum w:abstractNumId="15" w15:restartNumberingAfterBreak="0">
     <w:nsid w:val="798E4E6E"/>
     <w:multiLevelType w:val="hybridMultilevel"/>
     <w:tmpl w:val="FFFFFFFF"/>
@@ -6583,49 +7620,49 @@
     </w:lvl>
   </w:abstractNum>
   <w:num w:numId="1" w16cid:durableId="710770037">
-    <w:abstractNumId w:val="11"/>
+    <w:abstractNumId w:val="15"/>
   </w:num>
   <w:num w:numId="2" w16cid:durableId="1252815022">
     <w:abstractNumId w:val="3"/>
   </w:num>
   <w:num w:numId="3" w16cid:durableId="467747690">
-    <w:abstractNumId w:val="8"/>
+    <w:abstractNumId w:val="10"/>
   </w:num>
   <w:num w:numId="4" w16cid:durableId="1898085235">
     <w:abstractNumId w:val="4"/>
   </w:num>
   <w:num w:numId="5" w16cid:durableId="2006736264">
-    <w:abstractNumId w:val="7"/>
+    <w:abstractNumId w:val="9"/>
     <w:lvlOverride w:ilvl="0">
       <w:startOverride w:val="1"/>
     </w:lvlOverride>
   </w:num>
   <w:num w:numId="6" w16cid:durableId="2089840616">
-    <w:abstractNumId w:val="7"/>
+    <w:abstractNumId w:val="9"/>
     <w:lvlOverride w:ilvl="0">
       <w:startOverride w:val="1"/>
     </w:lvlOverride>
   </w:num>
   <w:num w:numId="7" w16cid:durableId="1644191920">
-    <w:abstractNumId w:val="7"/>
+    <w:abstractNumId w:val="9"/>
   </w:num>
   <w:num w:numId="8" w16cid:durableId="1815365057">
     <w:abstractNumId w:val="5"/>
   </w:num>
   <w:num w:numId="9" w16cid:durableId="334577241">
-    <w:abstractNumId w:val="7"/>
+    <w:abstractNumId w:val="9"/>
     <w:lvlOverride w:ilvl="0">
       <w:startOverride w:val="1"/>
     </w:lvlOverride>
   </w:num>
   <w:num w:numId="10" w16cid:durableId="1649557162">
-    <w:abstractNumId w:val="9"/>
+    <w:abstractNumId w:val="12"/>
   </w:num>
   <w:num w:numId="11" w16cid:durableId="1828747703">
-    <w:abstractNumId w:val="10"/>
+    <w:abstractNumId w:val="13"/>
   </w:num>
   <w:num w:numId="12" w16cid:durableId="519003112">
-    <w:abstractNumId w:val="7"/>
+    <w:abstractNumId w:val="9"/>
     <w:lvlOverride w:ilvl="0">
       <w:startOverride w:val="1"/>
     </w:lvlOverride>
@@ -6634,10 +7671,22 @@
     <w:abstractNumId w:val="6"/>
   </w:num>
   <w:num w:numId="14" w16cid:durableId="482506668">
-    <w:abstractNumId w:val="7"/>
+    <w:abstractNumId w:val="9"/>
     <w:lvlOverride w:ilvl="0">
       <w:startOverride w:val="1"/>
     </w:lvlOverride>
+  </w:num>
+  <w:num w:numId="15" w16cid:durableId="1930428613">
+    <w:abstractNumId w:val="7"/>
+  </w:num>
+  <w:num w:numId="16" w16cid:durableId="2076514781">
+    <w:abstractNumId w:val="11"/>
+  </w:num>
+  <w:num w:numId="17" w16cid:durableId="390075504">
+    <w:abstractNumId w:val="8"/>
+  </w:num>
+  <w:num w:numId="18" w16cid:durableId="550116365">
+    <w:abstractNumId w:val="14"/>
   </w:num>
   <w:numIdMacAtCleanup w:val="13"/>
 </w:numbering>
@@ -7180,7 +8229,6 @@
   <w:style w:type="character" w:default="1" w:styleId="Fontepargpadro">
     <w:name w:val="Default Paragraph Font"/>
     <w:uiPriority w:val="1"/>
-    <w:semiHidden/>
     <w:unhideWhenUsed/>
   </w:style>
   <w:style w:type="table" w:default="1" w:styleId="Tabelanormal">
@@ -7855,7 +8903,6 @@
         <w:numId w:val="10"/>
       </w:numPr>
       <w:tabs>
-        <w:tab w:val="clear" w:pos="1418"/>
         <w:tab w:val="num" w:pos="709"/>
       </w:tabs>
       <w:ind w:left="2013"/>

</xml_diff>

<commit_message>
Adicionando referências no capítulo 1
</commit_message>
<xml_diff>
--- a/docs/Rascunho TCC.docx
+++ b/docs/Rascunho TCC.docx
@@ -593,7 +593,7 @@
             <w:sz w:val="26"/>
             <w:szCs w:val="26"/>
           </w:rPr>
-          <w:t>17</w:t>
+          <w:t>iv</w:t>
         </w:r>
         <w:r>
           <w:rPr>
@@ -2782,35 +2782,46 @@
         <w:pStyle w:val="TE-Normal"/>
       </w:pPr>
       <w:r>
-        <w:t>A crescente disponibilidade de partituras digitais tem ampliado as possibilidades de uso de ferramentas computacionais na análise musical. Softwares de notação musical permitem criar, editar e exportar partituras em formatos estruturados, favorecendo o acesso a informações musicais que podem ser processadas por algoritmos.</w:t>
-      </w:r>
-    </w:p>
-    <w:p>
-      <w:pPr>
-        <w:pStyle w:val="TE-Normal"/>
-      </w:pPr>
-      <w:r>
-        <w:t>Entre esses formatos, o MusicXML destaca-se por representar a partitura de maneira simbólica, preservando elementos como notas, alturas, durações, compassos e organização da escrita musical. Essa característica permite que sistemas computacionais realizem operações de leitura, extração e comparação de dados musicais sem depender diretamente da análise de áudio.</w:t>
-      </w:r>
-    </w:p>
-    <w:p>
-      <w:pPr>
-        <w:pStyle w:val="TE-Normal"/>
-      </w:pPr>
-      <w:r>
-        <w:t xml:space="preserve">No campo da análise musical, a identificação de padrões melódicos está relacionada à compreensão de como uma obra organiza seus materiais internos. Recorrências de motivos, células ou movimentos melódicos podem indicar relações estruturais importantes, contribuindo para a percepção de unidade e coerência musical. </w:t>
-      </w:r>
-    </w:p>
-    <w:p>
-      <w:pPr>
-        <w:pStyle w:val="TE-Normal"/>
-      </w:pPr>
-      <w:r>
-        <w:t xml:space="preserve">Assim, a combinação entre partituras digitais, representação simbólica e técnicas computacionais oferece um caminho viável para o desenvolvimento de ferramentas de apoio à análise musical. Essas ferramentas não substituem a </w:t>
+        <w:t>A análise musical envolve a observação de relações internas entre os elementos que compõem uma obra, como alturas, durações, motivos, frases e recorrências estruturais. Entre esses elementos, os padrões melódicos ocupam papel relevante, pois contribuem para a organização do discurso musical e para a percepção de unidade ao longo da composição. Conforme Huron (2006), a escuta musical está fortemente relacionada à formação de expectativas, à identificação de regularidades e ao reconhecimento de eventos recorrentes.</w:t>
+      </w:r>
+    </w:p>
+    <w:p>
+      <w:pPr>
+        <w:pStyle w:val="TE-Normal"/>
+      </w:pPr>
+      <w:r>
+        <w:t>Tradicionalmente, a identificação desses padrões é realizada por meio da análise manual da partitura, processo que depende da leitura musical, da experiência do analista e dos critérios adotados para reconhecer similaridades entre trechos. Essa prática continua sendo essencial para a interpretação musical, porém pode se tornar demorada quando aplicada a obras extensas ou a conjuntos maiores de partituras. Além disso, determinados padrões podem não ocorrer de forma literal, mas por meio de transposições, variações intervalares ou semelhanças no contorno melódico, o que torna sua identificação uma tarefa sujeita a diferentes interpretações.</w:t>
+      </w:r>
+    </w:p>
+    <w:p>
+      <w:pPr>
+        <w:pStyle w:val="TE-Normal"/>
+      </w:pPr>
+      <w:r>
+        <w:t xml:space="preserve">Com o avanço das tecnologias digitais aplicadas à música, tornou-se possível representar partituras em formatos simbólicos estruturados, permitindo que informações </w:t>
       </w:r>
       <w:r>
         <w:lastRenderedPageBreak/>
-        <w:t>interpretação humana, mas podem auxiliar na identificação inicial de recorrências, oferecendo dados organizados para posterior avaliação do analista.</w:t>
+        <w:t>musicais sejam processadas computacionalmente. Diferentemente do áudio, que exige procedimentos de análise de sinal, a representação simbólica permite acessar diretamente elementos como notas, alturas, durações, compassos e organização dos eventos musicais (MÜLLER, 2015). Nesse contexto, o formato MusicXML se destaca por possibilitar a troca de partituras entre softwares de notação musical e por preservar informações relevantes da escrita musical em uma estrutura legível por sistemas computacionais.</w:t>
+      </w:r>
+    </w:p>
+    <w:p>
+      <w:pPr>
+        <w:pStyle w:val="TE-Normal"/>
+      </w:pPr>
+      <w:r>
+        <w:t>A área de Music Information Retrieval (MIR) investiga métodos para extração, organização, recuperação e análise de informações musicais em ambientes digitais (DOWNIE, 2003). Dentro desse campo, a análise de partituras digitais permite explorar tarefas como identificação de similaridades, comparação de sequências melódicas e descoberta de padrões recorrentes. Meredith (2016) destaca que a descoberta de padrões musicais está relacionada à identificação de estruturas repetidas ou transformadas dentro de uma obra, sendo uma questão importante para a análise musical computacional.</w:t>
+      </w:r>
+    </w:p>
+    <w:p>
+      <w:pPr>
+        <w:pStyle w:val="TE-Normal"/>
+      </w:pPr>
+      <w:r>
+        <w:t>Dessa forma, a combinação entre partituras digitais, representação simbólica e técnicas computacionais oferece uma possibilidade de apoio à análise musical. Essas ferramentas não substituem a interpretação humana, mas podem auxiliar na etapa inicial de identificação de recorrências, organizando dados e apontando possíveis padrões para avaliação posterior. Este trabalho insere-se nesse contexto ao propor um protótipo voltado à identificação automática de padrões melódicos recorrentes em partituras digitais no formato MusicXML, utilizando representações baseadas em intervalos melódicos e contorno melódico</w:t>
+      </w:r>
+      <w:r>
+        <w:t>.</w:t>
       </w:r>
     </w:p>
     <w:p>
@@ -2834,39 +2845,49 @@
         <w:pStyle w:val="TE-Normal"/>
       </w:pPr>
       <w:r>
-        <w:t>A identificação de padrões melódicos constitui uma prática relevante na análise musical, pois permite observar recorrências que contribuem para a organização interna das obras. No entanto, quando realizada exclusivamente de forma manual, essa tarefa pode se tornar demorada e pouco sistematizada, especialmente em composições extensas ou em conjuntos com múltiplas partituras.</w:t>
-      </w:r>
-    </w:p>
-    <w:p>
-      <w:pPr>
-        <w:pStyle w:val="TE-Normal"/>
-      </w:pPr>
-      <w:r>
-        <w:t>Além do tempo necessário para a leitura e comparação dos trechos musicais, a análise manual depende da experiência do analista e pode variar conforme os critérios adotados. Determinados padrões podem ser percebidos por um observador e não por outro, principalmente quando envolvem recorrências sutis, transposições ou semelhanças baseadas apenas no contorno geral da melodia.</w:t>
-      </w:r>
-    </w:p>
-    <w:p>
-      <w:pPr>
-        <w:pStyle w:val="TE-Normal"/>
-      </w:pPr>
-      <w:r>
-        <w:t>Nesse contexto, observa-se a necessidade de métodos que permitam representar sequências melódicas de forma estruturada, possibilitando sua comparação por meio de critérios computacionais. Representações baseadas em intervalos e contorno melódico podem contribuir para esse processo, pois descrevem relações entre notas de maneira mais abstrata do que a simples sequência de alturas absolutas.</w:t>
-      </w:r>
-    </w:p>
-    <w:p>
-      <w:pPr>
-        <w:pStyle w:val="TE-Normal"/>
-      </w:pPr>
-      <w:r>
-        <w:t>Diante disso, formula-se a seguinte questão de pesquisa: como identificar automaticamente padrões melódicos recorrentes em partituras digitais por meio de técnicas computacionais baseadas em representações estruturais da melodia?</w:t>
-      </w:r>
-    </w:p>
-    <w:p>
-      <w:pPr>
-        <w:pStyle w:val="TE-Normal"/>
-      </w:pPr>
-      <w:r>
-        <w:t>Com base nessa questão, definem-se os objetivos que orientam o desenvolvimento deste trabalho.</w:t>
+        <w:t>A</w:t>
+      </w:r>
+      <w:r>
+        <w:t xml:space="preserve">A identificação de padrões melódicos constitui uma prática relevante na análise musical, pois permite observar como determinados materiais são apresentados, repetidos, transformados ou reorganizados ao longo de uma obra. Esses padrões podem ocorrer de forma literal, por meio da repetição exata de uma sequência de notas, ou de </w:t>
+      </w:r>
+      <w:r>
+        <w:lastRenderedPageBreak/>
+        <w:t>forma mais abstrata, quando preservam relações estruturais, como intervalos relativos ou direção do movimento melódico.</w:t>
+      </w:r>
+    </w:p>
+    <w:p>
+      <w:pPr>
+        <w:pStyle w:val="TE-Normal"/>
+      </w:pPr>
+      <w:r>
+        <w:t>Quando realizada exclusivamente de forma manual, essa tarefa pode se tornar demorada e pouco sistematizada, especialmente em composições extensas ou em conjuntos com múltiplas partituras. Além do tempo necessário para a leitura e comparação dos trechos musicais, a análise manual depende da experiência do analista e pode variar conforme os critérios utilizados para reconhecer similaridades. Assim, dois trechos podem ser considerados semelhantes por compartilharem as mesmas alturas, a mesma estrutura intervalar ou apenas um contorno melódico parecido.</w:t>
+      </w:r>
+    </w:p>
+    <w:p>
+      <w:pPr>
+        <w:pStyle w:val="TE-Normal"/>
+      </w:pPr>
+      <w:r>
+        <w:t>Do ponto de vista computacional, esse problema exige que a melodia seja representada de maneira adequada para comparação. A simples sequência de alturas absolutas pode não ser suficiente para reconhecer padrões transpostos, enquanto representações mais abstratas, como intervalos e contornos, permitem observar relações estruturais entre notas sucessivas. Por isso, a escolha da representação musical influencia diretamente os padrões que poderão ser identificados pelo sistema.</w:t>
+      </w:r>
+    </w:p>
+    <w:p>
+      <w:pPr>
+        <w:pStyle w:val="TE-Normal"/>
+      </w:pPr>
+      <w:r>
+        <w:t>Nesse contexto, observa-se a necessidade de métodos que permitam extrair sequências melódicas de partituras digitais e convertê-las em representações estruturadas, possibilitando sua comparação por critérios computacionais. Com base nessa necessidade, este trabalho investiga a seguinte questão de pesquisa: como identificar automaticamente padrões melódicos recorrentes em partituras digitais por meio de técnicas computacionais baseadas em representações estruturais da melodia?</w:t>
+      </w:r>
+    </w:p>
+    <w:p>
+      <w:pPr>
+        <w:pStyle w:val="TE-Normal"/>
+      </w:pPr>
+      <w:r>
+        <w:t>Com base nessa questão, definem-se os objetivos que orientam o desenvolvimento deste trabalho</w:t>
+      </w:r>
+      <w:r>
+        <w:t>.</w:t>
       </w:r>
     </w:p>
     <w:p>
@@ -2904,11 +2925,7 @@
         <w:t xml:space="preserve"> protótipo </w:t>
       </w:r>
       <w:r>
-        <w:t xml:space="preserve">capaz de identificar padrões melódicos recorrentes </w:t>
-      </w:r>
-      <w:r>
-        <w:lastRenderedPageBreak/>
-        <w:t>em partituras digitais no formato MusicXML.</w:t>
+        <w:t>capaz de identificar padrões melódicos recorrentes em partituras digitais no formato MusicXML.</w:t>
       </w:r>
     </w:p>
     <w:p>
@@ -2918,6 +2935,7 @@
       </w:pPr>
       <w:bookmarkStart w:id="21" w:name="_Toc230252518"/>
       <w:r>
+        <w:lastRenderedPageBreak/>
         <w:t>Objetivos específicos</w:t>
       </w:r>
       <w:bookmarkEnd w:id="21"/>
@@ -3002,40 +3020,43 @@
         <w:pStyle w:val="TE-Normal"/>
       </w:pPr>
       <w:r>
-        <w:t>A identificação de padrões melódicos é importante para a análise musical porque permite compreender como determinados materiais são reutilizados, transformados ou organizados ao longo de uma composição. Esses padrões podem contribuir para a coesão interna da obra e para a percepção de unidade musical (HURON, 2006).</w:t>
-      </w:r>
-    </w:p>
-    <w:p>
-      <w:pPr>
-        <w:pStyle w:val="TE-Normal"/>
-      </w:pPr>
-      <w:r>
-        <w:t>Apesar de sua relevância, a identificação manual de recorrências melódicas pode exigir tempo, experiência e atenção a detalhes que nem sempre são facilmente observáveis em uma leitura inicial. Em obras mais extensas, ou na comparação entre diferentes partituras, torna-se útil contar com procedimentos capazes de organizar e apontar possíveis recorrências de maneira sistemática.</w:t>
-      </w:r>
-    </w:p>
-    <w:p>
-      <w:pPr>
-        <w:pStyle w:val="TE-Normal"/>
-      </w:pPr>
-      <w:r>
-        <w:t>O uso de partituras digitais em formato MusicXML favorece esse tipo de abordagem, pois permite a extração de informações musicais de forma estruturada. A partir desses dados, é possível converter melodias em representações computacionais, como sequências de intervalos e contornos melódicos, facilitando a comparação entre trechos.</w:t>
-      </w:r>
-    </w:p>
-    <w:p>
-      <w:pPr>
-        <w:pStyle w:val="TE-Normal"/>
-      </w:pPr>
+        <w:t>A identificação de padrões melódicos é importante para a análise musical porque permite compreender como determinados materiais são reutilizados, transformados ou organizados ao longo de uma composição. A recorrência de motivos, células melódicas e movimentos direcionais contribui para a coesão interna da obra e para a percepção de unidade musical (HURON, 2006). Dessa forma, o estudo de padrões não se limita à contagem de repetições, mas está relacionado à compreensão da estrutura musical.</w:t>
+      </w:r>
+    </w:p>
+    <w:p>
+      <w:pPr>
+        <w:pStyle w:val="TE-Normal"/>
+      </w:pPr>
+      <w:r>
+        <w:t>Apesar de sua relevância, a identificação manual de recorrências melódicas pode exigir tempo, experiência e atenção a detalhes que nem sempre são facilmente observáveis em uma leitura inicial. Em obras mais extensas, ou na comparação entre diferentes partituras, torna-se útil contar com procedimentos capazes de organizar e apontar possíveis recorrências de maneira sistemática. Nesse sentido, abordagens computacionais podem atuar como ferramentas de apoio, oferecendo dados estruturados para posterior interpretação pelo analista.</w:t>
+      </w:r>
+    </w:p>
+    <w:p>
+      <w:pPr>
+        <w:pStyle w:val="TE-Normal"/>
+      </w:pPr>
+      <w:r>
+        <w:t xml:space="preserve">O uso de partituras digitais em formato MusicXML favorece esse tipo de abordagem, pois permite a extração de informações musicais diretamente da representação simbólica da partitura. A partir desses dados, é possível converter </w:t>
+      </w:r>
       <w:r>
         <w:lastRenderedPageBreak/>
-        <w:t>Este trabalho justifica-se, portanto, pela possibilidade de explorar uma abordagem computacional simples, acessível e reprodutível para a identificação de padrões melódicos. Em vez de utilizar métodos mais complexos, como aprendizado de máquina ou técnicas avançadas de mineração de dados, a proposta concentra-se em representações estruturais diretamente relacionadas à organização melódica.</w:t>
-      </w:r>
-    </w:p>
-    <w:p>
-      <w:pPr>
-        <w:pStyle w:val="TE-Normal"/>
-      </w:pPr>
-      <w:r>
-        <w:t>Além disso, o desenvolvimento do protótipo pode contribuir para estudos futuros em análise musical assistida por computador, servindo como base para aprimoramentos posteriores, como a inclusão de aspectos rítmicos, harmônicos, polifônicos ou métricas mais elaboradas de similaridade musical.</w:t>
+        <w:t>melodias em representações computacionais, como sequências de intervalos e contornos melódicos, facilitando a comparação entre trechos. Essa escolha aproxima o trabalho de estudos da área de Music Information Retrieval, que investigam formas de processar, recuperar e analisar informações musicais em ambientes digitais (DOWNIE, 2003).</w:t>
+      </w:r>
+    </w:p>
+    <w:p>
+      <w:pPr>
+        <w:pStyle w:val="TE-Normal"/>
+      </w:pPr>
+      <w:r>
+        <w:t>Este trabalho justifica-se, portanto, pela possibilidade de explorar uma abordagem computacional simples, acessível e reprodutível para a identificação de padrões melódicos. Em vez de utilizar métodos mais complexos, como aprendizado de máquina ou técnicas avançadas de mineração de dados, a proposta concentra-se em representações estruturais diretamente relacionadas à organização melódica. Essa delimitação torna o desenvolvimento mais adequado ao escopo de um Trabalho de Conclusão de Curso e permite avaliar, de forma controlada, a viabilidade inicial da abordagem.</w:t>
+      </w:r>
+    </w:p>
+    <w:p>
+      <w:pPr>
+        <w:pStyle w:val="TE-Normal"/>
+      </w:pPr>
+      <w:r>
+        <w:t>Além disso, o protótipo desenvolvido poderá servir como base para estudos futuros em análise musical assistida por computador, permitindo aprimoramentos posteriores, como a inclusão de aspectos rítmicos, harmônicos, polifônicos ou métricas mais elaboradas de similaridade musical.</w:t>
       </w:r>
     </w:p>
     <w:p>
@@ -3069,7 +3090,11 @@
         <w:pStyle w:val="TE-Normal"/>
       </w:pPr>
       <w:r>
-        <w:t>O corpus será composto por cinco partituras autorais em formato MusicXML, selecionadas para permitir o desenvolvimento e a validação inicial do protótipo. Por se tratar de uma pesquisa exploratória, não se pretende realizar uma análise estatística ampla ou generalizar os resultados para diferentes repertórios musicais.</w:t>
+        <w:t xml:space="preserve">O corpus será composto por cinco partituras autorais em formato MusicXML, selecionadas para permitir o desenvolvimento e a validação inicial do protótipo. Por se tratar de uma pesquisa exploratória, não se pretende realizar uma análise estatística </w:t>
+      </w:r>
+      <w:r>
+        <w:lastRenderedPageBreak/>
+        <w:t>ampla ou generalizar os resultados para diferentes repertórios musicais.</w:t>
       </w:r>
     </w:p>
     <w:p>
@@ -3085,59 +3110,59 @@
         <w:pStyle w:val="TE-Normal"/>
       </w:pPr>
       <w:r>
-        <w:t xml:space="preserve">Assim, o objetivo do trabalho não é realizar uma análise musicológica completa das obras, mas verificar a viabilidade de uma abordagem computacional </w:t>
+        <w:t>Assim, o objetivo do trabalho não é realizar uma análise musicológica completa das obras, mas verificar a viabilidade de uma abordagem computacional simples para apoiar a identificação automática de padrões melódicos em partituras digitais.</w:t>
+      </w:r>
+    </w:p>
+    <w:p>
+      <w:pPr>
+        <w:pStyle w:val="T2-TituloSecundario"/>
+      </w:pPr>
+      <w:bookmarkStart w:id="24" w:name="_Toc230252521"/>
+      <w:r>
+        <w:t xml:space="preserve">Procedimentos </w:t>
+      </w:r>
+      <w:r>
+        <w:t>M</w:t>
+      </w:r>
+      <w:r>
+        <w:t>etodológicos</w:t>
+      </w:r>
+      <w:bookmarkEnd w:id="24"/>
+    </w:p>
+    <w:p>
+      <w:pPr>
+        <w:pStyle w:val="TE-Normal"/>
+      </w:pPr>
+      <w:r>
+        <w:t>O presente trabalho caracteriza-se como uma pesquisa de natureza aplicada, pois tem como objetivo o desenvolvimento de um protótipo computacional voltado à identificação de padrões melódicos em partituras digitais. Quanto aos objetivos, classifica-se como exploratória, uma vez que busca investigar a viabilidade de uma abordagem baseada em representações estruturais da melodia. Em relação aos procedimentos, trata-se de uma pesquisa experimental, envolvendo a implementação e avaliação de um algoritmo de análise musical.</w:t>
+      </w:r>
+    </w:p>
+    <w:p>
+      <w:pPr>
+        <w:pStyle w:val="TE-Normal"/>
+      </w:pPr>
+      <w:r>
+        <w:t>O desenvolvimento do trabalho será realizado a partir da seleção de um corpus composto por partituras digitais em formato MusicXML. Essas partituras serão utilizadas em versões simplificadas, contendo a linha melódica principal. Em seguida, será realizada a extração das sequências de notas, registrando informações relevantes como altura, posição sequencial e compasso de ocorrência.</w:t>
+      </w:r>
+    </w:p>
+    <w:p>
+      <w:pPr>
+        <w:pStyle w:val="TE-Normal"/>
+      </w:pPr>
+      <w:r>
+        <w:t>As sequências extraídas serão convertidas em duas representações estruturais. A primeira será baseada em intervalos melódicos relativos entre notas consecutivas, permitindo a identificação de padrões que mantenham a mesma estrutura intervalar. A segunda será baseada em contorno melódico, considerando apenas a direção do movimento entre as notas, como subida, descida ou repetição.</w:t>
+      </w:r>
+    </w:p>
+    <w:p>
+      <w:pPr>
+        <w:pStyle w:val="TE-Normal"/>
+      </w:pPr>
+      <w:r>
+        <w:t xml:space="preserve">A detecção de padrões será realizada por meio da comparação de </w:t>
       </w:r>
       <w:r>
         <w:lastRenderedPageBreak/>
-        <w:t>simples para apoiar a identificação automática de padrões melódicos em partituras digitais.</w:t>
-      </w:r>
-    </w:p>
-    <w:p>
-      <w:pPr>
-        <w:pStyle w:val="T2-TituloSecundario"/>
-      </w:pPr>
-      <w:bookmarkStart w:id="24" w:name="_Toc230252521"/>
-      <w:r>
-        <w:t xml:space="preserve">Procedimentos </w:t>
-      </w:r>
-      <w:r>
-        <w:t>M</w:t>
-      </w:r>
-      <w:r>
-        <w:t>etodológicos</w:t>
-      </w:r>
-      <w:bookmarkEnd w:id="24"/>
-    </w:p>
-    <w:p>
-      <w:pPr>
-        <w:pStyle w:val="TE-Normal"/>
-      </w:pPr>
-      <w:r>
-        <w:t>O presente trabalho caracteriza-se como uma pesquisa de natureza aplicada, pois tem como objetivo o desenvolvimento de um protótipo computacional voltado à identificação de padrões melódicos em partituras digitais. Quanto aos objetivos, classifica-se como exploratória, uma vez que busca investigar a viabilidade de uma abordagem baseada em representações estruturais da melodia. Em relação aos procedimentos, trata-se de uma pesquisa experimental, envolvendo a implementação e avaliação de um algoritmo de análise musical.</w:t>
-      </w:r>
-    </w:p>
-    <w:p>
-      <w:pPr>
-        <w:pStyle w:val="TE-Normal"/>
-      </w:pPr>
-      <w:r>
-        <w:t>O desenvolvimento do trabalho será realizado a partir da seleção de um corpus composto por partituras digitais em formato MusicXML. Essas partituras serão utilizadas em versões simplificadas, contendo a linha melódica principal. Em seguida, será realizada a extração das sequências de notas, registrando informações relevantes como altura, posição sequencial e compasso de ocorrência.</w:t>
-      </w:r>
-    </w:p>
-    <w:p>
-      <w:pPr>
-        <w:pStyle w:val="TE-Normal"/>
-      </w:pPr>
-      <w:r>
-        <w:t>As sequências extraídas serão convertidas em duas representações estruturais. A primeira será baseada em intervalos melódicos relativos entre notas consecutivas, permitindo a identificação de padrões que mantenham a mesma estrutura intervalar. A segunda será baseada em contorno melódico, considerando apenas a direção do movimento entre as notas, como subida, descida ou repetição.</w:t>
-      </w:r>
-    </w:p>
-    <w:p>
-      <w:pPr>
-        <w:pStyle w:val="TE-Normal"/>
-      </w:pPr>
-      <w:r>
-        <w:t>A detecção de padrões será realizada por meio da comparação de subsequências geradas a partir de janelas deslizantes. As recorrências identificadas serão registradas com informações sobre a sequência correspondente, o tipo de representação utilizada, a quantidade de ocorrências e sua localização aproximada nas partituras.</w:t>
+        <w:t>subsequências geradas a partir de janelas deslizantes. As recorrências identificadas serão registradas com informações sobre a sequência correspondente, o tipo de representação utilizada, a quantidade de ocorrências e sua localização aproximada nas partituras.</w:t>
       </w:r>
     </w:p>
     <w:p>
@@ -3153,7 +3178,6 @@
         <w:pStyle w:val="TE-Normal"/>
       </w:pPr>
       <w:r>
-        <w:lastRenderedPageBreak/>
         <w:t>O protótipo será desenvolvido utilizando a linguagem Python, com apoio de bibliotecas voltadas à manipulação de dados musicais simbólicos, como a music21. Os experimentos serão conduzidos em ambiente controlado, visando permitir a organização e a reprodução das etapas realizadas.</w:t>
       </w:r>
     </w:p>
@@ -3690,11 +3714,11 @@
       <w:pPr>
         <w:pStyle w:val="T2-TituloSecundario"/>
       </w:pPr>
-      <w:bookmarkStart w:id="30" w:name="_Toc230252526"/>
+      <w:bookmarkStart w:id="31" w:name="_Toc230252526"/>
       <w:r>
         <w:t>Padrões Melódicos</w:t>
       </w:r>
-      <w:bookmarkEnd w:id="30"/>
+      <w:bookmarkEnd w:id="31"/>
     </w:p>
     <w:p>
       <w:pPr>
@@ -3714,13 +3738,25 @@
     </w:p>
     <w:p>
       <w:pPr>
+        <w:pStyle w:val="TE-Normal"/>
+      </w:pPr>
+      <w:r>
+        <w:t xml:space="preserve">Do ponto de vista da análise computacional, a noção de padrão musical exige a definição de critérios de representação e comparação. Uma repetição pode ser identificada de forma literal, quando a mesma sequência de notas ocorre novamente, ou de forma estrutural, quando são preservadas relações internas entre os eventos musicais. Assim, duas melodias transpostas podem não compartilhar as mesmas alturas absolutas, mas ainda apresentar a mesma estrutura intervalar. Da mesma forma, trechos com intervalos diferentes podem preservar um contorno semelhante, mantendo a direção geral do movimento melódico. Essa distinção fundamenta a utilização, neste trabalho, </w:t>
+      </w:r>
+      <w:r>
+        <w:lastRenderedPageBreak/>
+        <w:t>de duas formas complementares de representação: intervalos melódicos e contorno melódico.</w:t>
+      </w:r>
+    </w:p>
+    <w:p>
+      <w:pPr>
         <w:pStyle w:val="T3-TituloTerciario"/>
       </w:pPr>
-      <w:bookmarkStart w:id="31" w:name="_Toc230252527"/>
+      <w:bookmarkStart w:id="32" w:name="_Toc230252527"/>
       <w:r>
         <w:t>Definição de padrões musicais</w:t>
       </w:r>
-      <w:bookmarkEnd w:id="31"/>
+      <w:bookmarkEnd w:id="32"/>
     </w:p>
     <w:p>
       <w:pPr>
@@ -3735,11 +3771,7 @@
         <w:pStyle w:val="TE-Normal"/>
       </w:pPr>
       <w:r>
-        <w:t xml:space="preserve">Nesse sentido, torna-se relevante utilizar representações que capturem a estrutura interna da melodia, permitindo a identificação de padrões independentemente </w:t>
-      </w:r>
-      <w:r>
-        <w:lastRenderedPageBreak/>
-        <w:t>de sua tonalidade ou posição na escala. Essa abordagem é especialmente útil em sistemas automatizados de análise musical.</w:t>
+        <w:t>Nesse sentido, torna-se relevante utilizar representações que capturem a estrutura interna da melodia, permitindo a identificação de padrões independentemente de sua tonalidade ou posição na escala. Essa abordagem é especialmente útil em sistemas automatizados de análise musical.</w:t>
       </w:r>
       <w:r>
         <w:t xml:space="preserve"> </w:t>
@@ -3867,8 +3899,8 @@
                                 <w:szCs w:val="24"/>
                               </w:rPr>
                             </w:pPr>
-                            <w:bookmarkStart w:id="32" w:name="_Toc230251476"/>
-                            <w:bookmarkStart w:id="33" w:name="_Toc230252030"/>
+                            <w:bookmarkStart w:id="33" w:name="_Toc230251476"/>
+                            <w:bookmarkStart w:id="34" w:name="_Toc230252030"/>
                             <w:r>
                               <w:rPr>
                                 <w:b/>
@@ -3976,8 +4008,8 @@
                               </w:rPr>
                               <w:t>Exemplo de padrão melódico recorrente em partitura, evidenciando a repetição de motivos musicais.</w:t>
                             </w:r>
-                            <w:bookmarkEnd w:id="32"/>
                             <w:bookmarkEnd w:id="33"/>
+                            <w:bookmarkEnd w:id="34"/>
                           </w:p>
                         </w:txbxContent>
                       </wps:txbx>
@@ -4160,18 +4192,30 @@
       <w:pPr>
         <w:pStyle w:val="T2-TituloSecundario"/>
       </w:pPr>
-      <w:bookmarkStart w:id="34" w:name="_Toc230252528"/>
+      <w:bookmarkStart w:id="37" w:name="_Toc230252528"/>
       <w:r>
         <w:t>Representação Intervalar</w:t>
       </w:r>
-      <w:bookmarkEnd w:id="34"/>
-    </w:p>
-    <w:p>
-      <w:pPr>
-        <w:pStyle w:val="TE-Normal"/>
-      </w:pPr>
-      <w:r>
-        <w:t>A representação intervalar consiste em descrever uma sequência melódica a partir das relações entre notas consecutivas, em vez de suas alturas absolutas. Essa abordagem permite identificar padrões estruturais que permanecem invariantes sob transposição, tornando-a especialmente útil para a análise comparativa de melodias (MEREDITH, 2016).</w:t>
+      <w:bookmarkEnd w:id="37"/>
+    </w:p>
+    <w:p>
+      <w:pPr>
+        <w:pStyle w:val="TE-Normal"/>
+      </w:pPr>
+      <w:r>
+        <w:t xml:space="preserve">A representação intervalar consiste em descrever uma sequência melódica a partir das relações entre notas consecutivas, em vez de suas alturas absolutas. Essa </w:t>
+      </w:r>
+      <w:r>
+        <w:lastRenderedPageBreak/>
+        <w:t>abordagem permite identificar padrões estruturais que permanecem invariantes sob transposição, tornando-a especialmente útil para a análise comparativa de melodias (MEREDITH, 2016).</w:t>
+      </w:r>
+    </w:p>
+    <w:p>
+      <w:pPr>
+        <w:pStyle w:val="TE-Normal"/>
+      </w:pPr>
+      <w:r>
+        <w:t>A utilização de intervalos relativos é especialmente relevante em tarefas de identificação de padrões porque reduz a dependência das alturas absolutas. Em uma melodia transposta, as notas específicas são alteradas, mas as relações entre notas consecutivas podem permanecer equivalentes. Dessa forma, a representação intervalar permite que o sistema reconheça semelhanças estruturais mesmo quando o padrão aparece em outra região da tessitura ou em outra tonalidade. Essa característica torna a abordagem adequada para a análise de recorrências melódicas em partituras digitais.</w:t>
       </w:r>
     </w:p>
     <w:p>
@@ -4198,7 +4242,7 @@
           <w:iCs w:val="0"/>
         </w:rPr>
       </w:pPr>
-      <w:bookmarkStart w:id="35" w:name="_Toc230252157"/>
+      <w:bookmarkStart w:id="38" w:name="_Toc230252157"/>
       <w:r>
         <w:rPr>
           <w:b/>
@@ -4209,7 +4253,6 @@
           <w:sz w:val="22"/>
           <w:szCs w:val="22"/>
         </w:rPr>
-        <w:lastRenderedPageBreak/>
         <w:t xml:space="preserve">TABELA </w:t>
       </w:r>
       <w:r>
@@ -4286,7 +4329,7 @@
       <w:r>
         <w:t>.</w:t>
       </w:r>
-      <w:bookmarkEnd w:id="35"/>
+      <w:bookmarkEnd w:id="38"/>
     </w:p>
     <w:tbl>
       <w:tblPr>
@@ -4793,11 +4836,11 @@
       <w:pPr>
         <w:pStyle w:val="T3-TituloTerciario"/>
       </w:pPr>
-      <w:bookmarkStart w:id="36" w:name="_Toc230252529"/>
+      <w:bookmarkStart w:id="39" w:name="_Toc230252529"/>
       <w:r>
         <w:t>Intervalos melódicos</w:t>
       </w:r>
-      <w:bookmarkEnd w:id="36"/>
+      <w:bookmarkEnd w:id="39"/>
     </w:p>
     <w:p>
       <w:pPr>
@@ -4819,11 +4862,12 @@
       <w:pPr>
         <w:pStyle w:val="T2-TituloSecundario"/>
       </w:pPr>
-      <w:bookmarkStart w:id="37" w:name="_Toc230252530"/>
-      <w:r>
+      <w:bookmarkStart w:id="40" w:name="_Toc230252530"/>
+      <w:r>
+        <w:lastRenderedPageBreak/>
         <w:t>Contorno Melódico</w:t>
       </w:r>
-      <w:bookmarkEnd w:id="37"/>
+      <w:bookmarkEnd w:id="40"/>
     </w:p>
     <w:p>
       <w:pPr>
@@ -4831,6 +4875,14 @@
       </w:pPr>
       <w:r>
         <w:t>O contorno melódico refere-se à forma geral de uma melodia, considerando apenas a direção do movimento entre notas, sem levar em conta a magnitude exata dos intervalos. Essa abordagem permite representar a melodia de forma mais abstrata, destacando seu “desenho” ao longo do tempo (HURON, 2006).</w:t>
+      </w:r>
+    </w:p>
+    <w:p>
+      <w:pPr>
+        <w:pStyle w:val="TE-Normal"/>
+      </w:pPr>
+      <w:r>
+        <w:t>A representação por contorno melódico adota um nível maior de abstração em relação à representação intervalar. Enquanto os intervalos preservam a magnitude exata do movimento entre duas notas, o contorno considera apenas sua direção. Essa simplificação pode ser útil para identificar semelhanças mais gerais entre trechos melódicos, especialmente quando duas sequências apresentam movimentos parecidos, mas não os mesmos intervalos. Assim, o contorno melódico permite observar padrões que poderiam não ser detectados por uma comparação intervalar estrita.</w:t>
       </w:r>
     </w:p>
     <w:p>
@@ -4865,38 +4917,38 @@
       <w:pPr>
         <w:pStyle w:val="T3-TituloTerciario"/>
       </w:pPr>
-      <w:bookmarkStart w:id="38" w:name="_Toc230252531"/>
+      <w:bookmarkStart w:id="41" w:name="_Toc230252531"/>
       <w:r>
         <w:t>Representação direcional</w:t>
       </w:r>
-      <w:bookmarkEnd w:id="38"/>
-    </w:p>
-    <w:p>
-      <w:pPr>
-        <w:pStyle w:val="TE-Normal"/>
-      </w:pPr>
+      <w:bookmarkEnd w:id="41"/>
+    </w:p>
+    <w:p>
+      <w:pPr>
+        <w:pStyle w:val="TE-Normal"/>
+      </w:pPr>
+      <w:r>
+        <w:t>A representação direcional do contorno melódico pode ser realizada por meio de símbolos que indicam a direção do movimento entre notas, como ascendente, descendente ou repetido.</w:t>
+      </w:r>
+    </w:p>
+    <w:p>
+      <w:pPr>
+        <w:pStyle w:val="TE-Normal"/>
+      </w:pPr>
+      <w:r>
+        <w:t>Essa simplificação permite identificar padrões estruturais mesmo quando os intervalos exatos diferem, tornando a abordagem complementar à representação intervalar. Em sistemas computacionais, a combinação dessas duas representações pode aumentar a robustez na detecção de padrões melódicos.</w:t>
+      </w:r>
+    </w:p>
+    <w:p>
+      <w:pPr>
+        <w:pStyle w:val="T2-TituloSecundario"/>
+      </w:pPr>
+      <w:bookmarkStart w:id="42" w:name="_Toc230252532"/>
       <w:r>
         <w:lastRenderedPageBreak/>
-        <w:t>A representação direcional do contorno melódico pode ser realizada por meio de símbolos que indicam a direção do movimento entre notas, como ascendente, descendente ou repetido.</w:t>
-      </w:r>
-    </w:p>
-    <w:p>
-      <w:pPr>
-        <w:pStyle w:val="TE-Normal"/>
-      </w:pPr>
-      <w:r>
-        <w:t>Essa simplificação permite identificar padrões estruturais mesmo quando os intervalos exatos diferem, tornando a abordagem complementar à representação intervalar. Em sistemas computacionais, a combinação dessas duas representações pode aumentar a robustez na detecção de padrões melódicos.</w:t>
-      </w:r>
-    </w:p>
-    <w:p>
-      <w:pPr>
-        <w:pStyle w:val="T2-TituloSecundario"/>
-      </w:pPr>
-      <w:bookmarkStart w:id="39" w:name="_Toc230252532"/>
-      <w:r>
         <w:t>Trabalhos Relacionados</w:t>
       </w:r>
-      <w:bookmarkEnd w:id="39"/>
+      <w:bookmarkEnd w:id="42"/>
     </w:p>
     <w:p>
       <w:pPr>
@@ -4927,19 +4979,19 @@
         <w:pStyle w:val="TE-Normal"/>
       </w:pPr>
       <w:r>
-        <w:t xml:space="preserve">No campo específico da descoberta de padrões musicais, Meredith (2016) </w:t>
+        <w:t>No campo específico da descoberta de padrões musicais, Meredith (2016) discute métodos computacionais voltados à identificação de recorrências estruturais em obras musicais. Suas contribuições são relevantes por demonstrar que padrões musicais podem ser investigados por meio de representações abstratas e procedimentos de comparação entre sequências. Embora muitos métodos apresentados na literatura utilizem algoritmos mais complexos, a noção de recorrência estrutural serve de base para a proposta deste trabalho.</w:t>
+      </w:r>
+    </w:p>
+    <w:p>
+      <w:pPr>
+        <w:pStyle w:val="TE-Normal"/>
+      </w:pPr>
+      <w:r>
+        <w:t xml:space="preserve">Além disso, estudos relacionados à percepção e cognição musical, como os de Huron (2006), contribuem para compreender a importância dos padrões na escuta e na organização musical. A recorrência de motivos e movimentos melódicos está associada </w:t>
       </w:r>
       <w:r>
         <w:lastRenderedPageBreak/>
-        <w:t>discute métodos computacionais voltados à identificação de recorrências estruturais em obras musicais. Suas contribuições são relevantes por demonstrar que padrões musicais podem ser investigados por meio de representações abstratas e procedimentos de comparação entre sequências. Embora muitos métodos apresentados na literatura utilizem algoritmos mais complexos, a noção de recorrência estrutural serve de base para a proposta deste trabalho.</w:t>
-      </w:r>
-    </w:p>
-    <w:p>
-      <w:pPr>
-        <w:pStyle w:val="TE-Normal"/>
-      </w:pPr>
-      <w:r>
-        <w:t>Além disso, estudos relacionados à percepção e cognição musical, como os de Huron (2006), contribuem para compreender a importância dos padrões na escuta e na organização musical. A recorrência de motivos e movimentos melódicos está associada à construção de expectativa, coerência e reconhecimento musical. Dessa forma, a identificação de padrões melódicos não possui apenas relevância técnica, mas também musical e perceptiva.</w:t>
+        <w:t>à construção de expectativa, coerência e reconhecimento musical. Dessa forma, a identificação de padrões melódicos não possui apenas relevância técnica, mas também musical e perceptiva.</w:t>
       </w:r>
     </w:p>
     <w:p>
@@ -4965,22 +5017,22 @@
       <w:pPr>
         <w:pStyle w:val="T1-TituloPrimario"/>
       </w:pPr>
-      <w:bookmarkStart w:id="40" w:name="_Toc230252533"/>
+      <w:bookmarkStart w:id="43" w:name="_Toc230252533"/>
       <w:r>
         <w:lastRenderedPageBreak/>
         <w:t>PROCEDIMENTOS METODOLÓGICOS</w:t>
       </w:r>
-      <w:bookmarkEnd w:id="40"/>
+      <w:bookmarkEnd w:id="43"/>
     </w:p>
     <w:p>
       <w:pPr>
         <w:pStyle w:val="T2-TituloSecundario"/>
       </w:pPr>
-      <w:bookmarkStart w:id="41" w:name="_Toc230252534"/>
+      <w:bookmarkStart w:id="44" w:name="_Toc230252534"/>
       <w:r>
         <w:t>Caracterização da pesquisa</w:t>
       </w:r>
-      <w:bookmarkEnd w:id="41"/>
+      <w:bookmarkEnd w:id="44"/>
     </w:p>
     <w:p>
       <w:pPr>
@@ -4994,11 +5046,11 @@
       <w:pPr>
         <w:pStyle w:val="T2-TituloSecundario"/>
       </w:pPr>
-      <w:bookmarkStart w:id="42" w:name="_Toc230252535"/>
+      <w:bookmarkStart w:id="45" w:name="_Toc230252535"/>
       <w:r>
         <w:t>Corpus de análise</w:t>
       </w:r>
-      <w:bookmarkEnd w:id="42"/>
+      <w:bookmarkEnd w:id="45"/>
     </w:p>
     <w:p>
       <w:pPr>
@@ -5060,7 +5112,7 @@
           <w:szCs w:val="22"/>
         </w:rPr>
       </w:pPr>
-      <w:bookmarkStart w:id="43" w:name="_Toc230252336"/>
+      <w:bookmarkStart w:id="46" w:name="_Toc230252336"/>
       <w:r>
         <w:rPr>
           <w:b/>
@@ -5144,7 +5196,7 @@
         </w:rPr>
         <w:t xml:space="preserve"> - Corpus de partituras utilizado na análise</w:t>
       </w:r>
-      <w:bookmarkEnd w:id="43"/>
+      <w:bookmarkEnd w:id="46"/>
     </w:p>
     <w:tbl>
       <w:tblPr>
@@ -5871,11 +5923,11 @@
       <w:pPr>
         <w:pStyle w:val="T2-TituloSecundario"/>
       </w:pPr>
-      <w:bookmarkStart w:id="44" w:name="_Toc230252536"/>
+      <w:bookmarkStart w:id="47" w:name="_Toc230252536"/>
       <w:r>
         <w:t>Extração da melodia</w:t>
       </w:r>
-      <w:bookmarkEnd w:id="44"/>
+      <w:bookmarkEnd w:id="47"/>
     </w:p>
     <w:p>
       <w:pPr>
@@ -5915,32 +5967,40 @@
     </w:p>
     <w:p>
       <w:pPr>
+        <w:pStyle w:val="TE-Normal"/>
+      </w:pPr>
+      <w:r>
+        <w:t>Como resultado dessa etapa, cada partitura será convertida em uma sequência ordenada de eventos melódicos. Cada evento deverá conter, no mínimo, a altura da nota, sua posição sequencial e o compasso em que ocorre. A altura será utilizada para o cálculo dos intervalos; a posição sequencial permitirá preservar a ordem da melodia; e o compasso servirá para localizar posteriormente as ocorrências dos padrões identificados. Dessa forma, a extração da melodia transforma a partitura em uma estrutura de dados adequada para as etapas seguintes de representação e comparação.</w:t>
+      </w:r>
+    </w:p>
+    <w:p>
+      <w:pPr>
         <w:pStyle w:val="T2-TituloSecundario"/>
       </w:pPr>
-      <w:bookmarkStart w:id="45" w:name="_Toc230252537"/>
+      <w:bookmarkStart w:id="48" w:name="_Toc230252537"/>
       <w:r>
         <w:t>Representação por intervalos</w:t>
       </w:r>
-      <w:bookmarkEnd w:id="45"/>
-    </w:p>
-    <w:p>
-      <w:pPr>
-        <w:pStyle w:val="TE-Normal"/>
-      </w:pPr>
-      <w:r>
-        <w:t xml:space="preserve">Após a extração das sequências melódicas, as notas serão convertidas em uma representação baseada em intervalos melódicos relativos. Essa representação consiste em calcular a diferença de altura entre cada par de notas consecutivas, substituindo a sequência de alturas absolutas por uma sequência de relações intervalares. Dessa forma, a análise passa a considerar a estrutura interna da melodia, e não apenas as notas específicas que a compõem. </w:t>
-      </w:r>
-    </w:p>
-    <w:p>
-      <w:pPr>
-        <w:pStyle w:val="TE-Normal"/>
-      </w:pPr>
-      <w:r>
-        <w:t xml:space="preserve">Por exemplo, uma sequência formada pelas notas Dó, Ré, Fá e Mi pode ser representada pelos intervalos +2, +3 e -1, considerando a distância em semitons entre notas sucessivas. Nessa lógica, o sinal positivo indica movimento ascendente, o sinal negativo indica movimento descendente e o valor zero indica repetição da mesma altura. </w:t>
+      <w:bookmarkEnd w:id="48"/>
+    </w:p>
+    <w:p>
+      <w:pPr>
+        <w:pStyle w:val="TE-Normal"/>
+      </w:pPr>
+      <w:r>
+        <w:t xml:space="preserve">Após a extração das sequências melódicas, as notas serão convertidas em uma representação baseada em intervalos melódicos relativos. Essa representação consiste em calcular a diferença de altura entre cada par de notas consecutivas, substituindo a </w:t>
       </w:r>
       <w:r>
         <w:lastRenderedPageBreak/>
-        <w:t>Essa representação permite que o algoritmo compare trechos musicais com base nas relações entre as notas, independentemente da tonalidade original.</w:t>
+        <w:t xml:space="preserve">sequência de alturas absolutas por uma sequência de relações intervalares. Dessa forma, a análise passa a considerar a estrutura interna da melodia, e não apenas as notas específicas que a compõem. </w:t>
+      </w:r>
+    </w:p>
+    <w:p>
+      <w:pPr>
+        <w:pStyle w:val="TE-Normal"/>
+      </w:pPr>
+      <w:r>
+        <w:t>Por exemplo, uma sequência formada pelas notas Dó, Ré, Fá e Mi pode ser representada pelos intervalos +2, +3 e -1, considerando a distância em semitons entre notas sucessivas. Nessa lógica, o sinal positivo indica movimento ascendente, o sinal negativo indica movimento descendente e o valor zero indica repetição da mesma altura. Essa representação permite que o algoritmo compare trechos musicais com base nas relações entre as notas, independentemente da tonalidade original.</w:t>
       </w:r>
     </w:p>
     <w:p>
@@ -5963,11 +6023,11 @@
       <w:pPr>
         <w:pStyle w:val="T2-TituloSecundario"/>
       </w:pPr>
-      <w:bookmarkStart w:id="46" w:name="_Toc230252538"/>
+      <w:bookmarkStart w:id="49" w:name="_Toc230252538"/>
       <w:r>
         <w:t>Representação por contorno</w:t>
       </w:r>
-      <w:bookmarkEnd w:id="46"/>
+      <w:bookmarkEnd w:id="49"/>
     </w:p>
     <w:p>
       <w:pPr>
@@ -5982,6 +6042,7 @@
         <w:pStyle w:val="TE-Normal"/>
       </w:pPr>
       <w:r>
+        <w:lastRenderedPageBreak/>
         <w:t>Para construir essa representação, cada intervalo entre notas consecutivas será convertido em uma categoria direcional. Intervalos ascendentes serão representados como movimento ascendente, intervalos descendentes como movimento descendente e intervalos iguais como repetição. Dessa forma, uma sequência intervalar como +2, +5 e -1 será reduzida a um contorno composto por subida, subida e descida. Embora haja perda de detalhe, a representação resultante permite observar semelhanças mais abstratas entre diferentes trechos melódicos.</w:t>
       </w:r>
     </w:p>
@@ -5993,54 +6054,53 @@
         </w:rPr>
       </w:pPr>
       <w:r>
+        <w:t>A utilização do contorno melódico é relevante porque determinados padrões podem ser percebidos como semelhantes mesmo quando não possuem exatamente os mesmos intervalos. Duas melodias podem apresentar movimentos direcionais equivalentes, ainda que uma utilize intervalos maiores ou menores que a outra. Assim, a análise por contorno permite identificar recorrências estruturais mais gerais, complementando os resultados obtidos pela análise intervalar.</w:t>
+      </w:r>
+    </w:p>
+    <w:p>
+      <w:pPr>
+        <w:pStyle w:val="TE-Normal"/>
+      </w:pPr>
+      <w:r>
+        <w:t>Neste trabalho, a representação por contorno será aplicada de forma complementar à representação intervalar. Enquanto a análise intervalar permitirá identificar padrões mais precisos, a análise de contorno possibilitará detectar recorrências mais flexíveis, baseadas na forma geral do movimento melódico. A comparação entre essas duas abordagens permitirá observar diferentes níveis de similaridade nas obras analisadas.</w:t>
+      </w:r>
+    </w:p>
+    <w:p>
+      <w:pPr>
+        <w:pStyle w:val="T2-TituloSecundario"/>
+      </w:pPr>
+      <w:bookmarkStart w:id="50" w:name="_Toc230252539"/>
+      <w:r>
+        <w:t>Detecção de padrões</w:t>
+      </w:r>
+      <w:bookmarkEnd w:id="50"/>
+    </w:p>
+    <w:p>
+      <w:pPr>
+        <w:pStyle w:val="TE-Normal"/>
+      </w:pPr>
+      <w:r>
+        <w:t>A detecção de padrões será realizada por meio da análise de subsequências extraídas das representações intervalares e de contorno melódico. Para isso, será adotada uma abordagem baseada em janelas deslizantes, na qual segmentos de tamanho fixo percorrem sequencialmente a melodia analisada. Cada janela corresponde a um trecho curto da sequência musical e será tratada como um candidato a padrão.</w:t>
+      </w:r>
+    </w:p>
+    <w:p>
+      <w:pPr>
+        <w:pStyle w:val="TE-Normal"/>
+      </w:pPr>
+      <w:r>
+        <w:t xml:space="preserve">Inicialmente, serão utilizadas janelas contendo entre três e cinco elementos. Essa escolha se justifica pelo fato de que segmentos curtos tendem a se aproximar da ideia de motivos melódicos, permitindo identificar recorrências locais sem exigir a </w:t>
+      </w:r>
+      <w:r>
         <w:lastRenderedPageBreak/>
-        <w:t>A utilização do contorno melódico é relevante porque determinados padrões podem ser percebidos como semelhantes mesmo quando não possuem exatamente os mesmos intervalos. Duas melodias podem apresentar movimentos direcionais equivalentes, ainda que uma utilize intervalos maiores ou menores que a outra. Assim, a análise por contorno permite identificar recorrências estruturais mais gerais, complementando os resultados obtidos pela análise intervalar.</w:t>
-      </w:r>
-    </w:p>
-    <w:p>
-      <w:pPr>
-        <w:pStyle w:val="TE-Normal"/>
-      </w:pPr>
-      <w:r>
-        <w:t>Neste trabalho, a representação por contorno será aplicada de forma complementar à representação intervalar. Enquanto a análise intervalar permitirá identificar padrões mais precisos, a análise de contorno possibilitará detectar recorrências mais flexíveis, baseadas na forma geral do movimento melódico. A comparação entre essas duas abordagens permitirá observar diferentes níveis de similaridade nas obras analisadas.</w:t>
-      </w:r>
-    </w:p>
-    <w:p>
-      <w:pPr>
-        <w:pStyle w:val="T2-TituloSecundario"/>
-      </w:pPr>
-      <w:bookmarkStart w:id="47" w:name="_Toc230252539"/>
-      <w:r>
-        <w:t>Detecção de padrões</w:t>
-      </w:r>
-      <w:bookmarkEnd w:id="47"/>
-    </w:p>
-    <w:p>
-      <w:pPr>
-        <w:pStyle w:val="TE-Normal"/>
-      </w:pPr>
-      <w:r>
-        <w:t>A detecção de padrões será realizada por meio da análise de subsequências extraídas das representações intervalares e de contorno melódico. Para isso, será adotada uma abordagem baseada em janelas deslizantes, na qual segmentos de tamanho fixo percorrem sequencialmente a melodia analisada. Cada janela corresponde a um trecho curto da sequência musical e será tratada como um candidato a padrão.</w:t>
-      </w:r>
-    </w:p>
-    <w:p>
-      <w:pPr>
-        <w:pStyle w:val="TE-Normal"/>
-      </w:pPr>
-      <w:r>
-        <w:t>Inicialmente, serão utilizadas janelas contendo entre três e cinco elementos. Essa escolha se justifica pelo fato de que segmentos curtos tendem a se aproximar da ideia de motivos melódicos, permitindo identificar recorrências locais sem exigir a comparação de frases musicais extensas. Além disso, o uso de diferentes tamanhos de janela possibilita observar padrões em níveis distintos de granularidade, desde pequenas células melódicas até estruturas um pouco mais amplas.</w:t>
-      </w:r>
-    </w:p>
-    <w:p>
-      <w:pPr>
-        <w:pStyle w:val="TE-Normal"/>
-      </w:pPr>
-      <w:r>
-        <w:t xml:space="preserve">Para cada obra do corpus, o algoritmo percorrerá a sequência de intervalos e a sequência de contorno, gerando todas as subsequências possíveis de acordo com os tamanhos de janela definidos. Em seguida, essas subsequências serão comparadas entre si, a fim de identificar aquelas que ocorrem mais de uma vez na mesma composição. As </w:t>
-      </w:r>
-      <w:r>
-        <w:lastRenderedPageBreak/>
-        <w:t>subsequências recorrentes serão registradas como padrões candidatos, acompanhadas de informações como tipo de representação utilizada, quantidade de ocorrências e localização aproximada na partitura.</w:t>
+        <w:t>comparação de frases musicais extensas. Além disso, o uso de diferentes tamanhos de janela possibilita observar padrões em níveis distintos de granularidade, desde pequenas células melódicas até estruturas um pouco mais amplas.</w:t>
+      </w:r>
+    </w:p>
+    <w:p>
+      <w:pPr>
+        <w:pStyle w:val="TE-Normal"/>
+      </w:pPr>
+      <w:r>
+        <w:t>Para cada obra do corpus, o algoritmo percorrerá a sequência de intervalos e a sequência de contorno, gerando todas as subsequências possíveis de acordo com os tamanhos de janela definidos. Em seguida, essas subsequências serão comparadas entre si, a fim de identificar aquelas que ocorrem mais de uma vez na mesma composição. As subsequências recorrentes serão registradas como padrões candidatos, acompanhadas de informações como tipo de representação utilizada, quantidade de ocorrências e localização aproximada na partitura.</w:t>
       </w:r>
     </w:p>
     <w:p>
@@ -6067,30 +6127,30 @@
       <w:pPr>
         <w:pStyle w:val="T2-TituloSecundario"/>
       </w:pPr>
-      <w:bookmarkStart w:id="48" w:name="_Toc230252540"/>
+      <w:bookmarkStart w:id="51" w:name="_Toc230252540"/>
       <w:r>
         <w:t>Análise dos resultados</w:t>
       </w:r>
-      <w:bookmarkEnd w:id="48"/>
-    </w:p>
-    <w:p>
-      <w:pPr>
-        <w:pStyle w:val="TE-Normal"/>
-      </w:pPr>
-      <w:r>
-        <w:t>Os resultados obtidos pelo protótipo serão analisados de forma qualitativa, com o objetivo de verificar a coerência das recorrências identificadas automaticamente. A avaliação não terá como finalidade estabelecer uma medição estatística ampla ou uma validação musicológica definitiva, mas observar se a abordagem proposta é capaz de apontar padrões melódicos relevantes dentro do corpus selecionado.</w:t>
-      </w:r>
-    </w:p>
-    <w:p>
-      <w:pPr>
-        <w:pStyle w:val="TE-Normal"/>
-      </w:pPr>
-      <w:r>
-        <w:t xml:space="preserve">Para cada obra analisada, serão observados os padrões detectados a partir da representação intervalar e da representação por contorno. A análise considerará aspectos como quantidade de padrões encontrados, frequência de ocorrência, localização dos padrões na partitura e relação entre os resultados obtidos pelas duas formas de representação. Também será verificado se os padrões identificados correspondem a </w:t>
+      <w:bookmarkEnd w:id="51"/>
+    </w:p>
+    <w:p>
+      <w:pPr>
+        <w:pStyle w:val="TE-Normal"/>
+      </w:pPr>
+      <w:r>
+        <w:t xml:space="preserve">Os resultados obtidos pelo protótipo serão analisados de forma qualitativa, com o objetivo de verificar a coerência das recorrências identificadas automaticamente. A avaliação não terá como finalidade estabelecer uma medição estatística ampla ou uma </w:t>
       </w:r>
       <w:r>
         <w:lastRenderedPageBreak/>
-        <w:t>trechos que, por inspeção manual, possam ser reconhecidos como recorrências melódicas.</w:t>
+        <w:t>validação musicológica definitiva, mas observar se a abordagem proposta é capaz de apontar padrões melódicos relevantes dentro do corpus selecionado.</w:t>
+      </w:r>
+    </w:p>
+    <w:p>
+      <w:pPr>
+        <w:pStyle w:val="TE-Normal"/>
+      </w:pPr>
+      <w:r>
+        <w:t>Para cada obra analisada, serão observados os padrões detectados a partir da representação intervalar e da representação por contorno. A análise considerará aspectos como quantidade de padrões encontrados, frequência de ocorrência, localização dos padrões na partitura e relação entre os resultados obtidos pelas duas formas de representação. Também será verificado se os padrões identificados correspondem a trechos que, por inspeção manual, possam ser reconhecidos como recorrências melódicas.</w:t>
       </w:r>
     </w:p>
     <w:p>
@@ -6124,17 +6184,18 @@
       <w:pPr>
         <w:pStyle w:val="T2-TituloSecundario"/>
       </w:pPr>
-      <w:bookmarkStart w:id="49" w:name="_Toc230252541"/>
+      <w:bookmarkStart w:id="52" w:name="_Toc230252541"/>
       <w:r>
         <w:t>Visão geral do sistema proposto</w:t>
       </w:r>
-      <w:bookmarkEnd w:id="49"/>
-    </w:p>
-    <w:p>
-      <w:pPr>
-        <w:pStyle w:val="TE-Normal"/>
-      </w:pPr>
-      <w:r>
+      <w:bookmarkEnd w:id="52"/>
+    </w:p>
+    <w:p>
+      <w:pPr>
+        <w:pStyle w:val="TE-Normal"/>
+      </w:pPr>
+      <w:r>
+        <w:lastRenderedPageBreak/>
         <w:t>O sistema proposto consiste em um protótipo computacional voltado à identificação de padrões melódicos recorrentes em partituras digitais no formato MusicXML. O funcionamento do sistema será organizado em etapas sequenciais, iniciando pela entrada dos arquivos musicais e finalizando com a apresentação dos padrões detectados e suas respectivas ocorrências.</w:t>
       </w:r>
     </w:p>
@@ -6143,50 +6204,49 @@
         <w:pStyle w:val="TE-Normal"/>
       </w:pPr>
       <w:r>
-        <w:t xml:space="preserve">Inicialmente, as partituras em MusicXML serão fornecidas como entrada do sistema. Em seguida, será realizada a extração da linha melódica principal, a partir da </w:t>
+        <w:t>Inicialmente, as partituras em MusicXML serão fornecidas como entrada do sistema. Em seguida, será realizada a extração da linha melódica principal, a partir da qual serão obtidas sequências de notas organizadas de acordo com sua ordem de ocorrência na partitura. Essas sequências constituirão a base para as etapas seguintes da análise.</w:t>
+      </w:r>
+    </w:p>
+    <w:p>
+      <w:pPr>
+        <w:pStyle w:val="TE-Normal"/>
+      </w:pPr>
+      <w:r>
+        <w:t>Após a extração das notas, o sistema realizará duas formas de representação da melodia. A primeira será a representação intervalar, baseada na diferença de altura entre notas consecutivas. A segunda será a representação por contorno, baseada apenas na direção do movimento melódico. Essas duas representações permitirão analisar a melodia em diferentes níveis de abstração.</w:t>
+      </w:r>
+    </w:p>
+    <w:p>
+      <w:pPr>
+        <w:pStyle w:val="TE-Normal"/>
+      </w:pPr>
+      <w:r>
+        <w:t>Na sequência, será aplicado o processo de detecção de padrões por janelas deslizantes. O algoritmo percorrerá as sequências geradas e identificará subsequências recorrentes, registrando sua quantidade de ocorrências e sua localização aproximada nas partituras. Esse procedimento será aplicado separadamente às representações intervalares e de contorno, permitindo comparar os padrões detectados em cada abordagem.</w:t>
+      </w:r>
+    </w:p>
+    <w:p>
+      <w:pPr>
+        <w:pStyle w:val="TE-Normal"/>
+      </w:pPr>
+      <w:r>
+        <w:t>Como saída, o sistema deverá apresentar uma relação dos padrões identificados, indicando o tipo de representação utilizada, a sequência correspondente, o número de ocorrências e os compassos em que cada padrão aparece. Essas informações serão posteriormente analisadas de forma qualitativa, com o objetivo de verificar a coerência dos resultados e a viabilidade da abordagem proposta.</w:t>
+      </w:r>
+    </w:p>
+    <w:p>
+      <w:pPr>
+        <w:pStyle w:val="TE-Normal"/>
+      </w:pPr>
+      <w:r>
+        <w:t xml:space="preserve">A Figura 3 apresenta a visão geral do fluxo de funcionamento do sistema proposto. O processo inicia com a entrada dos arquivos MusicXML, passa pela extração da linha melódica principal e segue para a conversão da melodia em duas representações: intervalos melódicos e contorno melódico. Em seguida, são aplicadas </w:t>
       </w:r>
       <w:r>
         <w:lastRenderedPageBreak/>
-        <w:t>qual serão obtidas sequências de notas organizadas de acordo com sua ordem de ocorrência na partitura. Essas sequências constituirão a base para as etapas seguintes da análise.</w:t>
-      </w:r>
-    </w:p>
-    <w:p>
-      <w:pPr>
-        <w:pStyle w:val="TE-Normal"/>
-      </w:pPr>
-      <w:r>
-        <w:t>Após a extração das notas, o sistema realizará duas formas de representação da melodia. A primeira será a representação intervalar, baseada na diferença de altura entre notas consecutivas. A segunda será a representação por contorno, baseada apenas na direção do movimento melódico. Essas duas representações permitirão analisar a melodia em diferentes níveis de abstração.</w:t>
-      </w:r>
-    </w:p>
-    <w:p>
-      <w:pPr>
-        <w:pStyle w:val="TE-Normal"/>
-      </w:pPr>
-      <w:r>
-        <w:t>Na sequência, será aplicado o processo de detecção de padrões por janelas deslizantes. O algoritmo percorrerá as sequências geradas e identificará subsequências recorrentes, registrando sua quantidade de ocorrências e sua localização aproximada nas partituras. Esse procedimento será aplicado separadamente às representações intervalares e de contorno, permitindo comparar os padrões detectados em cada abordagem.</w:t>
-      </w:r>
-    </w:p>
-    <w:p>
-      <w:pPr>
-        <w:pStyle w:val="TE-Normal"/>
-      </w:pPr>
-      <w:r>
-        <w:t>Como saída, o sistema deverá apresentar uma relação dos padrões identificados, indicando o tipo de representação utilizada, a sequência correspondente, o número de ocorrências e os compassos em que cada padrão aparece. Essas informações serão posteriormente analisadas de forma qualitativa, com o objetivo de verificar a coerência dos resultados e a viabilidade da abordagem proposta.</w:t>
-      </w:r>
-    </w:p>
-    <w:p>
-      <w:pPr>
-        <w:pStyle w:val="TE-Normal"/>
-      </w:pPr>
-      <w:r>
-        <w:t>Esse fluxo pode ser representado pelas seguintes etapas: entrada dos arquivos MusicXML, extração da melodia, conversão para representações estruturais, aplicação de janelas deslizantes, comparação de subsequências, identificação de padrões recorrentes e análise dos resultados obtidos. Essa organização modular facilita a compreensão do funcionamento do protótipo e permite que cada etapa seja avaliada separadamente durante o desenvolvimento do trabalho.</w:t>
-      </w:r>
-      <w:r>
-        <w:t xml:space="preserve"> </w:t>
-      </w:r>
-      <w:r>
-        <w:t>A Figura 3 apresenta uma visão geral do fluxo de funcionamento do sistema proposto, desde a entrada dos arquivos MusicXML até a análise qualitativa dos padrões identificados.</w:t>
-      </w:r>
+        <w:t>janelas deslizantes para gerar subsequências candidatas a padrão. Essas subsequências são comparadas entre si, e aquelas que apresentam recorrência são registradas com suas respectivas ocorrências e localizações aproximadas. Por fim, os resultados são analisados qualitativamente, a fim de verificar se os padrões identificados possuem coerência musical dentro do corpus analisado.</w:t>
+      </w:r>
+    </w:p>
+    <w:p>
+      <w:pPr>
+        <w:pStyle w:val="TE-Normal"/>
+      </w:pPr>
     </w:p>
     <w:p>
       <w:pPr>
@@ -6203,7 +6263,7 @@
           <w:szCs w:val="22"/>
         </w:rPr>
       </w:pPr>
-      <w:bookmarkStart w:id="50" w:name="_Toc230251477"/>
+      <w:bookmarkStart w:id="53" w:name="_Toc230251477"/>
       <w:r>
         <w:rPr>
           <w:b/>
@@ -6214,7 +6274,6 @@
           <w:sz w:val="22"/>
           <w:szCs w:val="22"/>
         </w:rPr>
-        <w:lastRenderedPageBreak/>
         <w:t xml:space="preserve">FIGURA </w:t>
       </w:r>
       <w:r>
@@ -6301,7 +6360,7 @@
         <w:t>- Fluxo geral do sistema proposto</w:t>
       </w:r>
       <w:bookmarkEnd w:id="6"/>
-      <w:bookmarkEnd w:id="50"/>
+      <w:bookmarkEnd w:id="53"/>
     </w:p>
     <w:p>
       <w:pPr>
@@ -6401,12 +6460,12 @@
       <w:pPr>
         <w:pStyle w:val="T1-TituloPrimario"/>
       </w:pPr>
-      <w:bookmarkStart w:id="51" w:name="_Toc230252542"/>
+      <w:bookmarkStart w:id="54" w:name="_Toc230252542"/>
       <w:r>
         <w:lastRenderedPageBreak/>
         <w:t>CRONOGRAMA</w:t>
       </w:r>
-      <w:bookmarkEnd w:id="51"/>
+      <w:bookmarkEnd w:id="54"/>
     </w:p>
     <w:p>
       <w:pPr>
@@ -6434,7 +6493,7 @@
           <w:szCs w:val="22"/>
         </w:rPr>
       </w:pPr>
-      <w:bookmarkStart w:id="52" w:name="_Toc230252337"/>
+      <w:bookmarkStart w:id="55" w:name="_Toc230252337"/>
       <w:r>
         <w:rPr>
           <w:i w:val="0"/>
@@ -6506,7 +6565,7 @@
         </w:rPr>
         <w:t xml:space="preserve"> - Cronograma previsto para o TCC I</w:t>
       </w:r>
-      <w:bookmarkEnd w:id="52"/>
+      <w:bookmarkEnd w:id="55"/>
     </w:p>
     <w:tbl>
       <w:tblPr>
@@ -7591,7 +7650,7 @@
           <w:szCs w:val="22"/>
         </w:rPr>
       </w:pPr>
-      <w:bookmarkStart w:id="53" w:name="_Toc230252338"/>
+      <w:bookmarkStart w:id="56" w:name="_Toc230252338"/>
       <w:r>
         <w:rPr>
           <w:i w:val="0"/>
@@ -7636,6 +7695,7 @@
         <w:rPr>
           <w:i w:val="0"/>
           <w:iCs w:val="0"/>
+          <w:noProof/>
           <w:color w:val="auto"/>
           <w:sz w:val="22"/>
           <w:szCs w:val="22"/>
@@ -7662,7 +7722,7 @@
         </w:rPr>
         <w:t xml:space="preserve"> - Cronograma previsto para o TCC II</w:t>
       </w:r>
-      <w:bookmarkEnd w:id="53"/>
+      <w:bookmarkEnd w:id="56"/>
     </w:p>
     <w:tbl>
       <w:tblPr>
@@ -8559,20 +8619,20 @@
       <w:pPr>
         <w:pStyle w:val="TP-TituloCentralizadoPos"/>
       </w:pPr>
-      <w:bookmarkStart w:id="54" w:name="_Toc527721628"/>
-      <w:bookmarkStart w:id="55" w:name="_Toc527793681"/>
-      <w:bookmarkStart w:id="56" w:name="_Toc527795414"/>
-      <w:bookmarkStart w:id="57" w:name="_Toc527798510"/>
-      <w:bookmarkStart w:id="58" w:name="_Toc230252543"/>
+      <w:bookmarkStart w:id="57" w:name="_Toc527721628"/>
+      <w:bookmarkStart w:id="58" w:name="_Toc527793681"/>
+      <w:bookmarkStart w:id="59" w:name="_Toc527795414"/>
+      <w:bookmarkStart w:id="60" w:name="_Toc527798510"/>
+      <w:bookmarkStart w:id="61" w:name="_Toc230252543"/>
       <w:r>
         <w:lastRenderedPageBreak/>
         <w:t>Referências</w:t>
       </w:r>
-      <w:bookmarkEnd w:id="54"/>
-      <w:bookmarkEnd w:id="55"/>
-      <w:bookmarkEnd w:id="56"/>
       <w:bookmarkEnd w:id="57"/>
       <w:bookmarkEnd w:id="58"/>
+      <w:bookmarkEnd w:id="59"/>
+      <w:bookmarkEnd w:id="60"/>
+      <w:bookmarkEnd w:id="61"/>
       <w:r>
         <w:t xml:space="preserve"> </w:t>
       </w:r>

</xml_diff>

<commit_message>
Escrita bruta capítulo 4
</commit_message>
<xml_diff>
--- a/docs/Rascunho TCC.docx
+++ b/docs/Rascunho TCC.docx
@@ -465,6 +465,7 @@
         <w:pStyle w:val="TC-TituloCentralizado"/>
         <w:rPr>
           <w:noProof/>
+          <w:szCs w:val="26"/>
         </w:rPr>
       </w:pPr>
       <w:bookmarkStart w:id="0" w:name="_Toc527721610"/>
@@ -472,7 +473,7 @@
       <w:bookmarkStart w:id="2" w:name="_Toc527795382"/>
       <w:bookmarkStart w:id="3" w:name="_Toc527798492"/>
       <w:bookmarkStart w:id="4" w:name="_Toc159362151"/>
-      <w:bookmarkStart w:id="5" w:name="_Toc230257759"/>
+      <w:bookmarkStart w:id="5" w:name="_Toc230641962"/>
       <w:r>
         <w:lastRenderedPageBreak/>
         <w:t>Lista de</w:t>
@@ -520,7 +521,7 @@
           <w14:ligatures w14:val="standardContextual"/>
         </w:rPr>
       </w:pPr>
-      <w:hyperlink w:anchor="_Toc230257654" w:history="1">
+      <w:hyperlink w:anchor="_Toc230641878" w:history="1">
         <w:r>
           <w:rPr>
             <w:rStyle w:val="Hyperlink"/>
@@ -566,7 +567,7 @@
             <w:sz w:val="26"/>
             <w:szCs w:val="26"/>
           </w:rPr>
-          <w:instrText xml:space="preserve"> PAGEREF _Toc230257654 \h </w:instrText>
+          <w:instrText xml:space="preserve"> PAGEREF _Toc230641878 \h </w:instrText>
         </w:r>
         <w:r>
           <w:rPr>
@@ -592,7 +593,7 @@
             <w:sz w:val="26"/>
             <w:szCs w:val="26"/>
           </w:rPr>
-          <w:t>18</w:t>
+          <w:t>19</w:t>
         </w:r>
         <w:r>
           <w:rPr>
@@ -620,7 +621,7 @@
           <w14:ligatures w14:val="standardContextual"/>
         </w:rPr>
       </w:pPr>
-      <w:hyperlink w:anchor="_Toc230257655" w:history="1">
+      <w:hyperlink w:anchor="_Toc230641879" w:history="1">
         <w:r>
           <w:rPr>
             <w:rStyle w:val="Hyperlink"/>
@@ -666,7 +667,7 @@
             <w:sz w:val="26"/>
             <w:szCs w:val="26"/>
           </w:rPr>
-          <w:instrText xml:space="preserve"> PAGEREF _Toc230257655 \h </w:instrText>
+          <w:instrText xml:space="preserve"> PAGEREF _Toc230641879 \h </w:instrText>
         </w:r>
         <w:r>
           <w:rPr>
@@ -692,7 +693,7 @@
             <w:sz w:val="26"/>
             <w:szCs w:val="26"/>
           </w:rPr>
-          <w:t>19</w:t>
+          <w:t>20</w:t>
         </w:r>
         <w:r>
           <w:rPr>
@@ -720,7 +721,7 @@
           <w14:ligatures w14:val="standardContextual"/>
         </w:rPr>
       </w:pPr>
-      <w:hyperlink w:anchor="_Toc230257656" w:history="1">
+      <w:hyperlink w:anchor="_Toc230641880" w:history="1">
         <w:r>
           <w:rPr>
             <w:rStyle w:val="Hyperlink"/>
@@ -766,7 +767,7 @@
             <w:sz w:val="26"/>
             <w:szCs w:val="26"/>
           </w:rPr>
-          <w:instrText xml:space="preserve"> PAGEREF _Toc230257656 \h </w:instrText>
+          <w:instrText xml:space="preserve"> PAGEREF _Toc230641880 \h </w:instrText>
         </w:r>
         <w:r>
           <w:rPr>
@@ -792,7 +793,7 @@
             <w:sz w:val="26"/>
             <w:szCs w:val="26"/>
           </w:rPr>
-          <w:t>29</w:t>
+          <w:t>30</w:t>
         </w:r>
         <w:r>
           <w:rPr>
@@ -815,12 +816,12 @@
           <w:rFonts w:asciiTheme="minorHAnsi" w:eastAsiaTheme="minorEastAsia" w:hAnsiTheme="minorHAnsi" w:cstheme="minorBidi"/>
           <w:noProof/>
           <w:kern w:val="2"/>
-          <w:sz w:val="26"/>
-          <w:szCs w:val="26"/>
+          <w:sz w:val="24"/>
+          <w:szCs w:val="24"/>
           <w14:ligatures w14:val="standardContextual"/>
         </w:rPr>
       </w:pPr>
-      <w:hyperlink w:anchor="_Toc230257657" w:history="1">
+      <w:hyperlink w:anchor="_Toc230641881" w:history="1">
         <w:r>
           <w:rPr>
             <w:rStyle w:val="Hyperlink"/>
@@ -866,7 +867,7 @@
             <w:sz w:val="26"/>
             <w:szCs w:val="26"/>
           </w:rPr>
-          <w:instrText xml:space="preserve"> PAGEREF _Toc230257657 \h </w:instrText>
+          <w:instrText xml:space="preserve"> PAGEREF _Toc230641881 \h </w:instrText>
         </w:r>
         <w:r>
           <w:rPr>
@@ -892,7 +893,7 @@
             <w:sz w:val="26"/>
             <w:szCs w:val="26"/>
           </w:rPr>
-          <w:t>33</w:t>
+          <w:t>36</w:t>
         </w:r>
         <w:r>
           <w:rPr>
@@ -960,7 +961,7 @@
         <w:pStyle w:val="TC-TituloCentralizado"/>
       </w:pPr>
       <w:bookmarkStart w:id="6" w:name="_Toc159362152"/>
-      <w:bookmarkStart w:id="7" w:name="_Toc230257760"/>
+      <w:bookmarkStart w:id="7" w:name="_Toc230641963"/>
       <w:r>
         <w:lastRenderedPageBreak/>
         <w:t>Lista de QUADROS</w:t>
@@ -1004,7 +1005,7 @@
         </w:rPr>
         <w:fldChar w:fldCharType="separate"/>
       </w:r>
-      <w:hyperlink w:anchor="_Toc230257710" w:history="1">
+      <w:hyperlink w:anchor="_Toc230641857" w:history="1">
         <w:r>
           <w:rPr>
             <w:rStyle w:val="Hyperlink"/>
@@ -1050,7 +1051,7 @@
             <w:sz w:val="26"/>
             <w:szCs w:val="26"/>
           </w:rPr>
-          <w:instrText xml:space="preserve"> PAGEREF _Toc230257710 \h </w:instrText>
+          <w:instrText xml:space="preserve"> PAGEREF _Toc230641857 \h </w:instrText>
         </w:r>
         <w:r>
           <w:rPr>
@@ -1076,7 +1077,7 @@
             <w:sz w:val="26"/>
             <w:szCs w:val="26"/>
           </w:rPr>
-          <w:t>25</w:t>
+          <w:t>26</w:t>
         </w:r>
         <w:r>
           <w:rPr>
@@ -1104,7 +1105,7 @@
           <w14:ligatures w14:val="standardContextual"/>
         </w:rPr>
       </w:pPr>
-      <w:hyperlink w:anchor="_Toc230257711" w:history="1">
+      <w:hyperlink w:anchor="_Toc230641858" w:history="1">
         <w:r>
           <w:rPr>
             <w:rStyle w:val="Hyperlink"/>
@@ -1123,7 +1124,7 @@
             <w:sz w:val="26"/>
             <w:szCs w:val="26"/>
           </w:rPr>
-          <w:t xml:space="preserve"> - Etapas do protótipo proposto</w:t>
+          <w:t xml:space="preserve"> - Requisitos do protótipo</w:t>
         </w:r>
         <w:r>
           <w:rPr>
@@ -1150,7 +1151,7 @@
             <w:sz w:val="26"/>
             <w:szCs w:val="26"/>
           </w:rPr>
-          <w:instrText xml:space="preserve"> PAGEREF _Toc230257711 \h </w:instrText>
+          <w:instrText xml:space="preserve"> PAGEREF _Toc230641858 \h </w:instrText>
         </w:r>
         <w:r>
           <w:rPr>
@@ -1204,7 +1205,7 @@
           <w14:ligatures w14:val="standardContextual"/>
         </w:rPr>
       </w:pPr>
-      <w:hyperlink w:anchor="_Toc230257712" w:history="1">
+      <w:hyperlink w:anchor="_Toc230641859" w:history="1">
         <w:r>
           <w:rPr>
             <w:rStyle w:val="Hyperlink"/>
@@ -1215,6 +1216,306 @@
             <w:szCs w:val="26"/>
           </w:rPr>
           <w:t>QUADRO 3</w:t>
+        </w:r>
+        <w:r>
+          <w:rPr>
+            <w:rStyle w:val="Hyperlink"/>
+            <w:noProof/>
+            <w:sz w:val="26"/>
+            <w:szCs w:val="26"/>
+          </w:rPr>
+          <w:t xml:space="preserve"> - Etapas do protótipo proposto</w:t>
+        </w:r>
+        <w:r>
+          <w:rPr>
+            <w:noProof/>
+            <w:webHidden/>
+            <w:sz w:val="26"/>
+            <w:szCs w:val="26"/>
+          </w:rPr>
+          <w:tab/>
+        </w:r>
+        <w:r>
+          <w:rPr>
+            <w:noProof/>
+            <w:webHidden/>
+            <w:sz w:val="26"/>
+            <w:szCs w:val="26"/>
+          </w:rPr>
+          <w:fldChar w:fldCharType="begin"/>
+        </w:r>
+        <w:r>
+          <w:rPr>
+            <w:noProof/>
+            <w:webHidden/>
+            <w:sz w:val="26"/>
+            <w:szCs w:val="26"/>
+          </w:rPr>
+          <w:instrText xml:space="preserve"> PAGEREF _Toc230641859 \h </w:instrText>
+        </w:r>
+        <w:r>
+          <w:rPr>
+            <w:noProof/>
+            <w:webHidden/>
+            <w:sz w:val="26"/>
+            <w:szCs w:val="26"/>
+          </w:rPr>
+        </w:r>
+        <w:r>
+          <w:rPr>
+            <w:noProof/>
+            <w:webHidden/>
+            <w:sz w:val="26"/>
+            <w:szCs w:val="26"/>
+          </w:rPr>
+          <w:fldChar w:fldCharType="separate"/>
+        </w:r>
+        <w:r>
+          <w:rPr>
+            <w:noProof/>
+            <w:webHidden/>
+            <w:sz w:val="26"/>
+            <w:szCs w:val="26"/>
+          </w:rPr>
+          <w:t>37</w:t>
+        </w:r>
+        <w:r>
+          <w:rPr>
+            <w:noProof/>
+            <w:webHidden/>
+            <w:sz w:val="26"/>
+            <w:szCs w:val="26"/>
+          </w:rPr>
+          <w:fldChar w:fldCharType="end"/>
+        </w:r>
+      </w:hyperlink>
+    </w:p>
+    <w:p>
+      <w:pPr>
+        <w:pStyle w:val="ndicedeilustraes"/>
+        <w:tabs>
+          <w:tab w:val="right" w:leader="dot" w:pos="9061"/>
+        </w:tabs>
+        <w:rPr>
+          <w:rFonts w:asciiTheme="minorHAnsi" w:eastAsiaTheme="minorEastAsia" w:hAnsiTheme="minorHAnsi" w:cstheme="minorBidi"/>
+          <w:noProof/>
+          <w:kern w:val="2"/>
+          <w:sz w:val="26"/>
+          <w:szCs w:val="26"/>
+          <w14:ligatures w14:val="standardContextual"/>
+        </w:rPr>
+      </w:pPr>
+      <w:hyperlink w:anchor="_Toc230641860" w:history="1">
+        <w:r>
+          <w:rPr>
+            <w:rStyle w:val="Hyperlink"/>
+            <w:b/>
+            <w:bCs/>
+            <w:noProof/>
+            <w:sz w:val="26"/>
+            <w:szCs w:val="26"/>
+          </w:rPr>
+          <w:t>QUADRO 4</w:t>
+        </w:r>
+        <w:r>
+          <w:rPr>
+            <w:rStyle w:val="Hyperlink"/>
+            <w:noProof/>
+            <w:sz w:val="26"/>
+            <w:szCs w:val="26"/>
+          </w:rPr>
+          <w:t xml:space="preserve"> - Estrutura dos dados extraídos</w:t>
+        </w:r>
+        <w:r>
+          <w:rPr>
+            <w:noProof/>
+            <w:webHidden/>
+            <w:sz w:val="26"/>
+            <w:szCs w:val="26"/>
+          </w:rPr>
+          <w:tab/>
+        </w:r>
+        <w:r>
+          <w:rPr>
+            <w:noProof/>
+            <w:webHidden/>
+            <w:sz w:val="26"/>
+            <w:szCs w:val="26"/>
+          </w:rPr>
+          <w:fldChar w:fldCharType="begin"/>
+        </w:r>
+        <w:r>
+          <w:rPr>
+            <w:noProof/>
+            <w:webHidden/>
+            <w:sz w:val="26"/>
+            <w:szCs w:val="26"/>
+          </w:rPr>
+          <w:instrText xml:space="preserve"> PAGEREF _Toc230641860 \h </w:instrText>
+        </w:r>
+        <w:r>
+          <w:rPr>
+            <w:noProof/>
+            <w:webHidden/>
+            <w:sz w:val="26"/>
+            <w:szCs w:val="26"/>
+          </w:rPr>
+        </w:r>
+        <w:r>
+          <w:rPr>
+            <w:noProof/>
+            <w:webHidden/>
+            <w:sz w:val="26"/>
+            <w:szCs w:val="26"/>
+          </w:rPr>
+          <w:fldChar w:fldCharType="separate"/>
+        </w:r>
+        <w:r>
+          <w:rPr>
+            <w:noProof/>
+            <w:webHidden/>
+            <w:sz w:val="26"/>
+            <w:szCs w:val="26"/>
+          </w:rPr>
+          <w:t>39</w:t>
+        </w:r>
+        <w:r>
+          <w:rPr>
+            <w:noProof/>
+            <w:webHidden/>
+            <w:sz w:val="26"/>
+            <w:szCs w:val="26"/>
+          </w:rPr>
+          <w:fldChar w:fldCharType="end"/>
+        </w:r>
+      </w:hyperlink>
+    </w:p>
+    <w:p>
+      <w:pPr>
+        <w:pStyle w:val="ndicedeilustraes"/>
+        <w:tabs>
+          <w:tab w:val="right" w:leader="dot" w:pos="9061"/>
+        </w:tabs>
+        <w:rPr>
+          <w:rFonts w:asciiTheme="minorHAnsi" w:eastAsiaTheme="minorEastAsia" w:hAnsiTheme="minorHAnsi" w:cstheme="minorBidi"/>
+          <w:noProof/>
+          <w:kern w:val="2"/>
+          <w:sz w:val="26"/>
+          <w:szCs w:val="26"/>
+          <w14:ligatures w14:val="standardContextual"/>
+        </w:rPr>
+      </w:pPr>
+      <w:hyperlink w:anchor="_Toc230641861" w:history="1">
+        <w:r>
+          <w:rPr>
+            <w:rStyle w:val="Hyperlink"/>
+            <w:b/>
+            <w:bCs/>
+            <w:noProof/>
+            <w:sz w:val="26"/>
+            <w:szCs w:val="26"/>
+          </w:rPr>
+          <w:t xml:space="preserve">QUADRO 5 </w:t>
+        </w:r>
+        <w:r>
+          <w:rPr>
+            <w:rStyle w:val="Hyperlink"/>
+            <w:noProof/>
+            <w:sz w:val="26"/>
+            <w:szCs w:val="26"/>
+          </w:rPr>
+          <w:t>- Estrutura prevista para apresentação dos resultados</w:t>
+        </w:r>
+        <w:r>
+          <w:rPr>
+            <w:noProof/>
+            <w:webHidden/>
+            <w:sz w:val="26"/>
+            <w:szCs w:val="26"/>
+          </w:rPr>
+          <w:tab/>
+        </w:r>
+        <w:r>
+          <w:rPr>
+            <w:noProof/>
+            <w:webHidden/>
+            <w:sz w:val="26"/>
+            <w:szCs w:val="26"/>
+          </w:rPr>
+          <w:fldChar w:fldCharType="begin"/>
+        </w:r>
+        <w:r>
+          <w:rPr>
+            <w:noProof/>
+            <w:webHidden/>
+            <w:sz w:val="26"/>
+            <w:szCs w:val="26"/>
+          </w:rPr>
+          <w:instrText xml:space="preserve"> PAGEREF _Toc230641861 \h </w:instrText>
+        </w:r>
+        <w:r>
+          <w:rPr>
+            <w:noProof/>
+            <w:webHidden/>
+            <w:sz w:val="26"/>
+            <w:szCs w:val="26"/>
+          </w:rPr>
+        </w:r>
+        <w:r>
+          <w:rPr>
+            <w:noProof/>
+            <w:webHidden/>
+            <w:sz w:val="26"/>
+            <w:szCs w:val="26"/>
+          </w:rPr>
+          <w:fldChar w:fldCharType="separate"/>
+        </w:r>
+        <w:r>
+          <w:rPr>
+            <w:noProof/>
+            <w:webHidden/>
+            <w:sz w:val="26"/>
+            <w:szCs w:val="26"/>
+          </w:rPr>
+          <w:t>40</w:t>
+        </w:r>
+        <w:r>
+          <w:rPr>
+            <w:noProof/>
+            <w:webHidden/>
+            <w:sz w:val="26"/>
+            <w:szCs w:val="26"/>
+          </w:rPr>
+          <w:fldChar w:fldCharType="end"/>
+        </w:r>
+      </w:hyperlink>
+    </w:p>
+    <w:p>
+      <w:pPr>
+        <w:pStyle w:val="ndicedeilustraes"/>
+        <w:tabs>
+          <w:tab w:val="right" w:leader="dot" w:pos="9061"/>
+        </w:tabs>
+        <w:rPr>
+          <w:rFonts w:asciiTheme="minorHAnsi" w:eastAsiaTheme="minorEastAsia" w:hAnsiTheme="minorHAnsi" w:cstheme="minorBidi"/>
+          <w:noProof/>
+          <w:kern w:val="2"/>
+          <w:sz w:val="26"/>
+          <w:szCs w:val="26"/>
+          <w14:ligatures w14:val="standardContextual"/>
+        </w:rPr>
+      </w:pPr>
+      <w:hyperlink w:anchor="_Toc230641862" w:history="1">
+        <w:r>
+          <w:rPr>
+            <w:rStyle w:val="Hyperlink"/>
+            <w:b/>
+            <w:bCs/>
+            <w:noProof/>
+            <w:sz w:val="26"/>
+            <w:szCs w:val="26"/>
+          </w:rPr>
+          <w:t>QUADRO 6</w:t>
         </w:r>
         <w:r>
           <w:rPr>
@@ -1250,7 +1551,7 @@
             <w:sz w:val="26"/>
             <w:szCs w:val="26"/>
           </w:rPr>
-          <w:instrText xml:space="preserve"> PAGEREF _Toc230257712 \h </w:instrText>
+          <w:instrText xml:space="preserve"> PAGEREF _Toc230641862 \h </w:instrText>
         </w:r>
         <w:r>
           <w:rPr>
@@ -1276,7 +1577,7 @@
             <w:sz w:val="26"/>
             <w:szCs w:val="26"/>
           </w:rPr>
-          <w:t>35</w:t>
+          <w:t>42</w:t>
         </w:r>
         <w:r>
           <w:rPr>
@@ -1304,7 +1605,7 @@
           <w14:ligatures w14:val="standardContextual"/>
         </w:rPr>
       </w:pPr>
-      <w:hyperlink w:anchor="_Toc230257713" w:history="1">
+      <w:hyperlink w:anchor="_Toc230641863" w:history="1">
         <w:r>
           <w:rPr>
             <w:rStyle w:val="Hyperlink"/>
@@ -1314,7 +1615,7 @@
             <w:sz w:val="26"/>
             <w:szCs w:val="26"/>
           </w:rPr>
-          <w:t>QUADRO 4</w:t>
+          <w:t>QUADRO 7</w:t>
         </w:r>
         <w:r>
           <w:rPr>
@@ -1350,7 +1651,7 @@
             <w:sz w:val="26"/>
             <w:szCs w:val="26"/>
           </w:rPr>
-          <w:instrText xml:space="preserve"> PAGEREF _Toc230257713 \h </w:instrText>
+          <w:instrText xml:space="preserve"> PAGEREF _Toc230641863 \h </w:instrText>
         </w:r>
         <w:r>
           <w:rPr>
@@ -1376,7 +1677,7 @@
             <w:sz w:val="26"/>
             <w:szCs w:val="26"/>
           </w:rPr>
-          <w:t>35</w:t>
+          <w:t>42</w:t>
         </w:r>
         <w:r>
           <w:rPr>
@@ -1451,7 +1752,7 @@
       <w:pPr>
         <w:pStyle w:val="TC-TituloCentralizado"/>
       </w:pPr>
-      <w:bookmarkStart w:id="8" w:name="_Toc230257761"/>
+      <w:bookmarkStart w:id="8" w:name="_Toc230641964"/>
       <w:r>
         <w:lastRenderedPageBreak/>
         <w:t>Lista de tABELAS</w:t>
@@ -1494,7 +1795,7 @@
         </w:rPr>
         <w:fldChar w:fldCharType="separate"/>
       </w:r>
-      <w:hyperlink w:anchor="_Toc230257720" w:history="1">
+      <w:hyperlink w:anchor="_Toc230641908" w:history="1">
         <w:r>
           <w:rPr>
             <w:rStyle w:val="Hyperlink"/>
@@ -1540,7 +1841,7 @@
             <w:sz w:val="26"/>
             <w:szCs w:val="26"/>
           </w:rPr>
-          <w:instrText xml:space="preserve"> PAGEREF _Toc230257720 \h </w:instrText>
+          <w:instrText xml:space="preserve"> PAGEREF _Toc230641908 \h </w:instrText>
         </w:r>
         <w:r>
           <w:rPr>
@@ -1566,7 +1867,7 @@
             <w:sz w:val="26"/>
             <w:szCs w:val="26"/>
           </w:rPr>
-          <w:t>20</w:t>
+          <w:t>21</w:t>
         </w:r>
         <w:r>
           <w:rPr>
@@ -1617,7 +1918,7 @@
         <w:pStyle w:val="TC-TituloCentralizado"/>
       </w:pPr>
       <w:bookmarkStart w:id="9" w:name="_Toc159362154"/>
-      <w:bookmarkStart w:id="10" w:name="_Toc230257762"/>
+      <w:bookmarkStart w:id="10" w:name="_Toc230641965"/>
       <w:r>
         <w:lastRenderedPageBreak/>
         <w:t>Lista de Siglas</w:t>
@@ -1642,9 +1943,33 @@
     </w:p>
     <w:p>
       <w:pPr>
-        <w:pStyle w:val="TE-Normal"/>
-        <w:ind w:firstLine="0"/>
-      </w:pPr>
+        <w:pStyle w:val="LI-ListaItem"/>
+      </w:pPr>
+      <w:r>
+        <w:t>RF</w:t>
+      </w:r>
+      <w:r>
+        <w:tab/>
+        <w:t xml:space="preserve">- </w:t>
+      </w:r>
+      <w:r>
+        <w:t>Requisito Funcional</w:t>
+      </w:r>
+    </w:p>
+    <w:p>
+      <w:pPr>
+        <w:pStyle w:val="LI-ListaItem"/>
+      </w:pPr>
+      <w:r>
+        <w:t>RNF</w:t>
+      </w:r>
+      <w:r>
+        <w:tab/>
+        <w:t xml:space="preserve">- </w:t>
+      </w:r>
+      <w:r>
+        <w:t>Requisito Não Funcional</w:t>
+      </w:r>
     </w:p>
     <w:p>
       <w:pPr>
@@ -1704,7 +2029,7 @@
         <w:fldChar w:fldCharType="begin"/>
       </w:r>
       <w:r>
-        <w:instrText xml:space="preserve"> PAGEREF _Toc230257759 \h </w:instrText>
+        <w:instrText xml:space="preserve"> PAGEREF _Toc230641962 \h </w:instrText>
       </w:r>
       <w:r>
         <w:fldChar w:fldCharType="separate"/>
@@ -1739,7 +2064,7 @@
         <w:fldChar w:fldCharType="begin"/>
       </w:r>
       <w:r>
-        <w:instrText xml:space="preserve"> PAGEREF _Toc230257760 \h </w:instrText>
+        <w:instrText xml:space="preserve"> PAGEREF _Toc230641963 \h </w:instrText>
       </w:r>
       <w:r>
         <w:fldChar w:fldCharType="separate"/>
@@ -1774,7 +2099,7 @@
         <w:fldChar w:fldCharType="begin"/>
       </w:r>
       <w:r>
-        <w:instrText xml:space="preserve"> PAGEREF _Toc230257761 \h </w:instrText>
+        <w:instrText xml:space="preserve"> PAGEREF _Toc230641964 \h </w:instrText>
       </w:r>
       <w:r>
         <w:fldChar w:fldCharType="separate"/>
@@ -1809,7 +2134,7 @@
         <w:fldChar w:fldCharType="begin"/>
       </w:r>
       <w:r>
-        <w:instrText xml:space="preserve"> PAGEREF _Toc230257762 \h </w:instrText>
+        <w:instrText xml:space="preserve"> PAGEREF _Toc230641965 \h </w:instrText>
       </w:r>
       <w:r>
         <w:fldChar w:fldCharType="separate"/>
@@ -1844,7 +2169,7 @@
         <w:fldChar w:fldCharType="begin"/>
       </w:r>
       <w:r>
-        <w:instrText xml:space="preserve"> PAGEREF _Toc230257763 \h </w:instrText>
+        <w:instrText xml:space="preserve"> PAGEREF _Toc230641966 \h </w:instrText>
       </w:r>
       <w:r>
         <w:fldChar w:fldCharType="separate"/>
@@ -1877,7 +2202,7 @@
         <w:fldChar w:fldCharType="begin"/>
       </w:r>
       <w:r>
-        <w:instrText xml:space="preserve"> PAGEREF _Toc230257764 \h </w:instrText>
+        <w:instrText xml:space="preserve"> PAGEREF _Toc230641967 \h </w:instrText>
       </w:r>
       <w:r>
         <w:fldChar w:fldCharType="separate"/>
@@ -1910,7 +2235,7 @@
         <w:fldChar w:fldCharType="begin"/>
       </w:r>
       <w:r>
-        <w:instrText xml:space="preserve"> PAGEREF _Toc230257765 \h </w:instrText>
+        <w:instrText xml:space="preserve"> PAGEREF _Toc230641968 \h </w:instrText>
       </w:r>
       <w:r>
         <w:fldChar w:fldCharType="separate"/>
@@ -1943,7 +2268,7 @@
         <w:fldChar w:fldCharType="begin"/>
       </w:r>
       <w:r>
-        <w:instrText xml:space="preserve"> PAGEREF _Toc230257766 \h </w:instrText>
+        <w:instrText xml:space="preserve"> PAGEREF _Toc230641969 \h </w:instrText>
       </w:r>
       <w:r>
         <w:fldChar w:fldCharType="separate"/>
@@ -1976,7 +2301,7 @@
         <w:fldChar w:fldCharType="begin"/>
       </w:r>
       <w:r>
-        <w:instrText xml:space="preserve"> PAGEREF _Toc230257767 \h </w:instrText>
+        <w:instrText xml:space="preserve"> PAGEREF _Toc230641970 \h </w:instrText>
       </w:r>
       <w:r>
         <w:fldChar w:fldCharType="separate"/>
@@ -2009,7 +2334,7 @@
         <w:fldChar w:fldCharType="begin"/>
       </w:r>
       <w:r>
-        <w:instrText xml:space="preserve"> PAGEREF _Toc230257768 \h </w:instrText>
+        <w:instrText xml:space="preserve"> PAGEREF _Toc230641971 \h </w:instrText>
       </w:r>
       <w:r>
         <w:fldChar w:fldCharType="separate"/>
@@ -2042,7 +2367,7 @@
         <w:fldChar w:fldCharType="begin"/>
       </w:r>
       <w:r>
-        <w:instrText xml:space="preserve"> PAGEREF _Toc230257769 \h </w:instrText>
+        <w:instrText xml:space="preserve"> PAGEREF _Toc230641972 \h </w:instrText>
       </w:r>
       <w:r>
         <w:fldChar w:fldCharType="separate"/>
@@ -2075,7 +2400,7 @@
         <w:fldChar w:fldCharType="begin"/>
       </w:r>
       <w:r>
-        <w:instrText xml:space="preserve"> PAGEREF _Toc230257770 \h </w:instrText>
+        <w:instrText xml:space="preserve"> PAGEREF _Toc230641973 \h </w:instrText>
       </w:r>
       <w:r>
         <w:fldChar w:fldCharType="separate"/>
@@ -2108,7 +2433,7 @@
         <w:fldChar w:fldCharType="begin"/>
       </w:r>
       <w:r>
-        <w:instrText xml:space="preserve"> PAGEREF _Toc230257771 \h </w:instrText>
+        <w:instrText xml:space="preserve"> PAGEREF _Toc230641974 \h </w:instrText>
       </w:r>
       <w:r>
         <w:fldChar w:fldCharType="separate"/>
@@ -2141,7 +2466,7 @@
         <w:fldChar w:fldCharType="begin"/>
       </w:r>
       <w:r>
-        <w:instrText xml:space="preserve"> PAGEREF _Toc230257772 \h </w:instrText>
+        <w:instrText xml:space="preserve"> PAGEREF _Toc230641975 \h </w:instrText>
       </w:r>
       <w:r>
         <w:fldChar w:fldCharType="separate"/>
@@ -2176,13 +2501,13 @@
         <w:fldChar w:fldCharType="begin"/>
       </w:r>
       <w:r>
-        <w:instrText xml:space="preserve"> PAGEREF _Toc230257773 \h </w:instrText>
+        <w:instrText xml:space="preserve"> PAGEREF _Toc230641976 \h </w:instrText>
       </w:r>
       <w:r>
         <w:fldChar w:fldCharType="separate"/>
       </w:r>
       <w:r>
-        <w:t>17</w:t>
+        <w:t>18</w:t>
       </w:r>
       <w:r>
         <w:fldChar w:fldCharType="end"/>
@@ -2209,13 +2534,13 @@
         <w:fldChar w:fldCharType="begin"/>
       </w:r>
       <w:r>
-        <w:instrText xml:space="preserve"> PAGEREF _Toc230257774 \h </w:instrText>
+        <w:instrText xml:space="preserve"> PAGEREF _Toc230641977 \h </w:instrText>
       </w:r>
       <w:r>
         <w:fldChar w:fldCharType="separate"/>
       </w:r>
       <w:r>
-        <w:t>17</w:t>
+        <w:t>18</w:t>
       </w:r>
       <w:r>
         <w:fldChar w:fldCharType="end"/>
@@ -2242,13 +2567,13 @@
         <w:fldChar w:fldCharType="begin"/>
       </w:r>
       <w:r>
-        <w:instrText xml:space="preserve"> PAGEREF _Toc230257775 \h </w:instrText>
+        <w:instrText xml:space="preserve"> PAGEREF _Toc230641978 \h </w:instrText>
       </w:r>
       <w:r>
         <w:fldChar w:fldCharType="separate"/>
       </w:r>
       <w:r>
-        <w:t>17</w:t>
+        <w:t>18</w:t>
       </w:r>
       <w:r>
         <w:fldChar w:fldCharType="end"/>
@@ -2275,13 +2600,13 @@
         <w:fldChar w:fldCharType="begin"/>
       </w:r>
       <w:r>
-        <w:instrText xml:space="preserve"> PAGEREF _Toc230257776 \h </w:instrText>
+        <w:instrText xml:space="preserve"> PAGEREF _Toc230641979 \h </w:instrText>
       </w:r>
       <w:r>
         <w:fldChar w:fldCharType="separate"/>
       </w:r>
       <w:r>
-        <w:t>18</w:t>
+        <w:t>19</w:t>
       </w:r>
       <w:r>
         <w:fldChar w:fldCharType="end"/>
@@ -2308,13 +2633,13 @@
         <w:fldChar w:fldCharType="begin"/>
       </w:r>
       <w:r>
-        <w:instrText xml:space="preserve"> PAGEREF _Toc230257777 \h </w:instrText>
+        <w:instrText xml:space="preserve"> PAGEREF _Toc230641980 \h </w:instrText>
       </w:r>
       <w:r>
         <w:fldChar w:fldCharType="separate"/>
       </w:r>
       <w:r>
-        <w:t>19</w:t>
+        <w:t>20</w:t>
       </w:r>
       <w:r>
         <w:fldChar w:fldCharType="end"/>
@@ -2341,13 +2666,13 @@
         <w:fldChar w:fldCharType="begin"/>
       </w:r>
       <w:r>
-        <w:instrText xml:space="preserve"> PAGEREF _Toc230257778 \h </w:instrText>
+        <w:instrText xml:space="preserve"> PAGEREF _Toc230641981 \h </w:instrText>
       </w:r>
       <w:r>
         <w:fldChar w:fldCharType="separate"/>
       </w:r>
       <w:r>
-        <w:t>19</w:t>
+        <w:t>20</w:t>
       </w:r>
       <w:r>
         <w:fldChar w:fldCharType="end"/>
@@ -2374,13 +2699,13 @@
         <w:fldChar w:fldCharType="begin"/>
       </w:r>
       <w:r>
-        <w:instrText xml:space="preserve"> PAGEREF _Toc230257779 \h </w:instrText>
+        <w:instrText xml:space="preserve"> PAGEREF _Toc230641982 \h </w:instrText>
       </w:r>
       <w:r>
         <w:fldChar w:fldCharType="separate"/>
       </w:r>
       <w:r>
-        <w:t>20</w:t>
+        <w:t>21</w:t>
       </w:r>
       <w:r>
         <w:fldChar w:fldCharType="end"/>
@@ -2407,13 +2732,13 @@
         <w:fldChar w:fldCharType="begin"/>
       </w:r>
       <w:r>
-        <w:instrText xml:space="preserve"> PAGEREF _Toc230257780 \h </w:instrText>
+        <w:instrText xml:space="preserve"> PAGEREF _Toc230641983 \h </w:instrText>
       </w:r>
       <w:r>
         <w:fldChar w:fldCharType="separate"/>
       </w:r>
       <w:r>
-        <w:t>21</w:t>
+        <w:t>22</w:t>
       </w:r>
       <w:r>
         <w:fldChar w:fldCharType="end"/>
@@ -2440,13 +2765,13 @@
         <w:fldChar w:fldCharType="begin"/>
       </w:r>
       <w:r>
-        <w:instrText xml:space="preserve"> PAGEREF _Toc230257781 \h </w:instrText>
+        <w:instrText xml:space="preserve"> PAGEREF _Toc230641984 \h </w:instrText>
       </w:r>
       <w:r>
         <w:fldChar w:fldCharType="separate"/>
       </w:r>
       <w:r>
-        <w:t>21</w:t>
+        <w:t>22</w:t>
       </w:r>
       <w:r>
         <w:fldChar w:fldCharType="end"/>
@@ -2473,13 +2798,13 @@
         <w:fldChar w:fldCharType="begin"/>
       </w:r>
       <w:r>
-        <w:instrText xml:space="preserve"> PAGEREF _Toc230257782 \h </w:instrText>
+        <w:instrText xml:space="preserve"> PAGEREF _Toc230641985 \h </w:instrText>
       </w:r>
       <w:r>
         <w:fldChar w:fldCharType="separate"/>
       </w:r>
       <w:r>
-        <w:t>22</w:t>
+        <w:t>23</w:t>
       </w:r>
       <w:r>
         <w:fldChar w:fldCharType="end"/>
@@ -2508,13 +2833,13 @@
         <w:fldChar w:fldCharType="begin"/>
       </w:r>
       <w:r>
-        <w:instrText xml:space="preserve"> PAGEREF _Toc230257783 \h </w:instrText>
+        <w:instrText xml:space="preserve"> PAGEREF _Toc230641986 \h </w:instrText>
       </w:r>
       <w:r>
         <w:fldChar w:fldCharType="separate"/>
       </w:r>
       <w:r>
-        <w:t>24</w:t>
+        <w:t>25</w:t>
       </w:r>
       <w:r>
         <w:fldChar w:fldCharType="end"/>
@@ -2541,13 +2866,13 @@
         <w:fldChar w:fldCharType="begin"/>
       </w:r>
       <w:r>
-        <w:instrText xml:space="preserve"> PAGEREF _Toc230257784 \h </w:instrText>
+        <w:instrText xml:space="preserve"> PAGEREF _Toc230641987 \h </w:instrText>
       </w:r>
       <w:r>
         <w:fldChar w:fldCharType="separate"/>
       </w:r>
       <w:r>
-        <w:t>24</w:t>
+        <w:t>25</w:t>
       </w:r>
       <w:r>
         <w:fldChar w:fldCharType="end"/>
@@ -2574,13 +2899,13 @@
         <w:fldChar w:fldCharType="begin"/>
       </w:r>
       <w:r>
-        <w:instrText xml:space="preserve"> PAGEREF _Toc230257785 \h </w:instrText>
+        <w:instrText xml:space="preserve"> PAGEREF _Toc230641988 \h </w:instrText>
       </w:r>
       <w:r>
         <w:fldChar w:fldCharType="separate"/>
       </w:r>
       <w:r>
-        <w:t>24</w:t>
+        <w:t>25</w:t>
       </w:r>
       <w:r>
         <w:fldChar w:fldCharType="end"/>
@@ -2607,13 +2932,13 @@
         <w:fldChar w:fldCharType="begin"/>
       </w:r>
       <w:r>
-        <w:instrText xml:space="preserve"> PAGEREF _Toc230257786 \h </w:instrText>
+        <w:instrText xml:space="preserve"> PAGEREF _Toc230641989 \h </w:instrText>
       </w:r>
       <w:r>
         <w:fldChar w:fldCharType="separate"/>
       </w:r>
       <w:r>
-        <w:t>25</w:t>
+        <w:t>26</w:t>
       </w:r>
       <w:r>
         <w:fldChar w:fldCharType="end"/>
@@ -2640,13 +2965,13 @@
         <w:fldChar w:fldCharType="begin"/>
       </w:r>
       <w:r>
-        <w:instrText xml:space="preserve"> PAGEREF _Toc230257787 \h </w:instrText>
+        <w:instrText xml:space="preserve"> PAGEREF _Toc230641990 \h </w:instrText>
       </w:r>
       <w:r>
         <w:fldChar w:fldCharType="separate"/>
       </w:r>
       <w:r>
-        <w:t>26</w:t>
+        <w:t>27</w:t>
       </w:r>
       <w:r>
         <w:fldChar w:fldCharType="end"/>
@@ -2673,13 +2998,13 @@
         <w:fldChar w:fldCharType="begin"/>
       </w:r>
       <w:r>
-        <w:instrText xml:space="preserve"> PAGEREF _Toc230257788 \h </w:instrText>
+        <w:instrText xml:space="preserve"> PAGEREF _Toc230641991 \h </w:instrText>
       </w:r>
       <w:r>
         <w:fldChar w:fldCharType="separate"/>
       </w:r>
       <w:r>
-        <w:t>27</w:t>
+        <w:t>28</w:t>
       </w:r>
       <w:r>
         <w:fldChar w:fldCharType="end"/>
@@ -2706,13 +3031,13 @@
         <w:fldChar w:fldCharType="begin"/>
       </w:r>
       <w:r>
-        <w:instrText xml:space="preserve"> PAGEREF _Toc230257789 \h </w:instrText>
+        <w:instrText xml:space="preserve"> PAGEREF _Toc230641992 \h </w:instrText>
       </w:r>
       <w:r>
         <w:fldChar w:fldCharType="separate"/>
       </w:r>
       <w:r>
-        <w:t>28</w:t>
+        <w:t>29</w:t>
       </w:r>
       <w:r>
         <w:fldChar w:fldCharType="end"/>
@@ -2739,41 +3064,7 @@
         <w:fldChar w:fldCharType="begin"/>
       </w:r>
       <w:r>
-        <w:instrText xml:space="preserve"> PAGEREF _Toc230257790 \h </w:instrText>
-      </w:r>
-      <w:r>
-        <w:fldChar w:fldCharType="separate"/>
-      </w:r>
-      <w:r>
-        <w:t>30</w:t>
-      </w:r>
-      <w:r>
-        <w:fldChar w:fldCharType="end"/>
-      </w:r>
-    </w:p>
-    <w:p>
-      <w:pPr>
-        <w:pStyle w:val="Sumrio3"/>
-        <w:rPr>
-          <w:rFonts w:asciiTheme="minorHAnsi" w:eastAsiaTheme="minorEastAsia" w:hAnsiTheme="minorHAnsi" w:cstheme="minorBidi"/>
-          <w:kern w:val="2"/>
-          <w:sz w:val="24"/>
-          <w:szCs w:val="24"/>
-          <w14:ligatures w14:val="standardContextual"/>
-        </w:rPr>
-      </w:pPr>
-      <w:r>
-        <w:lastRenderedPageBreak/>
-        <w:t>3.8 Visão geral do sistema proposto</w:t>
-      </w:r>
-      <w:r>
-        <w:tab/>
-      </w:r>
-      <w:r>
-        <w:fldChar w:fldCharType="begin"/>
-      </w:r>
-      <w:r>
-        <w:instrText xml:space="preserve"> PAGEREF _Toc230257791 \h </w:instrText>
+        <w:instrText xml:space="preserve"> PAGEREF _Toc230641993 \h </w:instrText>
       </w:r>
       <w:r>
         <w:fldChar w:fldCharType="separate"/>
@@ -2799,7 +3090,8 @@
         </w:rPr>
       </w:pPr>
       <w:r>
-        <w:t>4 CRONOGRAMA</w:t>
+        <w:lastRenderedPageBreak/>
+        <w:t>4 Modelagem do Protótipo</w:t>
       </w:r>
       <w:r>
         <w:tab/>
@@ -2808,13 +3100,279 @@
         <w:fldChar w:fldCharType="begin"/>
       </w:r>
       <w:r>
-        <w:instrText xml:space="preserve"> PAGEREF _Toc230257792 \h </w:instrText>
+        <w:instrText xml:space="preserve"> PAGEREF _Toc230641994 \h </w:instrText>
       </w:r>
       <w:r>
         <w:fldChar w:fldCharType="separate"/>
       </w:r>
       <w:r>
+        <w:t>33</w:t>
+      </w:r>
+      <w:r>
+        <w:fldChar w:fldCharType="end"/>
+      </w:r>
+    </w:p>
+    <w:p>
+      <w:pPr>
+        <w:pStyle w:val="Sumrio3"/>
+        <w:rPr>
+          <w:rFonts w:asciiTheme="minorHAnsi" w:eastAsiaTheme="minorEastAsia" w:hAnsiTheme="minorHAnsi" w:cstheme="minorBidi"/>
+          <w:kern w:val="2"/>
+          <w:sz w:val="24"/>
+          <w:szCs w:val="24"/>
+          <w14:ligatures w14:val="standardContextual"/>
+        </w:rPr>
+      </w:pPr>
+      <w:r>
+        <w:t>4.1 Descrição da solução proposta</w:t>
+      </w:r>
+      <w:r>
+        <w:tab/>
+      </w:r>
+      <w:r>
+        <w:fldChar w:fldCharType="begin"/>
+      </w:r>
+      <w:r>
+        <w:instrText xml:space="preserve"> PAGEREF _Toc230641995 \h </w:instrText>
+      </w:r>
+      <w:r>
+        <w:fldChar w:fldCharType="separate"/>
+      </w:r>
+      <w:r>
+        <w:t>33</w:t>
+      </w:r>
+      <w:r>
+        <w:fldChar w:fldCharType="end"/>
+      </w:r>
+    </w:p>
+    <w:p>
+      <w:pPr>
+        <w:pStyle w:val="Sumrio3"/>
+        <w:rPr>
+          <w:rFonts w:asciiTheme="minorHAnsi" w:eastAsiaTheme="minorEastAsia" w:hAnsiTheme="minorHAnsi" w:cstheme="minorBidi"/>
+          <w:kern w:val="2"/>
+          <w:sz w:val="24"/>
+          <w:szCs w:val="24"/>
+          <w14:ligatures w14:val="standardContextual"/>
+        </w:rPr>
+      </w:pPr>
+      <w:r>
+        <w:t>4.2 Requisitos do protótipo</w:t>
+      </w:r>
+      <w:r>
+        <w:tab/>
+      </w:r>
+      <w:r>
+        <w:fldChar w:fldCharType="begin"/>
+      </w:r>
+      <w:r>
+        <w:instrText xml:space="preserve"> PAGEREF _Toc230641996 \h </w:instrText>
+      </w:r>
+      <w:r>
+        <w:fldChar w:fldCharType="separate"/>
+      </w:r>
+      <w:r>
+        <w:t>34</w:t>
+      </w:r>
+      <w:r>
+        <w:fldChar w:fldCharType="end"/>
+      </w:r>
+    </w:p>
+    <w:p>
+      <w:pPr>
+        <w:pStyle w:val="Sumrio3"/>
+        <w:rPr>
+          <w:rFonts w:asciiTheme="minorHAnsi" w:eastAsiaTheme="minorEastAsia" w:hAnsiTheme="minorHAnsi" w:cstheme="minorBidi"/>
+          <w:kern w:val="2"/>
+          <w:sz w:val="24"/>
+          <w:szCs w:val="24"/>
+          <w14:ligatures w14:val="standardContextual"/>
+        </w:rPr>
+      </w:pPr>
+      <w:r>
+        <w:t>4.3 Arquitetura e fluxo geral do sistema</w:t>
+      </w:r>
+      <w:r>
+        <w:tab/>
+      </w:r>
+      <w:r>
+        <w:fldChar w:fldCharType="begin"/>
+      </w:r>
+      <w:r>
+        <w:instrText xml:space="preserve"> PAGEREF _Toc230641997 \h </w:instrText>
+      </w:r>
+      <w:r>
+        <w:fldChar w:fldCharType="separate"/>
+      </w:r>
+      <w:r>
         <w:t>35</w:t>
+      </w:r>
+      <w:r>
+        <w:fldChar w:fldCharType="end"/>
+      </w:r>
+    </w:p>
+    <w:p>
+      <w:pPr>
+        <w:pStyle w:val="Sumrio3"/>
+        <w:rPr>
+          <w:rFonts w:asciiTheme="minorHAnsi" w:eastAsiaTheme="minorEastAsia" w:hAnsiTheme="minorHAnsi" w:cstheme="minorBidi"/>
+          <w:kern w:val="2"/>
+          <w:sz w:val="24"/>
+          <w:szCs w:val="24"/>
+          <w14:ligatures w14:val="standardContextual"/>
+        </w:rPr>
+      </w:pPr>
+      <w:r>
+        <w:t>4.4 Etapas de processamento das partituras</w:t>
+      </w:r>
+      <w:r>
+        <w:tab/>
+      </w:r>
+      <w:r>
+        <w:fldChar w:fldCharType="begin"/>
+      </w:r>
+      <w:r>
+        <w:instrText xml:space="preserve"> PAGEREF _Toc230641998 \h </w:instrText>
+      </w:r>
+      <w:r>
+        <w:fldChar w:fldCharType="separate"/>
+      </w:r>
+      <w:r>
+        <w:t>37</w:t>
+      </w:r>
+      <w:r>
+        <w:fldChar w:fldCharType="end"/>
+      </w:r>
+    </w:p>
+    <w:p>
+      <w:pPr>
+        <w:pStyle w:val="Sumrio3"/>
+        <w:rPr>
+          <w:rFonts w:asciiTheme="minorHAnsi" w:eastAsiaTheme="minorEastAsia" w:hAnsiTheme="minorHAnsi" w:cstheme="minorBidi"/>
+          <w:kern w:val="2"/>
+          <w:sz w:val="24"/>
+          <w:szCs w:val="24"/>
+          <w14:ligatures w14:val="standardContextual"/>
+        </w:rPr>
+      </w:pPr>
+      <w:r>
+        <w:t>4.5 Estrutura dos dados extraídos</w:t>
+      </w:r>
+      <w:r>
+        <w:tab/>
+      </w:r>
+      <w:r>
+        <w:fldChar w:fldCharType="begin"/>
+      </w:r>
+      <w:r>
+        <w:instrText xml:space="preserve"> PAGEREF _Toc230641999 \h </w:instrText>
+      </w:r>
+      <w:r>
+        <w:fldChar w:fldCharType="separate"/>
+      </w:r>
+      <w:r>
+        <w:t>38</w:t>
+      </w:r>
+      <w:r>
+        <w:fldChar w:fldCharType="end"/>
+      </w:r>
+    </w:p>
+    <w:p>
+      <w:pPr>
+        <w:pStyle w:val="Sumrio3"/>
+        <w:rPr>
+          <w:rFonts w:asciiTheme="minorHAnsi" w:eastAsiaTheme="minorEastAsia" w:hAnsiTheme="minorHAnsi" w:cstheme="minorBidi"/>
+          <w:kern w:val="2"/>
+          <w:sz w:val="24"/>
+          <w:szCs w:val="24"/>
+          <w14:ligatures w14:val="standardContextual"/>
+        </w:rPr>
+      </w:pPr>
+      <w:r>
+        <w:t>4.6 Representação dos resultados esperados</w:t>
+      </w:r>
+      <w:r>
+        <w:tab/>
+      </w:r>
+      <w:r>
+        <w:fldChar w:fldCharType="begin"/>
+      </w:r>
+      <w:r>
+        <w:instrText xml:space="preserve"> PAGEREF _Toc230642000 \h </w:instrText>
+      </w:r>
+      <w:r>
+        <w:fldChar w:fldCharType="separate"/>
+      </w:r>
+      <w:r>
+        <w:t>39</w:t>
+      </w:r>
+      <w:r>
+        <w:fldChar w:fldCharType="end"/>
+      </w:r>
+    </w:p>
+    <w:p>
+      <w:pPr>
+        <w:pStyle w:val="Sumrio3"/>
+        <w:rPr>
+          <w:rFonts w:asciiTheme="minorHAnsi" w:eastAsiaTheme="minorEastAsia" w:hAnsiTheme="minorHAnsi" w:cstheme="minorBidi"/>
+          <w:kern w:val="2"/>
+          <w:sz w:val="24"/>
+          <w:szCs w:val="24"/>
+          <w14:ligatures w14:val="standardContextual"/>
+        </w:rPr>
+      </w:pPr>
+      <w:r>
+        <w:t>4.7 Considerações do capítulo</w:t>
+      </w:r>
+      <w:r>
+        <w:tab/>
+      </w:r>
+      <w:r>
+        <w:fldChar w:fldCharType="begin"/>
+      </w:r>
+      <w:r>
+        <w:instrText xml:space="preserve"> PAGEREF _Toc230642001 \h </w:instrText>
+      </w:r>
+      <w:r>
+        <w:fldChar w:fldCharType="separate"/>
+      </w:r>
+      <w:r>
+        <w:t>41</w:t>
+      </w:r>
+      <w:r>
+        <w:fldChar w:fldCharType="end"/>
+      </w:r>
+    </w:p>
+    <w:p>
+      <w:pPr>
+        <w:pStyle w:val="Sumrio2"/>
+        <w:rPr>
+          <w:rFonts w:asciiTheme="minorHAnsi" w:eastAsiaTheme="minorEastAsia" w:hAnsiTheme="minorHAnsi" w:cstheme="minorBidi"/>
+          <w:b w:val="0"/>
+          <w:smallCaps w:val="0"/>
+          <w:kern w:val="2"/>
+          <w:sz w:val="24"/>
+          <w:szCs w:val="24"/>
+          <w14:ligatures w14:val="standardContextual"/>
+        </w:rPr>
+      </w:pPr>
+      <w:r>
+        <w:t>5 CRONOGRAMA</w:t>
+      </w:r>
+      <w:r>
+        <w:tab/>
+      </w:r>
+      <w:r>
+        <w:fldChar w:fldCharType="begin"/>
+      </w:r>
+      <w:r>
+        <w:instrText xml:space="preserve"> PAGEREF _Toc230642002 \h </w:instrText>
+      </w:r>
+      <w:r>
+        <w:fldChar w:fldCharType="separate"/>
+      </w:r>
+      <w:r>
+        <w:t>42</w:t>
       </w:r>
       <w:r>
         <w:fldChar w:fldCharType="end"/>
@@ -2843,13 +3401,13 @@
         <w:fldChar w:fldCharType="begin"/>
       </w:r>
       <w:r>
-        <w:instrText xml:space="preserve"> PAGEREF _Toc230257793 \h </w:instrText>
+        <w:instrText xml:space="preserve"> PAGEREF _Toc230642003 \h </w:instrText>
       </w:r>
       <w:r>
         <w:fldChar w:fldCharType="separate"/>
       </w:r>
       <w:r>
-        <w:t>37</w:t>
+        <w:t>44</w:t>
       </w:r>
       <w:r>
         <w:fldChar w:fldCharType="end"/>
@@ -2892,16 +3450,16 @@
       <w:pPr>
         <w:pStyle w:val="T1-TituloPrimario"/>
       </w:pPr>
-      <w:bookmarkStart w:id="11" w:name="_Toc230257763"/>
-      <w:bookmarkStart w:id="12" w:name="_Toc527721613"/>
-      <w:bookmarkStart w:id="13" w:name="_Toc527793652"/>
-      <w:bookmarkStart w:id="14" w:name="_Toc527795385"/>
-      <w:bookmarkStart w:id="15" w:name="_Toc527798495"/>
+      <w:bookmarkStart w:id="11" w:name="_Toc527721613"/>
+      <w:bookmarkStart w:id="12" w:name="_Toc527793652"/>
+      <w:bookmarkStart w:id="13" w:name="_Toc527795385"/>
+      <w:bookmarkStart w:id="14" w:name="_Toc527798495"/>
+      <w:bookmarkStart w:id="15" w:name="_Toc230641966"/>
       <w:r>
         <w:lastRenderedPageBreak/>
         <w:t>Introdução</w:t>
       </w:r>
-      <w:bookmarkEnd w:id="11"/>
+      <w:bookmarkEnd w:id="15"/>
     </w:p>
     <w:p>
       <w:pPr>
@@ -2956,7 +3514,7 @@
       <w:pPr>
         <w:pStyle w:val="T2-TituloSecundario"/>
       </w:pPr>
-      <w:bookmarkStart w:id="16" w:name="_Toc230257764"/>
+      <w:bookmarkStart w:id="16" w:name="_Toc230641967"/>
       <w:r>
         <w:t>Contextualização</w:t>
       </w:r>
@@ -3013,7 +3571,7 @@
       <w:pPr>
         <w:pStyle w:val="T2-TituloSecundario"/>
       </w:pPr>
-      <w:bookmarkStart w:id="17" w:name="_Toc230257765"/>
+      <w:bookmarkStart w:id="17" w:name="_Toc230641968"/>
       <w:r>
         <w:t>De</w:t>
       </w:r>
@@ -3076,7 +3634,7 @@
       <w:pPr>
         <w:pStyle w:val="T2-TituloSecundario"/>
       </w:pPr>
-      <w:bookmarkStart w:id="18" w:name="_Toc230257766"/>
+      <w:bookmarkStart w:id="18" w:name="_Toc230641969"/>
       <w:r>
         <w:t>Objetivo</w:t>
       </w:r>
@@ -3090,7 +3648,7 @@
         <w:pStyle w:val="T3-TituloTerciario"/>
         <w:ind w:left="0"/>
       </w:pPr>
-      <w:bookmarkStart w:id="19" w:name="_Toc230257767"/>
+      <w:bookmarkStart w:id="19" w:name="_Toc230641970"/>
       <w:r>
         <w:t>Objetivo geral</w:t>
       </w:r>
@@ -3115,7 +3673,7 @@
         <w:pStyle w:val="T3-TituloTerciario"/>
         <w:ind w:left="0"/>
       </w:pPr>
-      <w:bookmarkStart w:id="20" w:name="_Toc230257768"/>
+      <w:bookmarkStart w:id="20" w:name="_Toc230641971"/>
       <w:r>
         <w:lastRenderedPageBreak/>
         <w:t>Objetivos específicos</w:t>
@@ -3191,7 +3749,7 @@
       <w:pPr>
         <w:pStyle w:val="T2-TituloSecundario"/>
       </w:pPr>
-      <w:bookmarkStart w:id="21" w:name="_Toc230257769"/>
+      <w:bookmarkStart w:id="21" w:name="_Toc230641972"/>
       <w:r>
         <w:t>Justificativa</w:t>
       </w:r>
@@ -3245,7 +3803,7 @@
       <w:pPr>
         <w:pStyle w:val="T2-TituloSecundario"/>
       </w:pPr>
-      <w:bookmarkStart w:id="22" w:name="_Toc230257770"/>
+      <w:bookmarkStart w:id="22" w:name="_Toc230641973"/>
       <w:r>
         <w:t>Delimitação do Escopo</w:t>
       </w:r>
@@ -3299,7 +3857,7 @@
       <w:pPr>
         <w:pStyle w:val="T2-TituloSecundario"/>
       </w:pPr>
-      <w:bookmarkStart w:id="23" w:name="_Toc230257771"/>
+      <w:bookmarkStart w:id="23" w:name="_Toc230641974"/>
       <w:r>
         <w:t xml:space="preserve">Procedimentos </w:t>
       </w:r>
@@ -3367,7 +3925,7 @@
       <w:pPr>
         <w:pStyle w:val="T2-TituloSecundario"/>
       </w:pPr>
-      <w:bookmarkStart w:id="24" w:name="_Toc230257772"/>
+      <w:bookmarkStart w:id="24" w:name="_Toc230641975"/>
       <w:r>
         <w:t>Estrutura</w:t>
       </w:r>
@@ -3381,7 +3939,7 @@
         <w:pStyle w:val="TE-Normal"/>
       </w:pPr>
       <w:r>
-        <w:t>Este trabalho está estruturado em quatro capítulos. O Capítulo 1 apresenta a introdução, contemplando a contextualização do tema, a delimitação do problema, os objetivos, a justificativa, o escopo e os procedimentos metodológicos adotados.</w:t>
+        <w:t>Este trabalho está estruturado em cinco capítulos. O Capítulo 1 apresenta a introdução, contemplando a contextualização do tema, a delimitação do problema, os objetivos, a justificativa, o escopo e os procedimentos metodológicos adotados.</w:t>
       </w:r>
     </w:p>
     <w:p>
@@ -3397,29 +3955,38 @@
         <w:pStyle w:val="TE-Normal"/>
       </w:pPr>
       <w:r>
-        <w:t>O Capítulo 3 descreve os procedimentos metodológicos do trabalho, detalhando o corpus de análise, o processo de extração da melodia, as representações utilizadas, o método de detecção de padrões e a forma de análise dos resultados.</w:t>
+        <w:t>O Capítulo 3 descreve os procedimentos metodológicos do trabalho, detalhando a caracterização da pesquisa, o corpus de análise, o processo de extração da melodia, as representações utilizadas, o método de detecção de padrões e a forma de análise dos resultados.</w:t>
       </w:r>
     </w:p>
     <w:p>
       <w:pPr>
         <w:pStyle w:val="TE-Normal"/>
-        <w:rPr>
-          <w:u w:val="single"/>
-        </w:rPr>
-      </w:pPr>
-      <w:r>
-        <w:t>Por fim, o Capítulo 4 apresenta o cronograma de desenvolvimento do trabalho, indicando as etapas previstas para a continuidade da pesquisa.</w:t>
+      </w:pPr>
+      <w:r>
+        <w:t>O Capítulo 4 apresenta a modelagem do protótipo, descrevendo a solução proposta, seus requisitos, a arquitetura geral do sistema, as etapas de processamento das partituras, a estrutura dos dados extraídos e a forma de representação dos resultados esperados.</w:t>
+      </w:r>
+    </w:p>
+    <w:p>
+      <w:pPr>
+        <w:pStyle w:val="TE-Normal"/>
+      </w:pPr>
+      <w:r>
+        <w:t xml:space="preserve">Por fim, o Capítulo 5 apresenta o cronograma de desenvolvimento do trabalho, </w:t>
+      </w:r>
+      <w:r>
+        <w:lastRenderedPageBreak/>
+        <w:t>indicando as etapas previstas para a continuidade da pesquisa no TCC II.</w:t>
       </w:r>
     </w:p>
     <w:p>
       <w:pPr>
         <w:pStyle w:val="T1-TituloPrimario"/>
       </w:pPr>
-      <w:bookmarkStart w:id="25" w:name="_Toc230257773"/>
+      <w:bookmarkStart w:id="25" w:name="_Toc230641976"/>
+      <w:bookmarkEnd w:id="11"/>
       <w:bookmarkEnd w:id="12"/>
       <w:bookmarkEnd w:id="13"/>
       <w:bookmarkEnd w:id="14"/>
-      <w:bookmarkEnd w:id="15"/>
       <w:r>
         <w:lastRenderedPageBreak/>
         <w:t>Fundamentação teórica</w:t>
@@ -3430,7 +3997,7 @@
       <w:pPr>
         <w:pStyle w:val="T2-TituloSecundario"/>
       </w:pPr>
-      <w:bookmarkStart w:id="26" w:name="_Toc230257774"/>
+      <w:bookmarkStart w:id="26" w:name="_Toc230641977"/>
       <w:r>
         <w:t>Representação Musical Digital</w:t>
       </w:r>
@@ -3462,7 +4029,7 @@
       <w:pPr>
         <w:pStyle w:val="T3-TituloTerciario"/>
       </w:pPr>
-      <w:bookmarkStart w:id="27" w:name="_Toc230257775"/>
+      <w:bookmarkStart w:id="27" w:name="_Toc230641978"/>
       <w:r>
         <w:t>Formato MusicXML</w:t>
       </w:r>
@@ -3558,7 +4125,9 @@
                               </w:rPr>
                             </w:pPr>
                             <w:bookmarkStart w:id="28" w:name="_Toc230252029"/>
-                            <w:bookmarkStart w:id="29" w:name="_Toc230257654"/>
+                            <w:bookmarkStart w:id="29" w:name="_Toc230641826"/>
+                            <w:bookmarkStart w:id="30" w:name="_Toc230641847"/>
+                            <w:bookmarkStart w:id="31" w:name="_Toc230641878"/>
                             <w:r>
                               <w:rPr>
                                 <w:b/>
@@ -3654,6 +4223,8 @@
                             </w:r>
                             <w:bookmarkEnd w:id="28"/>
                             <w:bookmarkEnd w:id="29"/>
+                            <w:bookmarkEnd w:id="30"/>
+                            <w:bookmarkEnd w:id="31"/>
                           </w:p>
                         </w:txbxContent>
                       </wps:txbx>
@@ -3691,8 +4262,10 @@
                           <w:szCs w:val="24"/>
                         </w:rPr>
                       </w:pPr>
-                      <w:bookmarkStart w:id="30" w:name="_Toc230252029"/>
-                      <w:bookmarkStart w:id="31" w:name="_Toc230257654"/>
+                      <w:bookmarkStart w:id="32" w:name="_Toc230252029"/>
+                      <w:bookmarkStart w:id="33" w:name="_Toc230641826"/>
+                      <w:bookmarkStart w:id="34" w:name="_Toc230641847"/>
+                      <w:bookmarkStart w:id="35" w:name="_Toc230641878"/>
                       <w:r>
                         <w:rPr>
                           <w:b/>
@@ -3786,8 +4359,10 @@
                         </w:rPr>
                         <w:t>- Exemplo de representação de uma partitura no formato MusicXML.</w:t>
                       </w:r>
-                      <w:bookmarkEnd w:id="30"/>
-                      <w:bookmarkEnd w:id="31"/>
+                      <w:bookmarkEnd w:id="32"/>
+                      <w:bookmarkEnd w:id="33"/>
+                      <w:bookmarkEnd w:id="34"/>
+                      <w:bookmarkEnd w:id="35"/>
                     </w:p>
                   </w:txbxContent>
                 </v:textbox>
@@ -3897,11 +4472,11 @@
       <w:pPr>
         <w:pStyle w:val="T2-TituloSecundario"/>
       </w:pPr>
-      <w:bookmarkStart w:id="32" w:name="_Toc230257776"/>
+      <w:bookmarkStart w:id="36" w:name="_Toc230641979"/>
       <w:r>
         <w:t>Padrões Melódicos</w:t>
       </w:r>
-      <w:bookmarkEnd w:id="32"/>
+      <w:bookmarkEnd w:id="36"/>
     </w:p>
     <w:p>
       <w:pPr>
@@ -3935,11 +4510,11 @@
       <w:pPr>
         <w:pStyle w:val="T3-TituloTerciario"/>
       </w:pPr>
-      <w:bookmarkStart w:id="33" w:name="_Toc230257777"/>
+      <w:bookmarkStart w:id="37" w:name="_Toc230641980"/>
       <w:r>
         <w:t>Definição de padrões musicais</w:t>
       </w:r>
-      <w:bookmarkEnd w:id="33"/>
+      <w:bookmarkEnd w:id="37"/>
     </w:p>
     <w:p>
       <w:pPr>
@@ -3987,7 +4562,7 @@
           <w:szCs w:val="22"/>
         </w:rPr>
       </w:pPr>
-      <w:bookmarkStart w:id="34" w:name="_Toc230257655"/>
+      <w:bookmarkStart w:id="38" w:name="_Toc230641879"/>
       <w:r>
         <w:rPr>
           <w:b/>
@@ -4071,7 +4646,7 @@
         </w:rPr>
         <w:t xml:space="preserve"> - Exemplo de padrão melódico recorrente em partitura, evidenciando a repetição de motivos musicais</w:t>
       </w:r>
-      <w:bookmarkEnd w:id="34"/>
+      <w:bookmarkEnd w:id="38"/>
     </w:p>
     <w:p>
       <w:pPr>
@@ -4164,11 +4739,11 @@
       <w:pPr>
         <w:pStyle w:val="T2-TituloSecundario"/>
       </w:pPr>
-      <w:bookmarkStart w:id="35" w:name="_Toc230257778"/>
+      <w:bookmarkStart w:id="39" w:name="_Toc230641981"/>
       <w:r>
         <w:t>Representação Intervalar</w:t>
       </w:r>
-      <w:bookmarkEnd w:id="35"/>
+      <w:bookmarkEnd w:id="39"/>
     </w:p>
     <w:p>
       <w:pPr>
@@ -4216,7 +4791,7 @@
           <w:iCs w:val="0"/>
         </w:rPr>
       </w:pPr>
-      <w:bookmarkStart w:id="36" w:name="_Toc230257720"/>
+      <w:bookmarkStart w:id="40" w:name="_Toc230641908"/>
       <w:r>
         <w:rPr>
           <w:b/>
@@ -4300,7 +4875,7 @@
         </w:rPr>
         <w:t xml:space="preserve"> - Representação intervalar e de contorno de uma sequência melódica</w:t>
       </w:r>
-      <w:bookmarkEnd w:id="36"/>
+      <w:bookmarkEnd w:id="40"/>
     </w:p>
     <w:tbl>
       <w:tblPr>
@@ -4807,11 +5382,11 @@
       <w:pPr>
         <w:pStyle w:val="T3-TituloTerciario"/>
       </w:pPr>
-      <w:bookmarkStart w:id="37" w:name="_Toc230257779"/>
+      <w:bookmarkStart w:id="41" w:name="_Toc230641982"/>
       <w:r>
         <w:t>Intervalos melódicos</w:t>
       </w:r>
-      <w:bookmarkEnd w:id="37"/>
+      <w:bookmarkEnd w:id="41"/>
     </w:p>
     <w:p>
       <w:pPr>
@@ -4837,11 +5412,11 @@
       <w:pPr>
         <w:pStyle w:val="T2-TituloSecundario"/>
       </w:pPr>
-      <w:bookmarkStart w:id="38" w:name="_Toc230257780"/>
+      <w:bookmarkStart w:id="42" w:name="_Toc230641983"/>
       <w:r>
         <w:t>Contorno Melódico</w:t>
       </w:r>
-      <w:bookmarkEnd w:id="38"/>
+      <w:bookmarkEnd w:id="42"/>
     </w:p>
     <w:p>
       <w:pPr>
@@ -4891,11 +5466,11 @@
       <w:pPr>
         <w:pStyle w:val="T3-TituloTerciario"/>
       </w:pPr>
-      <w:bookmarkStart w:id="39" w:name="_Toc230257781"/>
+      <w:bookmarkStart w:id="43" w:name="_Toc230641984"/>
       <w:r>
         <w:t>Representação direcional</w:t>
       </w:r>
-      <w:bookmarkEnd w:id="39"/>
+      <w:bookmarkEnd w:id="43"/>
     </w:p>
     <w:p>
       <w:pPr>
@@ -4921,11 +5496,11 @@
       <w:pPr>
         <w:pStyle w:val="T2-TituloSecundario"/>
       </w:pPr>
-      <w:bookmarkStart w:id="40" w:name="_Toc230257782"/>
+      <w:bookmarkStart w:id="44" w:name="_Toc230641985"/>
       <w:r>
         <w:t>Trabalhos Relacionados</w:t>
       </w:r>
-      <w:bookmarkEnd w:id="40"/>
+      <w:bookmarkEnd w:id="44"/>
     </w:p>
     <w:p>
       <w:pPr>
@@ -4994,22 +5569,22 @@
       <w:pPr>
         <w:pStyle w:val="T1-TituloPrimario"/>
       </w:pPr>
-      <w:bookmarkStart w:id="41" w:name="_Toc230257783"/>
+      <w:bookmarkStart w:id="45" w:name="_Toc230641986"/>
       <w:r>
         <w:lastRenderedPageBreak/>
         <w:t>PROCEDIMENTOS METODOLÓGICOS</w:t>
       </w:r>
-      <w:bookmarkEnd w:id="41"/>
+      <w:bookmarkEnd w:id="45"/>
     </w:p>
     <w:p>
       <w:pPr>
         <w:pStyle w:val="T2-TituloSecundario"/>
       </w:pPr>
-      <w:bookmarkStart w:id="42" w:name="_Toc230257784"/>
+      <w:bookmarkStart w:id="46" w:name="_Toc230641987"/>
       <w:r>
         <w:t>Caracterização da pesquisa</w:t>
       </w:r>
-      <w:bookmarkEnd w:id="42"/>
+      <w:bookmarkEnd w:id="46"/>
     </w:p>
     <w:p>
       <w:pPr>
@@ -5023,11 +5598,11 @@
       <w:pPr>
         <w:pStyle w:val="T2-TituloSecundario"/>
       </w:pPr>
-      <w:bookmarkStart w:id="43" w:name="_Toc230257785"/>
+      <w:bookmarkStart w:id="47" w:name="_Toc230641988"/>
       <w:r>
         <w:t>Corpus de análise</w:t>
       </w:r>
-      <w:bookmarkEnd w:id="43"/>
+      <w:bookmarkEnd w:id="47"/>
     </w:p>
     <w:p>
       <w:pPr>
@@ -5089,7 +5664,7 @@
           <w:szCs w:val="22"/>
         </w:rPr>
       </w:pPr>
-      <w:bookmarkStart w:id="44" w:name="_Toc230257710"/>
+      <w:bookmarkStart w:id="48" w:name="_Toc230641857"/>
       <w:r>
         <w:rPr>
           <w:b/>
@@ -5173,7 +5748,7 @@
         </w:rPr>
         <w:t xml:space="preserve"> - Corpus de partituras utilizado na análise</w:t>
       </w:r>
-      <w:bookmarkEnd w:id="44"/>
+      <w:bookmarkEnd w:id="48"/>
     </w:p>
     <w:tbl>
       <w:tblPr>
@@ -5922,11 +6497,11 @@
       <w:pPr>
         <w:pStyle w:val="T2-TituloSecundario"/>
       </w:pPr>
-      <w:bookmarkStart w:id="45" w:name="_Toc230257786"/>
+      <w:bookmarkStart w:id="49" w:name="_Toc230641989"/>
       <w:r>
         <w:t>Extração da melodia</w:t>
       </w:r>
-      <w:bookmarkEnd w:id="45"/>
+      <w:bookmarkEnd w:id="49"/>
     </w:p>
     <w:p>
       <w:pPr>
@@ -5976,11 +6551,11 @@
       <w:pPr>
         <w:pStyle w:val="T2-TituloSecundario"/>
       </w:pPr>
-      <w:bookmarkStart w:id="46" w:name="_Toc230257787"/>
+      <w:bookmarkStart w:id="50" w:name="_Toc230641990"/>
       <w:r>
         <w:t>Representação por intervalos</w:t>
       </w:r>
-      <w:bookmarkEnd w:id="46"/>
+      <w:bookmarkEnd w:id="50"/>
     </w:p>
     <w:p>
       <w:pPr>
@@ -6022,11 +6597,11 @@
       <w:pPr>
         <w:pStyle w:val="T2-TituloSecundario"/>
       </w:pPr>
-      <w:bookmarkStart w:id="47" w:name="_Toc230257788"/>
+      <w:bookmarkStart w:id="51" w:name="_Toc230641991"/>
       <w:r>
         <w:t>Representação por contorno</w:t>
       </w:r>
-      <w:bookmarkEnd w:id="47"/>
+      <w:bookmarkEnd w:id="51"/>
     </w:p>
     <w:p>
       <w:pPr>
@@ -6071,11 +6646,11 @@
       <w:pPr>
         <w:pStyle w:val="T2-TituloSecundario"/>
       </w:pPr>
-      <w:bookmarkStart w:id="48" w:name="_Toc230257789"/>
+      <w:bookmarkStart w:id="52" w:name="_Toc230641992"/>
       <w:r>
         <w:t>Detecção de padrões</w:t>
       </w:r>
-      <w:bookmarkEnd w:id="48"/>
+      <w:bookmarkEnd w:id="52"/>
     </w:p>
     <w:p>
       <w:pPr>
@@ -6131,7 +6706,7 @@
           <w:szCs w:val="22"/>
         </w:rPr>
       </w:pPr>
-      <w:bookmarkStart w:id="49" w:name="_Toc230257656"/>
+      <w:bookmarkStart w:id="53" w:name="_Toc230641880"/>
       <w:r>
         <w:rPr>
           <w:b/>
@@ -6225,7 +6800,7 @@
         </w:rPr>
         <w:t>- Exemplo de geração de subsequências por janelas deslizantes.</w:t>
       </w:r>
-      <w:bookmarkEnd w:id="49"/>
+      <w:bookmarkEnd w:id="53"/>
     </w:p>
     <w:p>
       <w:pPr>
@@ -6353,11 +6928,11 @@
       <w:pPr>
         <w:pStyle w:val="T2-TituloSecundario"/>
       </w:pPr>
-      <w:bookmarkStart w:id="50" w:name="_Toc230257790"/>
+      <w:bookmarkStart w:id="54" w:name="_Toc230641993"/>
       <w:r>
         <w:t>Análise dos resultados</w:t>
       </w:r>
-      <w:bookmarkEnd w:id="50"/>
+      <w:bookmarkEnd w:id="54"/>
     </w:p>
     <w:p>
       <w:pPr>
@@ -6410,22 +6985,25 @@
       <w:pPr>
         <w:pStyle w:val="T1-TituloPrimario"/>
       </w:pPr>
-      <w:bookmarkStart w:id="51" w:name="_Toc230257792"/>
+      <w:bookmarkStart w:id="55" w:name="_Toc230641994"/>
       <w:r>
         <w:lastRenderedPageBreak/>
         <w:t>Modelagem do Protótipo</w:t>
       </w:r>
+      <w:bookmarkEnd w:id="55"/>
     </w:p>
     <w:p>
       <w:pPr>
         <w:pStyle w:val="T2-TituloSecundario"/>
       </w:pPr>
+      <w:bookmarkStart w:id="56" w:name="_Toc230641995"/>
       <w:r>
         <w:t>Descrição da solução propost</w:t>
       </w:r>
       <w:r>
         <w:t>a</w:t>
       </w:r>
+      <w:bookmarkEnd w:id="56"/>
     </w:p>
     <w:p>
       <w:pPr>
@@ -6464,7 +7042,11 @@
         <w:pStyle w:val="TE-Normal"/>
       </w:pPr>
       <w:r>
-        <w:t>Como saída, o sistema deverá apresentar uma relação dos padrões identificados, indicando o tipo de representação utilizada, a sequência correspondente, o número de ocorrências e os compassos em que cada padrão aparece. Essas informações serão posteriormente analisadas de forma qualitativa, com o objetivo de verificar a coerência dos resultados e a viabilidade da abordagem proposta.</w:t>
+        <w:t xml:space="preserve">Como saída, o sistema deverá apresentar uma relação dos padrões identificados, indicando o tipo de representação utilizada, a sequência correspondente, o número de ocorrências e os compassos em que cada padrão aparece. Essas </w:t>
+      </w:r>
+      <w:r>
+        <w:lastRenderedPageBreak/>
+        <w:t>informações serão posteriormente analisadas de forma qualitativa, com o objetivo de verificar a coerência dos resultados e a viabilidade da abordagem proposta.</w:t>
       </w:r>
     </w:p>
     <w:p>
@@ -6476,9 +7058,11 @@
       <w:pPr>
         <w:pStyle w:val="T2-TituloSecundario"/>
       </w:pPr>
+      <w:bookmarkStart w:id="57" w:name="_Toc230641996"/>
       <w:r>
         <w:t>Requisitos do protótipo</w:t>
       </w:r>
+      <w:bookmarkEnd w:id="57"/>
     </w:p>
     <w:p>
       <w:pPr>
@@ -6529,6 +7113,7 @@
           <w:szCs w:val="22"/>
         </w:rPr>
       </w:pPr>
+      <w:bookmarkStart w:id="58" w:name="_Toc230641858"/>
       <w:r>
         <w:rPr>
           <w:b/>
@@ -6612,6 +7197,7 @@
         </w:rPr>
         <w:t xml:space="preserve"> - Requisitos do protótipo</w:t>
       </w:r>
+      <w:bookmarkEnd w:id="58"/>
     </w:p>
     <w:tbl>
       <w:tblPr>
@@ -6983,7 +7569,6 @@
                 <w:sz w:val="22"/>
                 <w:szCs w:val="16"/>
               </w:rPr>
-              <w:lastRenderedPageBreak/>
               <w:t>RF05</w:t>
             </w:r>
           </w:p>
@@ -7120,6 +7705,7 @@
                 <w:sz w:val="22"/>
                 <w:szCs w:val="16"/>
               </w:rPr>
+              <w:lastRenderedPageBreak/>
               <w:t>RF0</w:t>
             </w:r>
             <w:r>
@@ -7752,9 +8338,11 @@
       <w:pPr>
         <w:pStyle w:val="T2-TituloSecundario"/>
       </w:pPr>
+      <w:bookmarkStart w:id="59" w:name="_Toc230641997"/>
       <w:r>
         <w:t>Arquitetura e fluxo geral do sistema</w:t>
       </w:r>
+      <w:bookmarkEnd w:id="59"/>
     </w:p>
     <w:p>
       <w:pPr>
@@ -7767,11 +8355,11 @@
         <w:t>4</w:t>
       </w:r>
       <w:r>
-        <w:t xml:space="preserve"> apresenta a visão geral do fluxo de funcionamento do sistema proposto. O processo inicia com a entrada dos arquivos MusicXML, passa pela extração da linha melódica principal e segue para a conversão da melodia em duas representações: intervalos melódicos e contorno melódico. Em seguida, são aplicadas </w:t>
+        <w:t xml:space="preserve"> apresenta a visão geral do fluxo de funcionamento do sistema proposto. O processo inicia com a entrada dos arquivos MusicXML, passa pela extração da linha melódica principal e segue para a conversão da melodia em duas representações: intervalos melódicos e contorno melódico. Em seguida, são aplicadas janelas deslizantes para gerar subsequências candidatas a padrão. Essas subsequências são comparadas entre si, e aquelas que apresentam recorrência são registradas com suas respectivas ocorrências e localizações aproximadas. Por fim, os resultados são </w:t>
       </w:r>
       <w:r>
         <w:lastRenderedPageBreak/>
-        <w:t>janelas deslizantes para gerar subsequências candidatas a padrão. Essas subsequências são comparadas entre si, e aquelas que apresentam recorrência são registradas com suas respectivas ocorrências e localizações aproximadas. Por fim, os resultados são analisados qualitativamente, a fim de verificar se os padrões identificados possuem coerência musical dentro do corpus analisado.</w:t>
+        <w:t>analisados qualitativamente, a fim de verificar se os padrões identificados possuem coerência musical dentro do corpus analisado.</w:t>
       </w:r>
     </w:p>
     <w:p>
@@ -7789,7 +8377,7 @@
           <w:szCs w:val="22"/>
         </w:rPr>
       </w:pPr>
-      <w:bookmarkStart w:id="52" w:name="_Toc230257657"/>
+      <w:bookmarkStart w:id="60" w:name="_Toc230641881"/>
       <w:r>
         <w:rPr>
           <w:b/>
@@ -7885,7 +8473,7 @@
         </w:rPr>
         <w:t>- Fluxo geral do sistema proposto</w:t>
       </w:r>
-      <w:bookmarkEnd w:id="52"/>
+      <w:bookmarkEnd w:id="60"/>
     </w:p>
     <w:p>
       <w:pPr>
@@ -7998,11 +8586,11 @@
         <w:pStyle w:val="TE-Normal"/>
       </w:pPr>
       <w:r>
-        <w:t xml:space="preserve">A arquitetura proposta organiza o protótipo em etapas sequenciais e independentes, de modo que cada fase produza uma saída utilizada pela etapa seguinte. </w:t>
+        <w:t xml:space="preserve">A arquitetura proposta organiza o protótipo em etapas sequenciais e independentes, de modo que cada fase produza uma saída utilizada pela etapa seguinte. Essa organização favorece a compreensão do funcionamento geral da solução e permite que cada módulo seja ajustado ou expandido separadamente. Dessa forma, a leitura da partitura, a extração da melodia, a geração das representações estruturais, a detecção de </w:t>
       </w:r>
       <w:r>
         <w:lastRenderedPageBreak/>
-        <w:t>Essa organização favorece a compreensão do funcionamento geral da solução e permite que cada módulo seja ajustado ou expandido separadamente. Dessa forma, a leitura da partitura, a extração da melodia, a geração das representações estruturais, a detecção de recorrências e a apresentação dos resultados constituem partes distintas do fluxo de processamento.</w:t>
+        <w:t>recorrências e a apresentação dos resultados constituem partes distintas do fluxo de processamento.</w:t>
       </w:r>
     </w:p>
     <w:p>
@@ -8017,9 +8605,11 @@
       <w:pPr>
         <w:pStyle w:val="T2-TituloSecundario"/>
       </w:pPr>
+      <w:bookmarkStart w:id="61" w:name="_Toc230641998"/>
       <w:r>
         <w:t>Etapas de processamento das partituras</w:t>
       </w:r>
+      <w:bookmarkEnd w:id="61"/>
     </w:p>
     <w:p>
       <w:pPr>
@@ -8053,7 +8643,7 @@
           <w:szCs w:val="22"/>
         </w:rPr>
       </w:pPr>
-      <w:bookmarkStart w:id="53" w:name="_Toc230257711"/>
+      <w:bookmarkStart w:id="62" w:name="_Toc230641859"/>
       <w:r>
         <w:rPr>
           <w:b/>
@@ -8137,7 +8727,7 @@
         </w:rPr>
         <w:t xml:space="preserve"> - Etapas do protótipo proposto</w:t>
       </w:r>
-      <w:bookmarkEnd w:id="53"/>
+      <w:bookmarkEnd w:id="62"/>
     </w:p>
     <w:tbl>
       <w:tblPr>
@@ -8889,31 +9479,6 @@
     </w:p>
     <w:p>
       <w:pPr>
-        <w:pStyle w:val="TE-Normal"/>
-      </w:pPr>
-      <w:r>
-        <w:lastRenderedPageBreak/>
-        <w:t>As etapas apresentadas no Quadro 2 demonstram que o processamento das partituras ocorre de forma progressiva. Inicialmente, o arquivo MusicXML é carregado e convertido em uma estrutura manipulável pelo sistema. Em seguida, a linha melódica principal é extraída e organizada em uma sequência de eventos musicais. Essa sequência serve de base para a construção das representações intervalar e de contorno melódico.</w:t>
-      </w:r>
-    </w:p>
-    <w:p>
-      <w:pPr>
-        <w:pStyle w:val="TE-Normal"/>
-      </w:pPr>
-      <w:r>
-        <w:t>A partir dessas representações, o protótipo gera subsequências por meio de janelas deslizantes, permitindo que pequenos trechos melódicos sejam comparados entre si. Quando uma mesma subsequência aparece mais de uma vez, ela passa a ser considerada um padrão recorrente candidato. Por fim, os padrões identificados são organizados para análise qualitativa, considerando sua frequência, sua localização aproximada na partitura e sua relevância musical.</w:t>
-      </w:r>
-    </w:p>
-    <w:p>
-      <w:pPr>
-        <w:pStyle w:val="TE-Normal"/>
-      </w:pPr>
-      <w:r>
-        <w:t>Essa organização por etapas contribui para tornar o processo de análise mais claro e controlado, permitindo verificar em qual fase cada transformação ocorre. Além disso, facilita a identificação de possíveis limitações do protótipo, como problemas na extração da melodia, escolhas inadequadas de tamanho de janela ou detecção de padrões pouco significativos do ponto de vista musical.</w:t>
-      </w:r>
-    </w:p>
-    <w:p>
-      <w:pPr>
         <w:widowControl w:val="0"/>
         <w:pBdr>
           <w:top w:val="nil"/>
@@ -8933,6 +9498,766 @@
     </w:p>
     <w:p>
       <w:pPr>
+        <w:pStyle w:val="TE-Normal"/>
+      </w:pPr>
+      <w:r>
+        <w:t xml:space="preserve">As etapas apresentadas no Quadro </w:t>
+      </w:r>
+      <w:r>
+        <w:t>3</w:t>
+      </w:r>
+      <w:r>
+        <w:t xml:space="preserve"> demonstram que o processamento das partituras ocorre de forma progressiva. Inicialmente, o arquivo MusicXML é carregado </w:t>
+      </w:r>
+      <w:r>
+        <w:lastRenderedPageBreak/>
+        <w:t>e convertido em uma estrutura manipulável pelo sistema. Em seguida, a linha melódica principal é extraída e organizada em uma sequência de eventos musicais. Essa sequência serve de base para a construção das representações intervalar e de contorno melódico.</w:t>
+      </w:r>
+    </w:p>
+    <w:p>
+      <w:pPr>
+        <w:pStyle w:val="TE-Normal"/>
+      </w:pPr>
+      <w:r>
+        <w:t>A partir dessas representações, o protótipo gera subsequências por meio de janelas deslizantes, permitindo que pequenos trechos melódicos sejam comparados entre si. Quando uma mesma subsequência aparece mais de uma vez, ela passa a ser considerada um padrão recorrente candidato. Por fim, os padrões identificados são organizados para análise qualitativa, considerando sua frequência, sua localização aproximada na partitura e sua relevância musical.</w:t>
+      </w:r>
+    </w:p>
+    <w:p>
+      <w:pPr>
+        <w:pStyle w:val="TE-Normal"/>
+      </w:pPr>
+      <w:r>
+        <w:t>Essa organização por etapas contribui para tornar o processo de análise mais claro e controlado, permitindo verificar em qual fase cada transformação ocorre. Além disso, facilita a identificação de possíveis limitações do protótipo, como problemas na extração da melodia, escolhas inadequadas de tamanho de janela ou detecção de padrões pouco significativos do ponto de vista musical.</w:t>
+      </w:r>
+    </w:p>
+    <w:p>
+      <w:pPr>
+        <w:pStyle w:val="T2-TituloSecundario"/>
+      </w:pPr>
+      <w:bookmarkStart w:id="63" w:name="_Toc230641999"/>
+      <w:r>
+        <w:t>Estrutura dos dados extraídos</w:t>
+      </w:r>
+      <w:bookmarkEnd w:id="63"/>
+    </w:p>
+    <w:p>
+      <w:pPr>
+        <w:pStyle w:val="TE-Normal"/>
+      </w:pPr>
+      <w:r>
+        <w:t>A etapa de extração da melodia tem como resultado a transformação da partitura digital em uma estrutura de dados organizada. Essa estrutura deve conter as informações necessárias para permitir tanto a identificação dos padrões quanto a localização aproximada de suas ocorrências nas partituras analisadas. Dessa forma, cada nota extraída da linha melódica principal será representada por um conjunto de atributos musicais e computacionais.</w:t>
+      </w:r>
+    </w:p>
+    <w:p>
+      <w:pPr>
+        <w:pStyle w:val="TE-Normal"/>
+      </w:pPr>
+      <w:r>
+        <w:t>Entre os dados extraídos, destacam-se a identificação da obra, a posição sequencial da nota, o compasso de ocorrência, a altura, a duração, o intervalo em relação à nota anterior e o contorno melódico correspondente. Esses dados permitem que a melodia seja analisada não apenas como uma sequência de notas absolutas, mas também como uma estrutura formada por relações entre eventos sucessivos.</w:t>
+      </w:r>
+    </w:p>
+    <w:p>
+      <w:pPr>
+        <w:pStyle w:val="TE-Normal"/>
+      </w:pPr>
+      <w:r>
+        <w:t xml:space="preserve">O Quadro </w:t>
+      </w:r>
+      <w:r>
+        <w:t>4</w:t>
+      </w:r>
+      <w:r>
+        <w:t xml:space="preserve"> apresenta os principais campos previstos para a estrutura dos dados extraídos pelo protótipo.</w:t>
+      </w:r>
+    </w:p>
+    <w:p>
+      <w:pPr>
+        <w:pStyle w:val="Legenda"/>
+        <w:keepNext/>
+        <w:jc w:val="center"/>
+        <w:rPr>
+          <w:i w:val="0"/>
+          <w:iCs w:val="0"/>
+          <w:color w:val="auto"/>
+          <w:sz w:val="22"/>
+          <w:szCs w:val="22"/>
+        </w:rPr>
+      </w:pPr>
+      <w:bookmarkStart w:id="64" w:name="_Toc230641860"/>
+      <w:r>
+        <w:rPr>
+          <w:b/>
+          <w:bCs/>
+          <w:i w:val="0"/>
+          <w:iCs w:val="0"/>
+          <w:color w:val="auto"/>
+          <w:sz w:val="22"/>
+          <w:szCs w:val="22"/>
+        </w:rPr>
+        <w:lastRenderedPageBreak/>
+        <w:t xml:space="preserve">QUADRO </w:t>
+      </w:r>
+      <w:r>
+        <w:rPr>
+          <w:b/>
+          <w:bCs/>
+          <w:i w:val="0"/>
+          <w:iCs w:val="0"/>
+          <w:color w:val="auto"/>
+          <w:sz w:val="22"/>
+          <w:szCs w:val="22"/>
+        </w:rPr>
+        <w:fldChar w:fldCharType="begin"/>
+      </w:r>
+      <w:r>
+        <w:rPr>
+          <w:b/>
+          <w:bCs/>
+          <w:i w:val="0"/>
+          <w:iCs w:val="0"/>
+          <w:color w:val="auto"/>
+          <w:sz w:val="22"/>
+          <w:szCs w:val="22"/>
+        </w:rPr>
+        <w:instrText xml:space="preserve"> SEQ Quadro \* ARABIC </w:instrText>
+      </w:r>
+      <w:r>
+        <w:rPr>
+          <w:b/>
+          <w:bCs/>
+          <w:i w:val="0"/>
+          <w:iCs w:val="0"/>
+          <w:color w:val="auto"/>
+          <w:sz w:val="22"/>
+          <w:szCs w:val="22"/>
+        </w:rPr>
+        <w:fldChar w:fldCharType="separate"/>
+      </w:r>
+      <w:r>
+        <w:rPr>
+          <w:b/>
+          <w:bCs/>
+          <w:i w:val="0"/>
+          <w:iCs w:val="0"/>
+          <w:noProof/>
+          <w:color w:val="auto"/>
+          <w:sz w:val="22"/>
+          <w:szCs w:val="22"/>
+        </w:rPr>
+        <w:t>4</w:t>
+      </w:r>
+      <w:r>
+        <w:rPr>
+          <w:b/>
+          <w:bCs/>
+          <w:i w:val="0"/>
+          <w:iCs w:val="0"/>
+          <w:color w:val="auto"/>
+          <w:sz w:val="22"/>
+          <w:szCs w:val="22"/>
+        </w:rPr>
+        <w:fldChar w:fldCharType="end"/>
+      </w:r>
+      <w:r>
+        <w:rPr>
+          <w:i w:val="0"/>
+          <w:iCs w:val="0"/>
+          <w:color w:val="auto"/>
+          <w:sz w:val="22"/>
+          <w:szCs w:val="22"/>
+        </w:rPr>
+        <w:t xml:space="preserve"> - Estrutura dos dados extraídos</w:t>
+      </w:r>
+      <w:bookmarkEnd w:id="64"/>
+    </w:p>
+    <w:tbl>
+      <w:tblPr>
+        <w:tblStyle w:val="Tabelacomgrade"/>
+        <w:tblW w:w="9060" w:type="dxa"/>
+        <w:tblLook w:val="04A0" w:firstRow="1" w:lastRow="0" w:firstColumn="1" w:lastColumn="0" w:noHBand="0" w:noVBand="1"/>
+      </w:tblPr>
+      <w:tblGrid>
+        <w:gridCol w:w="1145"/>
+        <w:gridCol w:w="3957"/>
+        <w:gridCol w:w="3958"/>
+      </w:tblGrid>
+      <w:tr>
+        <w:tc>
+          <w:tcPr>
+            <w:tcW w:w="1145" w:type="dxa"/>
+            <w:vAlign w:val="center"/>
+          </w:tcPr>
+          <w:p>
+            <w:pPr>
+              <w:pStyle w:val="TE-Normal"/>
+              <w:ind w:firstLine="0"/>
+              <w:rPr>
+                <w:sz w:val="22"/>
+                <w:szCs w:val="22"/>
+              </w:rPr>
+            </w:pPr>
+            <w:r>
+              <w:rPr>
+                <w:b/>
+                <w:bCs/>
+                <w:sz w:val="22"/>
+                <w:szCs w:val="22"/>
+              </w:rPr>
+              <w:t>Campo</w:t>
+            </w:r>
+          </w:p>
+        </w:tc>
+        <w:tc>
+          <w:tcPr>
+            <w:tcW w:w="3957" w:type="dxa"/>
+            <w:vAlign w:val="center"/>
+          </w:tcPr>
+          <w:p>
+            <w:pPr>
+              <w:pStyle w:val="TE-Normal"/>
+              <w:ind w:firstLine="0"/>
+              <w:rPr>
+                <w:sz w:val="22"/>
+                <w:szCs w:val="22"/>
+              </w:rPr>
+            </w:pPr>
+            <w:r>
+              <w:rPr>
+                <w:b/>
+                <w:bCs/>
+                <w:sz w:val="22"/>
+                <w:szCs w:val="22"/>
+              </w:rPr>
+              <w:t>Descrição</w:t>
+            </w:r>
+          </w:p>
+        </w:tc>
+        <w:tc>
+          <w:tcPr>
+            <w:tcW w:w="3958" w:type="dxa"/>
+            <w:vAlign w:val="center"/>
+          </w:tcPr>
+          <w:p>
+            <w:pPr>
+              <w:pStyle w:val="TE-Normal"/>
+              <w:ind w:firstLine="0"/>
+              <w:rPr>
+                <w:sz w:val="22"/>
+                <w:szCs w:val="22"/>
+              </w:rPr>
+            </w:pPr>
+            <w:r>
+              <w:rPr>
+                <w:b/>
+                <w:bCs/>
+                <w:sz w:val="22"/>
+                <w:szCs w:val="22"/>
+              </w:rPr>
+              <w:t>Finalidade</w:t>
+            </w:r>
+          </w:p>
+        </w:tc>
+      </w:tr>
+      <w:tr>
+        <w:tc>
+          <w:tcPr>
+            <w:tcW w:w="1145" w:type="dxa"/>
+            <w:vAlign w:val="center"/>
+          </w:tcPr>
+          <w:p>
+            <w:pPr>
+              <w:pStyle w:val="TE-Normal"/>
+              <w:ind w:firstLine="0"/>
+              <w:rPr>
+                <w:sz w:val="22"/>
+                <w:szCs w:val="22"/>
+              </w:rPr>
+            </w:pPr>
+            <w:r>
+              <w:rPr>
+                <w:sz w:val="22"/>
+                <w:szCs w:val="22"/>
+              </w:rPr>
+              <w:t>Obra</w:t>
+            </w:r>
+          </w:p>
+        </w:tc>
+        <w:tc>
+          <w:tcPr>
+            <w:tcW w:w="3957" w:type="dxa"/>
+            <w:vAlign w:val="center"/>
+          </w:tcPr>
+          <w:p>
+            <w:pPr>
+              <w:pStyle w:val="TE-Normal"/>
+              <w:ind w:firstLine="0"/>
+              <w:rPr>
+                <w:sz w:val="22"/>
+                <w:szCs w:val="22"/>
+              </w:rPr>
+            </w:pPr>
+            <w:r>
+              <w:rPr>
+                <w:sz w:val="22"/>
+                <w:szCs w:val="22"/>
+              </w:rPr>
+              <w:t>Nome da partitura analisada</w:t>
+            </w:r>
+          </w:p>
+        </w:tc>
+        <w:tc>
+          <w:tcPr>
+            <w:tcW w:w="3958" w:type="dxa"/>
+            <w:vAlign w:val="center"/>
+          </w:tcPr>
+          <w:p>
+            <w:pPr>
+              <w:pStyle w:val="TE-Normal"/>
+              <w:ind w:firstLine="0"/>
+              <w:rPr>
+                <w:sz w:val="22"/>
+                <w:szCs w:val="22"/>
+              </w:rPr>
+            </w:pPr>
+            <w:r>
+              <w:rPr>
+                <w:sz w:val="22"/>
+                <w:szCs w:val="22"/>
+              </w:rPr>
+              <w:t>Identificar a origem dos dados e dos padrões encontrados.</w:t>
+            </w:r>
+          </w:p>
+        </w:tc>
+      </w:tr>
+      <w:tr>
+        <w:tc>
+          <w:tcPr>
+            <w:tcW w:w="1145" w:type="dxa"/>
+            <w:vAlign w:val="center"/>
+          </w:tcPr>
+          <w:p>
+            <w:pPr>
+              <w:pStyle w:val="TE-Normal"/>
+              <w:ind w:firstLine="0"/>
+              <w:rPr>
+                <w:sz w:val="22"/>
+                <w:szCs w:val="22"/>
+              </w:rPr>
+            </w:pPr>
+            <w:r>
+              <w:rPr>
+                <w:sz w:val="22"/>
+                <w:szCs w:val="22"/>
+              </w:rPr>
+              <w:t>Posição sequencial</w:t>
+            </w:r>
+          </w:p>
+        </w:tc>
+        <w:tc>
+          <w:tcPr>
+            <w:tcW w:w="3957" w:type="dxa"/>
+            <w:vAlign w:val="center"/>
+          </w:tcPr>
+          <w:p>
+            <w:pPr>
+              <w:pStyle w:val="TE-Normal"/>
+              <w:ind w:firstLine="0"/>
+              <w:rPr>
+                <w:sz w:val="22"/>
+                <w:szCs w:val="22"/>
+              </w:rPr>
+            </w:pPr>
+            <w:r>
+              <w:rPr>
+                <w:sz w:val="22"/>
+                <w:szCs w:val="22"/>
+              </w:rPr>
+              <w:t>Ordem da nota dentro da sequência melódica</w:t>
+            </w:r>
+          </w:p>
+        </w:tc>
+        <w:tc>
+          <w:tcPr>
+            <w:tcW w:w="3958" w:type="dxa"/>
+            <w:vAlign w:val="center"/>
+          </w:tcPr>
+          <w:p>
+            <w:pPr>
+              <w:pStyle w:val="TE-Normal"/>
+              <w:ind w:firstLine="0"/>
+              <w:rPr>
+                <w:sz w:val="22"/>
+                <w:szCs w:val="22"/>
+              </w:rPr>
+            </w:pPr>
+            <w:r>
+              <w:rPr>
+                <w:sz w:val="22"/>
+                <w:szCs w:val="22"/>
+              </w:rPr>
+              <w:t>Preservar a ordem dos eventos musicais.</w:t>
+            </w:r>
+          </w:p>
+        </w:tc>
+      </w:tr>
+      <w:tr>
+        <w:tc>
+          <w:tcPr>
+            <w:tcW w:w="1145" w:type="dxa"/>
+            <w:vAlign w:val="center"/>
+          </w:tcPr>
+          <w:p>
+            <w:pPr>
+              <w:pStyle w:val="TE-Normal"/>
+              <w:ind w:firstLine="0"/>
+              <w:rPr>
+                <w:sz w:val="22"/>
+                <w:szCs w:val="22"/>
+              </w:rPr>
+            </w:pPr>
+            <w:r>
+              <w:rPr>
+                <w:sz w:val="22"/>
+                <w:szCs w:val="22"/>
+              </w:rPr>
+              <w:t>Compasso</w:t>
+            </w:r>
+          </w:p>
+        </w:tc>
+        <w:tc>
+          <w:tcPr>
+            <w:tcW w:w="3957" w:type="dxa"/>
+            <w:vAlign w:val="center"/>
+          </w:tcPr>
+          <w:p>
+            <w:pPr>
+              <w:pStyle w:val="TE-Normal"/>
+              <w:ind w:firstLine="0"/>
+              <w:rPr>
+                <w:sz w:val="22"/>
+                <w:szCs w:val="22"/>
+              </w:rPr>
+            </w:pPr>
+            <w:r>
+              <w:rPr>
+                <w:sz w:val="22"/>
+                <w:szCs w:val="22"/>
+              </w:rPr>
+              <w:t>Localização aproximada da nota na partitura</w:t>
+            </w:r>
+          </w:p>
+        </w:tc>
+        <w:tc>
+          <w:tcPr>
+            <w:tcW w:w="3958" w:type="dxa"/>
+            <w:vAlign w:val="center"/>
+          </w:tcPr>
+          <w:p>
+            <w:pPr>
+              <w:pStyle w:val="TE-Normal"/>
+              <w:ind w:firstLine="0"/>
+              <w:rPr>
+                <w:sz w:val="22"/>
+                <w:szCs w:val="22"/>
+              </w:rPr>
+            </w:pPr>
+            <w:r>
+              <w:rPr>
+                <w:sz w:val="22"/>
+                <w:szCs w:val="22"/>
+              </w:rPr>
+              <w:t>Permitir localizar as ocorrências dos padrões identificados.</w:t>
+            </w:r>
+          </w:p>
+        </w:tc>
+      </w:tr>
+      <w:tr>
+        <w:tc>
+          <w:tcPr>
+            <w:tcW w:w="1145" w:type="dxa"/>
+            <w:vAlign w:val="center"/>
+          </w:tcPr>
+          <w:p>
+            <w:pPr>
+              <w:pStyle w:val="TE-Normal"/>
+              <w:ind w:firstLine="0"/>
+              <w:rPr>
+                <w:sz w:val="22"/>
+                <w:szCs w:val="22"/>
+              </w:rPr>
+            </w:pPr>
+            <w:r>
+              <w:rPr>
+                <w:sz w:val="22"/>
+                <w:szCs w:val="22"/>
+              </w:rPr>
+              <w:t>Altura</w:t>
+            </w:r>
+          </w:p>
+        </w:tc>
+        <w:tc>
+          <w:tcPr>
+            <w:tcW w:w="3957" w:type="dxa"/>
+            <w:vAlign w:val="center"/>
+          </w:tcPr>
+          <w:p>
+            <w:pPr>
+              <w:pStyle w:val="TE-Normal"/>
+              <w:ind w:firstLine="0"/>
+              <w:rPr>
+                <w:sz w:val="22"/>
+                <w:szCs w:val="22"/>
+              </w:rPr>
+            </w:pPr>
+            <w:r>
+              <w:rPr>
+                <w:sz w:val="22"/>
+                <w:szCs w:val="22"/>
+              </w:rPr>
+              <w:t>Representação da nota, preferencialmente em valor numérico, como MIDI</w:t>
+            </w:r>
+          </w:p>
+        </w:tc>
+        <w:tc>
+          <w:tcPr>
+            <w:tcW w:w="3958" w:type="dxa"/>
+            <w:vAlign w:val="center"/>
+          </w:tcPr>
+          <w:p>
+            <w:pPr>
+              <w:pStyle w:val="TE-Normal"/>
+              <w:ind w:firstLine="0"/>
+              <w:rPr>
+                <w:sz w:val="22"/>
+                <w:szCs w:val="22"/>
+              </w:rPr>
+            </w:pPr>
+            <w:r>
+              <w:rPr>
+                <w:sz w:val="22"/>
+                <w:szCs w:val="22"/>
+              </w:rPr>
+              <w:t>Servir de base para o cálculo dos intervalos melódicos.</w:t>
+            </w:r>
+          </w:p>
+        </w:tc>
+      </w:tr>
+      <w:tr>
+        <w:tc>
+          <w:tcPr>
+            <w:tcW w:w="1145" w:type="dxa"/>
+            <w:vAlign w:val="center"/>
+          </w:tcPr>
+          <w:p>
+            <w:pPr>
+              <w:pStyle w:val="TE-Normal"/>
+              <w:ind w:firstLine="0"/>
+              <w:rPr>
+                <w:sz w:val="22"/>
+                <w:szCs w:val="22"/>
+              </w:rPr>
+            </w:pPr>
+            <w:r>
+              <w:rPr>
+                <w:sz w:val="22"/>
+                <w:szCs w:val="22"/>
+              </w:rPr>
+              <w:t>Duração</w:t>
+            </w:r>
+          </w:p>
+        </w:tc>
+        <w:tc>
+          <w:tcPr>
+            <w:tcW w:w="3957" w:type="dxa"/>
+            <w:vAlign w:val="center"/>
+          </w:tcPr>
+          <w:p>
+            <w:pPr>
+              <w:pStyle w:val="TE-Normal"/>
+              <w:ind w:firstLine="0"/>
+              <w:rPr>
+                <w:sz w:val="22"/>
+                <w:szCs w:val="22"/>
+              </w:rPr>
+            </w:pPr>
+            <w:r>
+              <w:rPr>
+                <w:sz w:val="22"/>
+                <w:szCs w:val="22"/>
+              </w:rPr>
+              <w:t>Valor temporal da nota na partitura</w:t>
+            </w:r>
+          </w:p>
+        </w:tc>
+        <w:tc>
+          <w:tcPr>
+            <w:tcW w:w="3958" w:type="dxa"/>
+            <w:vAlign w:val="center"/>
+          </w:tcPr>
+          <w:p>
+            <w:pPr>
+              <w:pStyle w:val="TE-Normal"/>
+              <w:ind w:firstLine="0"/>
+              <w:rPr>
+                <w:sz w:val="22"/>
+                <w:szCs w:val="22"/>
+              </w:rPr>
+            </w:pPr>
+            <w:r>
+              <w:rPr>
+                <w:sz w:val="22"/>
+                <w:szCs w:val="22"/>
+              </w:rPr>
+              <w:t>Registrar informação musical complementar para análise posterior.</w:t>
+            </w:r>
+          </w:p>
+        </w:tc>
+      </w:tr>
+      <w:tr>
+        <w:tc>
+          <w:tcPr>
+            <w:tcW w:w="1145" w:type="dxa"/>
+            <w:vAlign w:val="center"/>
+          </w:tcPr>
+          <w:p>
+            <w:pPr>
+              <w:pStyle w:val="TE-Normal"/>
+              <w:ind w:firstLine="0"/>
+              <w:rPr>
+                <w:sz w:val="22"/>
+                <w:szCs w:val="22"/>
+              </w:rPr>
+            </w:pPr>
+            <w:r>
+              <w:rPr>
+                <w:sz w:val="22"/>
+                <w:szCs w:val="22"/>
+              </w:rPr>
+              <w:t>Intervalo</w:t>
+            </w:r>
+          </w:p>
+        </w:tc>
+        <w:tc>
+          <w:tcPr>
+            <w:tcW w:w="3957" w:type="dxa"/>
+            <w:vAlign w:val="center"/>
+          </w:tcPr>
+          <w:p>
+            <w:pPr>
+              <w:pStyle w:val="TE-Normal"/>
+              <w:ind w:firstLine="0"/>
+              <w:rPr>
+                <w:sz w:val="22"/>
+                <w:szCs w:val="22"/>
+              </w:rPr>
+            </w:pPr>
+            <w:r>
+              <w:rPr>
+                <w:sz w:val="22"/>
+                <w:szCs w:val="22"/>
+              </w:rPr>
+              <w:t>Diferença de altura entre a nota atual e a nota anterior</w:t>
+            </w:r>
+          </w:p>
+        </w:tc>
+        <w:tc>
+          <w:tcPr>
+            <w:tcW w:w="3958" w:type="dxa"/>
+            <w:vAlign w:val="center"/>
+          </w:tcPr>
+          <w:p>
+            <w:pPr>
+              <w:pStyle w:val="TE-Normal"/>
+              <w:ind w:firstLine="0"/>
+              <w:rPr>
+                <w:sz w:val="22"/>
+                <w:szCs w:val="22"/>
+              </w:rPr>
+            </w:pPr>
+            <w:r>
+              <w:rPr>
+                <w:sz w:val="22"/>
+                <w:szCs w:val="22"/>
+              </w:rPr>
+              <w:t>Representar a estrutura intervalar da melodia.</w:t>
+            </w:r>
+          </w:p>
+        </w:tc>
+      </w:tr>
+      <w:tr>
+        <w:tc>
+          <w:tcPr>
+            <w:tcW w:w="1145" w:type="dxa"/>
+            <w:vAlign w:val="center"/>
+          </w:tcPr>
+          <w:p>
+            <w:pPr>
+              <w:pStyle w:val="TE-Normal"/>
+              <w:ind w:firstLine="0"/>
+              <w:rPr>
+                <w:sz w:val="22"/>
+                <w:szCs w:val="22"/>
+              </w:rPr>
+            </w:pPr>
+            <w:r>
+              <w:rPr>
+                <w:sz w:val="22"/>
+                <w:szCs w:val="22"/>
+              </w:rPr>
+              <w:t>Contorno</w:t>
+            </w:r>
+          </w:p>
+        </w:tc>
+        <w:tc>
+          <w:tcPr>
+            <w:tcW w:w="3957" w:type="dxa"/>
+            <w:vAlign w:val="center"/>
+          </w:tcPr>
+          <w:p>
+            <w:pPr>
+              <w:pStyle w:val="TE-Normal"/>
+              <w:ind w:firstLine="0"/>
+              <w:rPr>
+                <w:sz w:val="22"/>
+                <w:szCs w:val="22"/>
+              </w:rPr>
+            </w:pPr>
+            <w:r>
+              <w:rPr>
+                <w:sz w:val="22"/>
+                <w:szCs w:val="22"/>
+              </w:rPr>
+              <w:t>Direção do movimento melódico, como subida, descida ou repetição</w:t>
+            </w:r>
+          </w:p>
+        </w:tc>
+        <w:tc>
+          <w:tcPr>
+            <w:tcW w:w="3958" w:type="dxa"/>
+            <w:vAlign w:val="center"/>
+          </w:tcPr>
+          <w:p>
+            <w:pPr>
+              <w:pStyle w:val="TE-Normal"/>
+              <w:ind w:firstLine="0"/>
+              <w:rPr>
+                <w:sz w:val="22"/>
+                <w:szCs w:val="22"/>
+              </w:rPr>
+            </w:pPr>
+            <w:r>
+              <w:rPr>
+                <w:sz w:val="22"/>
+                <w:szCs w:val="22"/>
+              </w:rPr>
+              <w:t>Permitir a comparação abstrata entre trechos melódicos.</w:t>
+            </w:r>
+          </w:p>
+        </w:tc>
+      </w:tr>
+    </w:tbl>
+    <w:p>
+      <w:pPr>
         <w:widowControl w:val="0"/>
         <w:pBdr>
           <w:top w:val="nil"/>
@@ -8949,58 +10274,95 @@
           <w:szCs w:val="22"/>
         </w:rPr>
       </w:pPr>
+      <w:r>
+        <w:rPr>
+          <w:color w:val="000000" w:themeColor="text1"/>
+          <w:sz w:val="22"/>
+          <w:szCs w:val="22"/>
+        </w:rPr>
+        <w:t>Fonte: Elaborada pelo autor (2026).</w:t>
+      </w:r>
+    </w:p>
+    <w:p>
+      <w:pPr>
+        <w:widowControl w:val="0"/>
+        <w:pBdr>
+          <w:top w:val="nil"/>
+          <w:left w:val="nil"/>
+          <w:bottom w:val="nil"/>
+          <w:right w:val="nil"/>
+          <w:between w:val="nil"/>
+        </w:pBdr>
+        <w:spacing w:line="360" w:lineRule="auto"/>
+        <w:jc w:val="center"/>
+        <w:rPr>
+          <w:color w:val="000000" w:themeColor="text1"/>
+          <w:sz w:val="22"/>
+          <w:szCs w:val="22"/>
+        </w:rPr>
+      </w:pPr>
+    </w:p>
+    <w:p>
+      <w:pPr>
+        <w:pStyle w:val="TE-Normal"/>
+      </w:pPr>
+      <w:r>
+        <w:t>A organização desses campos é essencial para que o protótipo consiga realizar a comparação entre subsequências musicais. A altura das notas permite calcular os intervalos melódicos, enquanto a sequência de intervalos possibilita a identificação de padrões transpostos. Já o contorno melódico oferece uma representação mais abstrata, permitindo reconhecer trechos que apresentam movimentos semelhantes, mesmo quando os intervalos exatos não coincidem.</w:t>
+      </w:r>
+    </w:p>
+    <w:p>
+      <w:pPr>
+        <w:pStyle w:val="TE-Normal"/>
+      </w:pPr>
+      <w:r>
+        <w:t>Além disso, a presença de informações como posição sequencial e compasso é importante para a etapa de apresentação dos resultados. Esses dados permitem indicar onde cada padrão ocorre dentro da partitura, facilitando a posterior verificação manual e a interpretação qualitativa dos padrões detectados</w:t>
+      </w:r>
+      <w:r>
+        <w:t>.</w:t>
+      </w:r>
     </w:p>
     <w:p>
       <w:pPr>
         <w:pStyle w:val="T2-TituloSecundario"/>
       </w:pPr>
-      <w:r>
-        <w:t>Estrutura dos dados extraídos</w:t>
-      </w:r>
-    </w:p>
-    <w:p>
-      <w:pPr>
-        <w:pStyle w:val="T2-TituloSecundario"/>
-      </w:pPr>
+      <w:bookmarkStart w:id="65" w:name="_Toc230642000"/>
       <w:r>
         <w:t>Representação dos resultados esperados</w:t>
       </w:r>
-    </w:p>
-    <w:p>
-      <w:pPr>
-        <w:pStyle w:val="T2-TituloSecundario"/>
-      </w:pPr>
-      <w:r>
-        <w:t>Considerações do capítulo</w:t>
-      </w:r>
+      <w:bookmarkEnd w:id="65"/>
     </w:p>
     <w:p>
       <w:pPr>
         <w:pStyle w:val="TE-Normal"/>
       </w:pPr>
+      <w:r>
+        <w:t xml:space="preserve">Os resultados esperados do protótipo consistem na apresentação dos padrões melódicos recorrentes identificados a partir das representações intervalar e de contorno </w:t>
+      </w:r>
+      <w:r>
+        <w:lastRenderedPageBreak/>
+        <w:t>melódico. Como a proposta deste trabalho possui caráter exploratório, a apresentação dos resultados deve priorizar a clareza das informações, permitindo que os padrões encontrados sejam interpretados e verificados manualmente.</w:t>
+      </w:r>
     </w:p>
     <w:p>
       <w:pPr>
         <w:pStyle w:val="TE-Normal"/>
-        <w:ind w:left="1009" w:firstLine="0"/>
-      </w:pPr>
-    </w:p>
-    <w:p>
-      <w:pPr>
-        <w:pStyle w:val="T1-TituloPrimario"/>
-      </w:pPr>
-      <w:r>
-        <w:lastRenderedPageBreak/>
-        <w:t>CRONOGRAMA</w:t>
-      </w:r>
-      <w:bookmarkEnd w:id="51"/>
+      </w:pPr>
+      <w:r>
+        <w:t>Para cada padrão identificado, o protótipo deverá apresentar a representação utilizada, a sequência correspondente, o número de ocorrências e a localização aproximada nas partituras analisadas. Essa organização permitirá observar quais padrões foram detectados por meio da comparação intervalar e quais foram identificados por meio do contorno melódico. Também será possível comparar os resultados obtidos por cada abordagem, verificando diferenças entre padrões mais específicos e padrões mais abstratos.</w:t>
+      </w:r>
     </w:p>
     <w:p>
       <w:pPr>
         <w:pStyle w:val="TE-Normal"/>
       </w:pPr>
       <w:r>
-        <w:t>O desenvolvimento do trabalho será organizado em duas etapas principais, correspondentes ao TCC I e ao TCC II. No TCC I, concentram-se as atividades de definição do tema, levantamento bibliográfico, delimitação metodológica e elaboração da estrutura inicial do trabalho. No TCC II, serão realizadas a implementação do protótipo, a execução dos experimentos, a análise dos resultados e a finalização do documento.</w:t>
+        <w:t xml:space="preserve">O Quadro </w:t>
+      </w:r>
+      <w:r>
+        <w:t>5</w:t>
+      </w:r>
+      <w:r>
+        <w:t xml:space="preserve"> apresenta uma estrutura prevista para a representação dos resultados gerados pelo protótipo.</w:t>
       </w:r>
     </w:p>
     <w:p>
@@ -9021,7 +10383,7 @@
           <w:szCs w:val="22"/>
         </w:rPr>
       </w:pPr>
-      <w:bookmarkStart w:id="54" w:name="_Toc230257712"/>
+      <w:bookmarkStart w:id="66" w:name="_Toc230641861"/>
       <w:r>
         <w:rPr>
           <w:b/>
@@ -9081,7 +10443,7 @@
           <w:sz w:val="22"/>
           <w:szCs w:val="22"/>
         </w:rPr>
-        <w:t>4</w:t>
+        <w:t>5</w:t>
       </w:r>
       <w:r>
         <w:rPr>
@@ -9097,15 +10459,887 @@
       </w:r>
       <w:r>
         <w:rPr>
+          <w:b/>
+          <w:bCs/>
           <w:i w:val="0"/>
           <w:iCs w:val="0"/>
           <w:color w:val="auto"/>
           <w:sz w:val="22"/>
           <w:szCs w:val="22"/>
         </w:rPr>
+        <w:t xml:space="preserve"> </w:t>
+      </w:r>
+      <w:r>
+        <w:rPr>
+          <w:i w:val="0"/>
+          <w:iCs w:val="0"/>
+          <w:color w:val="auto"/>
+          <w:sz w:val="22"/>
+          <w:szCs w:val="22"/>
+        </w:rPr>
+        <w:t>- Estrutura prevista para apresentação dos resultados</w:t>
+      </w:r>
+      <w:bookmarkEnd w:id="66"/>
+    </w:p>
+    <w:tbl>
+      <w:tblPr>
+        <w:tblStyle w:val="Tabelacomgrade"/>
+        <w:tblW w:w="0" w:type="auto"/>
+        <w:tblLook w:val="04A0" w:firstRow="1" w:lastRow="0" w:firstColumn="1" w:lastColumn="0" w:noHBand="0" w:noVBand="1"/>
+      </w:tblPr>
+      <w:tblGrid>
+        <w:gridCol w:w="1890"/>
+        <w:gridCol w:w="1536"/>
+        <w:gridCol w:w="1389"/>
+        <w:gridCol w:w="1559"/>
+        <w:gridCol w:w="2687"/>
+      </w:tblGrid>
+      <w:tr>
+        <w:tc>
+          <w:tcPr>
+            <w:tcW w:w="1890" w:type="dxa"/>
+            <w:vAlign w:val="center"/>
+          </w:tcPr>
+          <w:p>
+            <w:pPr>
+              <w:pStyle w:val="TE-Normal"/>
+              <w:ind w:firstLine="0"/>
+              <w:rPr>
+                <w:sz w:val="22"/>
+                <w:szCs w:val="22"/>
+              </w:rPr>
+            </w:pPr>
+            <w:r>
+              <w:rPr>
+                <w:b/>
+                <w:bCs/>
+                <w:sz w:val="22"/>
+                <w:szCs w:val="22"/>
+              </w:rPr>
+              <w:t>Obra</w:t>
+            </w:r>
+          </w:p>
+        </w:tc>
+        <w:tc>
+          <w:tcPr>
+            <w:tcW w:w="1536" w:type="dxa"/>
+            <w:vAlign w:val="center"/>
+          </w:tcPr>
+          <w:p>
+            <w:pPr>
+              <w:pStyle w:val="TE-Normal"/>
+              <w:ind w:firstLine="0"/>
+              <w:rPr>
+                <w:sz w:val="22"/>
+                <w:szCs w:val="22"/>
+              </w:rPr>
+            </w:pPr>
+            <w:r>
+              <w:rPr>
+                <w:b/>
+                <w:bCs/>
+                <w:sz w:val="22"/>
+                <w:szCs w:val="22"/>
+              </w:rPr>
+              <w:t>Tipo</w:t>
+            </w:r>
+            <w:r>
+              <w:rPr>
+                <w:b/>
+                <w:bCs/>
+                <w:sz w:val="22"/>
+                <w:szCs w:val="22"/>
+              </w:rPr>
+              <w:t xml:space="preserve"> </w:t>
+            </w:r>
+            <w:r>
+              <w:rPr>
+                <w:b/>
+                <w:bCs/>
+                <w:sz w:val="22"/>
+                <w:szCs w:val="22"/>
+              </w:rPr>
+              <w:t>de</w:t>
+            </w:r>
+            <w:r>
+              <w:rPr>
+                <w:b/>
+                <w:bCs/>
+                <w:sz w:val="22"/>
+                <w:szCs w:val="22"/>
+              </w:rPr>
+              <w:t xml:space="preserve"> </w:t>
+            </w:r>
+            <w:r>
+              <w:rPr>
+                <w:b/>
+                <w:bCs/>
+                <w:sz w:val="22"/>
+                <w:szCs w:val="22"/>
+              </w:rPr>
+              <w:t>representação</w:t>
+            </w:r>
+          </w:p>
+        </w:tc>
+        <w:tc>
+          <w:tcPr>
+            <w:tcW w:w="1389" w:type="dxa"/>
+            <w:vAlign w:val="center"/>
+          </w:tcPr>
+          <w:p>
+            <w:pPr>
+              <w:pStyle w:val="TE-Normal"/>
+              <w:ind w:firstLine="0"/>
+              <w:rPr>
+                <w:sz w:val="22"/>
+                <w:szCs w:val="22"/>
+              </w:rPr>
+            </w:pPr>
+            <w:r>
+              <w:rPr>
+                <w:b/>
+                <w:bCs/>
+                <w:sz w:val="22"/>
+                <w:szCs w:val="22"/>
+              </w:rPr>
+              <w:t>Padrão identificado</w:t>
+            </w:r>
+          </w:p>
+        </w:tc>
+        <w:tc>
+          <w:tcPr>
+            <w:tcW w:w="1559" w:type="dxa"/>
+            <w:vAlign w:val="center"/>
+          </w:tcPr>
+          <w:p>
+            <w:pPr>
+              <w:pStyle w:val="TE-Normal"/>
+              <w:ind w:firstLine="0"/>
+              <w:rPr>
+                <w:sz w:val="22"/>
+                <w:szCs w:val="22"/>
+              </w:rPr>
+            </w:pPr>
+            <w:r>
+              <w:rPr>
+                <w:b/>
+                <w:bCs/>
+                <w:sz w:val="22"/>
+                <w:szCs w:val="22"/>
+              </w:rPr>
+              <w:t>Ocorrências</w:t>
+            </w:r>
+          </w:p>
+        </w:tc>
+        <w:tc>
+          <w:tcPr>
+            <w:tcW w:w="2687" w:type="dxa"/>
+            <w:vAlign w:val="center"/>
+          </w:tcPr>
+          <w:p>
+            <w:pPr>
+              <w:pStyle w:val="TE-Normal"/>
+              <w:ind w:firstLine="0"/>
+              <w:rPr>
+                <w:sz w:val="22"/>
+                <w:szCs w:val="22"/>
+              </w:rPr>
+            </w:pPr>
+            <w:r>
+              <w:rPr>
+                <w:b/>
+                <w:bCs/>
+                <w:sz w:val="22"/>
+                <w:szCs w:val="22"/>
+              </w:rPr>
+              <w:t>Localização aproximada</w:t>
+            </w:r>
+          </w:p>
+        </w:tc>
+      </w:tr>
+      <w:tr>
+        <w:tc>
+          <w:tcPr>
+            <w:tcW w:w="1890" w:type="dxa"/>
+            <w:vAlign w:val="center"/>
+          </w:tcPr>
+          <w:p>
+            <w:pPr>
+              <w:pStyle w:val="TE-Normal"/>
+              <w:ind w:firstLine="0"/>
+              <w:rPr>
+                <w:sz w:val="22"/>
+                <w:szCs w:val="22"/>
+              </w:rPr>
+            </w:pPr>
+            <w:r>
+              <w:rPr>
+                <w:sz w:val="22"/>
+                <w:szCs w:val="22"/>
+              </w:rPr>
+              <w:t>Fantasia em Ré menor</w:t>
+            </w:r>
+          </w:p>
+        </w:tc>
+        <w:tc>
+          <w:tcPr>
+            <w:tcW w:w="1536" w:type="dxa"/>
+            <w:vAlign w:val="center"/>
+          </w:tcPr>
+          <w:p>
+            <w:pPr>
+              <w:pStyle w:val="TE-Normal"/>
+              <w:ind w:firstLine="0"/>
+              <w:rPr>
+                <w:sz w:val="22"/>
+                <w:szCs w:val="22"/>
+              </w:rPr>
+            </w:pPr>
+            <w:r>
+              <w:rPr>
+                <w:sz w:val="22"/>
+                <w:szCs w:val="22"/>
+              </w:rPr>
+              <w:t>Intervalar</w:t>
+            </w:r>
+          </w:p>
+        </w:tc>
+        <w:tc>
+          <w:tcPr>
+            <w:tcW w:w="1389" w:type="dxa"/>
+            <w:vAlign w:val="center"/>
+          </w:tcPr>
+          <w:p>
+            <w:pPr>
+              <w:pStyle w:val="TE-Normal"/>
+              <w:ind w:firstLine="0"/>
+              <w:rPr>
+                <w:sz w:val="22"/>
+                <w:szCs w:val="22"/>
+              </w:rPr>
+            </w:pPr>
+            <w:r>
+              <w:rPr>
+                <w:sz w:val="22"/>
+                <w:szCs w:val="22"/>
+              </w:rPr>
+              <w:t>+2, +3, -1</w:t>
+            </w:r>
+          </w:p>
+        </w:tc>
+        <w:tc>
+          <w:tcPr>
+            <w:tcW w:w="1559" w:type="dxa"/>
+            <w:vAlign w:val="center"/>
+          </w:tcPr>
+          <w:p>
+            <w:pPr>
+              <w:pStyle w:val="TE-Normal"/>
+              <w:ind w:firstLine="0"/>
+              <w:rPr>
+                <w:sz w:val="22"/>
+                <w:szCs w:val="22"/>
+              </w:rPr>
+            </w:pPr>
+            <w:r>
+              <w:rPr>
+                <w:sz w:val="22"/>
+                <w:szCs w:val="22"/>
+              </w:rPr>
+              <w:t>3</w:t>
+            </w:r>
+          </w:p>
+        </w:tc>
+        <w:tc>
+          <w:tcPr>
+            <w:tcW w:w="2687" w:type="dxa"/>
+            <w:vAlign w:val="center"/>
+          </w:tcPr>
+          <w:p>
+            <w:pPr>
+              <w:pStyle w:val="TE-Normal"/>
+              <w:ind w:firstLine="0"/>
+              <w:rPr>
+                <w:sz w:val="22"/>
+                <w:szCs w:val="22"/>
+              </w:rPr>
+            </w:pPr>
+            <w:r>
+              <w:rPr>
+                <w:sz w:val="22"/>
+                <w:szCs w:val="22"/>
+              </w:rPr>
+              <w:t>Compassos 4, 12 e 18</w:t>
+            </w:r>
+          </w:p>
+        </w:tc>
+      </w:tr>
+      <w:tr>
+        <w:tc>
+          <w:tcPr>
+            <w:tcW w:w="1890" w:type="dxa"/>
+            <w:vAlign w:val="center"/>
+          </w:tcPr>
+          <w:p>
+            <w:pPr>
+              <w:pStyle w:val="TE-Normal"/>
+              <w:ind w:firstLine="0"/>
+              <w:rPr>
+                <w:sz w:val="22"/>
+                <w:szCs w:val="22"/>
+              </w:rPr>
+            </w:pPr>
+            <w:r>
+              <w:rPr>
+                <w:sz w:val="22"/>
+                <w:szCs w:val="22"/>
+              </w:rPr>
+              <w:t>Fantasia em Ré menor</w:t>
+            </w:r>
+          </w:p>
+        </w:tc>
+        <w:tc>
+          <w:tcPr>
+            <w:tcW w:w="1536" w:type="dxa"/>
+            <w:vAlign w:val="center"/>
+          </w:tcPr>
+          <w:p>
+            <w:pPr>
+              <w:pStyle w:val="TE-Normal"/>
+              <w:ind w:firstLine="0"/>
+              <w:rPr>
+                <w:sz w:val="22"/>
+                <w:szCs w:val="22"/>
+              </w:rPr>
+            </w:pPr>
+            <w:r>
+              <w:rPr>
+                <w:sz w:val="22"/>
+                <w:szCs w:val="22"/>
+              </w:rPr>
+              <w:t>Contorno</w:t>
+            </w:r>
+          </w:p>
+        </w:tc>
+        <w:tc>
+          <w:tcPr>
+            <w:tcW w:w="1389" w:type="dxa"/>
+            <w:vAlign w:val="center"/>
+          </w:tcPr>
+          <w:p>
+            <w:pPr>
+              <w:pStyle w:val="TE-Normal"/>
+              <w:ind w:firstLine="0"/>
+              <w:rPr>
+                <w:sz w:val="22"/>
+                <w:szCs w:val="22"/>
+              </w:rPr>
+            </w:pPr>
+            <w:r>
+              <w:rPr>
+                <w:sz w:val="22"/>
+                <w:szCs w:val="22"/>
+              </w:rPr>
+              <w:t>↑, ↑, ↓</w:t>
+            </w:r>
+          </w:p>
+        </w:tc>
+        <w:tc>
+          <w:tcPr>
+            <w:tcW w:w="1559" w:type="dxa"/>
+            <w:vAlign w:val="center"/>
+          </w:tcPr>
+          <w:p>
+            <w:pPr>
+              <w:pStyle w:val="TE-Normal"/>
+              <w:ind w:firstLine="0"/>
+              <w:rPr>
+                <w:sz w:val="22"/>
+                <w:szCs w:val="22"/>
+              </w:rPr>
+            </w:pPr>
+            <w:r>
+              <w:rPr>
+                <w:sz w:val="22"/>
+                <w:szCs w:val="22"/>
+              </w:rPr>
+              <w:t>5</w:t>
+            </w:r>
+          </w:p>
+        </w:tc>
+        <w:tc>
+          <w:tcPr>
+            <w:tcW w:w="2687" w:type="dxa"/>
+            <w:vAlign w:val="center"/>
+          </w:tcPr>
+          <w:p>
+            <w:pPr>
+              <w:pStyle w:val="TE-Normal"/>
+              <w:ind w:firstLine="0"/>
+              <w:rPr>
+                <w:sz w:val="22"/>
+                <w:szCs w:val="22"/>
+              </w:rPr>
+            </w:pPr>
+            <w:r>
+              <w:rPr>
+                <w:sz w:val="22"/>
+                <w:szCs w:val="22"/>
+              </w:rPr>
+              <w:t>Compassos 4, 8, 12, 18 e 24</w:t>
+            </w:r>
+          </w:p>
+        </w:tc>
+      </w:tr>
+      <w:tr>
+        <w:tc>
+          <w:tcPr>
+            <w:tcW w:w="1890" w:type="dxa"/>
+            <w:vAlign w:val="center"/>
+          </w:tcPr>
+          <w:p>
+            <w:pPr>
+              <w:pStyle w:val="TE-Normal"/>
+              <w:ind w:firstLine="0"/>
+              <w:rPr>
+                <w:sz w:val="22"/>
+                <w:szCs w:val="22"/>
+              </w:rPr>
+            </w:pPr>
+            <w:r>
+              <w:rPr>
+                <w:sz w:val="22"/>
+                <w:szCs w:val="22"/>
+              </w:rPr>
+              <w:t>Valsa do Diabo</w:t>
+            </w:r>
+          </w:p>
+        </w:tc>
+        <w:tc>
+          <w:tcPr>
+            <w:tcW w:w="1536" w:type="dxa"/>
+            <w:vAlign w:val="center"/>
+          </w:tcPr>
+          <w:p>
+            <w:pPr>
+              <w:pStyle w:val="TE-Normal"/>
+              <w:ind w:firstLine="0"/>
+              <w:rPr>
+                <w:sz w:val="22"/>
+                <w:szCs w:val="22"/>
+              </w:rPr>
+            </w:pPr>
+            <w:r>
+              <w:rPr>
+                <w:sz w:val="22"/>
+                <w:szCs w:val="22"/>
+              </w:rPr>
+              <w:t>Intervalar</w:t>
+            </w:r>
+          </w:p>
+        </w:tc>
+        <w:tc>
+          <w:tcPr>
+            <w:tcW w:w="1389" w:type="dxa"/>
+            <w:vAlign w:val="center"/>
+          </w:tcPr>
+          <w:p>
+            <w:pPr>
+              <w:pStyle w:val="TE-Normal"/>
+              <w:ind w:firstLine="0"/>
+              <w:rPr>
+                <w:sz w:val="22"/>
+                <w:szCs w:val="22"/>
+              </w:rPr>
+            </w:pPr>
+            <w:r>
+              <w:rPr>
+                <w:sz w:val="22"/>
+                <w:szCs w:val="22"/>
+              </w:rPr>
+              <w:t>-2, -1, +3</w:t>
+            </w:r>
+          </w:p>
+        </w:tc>
+        <w:tc>
+          <w:tcPr>
+            <w:tcW w:w="1559" w:type="dxa"/>
+            <w:vAlign w:val="center"/>
+          </w:tcPr>
+          <w:p>
+            <w:pPr>
+              <w:pStyle w:val="TE-Normal"/>
+              <w:ind w:firstLine="0"/>
+              <w:rPr>
+                <w:sz w:val="22"/>
+                <w:szCs w:val="22"/>
+              </w:rPr>
+            </w:pPr>
+            <w:r>
+              <w:rPr>
+                <w:sz w:val="22"/>
+                <w:szCs w:val="22"/>
+              </w:rPr>
+              <w:t>2</w:t>
+            </w:r>
+          </w:p>
+        </w:tc>
+        <w:tc>
+          <w:tcPr>
+            <w:tcW w:w="2687" w:type="dxa"/>
+            <w:vAlign w:val="center"/>
+          </w:tcPr>
+          <w:p>
+            <w:pPr>
+              <w:pStyle w:val="TE-Normal"/>
+              <w:ind w:firstLine="0"/>
+              <w:rPr>
+                <w:sz w:val="22"/>
+                <w:szCs w:val="22"/>
+              </w:rPr>
+            </w:pPr>
+            <w:r>
+              <w:rPr>
+                <w:sz w:val="22"/>
+                <w:szCs w:val="22"/>
+              </w:rPr>
+              <w:t>Compassos 6 e 14</w:t>
+            </w:r>
+          </w:p>
+        </w:tc>
+      </w:tr>
+      <w:tr>
+        <w:tc>
+          <w:tcPr>
+            <w:tcW w:w="1890" w:type="dxa"/>
+            <w:vAlign w:val="center"/>
+          </w:tcPr>
+          <w:p>
+            <w:pPr>
+              <w:pStyle w:val="TE-Normal"/>
+              <w:ind w:firstLine="0"/>
+              <w:rPr>
+                <w:sz w:val="22"/>
+                <w:szCs w:val="22"/>
+              </w:rPr>
+            </w:pPr>
+            <w:r>
+              <w:rPr>
+                <w:sz w:val="22"/>
+                <w:szCs w:val="22"/>
+              </w:rPr>
+              <w:t>Élégie pour un amour</w:t>
+            </w:r>
+          </w:p>
+        </w:tc>
+        <w:tc>
+          <w:tcPr>
+            <w:tcW w:w="1536" w:type="dxa"/>
+            <w:vAlign w:val="center"/>
+          </w:tcPr>
+          <w:p>
+            <w:pPr>
+              <w:pStyle w:val="TE-Normal"/>
+              <w:ind w:firstLine="0"/>
+              <w:rPr>
+                <w:sz w:val="22"/>
+                <w:szCs w:val="22"/>
+              </w:rPr>
+            </w:pPr>
+            <w:r>
+              <w:rPr>
+                <w:sz w:val="22"/>
+                <w:szCs w:val="22"/>
+              </w:rPr>
+              <w:t>Contorno</w:t>
+            </w:r>
+          </w:p>
+        </w:tc>
+        <w:tc>
+          <w:tcPr>
+            <w:tcW w:w="1389" w:type="dxa"/>
+            <w:vAlign w:val="center"/>
+          </w:tcPr>
+          <w:p>
+            <w:pPr>
+              <w:pStyle w:val="TE-Normal"/>
+              <w:ind w:firstLine="0"/>
+              <w:rPr>
+                <w:sz w:val="22"/>
+                <w:szCs w:val="22"/>
+              </w:rPr>
+            </w:pPr>
+            <w:r>
+              <w:rPr>
+                <w:sz w:val="22"/>
+                <w:szCs w:val="22"/>
+              </w:rPr>
+              <w:t>↓, ↓, ↑</w:t>
+            </w:r>
+          </w:p>
+        </w:tc>
+        <w:tc>
+          <w:tcPr>
+            <w:tcW w:w="1559" w:type="dxa"/>
+            <w:vAlign w:val="center"/>
+          </w:tcPr>
+          <w:p>
+            <w:pPr>
+              <w:pStyle w:val="TE-Normal"/>
+              <w:ind w:firstLine="0"/>
+              <w:rPr>
+                <w:sz w:val="22"/>
+                <w:szCs w:val="22"/>
+              </w:rPr>
+            </w:pPr>
+            <w:r>
+              <w:rPr>
+                <w:sz w:val="22"/>
+                <w:szCs w:val="22"/>
+              </w:rPr>
+              <w:t>4</w:t>
+            </w:r>
+          </w:p>
+        </w:tc>
+        <w:tc>
+          <w:tcPr>
+            <w:tcW w:w="2687" w:type="dxa"/>
+            <w:vAlign w:val="center"/>
+          </w:tcPr>
+          <w:p>
+            <w:pPr>
+              <w:pStyle w:val="TE-Normal"/>
+              <w:ind w:firstLine="0"/>
+              <w:rPr>
+                <w:sz w:val="22"/>
+                <w:szCs w:val="22"/>
+              </w:rPr>
+            </w:pPr>
+            <w:r>
+              <w:rPr>
+                <w:sz w:val="22"/>
+                <w:szCs w:val="22"/>
+              </w:rPr>
+              <w:t>Compassos 3, 9, 15 e 21</w:t>
+            </w:r>
+          </w:p>
+        </w:tc>
+      </w:tr>
+    </w:tbl>
+    <w:p>
+      <w:pPr>
+        <w:widowControl w:val="0"/>
+        <w:pBdr>
+          <w:top w:val="nil"/>
+          <w:left w:val="nil"/>
+          <w:bottom w:val="nil"/>
+          <w:right w:val="nil"/>
+          <w:between w:val="nil"/>
+        </w:pBdr>
+        <w:spacing w:line="360" w:lineRule="auto"/>
+        <w:jc w:val="center"/>
+        <w:rPr>
+          <w:color w:val="000000" w:themeColor="text1"/>
+          <w:sz w:val="22"/>
+          <w:szCs w:val="22"/>
+        </w:rPr>
+      </w:pPr>
+      <w:r>
+        <w:rPr>
+          <w:color w:val="000000" w:themeColor="text1"/>
+          <w:sz w:val="22"/>
+          <w:szCs w:val="22"/>
+        </w:rPr>
+        <w:t>Fonte: Elaborada pelo autor (2026).</w:t>
+      </w:r>
+    </w:p>
+    <w:p>
+      <w:pPr>
+        <w:pStyle w:val="TE-Normal"/>
+      </w:pPr>
+    </w:p>
+    <w:p>
+      <w:pPr>
+        <w:pStyle w:val="TE-Normal"/>
+      </w:pPr>
+      <w:r>
+        <w:t>Os dados apresentados no quadro possuem caráter exemplificativo e demonstram como os resultados poderão ser organizados após a execução do protótipo. A coluna referente ao tipo de representação permite distinguir se o padrão foi encontrado por meio da sequência de intervalos ou por meio do contorno melódico. A coluna de ocorrências indica a frequência com que o padrão aparece, enquanto a localização aproximada auxilia na conferência manual dentro da partitura.</w:t>
+      </w:r>
+    </w:p>
+    <w:p>
+      <w:pPr>
+        <w:pStyle w:val="TE-Normal"/>
+      </w:pPr>
+      <w:r>
+        <w:t xml:space="preserve">Essa forma de apresentação busca tornar os resultados compreensíveis tanto </w:t>
+      </w:r>
+      <w:r>
+        <w:lastRenderedPageBreak/>
+        <w:t>do ponto de vista computacional quanto musical. Ao organizar os padrões detectados em tabelas ou relatórios, o protótipo poderá servir como ferramenta de apoio à análise, indicando possíveis recorrências que deverão ser posteriormente avaliadas pelo pesquisador. Assim, os resultados não serão tratados como conclusões automáticas definitivas, mas como indícios estruturados para análise qualitativa.</w:t>
+      </w:r>
+    </w:p>
+    <w:p>
+      <w:pPr>
+        <w:pStyle w:val="T2-TituloSecundario"/>
+      </w:pPr>
+      <w:bookmarkStart w:id="67" w:name="_Toc230642001"/>
+      <w:r>
+        <w:t>Considerações do capítulo</w:t>
+      </w:r>
+      <w:bookmarkEnd w:id="67"/>
+    </w:p>
+    <w:p>
+      <w:pPr>
+        <w:pStyle w:val="TE-Normal"/>
+      </w:pPr>
+      <w:r>
+        <w:t>Este capítulo apresentou a modelagem do protótipo proposto para a identificação automática de padrões melódicos recorrentes em partituras digitais no formato MusicXML. Foram descritos a solução proposta, os requisitos funcionais e não funcionais, a arquitetura geral do sistema, as etapas de processamento das partituras, a estrutura dos dados extraídos e a forma esperada de apresentação dos resultados.</w:t>
+      </w:r>
+    </w:p>
+    <w:p>
+      <w:pPr>
+        <w:pStyle w:val="TE-Normal"/>
+      </w:pPr>
+      <w:r>
+        <w:t>A modelagem apresentada permite compreender como a partitura digital será transformada em dados estruturados para análise computacional. O processo inicia com a leitura do arquivo MusicXML, passa pela extração da linha melódica principal, pela conversão da sequência de notas em representações intervalares e de contorno, e finaliza com a identificação e organização dos padrões recorrentes encontrados.</w:t>
+      </w:r>
+    </w:p>
+    <w:p>
+      <w:pPr>
+        <w:pStyle w:val="TE-Normal"/>
+      </w:pPr>
+      <w:r>
+        <w:t>Dessa forma, o capítulo estabelece a base para a implementação do protótipo no TCC II. A partir da estrutura definida, será possível desenvolver as etapas de extração, representação, comparação e apresentação dos resultados, avaliando posteriormente a viabilidade da abordagem proposta como ferramenta de apoio à análise musical computacional.</w:t>
+      </w:r>
+    </w:p>
+    <w:p>
+      <w:pPr>
+        <w:pStyle w:val="TE-Normal"/>
+        <w:ind w:left="1009" w:firstLine="0"/>
+      </w:pPr>
+    </w:p>
+    <w:p>
+      <w:pPr>
+        <w:pStyle w:val="T1-TituloPrimario"/>
+      </w:pPr>
+      <w:bookmarkStart w:id="68" w:name="_Toc230642002"/>
+      <w:r>
+        <w:lastRenderedPageBreak/>
+        <w:t>CRONOGRAMA</w:t>
+      </w:r>
+      <w:bookmarkEnd w:id="68"/>
+    </w:p>
+    <w:p>
+      <w:pPr>
+        <w:pStyle w:val="TE-Normal"/>
+      </w:pPr>
+      <w:r>
+        <w:t>O desenvolvimento do trabalho será organizado em duas etapas principais, correspondentes ao TCC I e ao TCC II. No TCC I, concentram-se as atividades de definição do tema, levantamento bibliográfico, delimitação metodológica e elaboração da estrutura inicial do trabalho. No TCC II, serão realizadas a implementação do protótipo, a execução dos experimentos, a análise dos resultados e a finalização do documento.</w:t>
+      </w:r>
+    </w:p>
+    <w:p>
+      <w:pPr>
+        <w:pStyle w:val="TE-Normal"/>
+      </w:pPr>
+    </w:p>
+    <w:p>
+      <w:pPr>
+        <w:pStyle w:val="Legenda"/>
+        <w:keepNext/>
+        <w:jc w:val="center"/>
+        <w:rPr>
+          <w:i w:val="0"/>
+          <w:iCs w:val="0"/>
+          <w:color w:val="auto"/>
+          <w:sz w:val="22"/>
+          <w:szCs w:val="22"/>
+        </w:rPr>
+      </w:pPr>
+      <w:bookmarkStart w:id="69" w:name="_Toc230641862"/>
+      <w:r>
+        <w:rPr>
+          <w:b/>
+          <w:bCs/>
+          <w:i w:val="0"/>
+          <w:iCs w:val="0"/>
+          <w:color w:val="auto"/>
+          <w:sz w:val="22"/>
+          <w:szCs w:val="22"/>
+        </w:rPr>
+        <w:t xml:space="preserve">QUADRO </w:t>
+      </w:r>
+      <w:r>
+        <w:rPr>
+          <w:b/>
+          <w:bCs/>
+          <w:i w:val="0"/>
+          <w:iCs w:val="0"/>
+          <w:color w:val="auto"/>
+          <w:sz w:val="22"/>
+          <w:szCs w:val="22"/>
+        </w:rPr>
+        <w:fldChar w:fldCharType="begin"/>
+      </w:r>
+      <w:r>
+        <w:rPr>
+          <w:b/>
+          <w:bCs/>
+          <w:i w:val="0"/>
+          <w:iCs w:val="0"/>
+          <w:color w:val="auto"/>
+          <w:sz w:val="22"/>
+          <w:szCs w:val="22"/>
+        </w:rPr>
+        <w:instrText xml:space="preserve"> SEQ Quadro \* ARABIC </w:instrText>
+      </w:r>
+      <w:r>
+        <w:rPr>
+          <w:b/>
+          <w:bCs/>
+          <w:i w:val="0"/>
+          <w:iCs w:val="0"/>
+          <w:color w:val="auto"/>
+          <w:sz w:val="22"/>
+          <w:szCs w:val="22"/>
+        </w:rPr>
+        <w:fldChar w:fldCharType="separate"/>
+      </w:r>
+      <w:r>
+        <w:rPr>
+          <w:b/>
+          <w:bCs/>
+          <w:i w:val="0"/>
+          <w:iCs w:val="0"/>
+          <w:noProof/>
+          <w:color w:val="auto"/>
+          <w:sz w:val="22"/>
+          <w:szCs w:val="22"/>
+        </w:rPr>
+        <w:t>6</w:t>
+      </w:r>
+      <w:r>
+        <w:rPr>
+          <w:b/>
+          <w:bCs/>
+          <w:i w:val="0"/>
+          <w:iCs w:val="0"/>
+          <w:color w:val="auto"/>
+          <w:sz w:val="22"/>
+          <w:szCs w:val="22"/>
+        </w:rPr>
+        <w:fldChar w:fldCharType="end"/>
+      </w:r>
+      <w:r>
+        <w:rPr>
+          <w:i w:val="0"/>
+          <w:iCs w:val="0"/>
+          <w:color w:val="auto"/>
+          <w:sz w:val="22"/>
+          <w:szCs w:val="22"/>
+        </w:rPr>
         <w:t xml:space="preserve"> - Cronograma previsto para o TCC I</w:t>
       </w:r>
-      <w:bookmarkEnd w:id="54"/>
+      <w:bookmarkEnd w:id="69"/>
     </w:p>
     <w:tbl>
       <w:tblPr>
@@ -10190,7 +12424,7 @@
           <w:szCs w:val="22"/>
         </w:rPr>
       </w:pPr>
-      <w:bookmarkStart w:id="55" w:name="_Toc230257713"/>
+      <w:bookmarkStart w:id="70" w:name="_Toc230641863"/>
       <w:r>
         <w:rPr>
           <w:b/>
@@ -10250,7 +12484,7 @@
           <w:sz w:val="22"/>
           <w:szCs w:val="22"/>
         </w:rPr>
-        <w:t>5</w:t>
+        <w:t>7</w:t>
       </w:r>
       <w:r>
         <w:rPr>
@@ -10274,7 +12508,7 @@
         </w:rPr>
         <w:t xml:space="preserve"> - Cronograma previsto para o TCC II</w:t>
       </w:r>
-      <w:bookmarkEnd w:id="55"/>
+      <w:bookmarkEnd w:id="70"/>
     </w:p>
     <w:tbl>
       <w:tblPr>
@@ -11183,20 +13417,20 @@
       <w:pPr>
         <w:pStyle w:val="TP-TituloCentralizadoPos"/>
       </w:pPr>
-      <w:bookmarkStart w:id="56" w:name="_Toc527721628"/>
-      <w:bookmarkStart w:id="57" w:name="_Toc527793681"/>
-      <w:bookmarkStart w:id="58" w:name="_Toc527795414"/>
-      <w:bookmarkStart w:id="59" w:name="_Toc527798510"/>
-      <w:bookmarkStart w:id="60" w:name="_Toc230257793"/>
+      <w:bookmarkStart w:id="71" w:name="_Toc527721628"/>
+      <w:bookmarkStart w:id="72" w:name="_Toc527793681"/>
+      <w:bookmarkStart w:id="73" w:name="_Toc527795414"/>
+      <w:bookmarkStart w:id="74" w:name="_Toc527798510"/>
+      <w:bookmarkStart w:id="75" w:name="_Toc230642003"/>
       <w:r>
         <w:lastRenderedPageBreak/>
         <w:t>Referências</w:t>
       </w:r>
-      <w:bookmarkEnd w:id="56"/>
-      <w:bookmarkEnd w:id="57"/>
-      <w:bookmarkEnd w:id="58"/>
-      <w:bookmarkEnd w:id="59"/>
-      <w:bookmarkEnd w:id="60"/>
+      <w:bookmarkEnd w:id="71"/>
+      <w:bookmarkEnd w:id="72"/>
+      <w:bookmarkEnd w:id="73"/>
+      <w:bookmarkEnd w:id="74"/>
+      <w:bookmarkEnd w:id="75"/>
       <w:r>
         <w:t xml:space="preserve"> </w:t>
       </w:r>

</xml_diff>